<commit_message>
PBL report: retrain results, front matter, screenshot slots, contents page numbers
Co-Authored-By: Claude Sonnet 5.5 <noreply@anthropic.com>
Claude-Session: https://claude.ai/code/session_01CcRevgLHUMr7Kjzc4fTXg4
</commit_message>
<xml_diff>
--- a/reports/pbl/pbl_report.docx
+++ b/reports/pbl/pbl_report.docx
@@ -15,146 +15,374 @@
         <w:pStyle w:val="Subtitle"/>
       </w:pPr>
       <w:r>
-        <w:t xml:space="preserve">Evaluating</w:t>
-      </w:r>
-      <w:r>
-        <w:t xml:space="preserve"> </w:t>
-      </w:r>
-      <w:r>
-        <w:t xml:space="preserve">Phishing-URL</w:t>
-      </w:r>
-      <w:r>
-        <w:t xml:space="preserve"> </w:t>
-      </w:r>
-      <w:r>
-        <w:t xml:space="preserve">Detection</w:t>
-      </w:r>
-      <w:r>
-        <w:t xml:space="preserve"> </w:t>
-      </w:r>
-      <w:r>
-        <w:t xml:space="preserve">Across</w:t>
-      </w:r>
-      <w:r>
-        <w:t xml:space="preserve"> </w:t>
-      </w:r>
-      <w:r>
-        <w:t xml:space="preserve">Sources,</w:t>
-      </w:r>
-      <w:r>
-        <w:t xml:space="preserve"> </w:t>
-      </w:r>
-      <w:r>
-        <w:t xml:space="preserve">Representations</w:t>
-      </w:r>
-      <w:r>
-        <w:t xml:space="preserve"> </w:t>
-      </w:r>
-      <w:r>
-        <w:t xml:space="preserve">and</w:t>
-      </w:r>
-      <w:r>
-        <w:t xml:space="preserve"> </w:t>
-      </w:r>
-      <w:r>
-        <w:t xml:space="preserve">Splits,</w:t>
-      </w:r>
-      <w:r>
-        <w:t xml:space="preserve"> </w:t>
-      </w:r>
-      <w:r>
-        <w:t xml:space="preserve">and</w:t>
-      </w:r>
-      <w:r>
-        <w:t xml:space="preserve"> </w:t>
-      </w:r>
-      <w:r>
-        <w:t xml:space="preserve">an</w:t>
-      </w:r>
-      <w:r>
-        <w:t xml:space="preserve"> </w:t>
-      </w:r>
-      <w:r>
-        <w:t xml:space="preserve">Explainable</w:t>
-      </w:r>
-      <w:r>
-        <w:t xml:space="preserve"> </w:t>
-      </w:r>
-      <w:r>
-        <w:t xml:space="preserve">Chrome-Extension</w:t>
-      </w:r>
-      <w:r>
-        <w:t xml:space="preserve"> </w:t>
-      </w:r>
-      <w:r>
-        <w:t xml:space="preserve">Detector</w:t>
-      </w:r>
-    </w:p>
-    <w:p>
-      <w:pPr>
-        <w:pStyle w:val="Author"/>
-      </w:pPr>
-      <w:r>
-        <w:t xml:space="preserve">Ritvik</w:t>
-      </w:r>
-      <w:r>
-        <w:t xml:space="preserve"> </w:t>
-      </w:r>
-      <w:r>
-        <w:t xml:space="preserve">Gangwar</w:t>
-      </w:r>
-    </w:p>
-    <w:p>
-      <w:pPr>
-        <w:pStyle w:val="Date"/>
-      </w:pPr>
-      <w:r>
-        <w:t xml:space="preserve">Project-Based</w:t>
-      </w:r>
-      <w:r>
-        <w:t xml:space="preserve"> </w:t>
-      </w:r>
-      <w:r>
-        <w:t xml:space="preserve">Learning</w:t>
-      </w:r>
-      <w:r>
-        <w:t xml:space="preserve"> </w:t>
-      </w:r>
-      <w:r>
-        <w:t xml:space="preserve">final</w:t>
-      </w:r>
-      <w:r>
-        <w:t xml:space="preserve"> </w:t>
-      </w:r>
-      <w:r>
-        <w:t xml:space="preserve">report,</w:t>
-      </w:r>
-      <w:r>
-        <w:t xml:space="preserve"> </w:t>
-      </w:r>
-      <w:r>
-        <w:t xml:space="preserve">6th</w:t>
-      </w:r>
-      <w:r>
-        <w:t xml:space="preserve"> </w:t>
-      </w:r>
-      <w:r>
-        <w:t xml:space="preserve">semester,</w:t>
-      </w:r>
-      <w:r>
-        <w:t xml:space="preserve"> </w:t>
-      </w:r>
-      <w:r>
-        <w:t xml:space="preserve">October</w:t>
-      </w:r>
-      <w:r>
-        <w:t xml:space="preserve"> </w:t>
-      </w:r>
-      <w:r>
-        <w:t xml:space="preserve">2026</w:t>
-      </w:r>
-    </w:p>
-    <w:bookmarkStart w:id="20" w:name="contents"/>
+        <w:t xml:space="preserve">Evaluating Phishing-URL Detection Across Sources, Representations and Splits, and an Explainable Chrome-Extension Detector</w:t>
+      </w:r>
+    </w:p>
+    <w:p>
+      <w:pPr>
+        <w:pStyle w:val="Normal"/>
+      </w:pPr>
+      <w:r>
+        <w:t xml:space="preserve">Project-Based Learning final report</w:t>
+      </w:r>
+    </w:p>
+    <w:p>
+      <w:pPr>
+        <w:pStyle w:val="Normal"/>
+      </w:pPr>
+      <w:r>
+        <w:t xml:space="preserve">Submitted by</w:t>
+      </w:r>
+      <w:r>
+        <w:t xml:space="preserve"> </w:t>
+      </w:r>
+      <w:r>
+        <w:rPr>
+          <w:bCs/>
+          <w:b/>
+        </w:rPr>
+        <w:t xml:space="preserve">Your name</w:t>
+      </w:r>
+      <w:r>
+        <w:t xml:space="preserve"> </w:t>
+      </w:r>
+      <w:r>
+        <w:t xml:space="preserve">(</w:t>
+      </w:r>
+      <w:r>
+        <w:t xml:space="preserve">Roll number</w:t>
+      </w:r>
+      <w:r>
+        <w:t xml:space="preserve">)</w:t>
+      </w:r>
+    </w:p>
+    <w:p>
+      <w:pPr>
+        <w:pStyle w:val="Normal"/>
+      </w:pPr>
+      <w:r>
+        <w:t xml:space="preserve">Department</w:t>
+      </w:r>
+      <w:r>
+        <w:t xml:space="preserve">,</w:t>
+      </w:r>
+      <w:r>
+        <w:t xml:space="preserve"> </w:t>
+      </w:r>
+      <w:r>
+        <w:t xml:space="preserve">Institution</w:t>
+      </w:r>
+    </w:p>
+    <w:p>
+      <w:pPr>
+        <w:pStyle w:val="Normal"/>
+      </w:pPr>
+      <w:r>
+        <w:t xml:space="preserve">Guide:</w:t>
+      </w:r>
+      <w:r>
+        <w:t xml:space="preserve"> </w:t>
+      </w:r>
+      <w:r>
+        <w:t xml:space="preserve">Guide name</w:t>
+      </w:r>
+    </w:p>
+    <w:p>
+      <w:pPr>
+        <w:pStyle w:val="Normal"/>
+      </w:pPr>
+      <w:r>
+        <w:t xml:space="preserve">Semester and year</w:t>
+      </w:r>
+    </w:p>
+    <w:p>
+      <w:r>
+        <w:br w:type="page"/>
+      </w:r>
+    </w:p>
+    <w:bookmarkStart w:id="20" w:name="certificate"/>
+    <w:p>
+      <w:pPr>
+        <w:pStyle w:val="Heading1"/>
+      </w:pPr>
+      <w:r>
+        <w:t xml:space="preserve">Certificate</w:t>
+      </w:r>
+    </w:p>
+    <w:p>
+      <w:pPr>
+        <w:pStyle w:val="FirstParagraph"/>
+      </w:pPr>
+      <w:r>
+        <w:t xml:space="preserve">This is to certify that the Project-Based Learning report titled</w:t>
+      </w:r>
+      <w:r>
+        <w:t xml:space="preserve"> </w:t>
+      </w:r>
+      <w:r>
+        <w:rPr>
+          <w:bCs/>
+          <w:b/>
+        </w:rPr>
+        <w:t xml:space="preserve">“</w:t>
+      </w:r>
+      <w:r>
+        <w:rPr>
+          <w:bCs/>
+          <w:b/>
+        </w:rPr>
+        <w:t xml:space="preserve">PhishDrift: Evaluating Phishing-URL Detection Across Sources, Representations and Splits, and an Explainable Chrome-Extension Detector</w:t>
+      </w:r>
+      <w:r>
+        <w:rPr>
+          <w:bCs/>
+          <w:b/>
+        </w:rPr>
+        <w:t xml:space="preserve">”</w:t>
+      </w:r>
+      <w:r>
+        <w:t xml:space="preserve"> </w:t>
+      </w:r>
+      <w:r>
+        <w:t xml:space="preserve">is a record of work carried out by</w:t>
+      </w:r>
+      <w:r>
+        <w:t xml:space="preserve"> </w:t>
+      </w:r>
+      <w:r>
+        <w:rPr>
+          <w:bCs/>
+          <w:b/>
+        </w:rPr>
+        <w:t xml:space="preserve">Your name</w:t>
+      </w:r>
+      <w:r>
+        <w:t xml:space="preserve"> </w:t>
+      </w:r>
+      <w:r>
+        <w:t xml:space="preserve">(</w:t>
+      </w:r>
+      <w:r>
+        <w:t xml:space="preserve">Roll number</w:t>
+      </w:r>
+      <w:r>
+        <w:t xml:space="preserve">),</w:t>
+      </w:r>
+      <w:r>
+        <w:t xml:space="preserve"> </w:t>
+      </w:r>
+      <w:r>
+        <w:t xml:space="preserve">Department</w:t>
+      </w:r>
+      <w:r>
+        <w:t xml:space="preserve">,</w:t>
+      </w:r>
+      <w:r>
+        <w:t xml:space="preserve"> </w:t>
+      </w:r>
+      <w:r>
+        <w:t xml:space="preserve">Institution</w:t>
+      </w:r>
+      <w:r>
+        <w:t xml:space="preserve">, during</w:t>
+      </w:r>
+      <w:r>
+        <w:t xml:space="preserve"> </w:t>
+      </w:r>
+      <w:r>
+        <w:t xml:space="preserve">Semester and year</w:t>
+      </w:r>
+      <w:r>
+        <w:t xml:space="preserve">, under my guidance.</w:t>
+      </w:r>
+    </w:p>
+    <w:p>
+      <w:pPr>
+        <w:pStyle w:val="BodyText"/>
+      </w:pPr>
+      <w:r>
+        <w:t xml:space="preserve"> </w:t>
+      </w:r>
+    </w:p>
+    <w:p>
+      <w:pPr>
+        <w:pStyle w:val="BodyText"/>
+      </w:pPr>
+      <w:r>
+        <w:t xml:space="preserve">Guide:</w:t>
+      </w:r>
+      <w:r>
+        <w:t xml:space="preserve"> </w:t>
+      </w:r>
+      <w:r>
+        <w:t xml:space="preserve">Guide name</w:t>
+      </w:r>
+      <w:r>
+        <w:t xml:space="preserve"> </w:t>
+      </w:r>
+      <w:r>
+        <w:t xml:space="preserve">     Signature: ____________    Date: __________</w:t>
+      </w:r>
+    </w:p>
+    <w:p>
+      <w:pPr>
+        <w:pStyle w:val="BodyText"/>
+      </w:pPr>
+      <w:r>
+        <w:t xml:space="preserve">Head of Department: ____________    Signature: ____________    Date: __________</w:t>
+      </w:r>
+    </w:p>
+    <w:p>
+      <w:r>
+        <w:br w:type="page"/>
+      </w:r>
+    </w:p>
+    <w:bookmarkEnd w:id="20"/>
+    <w:bookmarkStart w:id="21" w:name="declaration"/>
+    <w:p>
+      <w:pPr>
+        <w:pStyle w:val="Heading1"/>
+      </w:pPr>
+      <w:r>
+        <w:t xml:space="preserve">Declaration</w:t>
+      </w:r>
+    </w:p>
+    <w:p>
+      <w:pPr>
+        <w:pStyle w:val="FirstParagraph"/>
+      </w:pPr>
+      <w:r>
+        <w:t xml:space="preserve">I,</w:t>
+      </w:r>
+      <w:r>
+        <w:t xml:space="preserve"> </w:t>
+      </w:r>
+      <w:r>
+        <w:rPr>
+          <w:bCs/>
+          <w:b/>
+        </w:rPr>
+        <w:t xml:space="preserve">Your name</w:t>
+      </w:r>
+      <w:r>
+        <w:t xml:space="preserve"> </w:t>
+      </w:r>
+      <w:r>
+        <w:t xml:space="preserve">(</w:t>
+      </w:r>
+      <w:r>
+        <w:t xml:space="preserve">Roll number</w:t>
+      </w:r>
+      <w:r>
+        <w:t xml:space="preserve">), declare that this report is my own work. The data come from public datasets and feeds named in the report, and its numbers come from files that scripts in the project repository write to the</w:t>
+      </w:r>
+      <w:r>
+        <w:t xml:space="preserve"> </w:t>
+      </w:r>
+      <w:r>
+        <w:rPr>
+          <w:rStyle w:val="VerbatimChar"/>
+        </w:rPr>
+        <w:t xml:space="preserve">reports/</w:t>
+      </w:r>
+      <w:r>
+        <w:t xml:space="preserve"> </w:t>
+      </w:r>
+      <w:r>
+        <w:t xml:space="preserve">folder, or from the project log, with the source named beside each. Where a result is estimated or not measured, the report says so. Other people’s work is cited in the references.</w:t>
+      </w:r>
+    </w:p>
+    <w:p>
+      <w:pPr>
+        <w:pStyle w:val="BodyText"/>
+      </w:pPr>
+      <w:r>
+        <w:t xml:space="preserve"> </w:t>
+      </w:r>
+    </w:p>
+    <w:p>
+      <w:pPr>
+        <w:pStyle w:val="BodyText"/>
+      </w:pPr>
+      <w:r>
+        <w:t xml:space="preserve">Your name</w:t>
+      </w:r>
+      <w:r>
+        <w:t xml:space="preserve"> </w:t>
+      </w:r>
+      <w:r>
+        <w:t xml:space="preserve">     Signature: ____________    Date: __________</w:t>
+      </w:r>
+    </w:p>
+    <w:p>
+      <w:r>
+        <w:br w:type="page"/>
+      </w:r>
+    </w:p>
+    <w:bookmarkEnd w:id="21"/>
+    <w:bookmarkStart w:id="22" w:name="acknowledgement"/>
+    <w:p>
+      <w:pPr>
+        <w:pStyle w:val="Heading1"/>
+      </w:pPr>
+      <w:r>
+        <w:t xml:space="preserve">Acknowledgement</w:t>
+      </w:r>
+    </w:p>
+    <w:p>
+      <w:pPr>
+        <w:pStyle w:val="FirstParagraph"/>
+      </w:pPr>
+      <w:r>
+        <w:t xml:space="preserve">Template, edit before submission.</w:t>
+      </w:r>
+      <w:r>
+        <w:t xml:space="preserve"> </w:t>
+      </w:r>
+      <w:r>
+        <w:t xml:space="preserve">I thank my guide,</w:t>
+      </w:r>
+      <w:r>
+        <w:t xml:space="preserve"> </w:t>
+      </w:r>
+      <w:r>
+        <w:t xml:space="preserve">Guide name</w:t>
+      </w:r>
+      <w:r>
+        <w:t xml:space="preserve">, for direction and feedback during this project, the</w:t>
+      </w:r>
+      <w:r>
+        <w:t xml:space="preserve"> </w:t>
+      </w:r>
+      <w:r>
+        <w:t xml:space="preserve">Department</w:t>
+      </w:r>
+      <w:r>
+        <w:t xml:space="preserve"> </w:t>
+      </w:r>
+      <w:r>
+        <w:t xml:space="preserve">at</w:t>
+      </w:r>
+      <w:r>
+        <w:t xml:space="preserve"> </w:t>
+      </w:r>
+      <w:r>
+        <w:t xml:space="preserve">Institution</w:t>
+      </w:r>
+      <w:r>
+        <w:t xml:space="preserve"> </w:t>
+      </w:r>
+      <w:r>
+        <w:t xml:space="preserve">for the opportunity to carry out project-based learning, and the authors of the public datasets and tools used here, whose work made the study possible.</w:t>
+      </w:r>
+    </w:p>
+    <w:p>
+      <w:r>
+        <w:br w:type="page"/>
+      </w:r>
+    </w:p>
+    <w:bookmarkEnd w:id="22"/>
+    <w:bookmarkStart w:id="23" w:name="contents"/>
     <w:p>
       <w:pPr>
         <w:pStyle w:val="Heading1"/>
@@ -171,17 +399,8 @@
         </w:numPr>
         <w:pStyle w:val="Compact"/>
       </w:pPr>
-    </w:p>
-    <w:p>
-      <w:pPr>
-        <w:numPr>
-          <w:ilvl w:val="1"/>
-          <w:numId w:val="1002"/>
-        </w:numPr>
-        <w:pStyle w:val="Compact"/>
-      </w:pPr>
-      <w:r>
-        <w:t xml:space="preserve">Introduction</w:t>
+      <w:r>
+        <w:t xml:space="preserve">1. Introduction</w:t>
       </w:r>
     </w:p>
     <w:p>
@@ -192,17 +411,8 @@
         </w:numPr>
         <w:pStyle w:val="Compact"/>
       </w:pPr>
-    </w:p>
-    <w:p>
-      <w:pPr>
-        <w:numPr>
-          <w:ilvl w:val="1"/>
-          <w:numId w:val="1003"/>
-        </w:numPr>
-        <w:pStyle w:val="Compact"/>
-      </w:pPr>
-      <w:r>
-        <w:t xml:space="preserve">Background and questions</w:t>
+      <w:r>
+        <w:t xml:space="preserve">2. Background and questions</w:t>
       </w:r>
     </w:p>
     <w:p>
@@ -213,17 +423,8 @@
         </w:numPr>
         <w:pStyle w:val="Compact"/>
       </w:pPr>
-    </w:p>
-    <w:p>
-      <w:pPr>
-        <w:numPr>
-          <w:ilvl w:val="1"/>
-          <w:numId w:val="1004"/>
-        </w:numPr>
-        <w:pStyle w:val="Compact"/>
-      </w:pPr>
-      <w:r>
-        <w:t xml:space="preserve">Part I: design and method</w:t>
+      <w:r>
+        <w:t xml:space="preserve">3. Part I: design and method</w:t>
       </w:r>
     </w:p>
     <w:p>
@@ -234,17 +435,8 @@
         </w:numPr>
         <w:pStyle w:val="Compact"/>
       </w:pPr>
-    </w:p>
-    <w:p>
-      <w:pPr>
-        <w:numPr>
-          <w:ilvl w:val="1"/>
-          <w:numId w:val="1005"/>
-        </w:numPr>
-        <w:pStyle w:val="Compact"/>
-      </w:pPr>
-      <w:r>
-        <w:t xml:space="preserve">Feature engine and models</w:t>
+      <w:r>
+        <w:t xml:space="preserve">4. Part I: results</w:t>
       </w:r>
     </w:p>
     <w:p>
@@ -255,17 +447,8 @@
         </w:numPr>
         <w:pStyle w:val="Compact"/>
       </w:pPr>
-    </w:p>
-    <w:p>
-      <w:pPr>
-        <w:numPr>
-          <w:ilvl w:val="1"/>
-          <w:numId w:val="1006"/>
-        </w:numPr>
-        <w:pStyle w:val="Compact"/>
-      </w:pPr>
-      <w:r>
-        <w:t xml:space="preserve">System: extension and backend</w:t>
+      <w:r>
+        <w:t xml:space="preserve">5. Data and corpus</w:t>
       </w:r>
     </w:p>
     <w:p>
@@ -276,17 +459,8 @@
         </w:numPr>
         <w:pStyle w:val="Compact"/>
       </w:pPr>
-    </w:p>
-    <w:p>
-      <w:pPr>
-        <w:numPr>
-          <w:ilvl w:val="1"/>
-          <w:numId w:val="1007"/>
-        </w:numPr>
-        <w:pStyle w:val="Compact"/>
-      </w:pPr>
-      <w:r>
-        <w:t xml:space="preserve">Evaluation of the detector</w:t>
+      <w:r>
+        <w:t xml:space="preserve">6. Feature engine and models</w:t>
       </w:r>
     </w:p>
     <w:p>
@@ -297,17 +471,8 @@
         </w:numPr>
         <w:pStyle w:val="Compact"/>
       </w:pPr>
-    </w:p>
-    <w:p>
-      <w:pPr>
-        <w:numPr>
-          <w:ilvl w:val="1"/>
-          <w:numId w:val="1008"/>
-        </w:numPr>
-        <w:pStyle w:val="Compact"/>
-      </w:pPr>
-      <w:r>
-        <w:t xml:space="preserve">Limitations and what is not done</w:t>
+      <w:r>
+        <w:t xml:space="preserve">7. System: extension and backend</w:t>
       </w:r>
     </w:p>
     <w:p>
@@ -318,17 +483,8 @@
         </w:numPr>
         <w:pStyle w:val="Compact"/>
       </w:pPr>
-    </w:p>
-    <w:p>
-      <w:pPr>
-        <w:numPr>
-          <w:ilvl w:val="1"/>
-          <w:numId w:val="1009"/>
-        </w:numPr>
-        <w:pStyle w:val="Compact"/>
-      </w:pPr>
-      <w:r>
-        <w:t xml:space="preserve">Conclusion and future work</w:t>
+      <w:r>
+        <w:t xml:space="preserve">8. Evaluation of the detector</w:t>
       </w:r>
     </w:p>
     <w:p>
@@ -340,11 +496,35 @@
         <w:pStyle w:val="Compact"/>
       </w:pPr>
       <w:r>
+        <w:t xml:space="preserve">9. Limitations and what is not done</w:t>
+      </w:r>
+    </w:p>
+    <w:p>
+      <w:pPr>
+        <w:numPr>
+          <w:ilvl w:val="0"/>
+          <w:numId w:val="1001"/>
+        </w:numPr>
+        <w:pStyle w:val="Compact"/>
+      </w:pPr>
+      <w:r>
+        <w:t xml:space="preserve">10. Conclusion and future work</w:t>
+      </w:r>
+    </w:p>
+    <w:p>
+      <w:pPr>
+        <w:numPr>
+          <w:ilvl w:val="0"/>
+          <w:numId w:val="1001"/>
+        </w:numPr>
+        <w:pStyle w:val="Compact"/>
+      </w:pPr>
+      <w:r>
         <w:t xml:space="preserve">References</w:t>
       </w:r>
     </w:p>
-    <w:bookmarkEnd w:id="20"/>
-    <w:bookmarkStart w:id="21" w:name="abstract"/>
+    <w:bookmarkEnd w:id="23"/>
+    <w:bookmarkStart w:id="24" w:name="abstract"/>
     <w:p>
       <w:pPr>
         <w:pStyle w:val="Heading1"/>
@@ -401,8 +581,8 @@
         <w:t xml:space="preserve">In Part I, the median score falls from 0.977 on raw URLs to 0.850 when a URL is reduced to its domain, and the fall appears in 100% of settings; transfer to datasets that share no source stays above chance. Source dependence holds in part (76% of settings) and the gap in false alarms on naturally browsed legitimate pages holds in part (76%): at the 1% threshold 15.2% of those pages are flagged against 1.0% on the model’s own test side. The share of the fall that sits in the host name does not hold across cells and depends on how the benchmark is prepared, and the larger split-to-split spread of the normalised score does not hold. The effect of masking hosting platforms could not be tested. Each result is stated as behaviour under one frozen design, not as a general claim.</w:t>
       </w:r>
     </w:p>
-    <w:bookmarkEnd w:id="21"/>
-    <w:bookmarkStart w:id="26" w:name="introduction"/>
+    <w:bookmarkEnd w:id="24"/>
+    <w:bookmarkStart w:id="29" w:name="introduction"/>
     <w:p>
       <w:pPr>
         <w:pStyle w:val="Heading1"/>
@@ -411,7 +591,7 @@
         <w:t xml:space="preserve">1. Introduction</w:t>
       </w:r>
     </w:p>
-    <w:bookmarkStart w:id="22" w:name="motivation"/>
+    <w:bookmarkStart w:id="25" w:name="motivation"/>
     <w:p>
       <w:pPr>
         <w:pStyle w:val="Heading2"/>
@@ -428,8 +608,8 @@
         <w:t xml:space="preserve">Phishing sites steal passwords and payment details, and new ones appear every hour. Machine-learning detectors are an obvious defence, and many published ones report accuracy above 99% on a public dataset. A detector that reaches that on one dataset can still fail on the pages a person actually browses. In this project the median AUC falls from 0.977 on raw URLs to 0.850 once URLs are reduced to their domain, and at the 1% threshold set on a benchmark, 15.2% of ordinary legitimate pages are flagged against 1.0% on the benchmark itself.</w:t>
       </w:r>
     </w:p>
-    <w:bookmarkEnd w:id="22"/>
-    <w:bookmarkStart w:id="23" w:name="objectives"/>
+    <w:bookmarkEnd w:id="25"/>
+    <w:bookmarkStart w:id="26" w:name="objectives"/>
     <w:p>
       <w:pPr>
         <w:pStyle w:val="Heading2"/>
@@ -442,7 +622,7 @@
       <w:pPr>
         <w:numPr>
           <w:ilvl w:val="0"/>
-          <w:numId w:val="1010"/>
+          <w:numId w:val="1002"/>
         </w:numPr>
         <w:pStyle w:val="Compact"/>
       </w:pPr>
@@ -464,7 +644,7 @@
       <w:pPr>
         <w:numPr>
           <w:ilvl w:val="0"/>
-          <w:numId w:val="1010"/>
+          <w:numId w:val="1002"/>
         </w:numPr>
         <w:pStyle w:val="Compact"/>
       </w:pPr>
@@ -486,7 +666,7 @@
       <w:pPr>
         <w:numPr>
           <w:ilvl w:val="0"/>
-          <w:numId w:val="1010"/>
+          <w:numId w:val="1002"/>
         </w:numPr>
         <w:pStyle w:val="Compact"/>
       </w:pPr>
@@ -516,8 +696,8 @@
         <w:t xml:space="preserve">, with fixed seeds, and say plainly where a result is measured, inferred or not tested.</w:t>
       </w:r>
     </w:p>
-    <w:bookmarkEnd w:id="23"/>
-    <w:bookmarkStart w:id="24" w:name="what-is-new"/>
+    <w:bookmarkEnd w:id="26"/>
+    <w:bookmarkStart w:id="27" w:name="what-is-new"/>
     <w:p>
       <w:pPr>
         <w:pStyle w:val="Heading2"/>
@@ -552,8 +732,8 @@
         <w:t xml:space="preserve">is common. Novelty here is in the protocol: domain-grouped splits repeated ten times, leave-one-source-out and out-of-distribution false-alarm reporting, negative controls with shuffled labels, URL-depth checks, and tiered models whose missing inputs never reveal the data source; then a deployed, explainable system built on that protocol.</w:t>
       </w:r>
     </w:p>
-    <w:bookmarkEnd w:id="24"/>
-    <w:bookmarkStart w:id="25" w:name="scope-and-structure"/>
+    <w:bookmarkEnd w:id="27"/>
+    <w:bookmarkStart w:id="28" w:name="scope-and-structure"/>
     <w:p>
       <w:pPr>
         <w:pStyle w:val="Heading2"/>
@@ -570,9 +750,9 @@
         <w:t xml:space="preserve">Chapter 2 gives the background and the questions. Chapters 3 and 4 are Part I, the evaluation study. Chapters 5 to 9 are Part II: data, features and models, the extension and backend, the evaluation of the detector, and the limitations. Chapter 10 concludes. Results from Part I are not used as evidence for Part II, or the reverse.</w:t>
       </w:r>
     </w:p>
-    <w:bookmarkEnd w:id="25"/>
-    <w:bookmarkEnd w:id="26"/>
-    <w:bookmarkStart w:id="30" w:name="background-and-questions"/>
+    <w:bookmarkEnd w:id="28"/>
+    <w:bookmarkEnd w:id="29"/>
+    <w:bookmarkStart w:id="33" w:name="background-and-questions"/>
     <w:p>
       <w:pPr>
         <w:pStyle w:val="Heading1"/>
@@ -581,7 +761,7 @@
         <w:t xml:space="preserve">2. Background and questions</w:t>
       </w:r>
     </w:p>
-    <w:bookmarkStart w:id="27" w:name="why-one-benchmark-score-misleads"/>
+    <w:bookmarkStart w:id="30" w:name="why-one-benchmark-score-misleads"/>
     <w:p>
       <w:pPr>
         <w:pStyle w:val="Heading2"/>
@@ -646,8 +826,8 @@
         <w:t xml:space="preserve">(which domains happen to land in the test side). A fourth gap opens at deployment: the legitimate pages a person browses are not the legitimate pages of the benchmark. This study measures each of these directly.</w:t>
       </w:r>
     </w:p>
-    <w:bookmarkEnd w:id="27"/>
-    <w:bookmarkStart w:id="28" w:name="questions-asked"/>
+    <w:bookmarkEnd w:id="30"/>
+    <w:bookmarkStart w:id="31" w:name="questions-asked"/>
     <w:p>
       <w:pPr>
         <w:pStyle w:val="Heading2"/>
@@ -668,7 +848,7 @@
       <w:pPr>
         <w:numPr>
           <w:ilvl w:val="0"/>
-          <w:numId w:val="1011"/>
+          <w:numId w:val="1003"/>
         </w:numPr>
         <w:pStyle w:val="Compact"/>
       </w:pPr>
@@ -705,7 +885,7 @@
       <w:pPr>
         <w:numPr>
           <w:ilvl w:val="0"/>
-          <w:numId w:val="1011"/>
+          <w:numId w:val="1003"/>
         </w:numPr>
         <w:pStyle w:val="Compact"/>
       </w:pPr>
@@ -727,7 +907,7 @@
       <w:pPr>
         <w:numPr>
           <w:ilvl w:val="0"/>
-          <w:numId w:val="1011"/>
+          <w:numId w:val="1003"/>
         </w:numPr>
         <w:pStyle w:val="Compact"/>
       </w:pPr>
@@ -749,7 +929,7 @@
       <w:pPr>
         <w:numPr>
           <w:ilvl w:val="0"/>
-          <w:numId w:val="1011"/>
+          <w:numId w:val="1003"/>
         </w:numPr>
         <w:pStyle w:val="Compact"/>
       </w:pPr>
@@ -771,7 +951,7 @@
       <w:pPr>
         <w:numPr>
           <w:ilvl w:val="0"/>
-          <w:numId w:val="1011"/>
+          <w:numId w:val="1003"/>
         </w:numPr>
         <w:pStyle w:val="Compact"/>
       </w:pPr>
@@ -793,7 +973,7 @@
       <w:pPr>
         <w:numPr>
           <w:ilvl w:val="0"/>
-          <w:numId w:val="1011"/>
+          <w:numId w:val="1003"/>
         </w:numPr>
         <w:pStyle w:val="Compact"/>
       </w:pPr>
@@ -815,7 +995,7 @@
       <w:pPr>
         <w:numPr>
           <w:ilvl w:val="0"/>
-          <w:numId w:val="1011"/>
+          <w:numId w:val="1003"/>
         </w:numPr>
         <w:pStyle w:val="Compact"/>
       </w:pPr>
@@ -841,8 +1021,8 @@
         <w:t xml:space="preserve">A second, exploratory part repeats the representation idea on page HTML (Section 4.11). It gives no verdicts.</w:t>
       </w:r>
     </w:p>
-    <w:bookmarkEnd w:id="28"/>
-    <w:bookmarkStart w:id="29" w:name="related-datasets-and-tools"/>
+    <w:bookmarkEnd w:id="31"/>
+    <w:bookmarkStart w:id="32" w:name="related-datasets-and-tools"/>
     <w:p>
       <w:pPr>
         <w:pStyle w:val="Heading2"/>
@@ -859,9 +1039,9 @@
         <w:t xml:space="preserve">The study and the detector draw on public datasets (PhreshPhish, PhiUSIIL, URL-Phish, PhishStorm, Phishpedia, Phish-Blitz) and live feeds (OpenPhish, Phishing.Database). Only the URL, label, date and page HTML are read from any of them; no dataset’s precomputed feature columns are used, because one such column (a similarity index) alone identifies PhiUSIIL’s legitimate class. Features follow the published definitions of Hannousse and Yahiouche and of PhiUSIIL, re-implemented in one engine. Models are LightGBM, XGBoost, logistic regression and a character n-gram TF-IDF linear model.</w:t>
       </w:r>
     </w:p>
-    <w:bookmarkEnd w:id="29"/>
-    <w:bookmarkEnd w:id="30"/>
-    <w:bookmarkStart w:id="84" w:name="part-i-design-and-method"/>
+    <w:bookmarkEnd w:id="32"/>
+    <w:bookmarkEnd w:id="33"/>
+    <w:bookmarkStart w:id="41" w:name="part-i-design-and-method"/>
     <w:p>
       <w:pPr>
         <w:pStyle w:val="Heading1"/>
@@ -870,7 +1050,7 @@
         <w:t xml:space="preserve">3. Part I: design and method</w:t>
       </w:r>
     </w:p>
-    <w:bookmarkStart w:id="31" w:name="sources"/>
+    <w:bookmarkStart w:id="34" w:name="sources"/>
     <w:p>
       <w:pPr>
         <w:pStyle w:val="Heading2"/>
@@ -1681,8 +1861,8 @@
         </w:tc>
       </w:tr>
     </w:tbl>
-    <w:bookmarkEnd w:id="31"/>
-    <w:bookmarkStart w:id="32" w:name="representations"/>
+    <w:bookmarkEnd w:id="34"/>
+    <w:bookmarkStart w:id="35" w:name="representations"/>
     <w:p>
       <w:pPr>
         <w:pStyle w:val="Heading2"/>
@@ -1753,8 +1933,8 @@
         <w:t xml:space="preserve">.</w:t>
       </w:r>
     </w:p>
-    <w:bookmarkEnd w:id="32"/>
-    <w:bookmarkStart w:id="36" w:name="models-and-splits"/>
+    <w:bookmarkEnd w:id="35"/>
+    <w:bookmarkStart w:id="39" w:name="models-and-splits"/>
     <w:p>
       <w:pPr>
         <w:pStyle w:val="Heading2"/>
@@ -1780,18 +1960,18 @@
           <wp:inline>
             <wp:extent cx="6261100" cy="2787097"/>
             <wp:effectExtent b="0" l="0" r="0" t="0"/>
-            <wp:docPr descr="Figure 4.1. Study design. Seven questions are tested across 25 source cells, four models, four URL forms and ten splits." title="" id="34" name="Picture"/>
+            <wp:docPr descr="Figure 4.1. Study design. Seven questions are tested across 25 source cells, four models, four URL forms and ten splits." title="" id="37" name="Picture"/>
             <a:graphic>
               <a:graphicData uri="http://schemas.openxmlformats.org/drawingml/2006/picture">
                 <pic:pic>
                   <pic:nvPicPr>
-                    <pic:cNvPr descr="fig01_design.png" id="35" name="Picture"/>
+                    <pic:cNvPr descr="fig01_design.png" id="38" name="Picture"/>
                     <pic:cNvPicPr>
                       <a:picLocks noChangeArrowheads="1" noChangeAspect="1"/>
                     </pic:cNvPicPr>
                   </pic:nvPicPr>
                   <pic:blipFill>
-                    <a:blip r:embed="rId33"/>
+                    <a:blip r:embed="rId36"/>
                     <a:stretch>
                       <a:fillRect/>
                     </a:stretch>
@@ -1826,8 +2006,8 @@
         <w:t xml:space="preserve">Figure 4.1. Study design. Seven questions are tested across 25 source cells, four models, four URL forms and ten splits.</w:t>
       </w:r>
     </w:p>
-    <w:bookmarkEnd w:id="36"/>
-    <w:bookmarkStart w:id="37" w:name="the-rule-for-calling-a-result-consistent"/>
+    <w:bookmarkEnd w:id="39"/>
+    <w:bookmarkStart w:id="40" w:name="the-rule-for-calling-a-result-consistent"/>
     <w:p>
       <w:pPr>
         <w:pStyle w:val="Heading2"/>
@@ -1968,15 +2148,19 @@
       <w:r>
         <w:t xml:space="preserve">describes this design’s data; it is not a claim that the effect is absent elsewhere.</w:t>
       </w:r>
-      <w:r>
-        <w:t xml:space="preserve"> </w:t>
-      </w:r>
-      <w:r>
-        <w:t xml:space="preserve"># 4. Part I: results</w:t>
-      </w:r>
-    </w:p>
-    <w:bookmarkEnd w:id="37"/>
-    <w:bookmarkStart w:id="44" w:name="q1-representation-sensitivity-holds"/>
+    </w:p>
+    <w:bookmarkEnd w:id="40"/>
+    <w:bookmarkEnd w:id="41"/>
+    <w:bookmarkStart w:id="88" w:name="part-i-results"/>
+    <w:p>
+      <w:pPr>
+        <w:pStyle w:val="Heading1"/>
+      </w:pPr>
+      <w:r>
+        <w:t xml:space="preserve">4. Part I: results</w:t>
+      </w:r>
+    </w:p>
+    <w:bookmarkStart w:id="48" w:name="q1-representation-sensitivity-holds"/>
     <w:p>
       <w:pPr>
         <w:pStyle w:val="Heading2"/>
@@ -2002,18 +2186,18 @@
           <wp:inline>
             <wp:extent cx="6261100" cy="2635836"/>
             <wp:effectExtent b="0" l="0" r="0" t="0"/>
-            <wp:docPr descr="Figure 4.2. Representation ladder, 25 cells. Thin lines are cells; the thick line is the median." title="" id="39" name="Picture"/>
+            <wp:docPr descr="Figure 4.2. Representation ladder, 25 cells. Thin lines are cells; the thick line is the median." title="" id="43" name="Picture"/>
             <a:graphic>
               <a:graphicData uri="http://schemas.openxmlformats.org/drawingml/2006/picture">
                 <pic:pic>
                   <pic:nvPicPr>
-                    <pic:cNvPr descr="fig02_ladder.png" id="40" name="Picture"/>
+                    <pic:cNvPr descr="fig02_ladder.png" id="44" name="Picture"/>
                     <pic:cNvPicPr>
                       <a:picLocks noChangeArrowheads="1" noChangeAspect="1"/>
                     </pic:cNvPicPr>
                   </pic:nvPicPr>
                   <pic:blipFill>
-                    <a:blip r:embed="rId38"/>
+                    <a:blip r:embed="rId42"/>
                     <a:stretch>
                       <a:fillRect/>
                     </a:stretch>
@@ -2057,18 +2241,18 @@
           <wp:inline>
             <wp:extent cx="5909137" cy="3060253"/>
             <wp:effectExtent b="0" l="0" r="0" t="0"/>
-            <wp:docPr descr="Figure 4.3. Median AUC by representation and model, with the range across the 25 cells." title="" id="42" name="Picture"/>
+            <wp:docPr descr="Figure 4.3. Median AUC by representation and model, with the range across the 25 cells." title="" id="46" name="Picture"/>
             <a:graphic>
               <a:graphicData uri="http://schemas.openxmlformats.org/drawingml/2006/picture">
                 <pic:pic>
                   <pic:nvPicPr>
-                    <pic:cNvPr descr="fig03_models.png" id="43" name="Picture"/>
+                    <pic:cNvPr descr="fig03_models.png" id="47" name="Picture"/>
                     <pic:cNvPicPr>
                       <a:picLocks noChangeArrowheads="1" noChangeAspect="1"/>
                     </pic:cNvPicPr>
                   </pic:nvPicPr>
                   <pic:blipFill>
-                    <a:blip r:embed="rId41"/>
+                    <a:blip r:embed="rId45"/>
                     <a:stretch>
                       <a:fillRect/>
                     </a:stretch>
@@ -3438,8 +3622,8 @@
         </w:tc>
       </w:tr>
     </w:tbl>
-    <w:bookmarkEnd w:id="44"/>
-    <w:bookmarkStart w:id="48" w:name="q2-where-the-drop-sits-does-not-hold"/>
+    <w:bookmarkEnd w:id="48"/>
+    <w:bookmarkStart w:id="52" w:name="q2-where-the-drop-sits-does-not-hold"/>
     <w:p>
       <w:pPr>
         <w:pStyle w:val="Heading2"/>
@@ -3763,18 +3947,18 @@
           <wp:inline>
             <wp:extent cx="6261100" cy="4454144"/>
             <wp:effectExtent b="0" l="0" r="0" t="0"/>
-            <wp:docPr descr="Figure 4.4. Share of the R1 to R4 drop by step, LightGBM, per cell." title="" id="46" name="Picture"/>
+            <wp:docPr descr="Figure 4.4. Share of the R1 to R4 drop by step, LightGBM, per cell." title="" id="50" name="Picture"/>
             <a:graphic>
               <a:graphicData uri="http://schemas.openxmlformats.org/drawingml/2006/picture">
                 <pic:pic>
                   <pic:nvPicPr>
-                    <pic:cNvPr descr="fig04_share.png" id="47" name="Picture"/>
+                    <pic:cNvPr descr="fig04_share.png" id="51" name="Picture"/>
                     <pic:cNvPicPr>
                       <a:picLocks noChangeArrowheads="1" noChangeAspect="1"/>
                     </pic:cNvPicPr>
                   </pic:nvPicPr>
                   <pic:blipFill>
-                    <a:blip r:embed="rId45"/>
+                    <a:blip r:embed="rId49"/>
                     <a:stretch>
                       <a:fillRect/>
                     </a:stretch>
@@ -3809,8 +3993,8 @@
         <w:t xml:space="preserve">Figure 4.4. Share of the R1 to R4 drop by step, LightGBM, per cell.</w:t>
       </w:r>
     </w:p>
-    <w:bookmarkEnd w:id="48"/>
-    <w:bookmarkStart w:id="52" w:name="q3-source-dependence-holds-in-part"/>
+    <w:bookmarkEnd w:id="52"/>
+    <w:bookmarkStart w:id="56" w:name="q3-source-dependence-holds-in-part"/>
     <w:p>
       <w:pPr>
         <w:pStyle w:val="Heading2"/>
@@ -3836,18 +4020,18 @@
           <wp:inline>
             <wp:extent cx="6261100" cy="2822223"/>
             <wp:effectExtent b="0" l="0" r="0" t="0"/>
-            <wp:docPr descr="Figure 4.5. R4 AUC for every phishing-by-legitimate cell (left) and the distribution of swap effects (right)." title="" id="50" name="Picture"/>
+            <wp:docPr descr="Figure 4.5. R4 AUC for every phishing-by-legitimate cell (left) and the distribution of swap effects (right)." title="" id="54" name="Picture"/>
             <a:graphic>
               <a:graphicData uri="http://schemas.openxmlformats.org/drawingml/2006/picture">
                 <pic:pic>
                   <pic:nvPicPr>
-                    <pic:cNvPr descr="fig05_source.png" id="51" name="Picture"/>
+                    <pic:cNvPr descr="fig05_source.png" id="55" name="Picture"/>
                     <pic:cNvPicPr>
                       <a:picLocks noChangeArrowheads="1" noChangeAspect="1"/>
                     </pic:cNvPicPr>
                   </pic:nvPicPr>
                   <pic:blipFill>
-                    <a:blip r:embed="rId49"/>
+                    <a:blip r:embed="rId53"/>
                     <a:stretch>
                       <a:fillRect/>
                     </a:stretch>
@@ -3890,8 +4074,8 @@
         <w:t xml:space="preserve">the interaction check, an interaction between phishing and legitimate source, holds in 26% of settings; an interaction is hard to establish with this many settings, so it is treated as inconclusive.</w:t>
       </w:r>
     </w:p>
-    <w:bookmarkEnd w:id="52"/>
-    <w:bookmarkStart w:id="56" w:name="q4-split-sensitivity-does-not-hold"/>
+    <w:bookmarkEnd w:id="56"/>
+    <w:bookmarkStart w:id="60" w:name="q4-split-sensitivity-does-not-hold"/>
     <w:p>
       <w:pPr>
         <w:pStyle w:val="Heading2"/>
@@ -3917,18 +4101,18 @@
           <wp:inline>
             <wp:extent cx="4714444" cy="3795449"/>
             <wp:effectExtent b="0" l="0" r="0" t="0"/>
-            <wp:docPr descr="Figure 4.6. SD of AUC across ten splits, raw against R4, one point per cell and model." title="" id="54" name="Picture"/>
+            <wp:docPr descr="Figure 4.6. SD of AUC across ten splits, raw against R4, one point per cell and model." title="" id="58" name="Picture"/>
             <a:graphic>
               <a:graphicData uri="http://schemas.openxmlformats.org/drawingml/2006/picture">
                 <pic:pic>
                   <pic:nvPicPr>
-                    <pic:cNvPr descr="fig06_split.png" id="55" name="Picture"/>
+                    <pic:cNvPr descr="fig06_split.png" id="59" name="Picture"/>
                     <pic:cNvPicPr>
                       <a:picLocks noChangeArrowheads="1" noChangeAspect="1"/>
                     </pic:cNvPicPr>
                   </pic:nvPicPr>
                   <pic:blipFill>
-                    <a:blip r:embed="rId53"/>
+                    <a:blip r:embed="rId57"/>
                     <a:stretch>
                       <a:fillRect/>
                     </a:stretch>
@@ -3963,8 +4147,8 @@
         <w:t xml:space="preserve">Figure 4.6. SD of AUC across ten splits, raw against R4, one point per cell and model.</w:t>
       </w:r>
     </w:p>
-    <w:bookmarkEnd w:id="56"/>
-    <w:bookmarkStart w:id="57" w:name="q5-platform-masking-not-testable"/>
+    <w:bookmarkEnd w:id="60"/>
+    <w:bookmarkStart w:id="61" w:name="q5-platform-masking-not-testable"/>
     <w:p>
       <w:pPr>
         <w:pStyle w:val="Heading2"/>
@@ -3981,8 +4165,8 @@
         <w:t xml:space="preserve">Masking replaces hosting-platform domains with a neutral token. The caps used here leave no registrable domain on a hosting platform in any cell, so there is nothing to mask and the finding cannot be tested. A design that keeps platform domains is future work.</w:t>
       </w:r>
     </w:p>
-    <w:bookmarkEnd w:id="57"/>
-    <w:bookmarkStart w:id="61" w:name="q6-independent-benign-transfer-holds"/>
+    <w:bookmarkEnd w:id="61"/>
+    <w:bookmarkStart w:id="65" w:name="q6-independent-benign-transfer-holds"/>
     <w:p>
       <w:pPr>
         <w:pStyle w:val="Heading2"/>
@@ -4008,18 +4192,18 @@
           <wp:inline>
             <wp:extent cx="5449640" cy="3060253"/>
             <wp:effectExtent b="0" l="0" r="0" t="0"/>
-            <wp:docPr descr="Figure 4.7. Transfer AUC on fully independent cells." title="" id="59" name="Picture"/>
+            <wp:docPr descr="Figure 4.7. Transfer AUC on fully independent cells." title="" id="63" name="Picture"/>
             <a:graphic>
               <a:graphicData uri="http://schemas.openxmlformats.org/drawingml/2006/picture">
                 <pic:pic>
                   <pic:nvPicPr>
-                    <pic:cNvPr descr="fig07_transfer.png" id="60" name="Picture"/>
+                    <pic:cNvPr descr="fig07_transfer.png" id="64" name="Picture"/>
                     <pic:cNvPicPr>
                       <a:picLocks noChangeArrowheads="1" noChangeAspect="1"/>
                     </pic:cNvPicPr>
                   </pic:nvPicPr>
                   <pic:blipFill>
-                    <a:blip r:embed="rId58"/>
+                    <a:blip r:embed="rId62"/>
                     <a:stretch>
                       <a:fillRect/>
                     </a:stretch>
@@ -4054,8 +4238,8 @@
         <w:t xml:space="preserve">Figure 4.7. Transfer AUC on fully independent cells.</w:t>
       </w:r>
     </w:p>
-    <w:bookmarkEnd w:id="61"/>
-    <w:bookmarkStart w:id="65" w:name="Xd8634e9584e2c3a5f552c1d6de4e9353b6f0ee6"/>
+    <w:bookmarkEnd w:id="65"/>
+    <w:bookmarkStart w:id="69" w:name="Xd8634e9584e2c3a5f552c1d6de4e9353b6f0ee6"/>
     <w:p>
       <w:pPr>
         <w:pStyle w:val="Heading2"/>
@@ -4081,18 +4265,18 @@
           <wp:inline>
             <wp:extent cx="5082042" cy="3974653"/>
             <wp:effectExtent b="0" l="0" r="0" t="0"/>
-            <wp:docPr descr="Figure 4.8. False alarms on natural pages against the cell’s own test side, log scale." title="" id="63" name="Picture"/>
+            <wp:docPr descr="Figure 4.8. False alarms on natural pages against the cell’s own test side, log scale." title="" id="67" name="Picture"/>
             <a:graphic>
               <a:graphicData uri="http://schemas.openxmlformats.org/drawingml/2006/picture">
                 <pic:pic>
                   <pic:nvPicPr>
-                    <pic:cNvPr descr="fig08_ood.png" id="64" name="Picture"/>
+                    <pic:cNvPr descr="fig08_ood.png" id="68" name="Picture"/>
                     <pic:cNvPicPr>
                       <a:picLocks noChangeArrowheads="1" noChangeAspect="1"/>
                     </pic:cNvPicPr>
                   </pic:nvPicPr>
                   <pic:blipFill>
-                    <a:blip r:embed="rId62"/>
+                    <a:blip r:embed="rId66"/>
                     <a:stretch>
                       <a:fillRect/>
                     </a:stretch>
@@ -4127,8 +4311,8 @@
         <w:t xml:space="preserve">Figure 4.8. False alarms on natural pages against the cell’s own test side, log scale.</w:t>
       </w:r>
     </w:p>
-    <w:bookmarkEnd w:id="65"/>
-    <w:bookmarkStart w:id="69" w:name="negative-controls"/>
+    <w:bookmarkEnd w:id="69"/>
+    <w:bookmarkStart w:id="73" w:name="negative-controls"/>
     <w:p>
       <w:pPr>
         <w:pStyle w:val="Heading2"/>
@@ -4154,18 +4338,18 @@
           <wp:inline>
             <wp:extent cx="5909137" cy="2876454"/>
             <wp:effectExtent b="0" l="0" r="0" t="0"/>
-            <wp:docPr descr="Figure 4.9. Shuffled-label controls, 100 conditions." title="" id="67" name="Picture"/>
+            <wp:docPr descr="Figure 4.9. Shuffled-label controls, 100 conditions." title="" id="71" name="Picture"/>
             <a:graphic>
               <a:graphicData uri="http://schemas.openxmlformats.org/drawingml/2006/picture">
                 <pic:pic>
                   <pic:nvPicPr>
-                    <pic:cNvPr descr="fig09_controls.png" id="68" name="Picture"/>
+                    <pic:cNvPr descr="fig09_controls.png" id="72" name="Picture"/>
                     <pic:cNvPicPr>
                       <a:picLocks noChangeArrowheads="1" noChangeAspect="1"/>
                     </pic:cNvPicPr>
                   </pic:nvPicPr>
                   <pic:blipFill>
-                    <a:blip r:embed="rId66"/>
+                    <a:blip r:embed="rId70"/>
                     <a:stretch>
                       <a:fillRect/>
                     </a:stretch>
@@ -4200,8 +4384,8 @@
         <w:t xml:space="preserve">Figure 4.9. Shuffled-label controls, 100 conditions.</w:t>
       </w:r>
     </w:p>
-    <w:bookmarkEnd w:id="69"/>
-    <w:bookmarkStart w:id="70" w:name="dataset-fingerprints"/>
+    <w:bookmarkEnd w:id="73"/>
+    <w:bookmarkStart w:id="74" w:name="dataset-fingerprints"/>
     <w:p>
       <w:pPr>
         <w:pStyle w:val="Heading2"/>
@@ -4773,8 +4957,8 @@
         </w:tc>
       </w:tr>
     </w:tbl>
-    <w:bookmarkEnd w:id="70"/>
-    <w:bookmarkStart w:id="74" w:name="follow-up-checks"/>
+    <w:bookmarkEnd w:id="74"/>
+    <w:bookmarkStart w:id="78" w:name="follow-up-checks"/>
     <w:p>
       <w:pPr>
         <w:pStyle w:val="Heading2"/>
@@ -4828,18 +5012,18 @@
           <wp:inline>
             <wp:extent cx="6261100" cy="2334766"/>
             <wp:effectExtent b="0" l="0" r="0" t="0"/>
-            <wp:docPr descr="Figure 4.10. Left: XGBoost AUC from raw PhiUSIIL to the study cell. Right: the flagged control." title="" id="72" name="Picture"/>
+            <wp:docPr descr="Figure 4.10. Left: XGBoost AUC from raw PhiUSIIL to the study cell. Right: the flagged control." title="" id="76" name="Picture"/>
             <a:graphic>
               <a:graphicData uri="http://schemas.openxmlformats.org/drawingml/2006/picture">
                 <pic:pic>
                   <pic:nvPicPr>
-                    <pic:cNvPr descr="fig12_followup.png" id="73" name="Picture"/>
+                    <pic:cNvPr descr="fig12_followup.png" id="77" name="Picture"/>
                     <pic:cNvPicPr>
                       <a:picLocks noChangeArrowheads="1" noChangeAspect="1"/>
                     </pic:cNvPicPr>
                   </pic:nvPicPr>
                   <pic:blipFill>
-                    <a:blip r:embed="rId71"/>
+                    <a:blip r:embed="rId75"/>
                     <a:stretch>
                       <a:fillRect/>
                     </a:stretch>
@@ -4874,8 +5058,8 @@
         <w:t xml:space="preserve">Figure 4.10. Left: XGBoost AUC from raw PhiUSIIL to the study cell. Right: the flagged control.</w:t>
       </w:r>
     </w:p>
-    <w:bookmarkEnd w:id="74"/>
-    <w:bookmarkStart w:id="81" w:name="page-html-exploratory"/>
+    <w:bookmarkEnd w:id="78"/>
+    <w:bookmarkStart w:id="85" w:name="page-html-exploratory"/>
     <w:p>
       <w:pPr>
         <w:pStyle w:val="Heading2"/>
@@ -5496,7 +5680,7 @@
       <w:pPr>
         <w:numPr>
           <w:ilvl w:val="0"/>
-          <w:numId w:val="1012"/>
+          <w:numId w:val="1004"/>
         </w:numPr>
         <w:pStyle w:val="Compact"/>
       </w:pPr>
@@ -5518,7 +5702,7 @@
       <w:pPr>
         <w:numPr>
           <w:ilvl w:val="0"/>
-          <w:numId w:val="1012"/>
+          <w:numId w:val="1004"/>
         </w:numPr>
         <w:pStyle w:val="Compact"/>
       </w:pPr>
@@ -5540,7 +5724,7 @@
       <w:pPr>
         <w:numPr>
           <w:ilvl w:val="0"/>
-          <w:numId w:val="1012"/>
+          <w:numId w:val="1004"/>
         </w:numPr>
         <w:pStyle w:val="Compact"/>
       </w:pPr>
@@ -5583,18 +5767,18 @@
           <wp:inline>
             <wp:extent cx="6261100" cy="2974654"/>
             <wp:effectExtent b="0" l="0" r="0" t="0"/>
-            <wp:docPr descr="Figure 4.11. Page and URL representations, LightGBM." title="" id="76" name="Picture"/>
+            <wp:docPr descr="Figure 4.11. Page and URL representations, LightGBM." title="" id="80" name="Picture"/>
             <a:graphic>
               <a:graphicData uri="http://schemas.openxmlformats.org/drawingml/2006/picture">
                 <pic:pic>
                   <pic:nvPicPr>
-                    <pic:cNvPr descr="fig10_pageb.png" id="77" name="Picture"/>
+                    <pic:cNvPr descr="fig10_pageb.png" id="81" name="Picture"/>
                     <pic:cNvPicPr>
                       <a:picLocks noChangeArrowheads="1" noChangeAspect="1"/>
                     </pic:cNvPicPr>
                   </pic:nvPicPr>
                   <pic:blipFill>
-                    <a:blip r:embed="rId75"/>
+                    <a:blip r:embed="rId79"/>
                     <a:stretch>
                       <a:fillRect/>
                     </a:stretch>
@@ -5638,18 +5822,18 @@
           <wp:inline>
             <wp:extent cx="5909137" cy="2876454"/>
             <wp:effectExtent b="0" l="0" r="0" t="0"/>
-            <wp:docPr descr="Figure 4.12. Share of rows with usable HTML, by source and class." title="" id="79" name="Picture"/>
+            <wp:docPr descr="Figure 4.12. Share of rows with usable HTML, by source and class." title="" id="83" name="Picture"/>
             <a:graphic>
               <a:graphicData uri="http://schemas.openxmlformats.org/drawingml/2006/picture">
                 <pic:pic>
                   <pic:nvPicPr>
-                    <pic:cNvPr descr="fig11_html_coverage.png" id="80" name="Picture"/>
+                    <pic:cNvPr descr="fig11_html_coverage.png" id="84" name="Picture"/>
                     <pic:cNvPicPr>
                       <a:picLocks noChangeArrowheads="1" noChangeAspect="1"/>
                     </pic:cNvPicPr>
                   </pic:nvPicPr>
                   <pic:blipFill>
-                    <a:blip r:embed="rId78"/>
+                    <a:blip r:embed="rId82"/>
                     <a:stretch>
                       <a:fillRect/>
                     </a:stretch>
@@ -6387,8 +6571,8 @@
         </w:tc>
       </w:tr>
     </w:tbl>
-    <w:bookmarkEnd w:id="81"/>
-    <w:bookmarkStart w:id="82" w:name="limitations-of-the-study"/>
+    <w:bookmarkEnd w:id="85"/>
+    <w:bookmarkStart w:id="86" w:name="limitations-of-the-study"/>
     <w:p>
       <w:pPr>
         <w:pStyle w:val="Heading2"/>
@@ -6401,7 +6585,7 @@
       <w:pPr>
         <w:numPr>
           <w:ilvl w:val="0"/>
-          <w:numId w:val="1013"/>
+          <w:numId w:val="1005"/>
         </w:numPr>
         <w:pStyle w:val="Compact"/>
       </w:pPr>
@@ -6423,7 +6607,7 @@
       <w:pPr>
         <w:numPr>
           <w:ilvl w:val="0"/>
-          <w:numId w:val="1013"/>
+          <w:numId w:val="1005"/>
         </w:numPr>
         <w:pStyle w:val="Compact"/>
       </w:pPr>
@@ -6445,7 +6629,7 @@
       <w:pPr>
         <w:numPr>
           <w:ilvl w:val="0"/>
-          <w:numId w:val="1013"/>
+          <w:numId w:val="1005"/>
         </w:numPr>
         <w:pStyle w:val="Compact"/>
       </w:pPr>
@@ -6467,7 +6651,7 @@
       <w:pPr>
         <w:numPr>
           <w:ilvl w:val="0"/>
-          <w:numId w:val="1013"/>
+          <w:numId w:val="1005"/>
         </w:numPr>
         <w:pStyle w:val="Compact"/>
       </w:pPr>
@@ -6501,7 +6685,7 @@
       <w:pPr>
         <w:numPr>
           <w:ilvl w:val="0"/>
-          <w:numId w:val="1013"/>
+          <w:numId w:val="1005"/>
         </w:numPr>
         <w:pStyle w:val="Compact"/>
       </w:pPr>
@@ -6523,7 +6707,7 @@
       <w:pPr>
         <w:numPr>
           <w:ilvl w:val="0"/>
-          <w:numId w:val="1013"/>
+          <w:numId w:val="1005"/>
         </w:numPr>
         <w:pStyle w:val="Compact"/>
       </w:pPr>
@@ -6545,7 +6729,7 @@
       <w:pPr>
         <w:numPr>
           <w:ilvl w:val="0"/>
-          <w:numId w:val="1013"/>
+          <w:numId w:val="1005"/>
         </w:numPr>
         <w:pStyle w:val="Compact"/>
       </w:pPr>
@@ -6590,8 +6774,8 @@
         <w:t xml:space="preserve">; seeds are fixed.</w:t>
       </w:r>
     </w:p>
-    <w:bookmarkEnd w:id="82"/>
-    <w:bookmarkStart w:id="83" w:name="what-can-and-cannot-be-claimed"/>
+    <w:bookmarkEnd w:id="86"/>
+    <w:bookmarkStart w:id="87" w:name="what-can-and-cannot-be-claimed"/>
     <w:p>
       <w:pPr>
         <w:pStyle w:val="Heading2"/>
@@ -7035,9 +7219,9 @@
         </w:tc>
       </w:tr>
     </w:tbl>
-    <w:bookmarkEnd w:id="83"/>
-    <w:bookmarkEnd w:id="84"/>
-    <w:bookmarkStart w:id="91" w:name="data-and-corpus"/>
+    <w:bookmarkEnd w:id="87"/>
+    <w:bookmarkEnd w:id="88"/>
+    <w:bookmarkStart w:id="95" w:name="data-and-corpus"/>
     <w:p>
       <w:pPr>
         <w:pStyle w:val="Heading1"/>
@@ -7184,7 +7368,7 @@
         <w:t xml:space="preserve">Corpus counts in chapter 5 come from the corpus data card as quoted in the 2026-10-13 report draft. The data card file itself is not in this checkout, so those counts are carried over and were not re-checked against it.</w:t>
       </w:r>
     </w:p>
-    <w:bookmarkStart w:id="85" w:name="why-the-corpus-is-built-this-way"/>
+    <w:bookmarkStart w:id="89" w:name="why-the-corpus-is-built-this-way"/>
     <w:p>
       <w:pPr>
         <w:pStyle w:val="Heading2"/>
@@ -7222,8 +7406,8 @@
         <w:t xml:space="preserve">: only URL, label, date and HTML are read from any dataset, never a precomputed feature column; one registrable-domain definition is used everywhere (public-suffix-only); and no model is trained until the corpus passes a depth check.</w:t>
       </w:r>
     </w:p>
-    <w:bookmarkEnd w:id="85"/>
-    <w:bookmarkStart w:id="86" w:name="sources-1"/>
+    <w:bookmarkEnd w:id="89"/>
+    <w:bookmarkStart w:id="90" w:name="sources-1"/>
     <w:p>
       <w:pPr>
         <w:pStyle w:val="Heading2"/>
@@ -8180,8 +8364,8 @@
         <w:t xml:space="preserve">, 2026-10-11). Because PhishStorm has no HTML, the page model has no held-out source at all. Third, the live feeds are still tiny in the pool (245 URLs); they matter mainly for tier C (section 6.4). Licences recorded in the data card: PhreshPhish CC BY 4.0 (anti-phishing research only), PhiUSIIL CC BY 4.0, Phishpedia research use, OpenPhish non-commercial, Phishing.Database MIT; the URL-Phish and Phish-Blitz terms are still to be confirmed.</w:t>
       </w:r>
     </w:p>
-    <w:bookmarkEnd w:id="86"/>
-    <w:bookmarkStart w:id="87" w:name="corpus-build"/>
+    <w:bookmarkEnd w:id="90"/>
+    <w:bookmarkStart w:id="91" w:name="corpus-build"/>
     <w:p>
       <w:pPr>
         <w:pStyle w:val="Heading2"/>
@@ -8634,8 +8818,8 @@
         <w:t xml:space="preserve">). Zero domain overlap and zero canonical-URL overlap between sides is a hard run-time failure, not a warning.</w:t>
       </w:r>
     </w:p>
-    <w:bookmarkEnd w:id="87"/>
-    <w:bookmarkStart w:id="88" w:name="depth-balance"/>
+    <w:bookmarkEnd w:id="91"/>
+    <w:bookmarkStart w:id="92" w:name="depth-balance"/>
     <w:p>
       <w:pPr>
         <w:pStyle w:val="Heading2"/>
@@ -8697,8 +8881,8 @@
         <w:t xml:space="preserve">). This is why chapter 8 adds a depth-matched evaluation and a representation check instead of trusting pooled numbers.</w:t>
       </w:r>
     </w:p>
-    <w:bookmarkEnd w:id="88"/>
-    <w:bookmarkStart w:id="89" w:name="benign-inner-pages"/>
+    <w:bookmarkEnd w:id="92"/>
+    <w:bookmarkStart w:id="93" w:name="benign-inner-pages"/>
     <w:p>
       <w:pPr>
         <w:pStyle w:val="Heading2"/>
@@ -8765,8 +8949,8 @@
         <w:t xml:space="preserve">, 2026-10-20). The corpus described above does not include it, and its effect on false alarms is not measured.</w:t>
       </w:r>
     </w:p>
-    <w:bookmarkEnd w:id="89"/>
-    <w:bookmarkStart w:id="90" w:name="evaluation-only-data"/>
+    <w:bookmarkEnd w:id="93"/>
+    <w:bookmarkStart w:id="94" w:name="evaluation-only-data"/>
     <w:p>
       <w:pPr>
         <w:pStyle w:val="Heading2"/>
@@ -8828,9 +9012,9 @@
         <w:t xml:space="preserve">). The natural pages were sampled from Tranco-listed sites, which makes them easier than a long-tail browsing history; this is a limitation of every false-alarm number below.</w:t>
       </w:r>
     </w:p>
-    <w:bookmarkEnd w:id="90"/>
-    <w:bookmarkEnd w:id="91"/>
-    <w:bookmarkStart w:id="97" w:name="feature-engine-and-models"/>
+    <w:bookmarkEnd w:id="94"/>
+    <w:bookmarkEnd w:id="95"/>
+    <w:bookmarkStart w:id="101" w:name="feature-engine-and-models"/>
     <w:p>
       <w:pPr>
         <w:pStyle w:val="Heading1"/>
@@ -8839,7 +9023,7 @@
         <w:t xml:space="preserve">6. Feature engine and models</w:t>
       </w:r>
     </w:p>
-    <w:bookmarkStart w:id="92" w:name="one-engine-three-tiers"/>
+    <w:bookmarkStart w:id="96" w:name="one-engine-three-tiers"/>
     <w:p>
       <w:pPr>
         <w:pStyle w:val="Heading2"/>
@@ -9338,8 +9522,8 @@
         <w:t xml:space="preserve">).</w:t>
       </w:r>
     </w:p>
-    <w:bookmarkEnd w:id="92"/>
-    <w:bookmarkStart w:id="93" w:name="Xd11bde47366ac7966d4a9d7083ebb37ade0493f"/>
+    <w:bookmarkEnd w:id="96"/>
+    <w:bookmarkStart w:id="97" w:name="Xd11bde47366ac7966d4a9d7083ebb37ade0493f"/>
     <w:p>
       <w:pPr>
         <w:pStyle w:val="Heading2"/>
@@ -9418,8 +9602,8 @@
         <w:t xml:space="preserve">).</w:t>
       </w:r>
     </w:p>
-    <w:bookmarkEnd w:id="93"/>
-    <w:bookmarkStart w:id="94" w:name="tier-b-the-page-model-and-the-blend"/>
+    <w:bookmarkEnd w:id="97"/>
+    <w:bookmarkStart w:id="98" w:name="tier-b-the-page-model-and-the-blend"/>
     <w:p>
       <w:pPr>
         <w:pStyle w:val="Heading2"/>
@@ -9549,8 +9733,8 @@
         <w:t xml:space="preserve">).</w:t>
       </w:r>
     </w:p>
-    <w:bookmarkEnd w:id="94"/>
-    <w:bookmarkStart w:id="95" w:name="tier-c-domain-dns-and-tls"/>
+    <w:bookmarkEnd w:id="98"/>
+    <w:bookmarkStart w:id="99" w:name="tier-c-domain-dns-and-tls"/>
     <w:p>
       <w:pPr>
         <w:pStyle w:val="Heading2"/>
@@ -9567,8 +9751,8 @@
         <w:t xml:space="preserve">Tier C features (registration age and expiry from RDAP, DNS records, certificate age, validity and issuer) can only be computed honestly when captured as soon as a URL is first seen, so the collector records them for live-feed hosts, and for legitimate Tranco hosts, twice a day. They are never computed today for old dataset URLs. Tier C is therefore trained on live data only, and its sample is small (section 8.9). A separate set of hand-set backend rules (section 7.5) uses the same facts at run time; it is not the tier C model.</w:t>
       </w:r>
     </w:p>
-    <w:bookmarkEnd w:id="95"/>
-    <w:bookmarkStart w:id="96" w:name="calibration-and-thresholds"/>
+    <w:bookmarkEnd w:id="99"/>
+    <w:bookmarkStart w:id="100" w:name="calibration-and-thresholds"/>
     <w:p>
       <w:pPr>
         <w:pStyle w:val="Heading2"/>
@@ -9630,9 +9814,9 @@
         <w:t xml:space="preserve">). Chapter 8 shows that the thresholds themselves do not transfer well to a new source.</w:t>
       </w:r>
     </w:p>
-    <w:bookmarkEnd w:id="96"/>
-    <w:bookmarkEnd w:id="97"/>
-    <w:bookmarkStart w:id="108" w:name="system-extension-and-backend"/>
+    <w:bookmarkEnd w:id="100"/>
+    <w:bookmarkEnd w:id="101"/>
+    <w:bookmarkStart w:id="113" w:name="system-extension-and-backend"/>
     <w:p>
       <w:pPr>
         <w:pStyle w:val="Heading1"/>
@@ -9641,7 +9825,7 @@
         <w:t xml:space="preserve">7. System: extension and backend</w:t>
       </w:r>
     </w:p>
-    <w:bookmarkStart w:id="101" w:name="runtime-layers"/>
+    <w:bookmarkStart w:id="105" w:name="runtime-layers"/>
     <w:p>
       <w:pPr>
         <w:pStyle w:val="Heading2"/>
@@ -9709,18 +9893,18 @@
           <wp:inline>
             <wp:extent cx="4810938" cy="4567405"/>
             <wp:effectExtent b="0" l="0" r="0" t="0"/>
-            <wp:docPr descr="Figure 7.1. Runtime layers of PhishDrift and where each runs. No data; drawn by scripts/pbl_figures.py." title="" id="99" name="Picture"/>
+            <wp:docPr descr="Figure 7.1. Runtime layers of PhishDrift and where each runs. No data; drawn by scripts/pbl_figures.py." title="" id="103" name="Picture"/>
             <a:graphic>
               <a:graphicData uri="http://schemas.openxmlformats.org/drawingml/2006/picture">
                 <pic:pic>
                   <pic:nvPicPr>
-                    <pic:cNvPr descr="figures/fig06_layers.png" id="100" name="Picture"/>
+                    <pic:cNvPr descr="figures/fig06_layers.png" id="104" name="Picture"/>
                     <pic:cNvPicPr>
                       <a:picLocks noChangeArrowheads="1" noChangeAspect="1"/>
                     </pic:cNvPicPr>
                   </pic:nvPicPr>
                   <pic:blipFill>
-                    <a:blip r:embed="rId98"/>
+                    <a:blip r:embed="rId102"/>
                     <a:stretch>
                       <a:fillRect/>
                     </a:stretch>
@@ -9759,7 +9943,7 @@
       <w:pPr>
         <w:numPr>
           <w:ilvl w:val="0"/>
-          <w:numId w:val="1014"/>
+          <w:numId w:val="1006"/>
         </w:numPr>
         <w:pStyle w:val="Compact"/>
       </w:pPr>
@@ -9781,7 +9965,7 @@
       <w:pPr>
         <w:numPr>
           <w:ilvl w:val="0"/>
-          <w:numId w:val="1014"/>
+          <w:numId w:val="1006"/>
         </w:numPr>
         <w:pStyle w:val="Compact"/>
       </w:pPr>
@@ -9803,7 +9987,7 @@
       <w:pPr>
         <w:numPr>
           <w:ilvl w:val="0"/>
-          <w:numId w:val="1014"/>
+          <w:numId w:val="1006"/>
         </w:numPr>
         <w:pStyle w:val="Compact"/>
       </w:pPr>
@@ -9825,7 +10009,7 @@
       <w:pPr>
         <w:numPr>
           <w:ilvl w:val="0"/>
-          <w:numId w:val="1014"/>
+          <w:numId w:val="1006"/>
         </w:numPr>
         <w:pStyle w:val="Compact"/>
       </w:pPr>
@@ -9847,7 +10031,7 @@
       <w:pPr>
         <w:numPr>
           <w:ilvl w:val="0"/>
-          <w:numId w:val="1014"/>
+          <w:numId w:val="1006"/>
         </w:numPr>
         <w:pStyle w:val="Compact"/>
       </w:pPr>
@@ -9906,8 +10090,8 @@
         <w:t xml:space="preserve">), each with plain-English reasons from TreeSHAP and rule hits. The optional language-model second opinion (layer 6 in the specification) was not built; it was first on the cut list.</w:t>
       </w:r>
     </w:p>
-    <w:bookmarkEnd w:id="101"/>
-    <w:bookmarkStart w:id="102" w:name="how-a-verdict-is-decided"/>
+    <w:bookmarkEnd w:id="105"/>
+    <w:bookmarkStart w:id="106" w:name="how-a-verdict-is-decided"/>
     <w:p>
       <w:pPr>
         <w:pStyle w:val="Heading2"/>
@@ -9943,7 +10127,7 @@
       <w:pPr>
         <w:numPr>
           <w:ilvl w:val="0"/>
-          <w:numId w:val="1015"/>
+          <w:numId w:val="1007"/>
         </w:numPr>
         <w:pStyle w:val="Compact"/>
       </w:pPr>
@@ -9973,7 +10157,7 @@
       <w:pPr>
         <w:numPr>
           <w:ilvl w:val="0"/>
-          <w:numId w:val="1015"/>
+          <w:numId w:val="1007"/>
         </w:numPr>
         <w:pStyle w:val="Compact"/>
       </w:pPr>
@@ -9985,7 +10169,7 @@
       <w:pPr>
         <w:numPr>
           <w:ilvl w:val="0"/>
-          <w:numId w:val="1015"/>
+          <w:numId w:val="1007"/>
         </w:numPr>
         <w:pStyle w:val="Compact"/>
       </w:pPr>
@@ -10015,7 +10199,7 @@
       <w:pPr>
         <w:numPr>
           <w:ilvl w:val="0"/>
-          <w:numId w:val="1015"/>
+          <w:numId w:val="1007"/>
         </w:numPr>
         <w:pStyle w:val="Compact"/>
       </w:pPr>
@@ -10039,7 +10223,7 @@
       <w:pPr>
         <w:numPr>
           <w:ilvl w:val="0"/>
-          <w:numId w:val="1015"/>
+          <w:numId w:val="1007"/>
         </w:numPr>
         <w:pStyle w:val="Compact"/>
       </w:pPr>
@@ -10069,7 +10253,7 @@
       <w:pPr>
         <w:numPr>
           <w:ilvl w:val="0"/>
-          <w:numId w:val="1015"/>
+          <w:numId w:val="1007"/>
         </w:numPr>
         <w:pStyle w:val="Compact"/>
       </w:pPr>
@@ -10093,7 +10277,7 @@
       <w:pPr>
         <w:numPr>
           <w:ilvl w:val="0"/>
-          <w:numId w:val="1015"/>
+          <w:numId w:val="1007"/>
         </w:numPr>
         <w:pStyle w:val="Compact"/>
       </w:pPr>
@@ -10120,7 +10304,7 @@
       <w:pPr>
         <w:numPr>
           <w:ilvl w:val="0"/>
-          <w:numId w:val="1015"/>
+          <w:numId w:val="1007"/>
         </w:numPr>
         <w:pStyle w:val="Compact"/>
       </w:pPr>
@@ -10128,8 +10312,8 @@
         <w:t xml:space="preserve">Pages with no web address of their own (data URLs, sandboxed frames) are not scored and warn only if they ask for credentials.</w:t>
       </w:r>
     </w:p>
-    <w:bookmarkEnd w:id="102"/>
-    <w:bookmarkStart w:id="103" w:name="lists-zones-and-sync"/>
+    <w:bookmarkEnd w:id="106"/>
+    <w:bookmarkStart w:id="107" w:name="lists-zones-and-sync"/>
     <w:p>
       <w:pPr>
         <w:pStyle w:val="Heading2"/>
@@ -10351,8 +10535,8 @@
         <w:t xml:space="preserve">, 2026-10-19; this is a measurement on constructed variants). Signatures are off until a key is generated on the backend machine, and the bundled allowlist held 43,595 domains at the 2026-10-19 rebuild (137 tenant hosts were added later) because the cloud rebuild could not download Tranco; the PC rebuild restores 5,740 more (same entry).</w:t>
       </w:r>
     </w:p>
-    <w:bookmarkEnd w:id="103"/>
-    <w:bookmarkStart w:id="104" w:name="brand-and-look-alike-rules"/>
+    <w:bookmarkEnd w:id="107"/>
+    <w:bookmarkStart w:id="108" w:name="brand-and-look-alike-rules"/>
     <w:p>
       <w:pPr>
         <w:pStyle w:val="Heading2"/>
@@ -10425,8 +10609,8 @@
         <w:t xml:space="preserve">). The rules were tuned after the natural set was seen, so these false-alarm counts are not independent. TLD swaps such as a bank’s name on another suffix are not caught, because brands own many suffixes.</w:t>
       </w:r>
     </w:p>
-    <w:bookmarkEnd w:id="104"/>
-    <w:bookmarkStart w:id="105" w:name="backend-and-privacy"/>
+    <w:bookmarkEnd w:id="108"/>
+    <w:bookmarkStart w:id="109" w:name="backend-and-privacy"/>
     <w:p>
       <w:pPr>
         <w:pStyle w:val="Heading2"/>
@@ -10711,8 +10895,8 @@
         <w:t xml:space="preserve">. This is a small sample, and the severities are set from it.</w:t>
       </w:r>
     </w:p>
-    <w:bookmarkEnd w:id="105"/>
-    <w:bookmarkStart w:id="106" w:name="latency"/>
+    <w:bookmarkEnd w:id="109"/>
+    <w:bookmarkStart w:id="110" w:name="latency"/>
     <w:p>
       <w:pPr>
         <w:pStyle w:val="Heading2"/>
@@ -10921,8 +11105,8 @@
         <w:t xml:space="preserve">Start-up, once per browser session, takes 166 ms to parse the 11.7 MB model bundle and 73 ms to build the model. The extension scores every navigation without reasons and asks for reasons only when a warning is shown. Page-model latency and backend response times are not measured.</w:t>
       </w:r>
     </w:p>
-    <w:bookmarkEnd w:id="106"/>
-    <w:bookmarkStart w:id="107" w:name="url-check-page-and-user-interface"/>
+    <w:bookmarkEnd w:id="110"/>
+    <w:bookmarkStart w:id="111" w:name="url-check-page-and-user-interface"/>
     <w:p>
       <w:pPr>
         <w:pStyle w:val="Heading2"/>
@@ -11016,9 +11200,195 @@
         <w:t xml:space="preserve">(which sends only the domain). The toolbar popup shows the current verdict and its reasons. Screenshots of each state should be taken on the author’s own browser for the final report.</w:t>
       </w:r>
     </w:p>
-    <w:bookmarkEnd w:id="107"/>
-    <w:bookmarkEnd w:id="108"/>
-    <w:bookmarkStart w:id="142" w:name="evaluation-of-the-detector"/>
+    <w:bookmarkEnd w:id="111"/>
+    <w:bookmarkStart w:id="112" w:name="screenshots"/>
+    <w:p>
+      <w:pPr>
+        <w:pStyle w:val="Heading2"/>
+      </w:pPr>
+      <w:r>
+        <w:t xml:space="preserve">7.8 Screenshots</w:t>
+      </w:r>
+    </w:p>
+    <w:p>
+      <w:pPr>
+        <w:pStyle w:val="FirstParagraph"/>
+      </w:pPr>
+      <w:r>
+        <w:t xml:space="preserve">The environment that built the system cannot browse, so these slots are for the author’s own screenshots. Each slot says what the picture should show.</w:t>
+      </w:r>
+    </w:p>
+    <w:p>
+      <w:pPr>
+        <w:pStyle w:val="BodyText"/>
+      </w:pPr>
+      <w:r>
+        <w:rPr>
+          <w:bCs/>
+          <w:b/>
+        </w:rPr>
+        <w:t xml:space="preserve">Screenshot 1. A page judged safe.</w:t>
+      </w:r>
+      <w:r>
+        <w:t xml:space="preserve"> </w:t>
+      </w:r>
+      <w:r>
+        <w:t xml:space="preserve">Paste screenshot here</w:t>
+      </w:r>
+      <w:r>
+        <w:br/>
+      </w:r>
+      <w:r>
+        <w:t xml:space="preserve">Should show: a normal site open in Chrome with the PhishDrift icon showing no warning.</w:t>
+      </w:r>
+    </w:p>
+    <w:p>
+      <w:pPr>
+        <w:pStyle w:val="BodyText"/>
+      </w:pPr>
+      <w:r>
+        <w:rPr>
+          <w:bCs/>
+          <w:b/>
+        </w:rPr>
+        <w:t xml:space="preserve">Screenshot 2. Suspicious banner.</w:t>
+      </w:r>
+      <w:r>
+        <w:t xml:space="preserve"> </w:t>
+      </w:r>
+      <w:r>
+        <w:t xml:space="preserve">Paste screenshot here</w:t>
+      </w:r>
+      <w:r>
+        <w:br/>
+      </w:r>
+      <w:r>
+        <w:t xml:space="preserve">Should show: a page with the yellow banner at the top and its one-line reason.</w:t>
+      </w:r>
+    </w:p>
+    <w:p>
+      <w:pPr>
+        <w:pStyle w:val="BodyText"/>
+      </w:pPr>
+      <w:r>
+        <w:rPr>
+          <w:bCs/>
+          <w:b/>
+        </w:rPr>
+        <w:t xml:space="preserve">Screenshot 3. Dangerous warning page.</w:t>
+      </w:r>
+      <w:r>
+        <w:t xml:space="preserve"> </w:t>
+      </w:r>
+      <w:r>
+        <w:t xml:space="preserve">Paste screenshot here</w:t>
+      </w:r>
+      <w:r>
+        <w:br/>
+      </w:r>
+      <w:r>
+        <w:t xml:space="preserve">Should show: the full warning page with the plain-English reasons and the buttons.</w:t>
+      </w:r>
+    </w:p>
+    <w:p>
+      <w:pPr>
+        <w:pStyle w:val="BodyText"/>
+      </w:pPr>
+      <w:r>
+        <w:rPr>
+          <w:bCs/>
+          <w:b/>
+        </w:rPr>
+        <w:t xml:space="preserve">Screenshot 4. Popup with reasons.</w:t>
+      </w:r>
+      <w:r>
+        <w:t xml:space="preserve"> </w:t>
+      </w:r>
+      <w:r>
+        <w:t xml:space="preserve">Paste screenshot here</w:t>
+      </w:r>
+      <w:r>
+        <w:br/>
+      </w:r>
+      <w:r>
+        <w:t xml:space="preserve">Should show: the toolbar popup open on a flagged page, listing the reasons.</w:t>
+      </w:r>
+    </w:p>
+    <w:p>
+      <w:pPr>
+        <w:pStyle w:val="BodyText"/>
+      </w:pPr>
+      <w:r>
+        <w:rPr>
+          <w:bCs/>
+          <w:b/>
+        </w:rPr>
+        <w:t xml:space="preserve">Screenshot 5. Report a false alarm.</w:t>
+      </w:r>
+      <w:r>
+        <w:t xml:space="preserve"> </w:t>
+      </w:r>
+      <w:r>
+        <w:t xml:space="preserve">Paste screenshot here</w:t>
+      </w:r>
+      <w:r>
+        <w:br/>
+      </w:r>
+      <w:r>
+        <w:t xml:space="preserve">Should show: the button or form used to report a wrong warning (domain only is sent).</w:t>
+      </w:r>
+    </w:p>
+    <w:p>
+      <w:pPr>
+        <w:pStyle w:val="BodyText"/>
+      </w:pPr>
+      <w:r>
+        <w:rPr>
+          <w:bCs/>
+          <w:b/>
+        </w:rPr>
+        <w:t xml:space="preserve">Screenshot 6. URL check page, layer view.</w:t>
+      </w:r>
+      <w:r>
+        <w:t xml:space="preserve"> </w:t>
+      </w:r>
+      <w:r>
+        <w:t xml:space="preserve">Paste screenshot here</w:t>
+      </w:r>
+      <w:r>
+        <w:br/>
+      </w:r>
+      <w:r>
+        <w:t xml:space="preserve">Should show: one layer screen of the URL check page, for example the address-model gauge.</w:t>
+      </w:r>
+    </w:p>
+    <w:p>
+      <w:pPr>
+        <w:pStyle w:val="BodyText"/>
+      </w:pPr>
+      <w:r>
+        <w:rPr>
+          <w:bCs/>
+          <w:b/>
+        </w:rPr>
+        <w:t xml:space="preserve">Screenshot 7. URL check page, verdict.</w:t>
+      </w:r>
+      <w:r>
+        <w:t xml:space="preserve"> </w:t>
+      </w:r>
+      <w:r>
+        <w:t xml:space="preserve">Paste screenshot here</w:t>
+      </w:r>
+      <w:r>
+        <w:br/>
+      </w:r>
+      <w:r>
+        <w:t xml:space="preserve">Should show: the final verdict screen with the shield, reasons and score meter.</w:t>
+      </w:r>
+    </w:p>
+    <w:bookmarkEnd w:id="112"/>
+    <w:bookmarkEnd w:id="113"/>
+    <w:bookmarkStart w:id="148" w:name="evaluation-of-the-detector"/>
     <w:p>
       <w:pPr>
         <w:pStyle w:val="Heading1"/>
@@ -11027,7 +11397,7 @@
         <w:t xml:space="preserve">8. Evaluation of the detector</w:t>
       </w:r>
     </w:p>
-    <w:bookmarkStart w:id="109" w:name="protocol"/>
+    <w:bookmarkStart w:id="114" w:name="protocol"/>
     <w:p>
       <w:pPr>
         <w:pStyle w:val="Heading2"/>
@@ -11053,8 +11423,8 @@
         <w:t xml:space="preserve">), so a 0.1% point allows about 61, 23 and 56 false positives respectively, and in per-bucket views fewer than ten (marked with an asterisk where it applies). No held-out-source result above 99% appears anywhere below, so the leakage tripwire did not fire there; the one place above 0.99 on the test side (tier B on HTML rows) was investigated separately (section 8.4).</w:t>
       </w:r>
     </w:p>
-    <w:bookmarkEnd w:id="109"/>
-    <w:bookmarkStart w:id="113" w:name="Xcc216b2b2525ecbb63550bba86da6a173801b8e"/>
+    <w:bookmarkEnd w:id="114"/>
+    <w:bookmarkStart w:id="118" w:name="Xcc216b2b2525ecbb63550bba86da6a173801b8e"/>
     <w:p>
       <w:pPr>
         <w:pStyle w:val="Heading2"/>
@@ -12392,18 +12762,18 @@
           <wp:inline>
             <wp:extent cx="5922922" cy="3000518"/>
             <wp:effectExtent b="0" l="0" r="0" t="0"/>
-            <wp:docPr descr="Figure 8.1. Recall at FPR 1% and 0.1% by model and evaluation set (median of 10 splits, whiskers min to max)." title="" id="111" name="Picture"/>
+            <wp:docPr descr="Figure 8.1. Recall at FPR 1% and 0.1% by model and evaluation set (median of 10 splits, whiskers min to max)." title="" id="116" name="Picture"/>
             <a:graphic>
               <a:graphicData uri="http://schemas.openxmlformats.org/drawingml/2006/picture">
                 <pic:pic>
                   <pic:nvPicPr>
-                    <pic:cNvPr descr="figures/fig01_recall_by_model.png" id="112" name="Picture"/>
+                    <pic:cNvPr descr="figures/fig01_recall_by_model.png" id="117" name="Picture"/>
                     <pic:cNvPicPr>
                       <a:picLocks noChangeArrowheads="1" noChangeAspect="1"/>
                     </pic:cNvPicPr>
                   </pic:nvPicPr>
                   <pic:blipFill>
-                    <a:blip r:embed="rId110"/>
+                    <a:blip r:embed="rId115"/>
                     <a:stretch>
                       <a:fillRect/>
                     </a:stretch>
@@ -12535,8 +12905,8 @@
         <w:t xml:space="preserve">). The address model lost about three points at 1% and nine at 0.1%.</w:t>
       </w:r>
     </w:p>
-    <w:bookmarkEnd w:id="113"/>
-    <w:bookmarkStart w:id="117" w:name="what-the-page-adds"/>
+    <w:bookmarkEnd w:id="118"/>
+    <w:bookmarkStart w:id="122" w:name="what-the-page-adds"/>
     <w:p>
       <w:pPr>
         <w:pStyle w:val="Heading2"/>
@@ -12926,18 +13296,18 @@
           <wp:inline>
             <wp:extent cx="5922922" cy="2614540"/>
             <wp:effectExtent b="0" l="0" r="0" t="0"/>
-            <wp:docPr descr="Figure 8.2. Address model against the blend, on URLs with and without usable HTML (reports/blend2.md)." title="" id="115" name="Picture"/>
+            <wp:docPr descr="Figure 8.2. Address model against the blend, on URLs with and without usable HTML (reports/blend2.md)." title="" id="120" name="Picture"/>
             <a:graphic>
               <a:graphicData uri="http://schemas.openxmlformats.org/drawingml/2006/picture">
                 <pic:pic>
                   <pic:nvPicPr>
-                    <pic:cNvPr descr="figures/fig02_html_gain.png" id="116" name="Picture"/>
+                    <pic:cNvPr descr="figures/fig02_html_gain.png" id="121" name="Picture"/>
                     <pic:cNvPicPr>
                       <a:picLocks noChangeArrowheads="1" noChangeAspect="1"/>
                     </pic:cNvPicPr>
                   </pic:nvPicPr>
                   <pic:blipFill>
-                    <a:blip r:embed="rId114"/>
+                    <a:blip r:embed="rId119"/>
                     <a:stretch>
                       <a:fillRect/>
                     </a:stretch>
@@ -13013,8 +13383,8 @@
         <w:t xml:space="preserve">).</w:t>
       </w:r>
     </w:p>
-    <w:bookmarkEnd w:id="117"/>
-    <w:bookmarkStart w:id="118" w:name="checks-on-the-page-model"/>
+    <w:bookmarkEnd w:id="122"/>
+    <w:bookmarkStart w:id="123" w:name="checks-on-the-page-model"/>
     <w:p>
       <w:pPr>
         <w:pStyle w:val="Heading2"/>
@@ -13081,8 +13451,8 @@
         <w:t xml:space="preserve">), so the HTML subset is not a random sample. Re-weighting each HTML row by the inverse of its estimated probability of having usable HTML (clipped at 20; effective sample sizes 4,788 phishing and 17,855 legitimate rows) lowers the blend’s warned recall on HTML rows from 93.0 to 91.9 and its dangerous recall from 85.7 to 82.5. On the time slice the corrected and uncorrected figures differ by less than one point (80.4 to 80.7 warned). The correction assumes HTML loss depends only on the URL features and source; if phishing pages whose HTML survives are easier than those whose HTML does not, even the corrected figure is optimistic.</w:t>
       </w:r>
     </w:p>
-    <w:bookmarkEnd w:id="118"/>
-    <w:bookmarkStart w:id="119" w:name="the-shipped-verdict-rules"/>
+    <w:bookmarkEnd w:id="123"/>
+    <w:bookmarkStart w:id="124" w:name="the-shipped-verdict-rules"/>
     <w:p>
       <w:pPr>
         <w:pStyle w:val="Heading2"/>
@@ -14056,8 +14426,8 @@
         <w:t xml:space="preserve">).</w:t>
       </w:r>
     </w:p>
-    <w:bookmarkEnd w:id="119"/>
-    <w:bookmarkStart w:id="123" w:name="Xe426f1dec27245d1838fe304132d4e0595d666a"/>
+    <w:bookmarkEnd w:id="124"/>
+    <w:bookmarkStart w:id="128" w:name="Xe426f1dec27245d1838fe304132d4e0595d666a"/>
     <w:p>
       <w:pPr>
         <w:pStyle w:val="Heading2"/>
@@ -14665,18 +15035,18 @@
           <wp:inline>
             <wp:extent cx="5844808" cy="2522641"/>
             <wp:effectExtent b="0" l="0" r="0" t="0"/>
-            <wp:docPr descr="Figure 8.3. False-positive rate on the left-out source at the threshold chosen for 1% on the other sources." title="" id="121" name="Picture"/>
+            <wp:docPr descr="Figure 8.3. False-positive rate on the left-out source at the threshold chosen for 1% on the other sources." title="" id="126" name="Picture"/>
             <a:graphic>
               <a:graphicData uri="http://schemas.openxmlformats.org/drawingml/2006/picture">
                 <pic:pic>
                   <pic:nvPicPr>
-                    <pic:cNvPr descr="figures/fig03_loso_threshold_transfer.png" id="122" name="Picture"/>
+                    <pic:cNvPr descr="figures/fig03_loso_threshold_transfer.png" id="127" name="Picture"/>
                     <pic:cNvPicPr>
                       <a:picLocks noChangeArrowheads="1" noChangeAspect="1"/>
                     </pic:cNvPicPr>
                   </pic:nvPicPr>
                   <pic:blipFill>
-                    <a:blip r:embed="rId120"/>
+                    <a:blip r:embed="rId125"/>
                     <a:stretch>
                       <a:fillRect/>
                     </a:stretch>
@@ -14734,8 +15104,8 @@
         <w:t xml:space="preserve">baseline (43.4% recall at 1% FPR) beat both trained models (29.5% and 8.2%). The models partly learn source style, and thresholds tuned on some sources do not transfer to another. The live-feed row rests on 245 URLs and is shown for completeness only.</w:t>
       </w:r>
     </w:p>
-    <w:bookmarkEnd w:id="123"/>
-    <w:bookmarkStart w:id="130" w:name="depth-and-representation-checks"/>
+    <w:bookmarkEnd w:id="128"/>
+    <w:bookmarkStart w:id="135" w:name="depth-and-representation-checks"/>
     <w:p>
       <w:pPr>
         <w:pStyle w:val="Heading2"/>
@@ -15160,18 +15530,18 @@
           <wp:inline>
             <wp:extent cx="5922922" cy="2637515"/>
             <wp:effectExtent b="0" l="0" r="0" t="0"/>
-            <wp:docPr descr="Figure 8.4. Raw against normalised URLs: recall at FPR 1% and 0.1%." title="" id="125" name="Picture"/>
+            <wp:docPr descr="Figure 8.4. Raw against normalised URLs: recall at FPR 1% and 0.1%." title="" id="130" name="Picture"/>
             <a:graphic>
               <a:graphicData uri="http://schemas.openxmlformats.org/drawingml/2006/picture">
                 <pic:pic>
                   <pic:nvPicPr>
-                    <pic:cNvPr descr="figures/fig07_representation.png" id="126" name="Picture"/>
+                    <pic:cNvPr descr="figures/fig07_representation.png" id="131" name="Picture"/>
                     <pic:cNvPicPr>
                       <a:picLocks noChangeArrowheads="1" noChangeAspect="1"/>
                     </pic:cNvPicPr>
                   </pic:nvPicPr>
                   <pic:blipFill>
-                    <a:blip r:embed="rId124"/>
+                    <a:blip r:embed="rId129"/>
                     <a:stretch>
                       <a:fillRect/>
                     </a:stretch>
@@ -15232,18 +15602,18 @@
           <wp:inline>
             <wp:extent cx="5922922" cy="2522641"/>
             <wp:effectExtent b="0" l="0" r="0" t="0"/>
-            <wp:docPr descr="Figure 8.5. Shipped address model (hybrid2), ROC-AUC by URL depth bucket on three sets." title="" id="128" name="Picture"/>
+            <wp:docPr descr="Figure 8.5. Shipped address model (hybrid2), ROC-AUC by URL depth bucket on three sets." title="" id="133" name="Picture"/>
             <a:graphic>
               <a:graphicData uri="http://schemas.openxmlformats.org/drawingml/2006/picture">
                 <pic:pic>
                   <pic:nvPicPr>
-                    <pic:cNvPr descr="figures/fig08_depth_buckets.png" id="129" name="Picture"/>
+                    <pic:cNvPr descr="figures/fig08_depth_buckets.png" id="134" name="Picture"/>
                     <pic:cNvPicPr>
                       <a:picLocks noChangeArrowheads="1" noChangeAspect="1"/>
                     </pic:cNvPicPr>
                   </pic:nvPicPr>
                   <pic:blipFill>
-                    <a:blip r:embed="rId127"/>
+                    <a:blip r:embed="rId132"/>
                     <a:stretch>
                       <a:fillRect/>
                     </a:stretch>
@@ -15298,8 +15668,8 @@
         <w:t xml:space="preserve">) shows that the result does not rest on depth alone. Depth 0 (bare domains) is the weakest bucket on every set: 0.9209 on test, 0.9270 on the time slice and 0.7985 on PhishStorm, where it holds only 91 legitimate URLs and the cal 1% threshold flags 30.2% of them. On PhishStorm depths 1 to 3 give 0.954 to 0.960, about the overall 0.9587, so the held-out result is not an artefact of PhishStorm’s depth imbalance.</w:t>
       </w:r>
     </w:p>
-    <w:bookmarkEnd w:id="130"/>
-    <w:bookmarkStart w:id="134" w:name="Xcd7faad2695b1e803ca25dd0fcfbd11dee0a145"/>
+    <w:bookmarkEnd w:id="135"/>
+    <w:bookmarkStart w:id="140" w:name="Xcd7faad2695b1e803ca25dd0fcfbd11dee0a145"/>
     <w:p>
       <w:pPr>
         <w:pStyle w:val="Heading2"/>
@@ -15821,18 +16191,18 @@
           <wp:inline>
             <wp:extent cx="6024012" cy="2798339"/>
             <wp:effectExtent b="0" l="0" r="0" t="0"/>
-            <wp:docPr descr="Figure 8.6. Natural-page false alarms by model and by layer set (reports/ood_fpr.md, reports/blend2_rules.md, reports/shipped_verdicts.md, reports/page_fixes_fpr.md)." title="" id="132" name="Picture"/>
+            <wp:docPr descr="Figure 8.6. Natural-page false alarms by model and by layer set (reports/ood_fpr.md, reports/blend2_rules.md, reports/shipped_verdicts.md, reports/page_fixes_fpr.md)." title="" id="137" name="Picture"/>
             <a:graphic>
               <a:graphicData uri="http://schemas.openxmlformats.org/drawingml/2006/picture">
                 <pic:pic>
                   <pic:nvPicPr>
-                    <pic:cNvPr descr="figures/fig04_false_alarms_natural_pages.png" id="133" name="Picture"/>
+                    <pic:cNvPr descr="figures/fig04_false_alarms_natural_pages.png" id="138" name="Picture"/>
                     <pic:cNvPicPr>
                       <a:picLocks noChangeArrowheads="1" noChangeAspect="1"/>
                     </pic:cNvPicPr>
                   </pic:nvPicPr>
                   <pic:blipFill>
-                    <a:blip r:embed="rId131"/>
+                    <a:blip r:embed="rId136"/>
                     <a:stretch>
                       <a:fillRect/>
                     </a:stretch>
@@ -15973,8 +16343,420 @@
         <w:t xml:space="preserve">). All of these are measured on stored HTML, not on a live page, and the natural set is Tranco-seeded.</w:t>
       </w:r>
     </w:p>
-    <w:bookmarkEnd w:id="134"/>
-    <w:bookmarkStart w:id="135" w:name="negative-controls-1"/>
+    <w:bookmarkStart w:id="139" w:name="X52a89796c9262ce33fe1ffd1a665247df49ea0d"/>
+    <w:p>
+      <w:pPr>
+        <w:pStyle w:val="Heading3"/>
+      </w:pPr>
+      <w:r>
+        <w:t xml:space="preserve">8.8.1 After retraining with deep legitimate pages of popular sites</w:t>
+      </w:r>
+    </w:p>
+    <w:p>
+      <w:pPr>
+        <w:pStyle w:val="FirstParagraph"/>
+      </w:pPr>
+      <w:r>
+        <w:t xml:space="preserve">The address model’s false alarms were attributed to benign training URLs that were mostly bare homepages (an explanation from the project log, not a separate test). A crawl of inner pages of popular sites (14,026 pages, robots.txt respected; the 2,555 natural pages were excluded from it) was added to the pool, the brand list was extended from 772 to 899 names, and the shipped split-0 model was retrained and exported on the project PC on 2026-10-21 (</w:t>
+      </w:r>
+      <w:r>
+        <w:rPr>
+          <w:rStyle w:val="VerbatimChar"/>
+        </w:rPr>
+        <w:t xml:space="preserve">docs/PROGRESS.md</w:t>
+      </w:r>
+      <w:r>
+        <w:t xml:space="preserve">, entry</w:t>
+      </w:r>
+      <w:r>
+        <w:t xml:space="preserve"> </w:t>
+      </w:r>
+      <w:r>
+        <w:t xml:space="preserve">“</w:t>
+      </w:r>
+      <w:r>
+        <w:t xml:space="preserve">Retrain on the pool with the popular-sites crawl</w:t>
+      </w:r>
+      <w:r>
+        <w:t xml:space="preserve">”</w:t>
+      </w:r>
+      <w:r>
+        <w:t xml:space="preserve">).</w:t>
+      </w:r>
+    </w:p>
+    <w:tbl>
+      <w:tblPr>
+        <w:tblStyle w:val="Table"/>
+        <w:tblW w:type="pct" w:w="5000"/>
+        <w:tblLook w:firstRow="1" w:lastRow="0" w:firstColumn="0" w:lastColumn="0" w:noHBand="0" w:noVBand="0" w:val="0020"/>
+        <w:jc w:val="start"/>
+      </w:tblPr>
+      <w:tblGrid>
+        <w:gridCol w:w="2640"/>
+        <w:gridCol w:w="2640"/>
+        <w:gridCol w:w="2640"/>
+      </w:tblGrid>
+      <w:tr>
+        <w:trPr>
+          <w:tblHeader w:val="true"/>
+        </w:trPr>
+        <w:tc>
+          <w:tcPr/>
+          <w:p>
+            <w:pPr>
+              <w:pStyle w:val="Compact"/>
+              <w:jc w:val="left"/>
+            </w:pPr>
+            <w:r>
+              <w:t xml:space="preserve">measure</w:t>
+            </w:r>
+          </w:p>
+        </w:tc>
+        <w:tc>
+          <w:tcPr/>
+          <w:p>
+            <w:pPr>
+              <w:pStyle w:val="Compact"/>
+              <w:jc w:val="left"/>
+            </w:pPr>
+            <w:r>
+              <w:t xml:space="preserve">before retrain</w:t>
+            </w:r>
+          </w:p>
+        </w:tc>
+        <w:tc>
+          <w:tcPr/>
+          <w:p>
+            <w:pPr>
+              <w:pStyle w:val="Compact"/>
+              <w:jc w:val="left"/>
+            </w:pPr>
+            <w:r>
+              <w:t xml:space="preserve">after retrain</w:t>
+            </w:r>
+          </w:p>
+        </w:tc>
+      </w:tr>
+      <w:tr>
+        <w:tc>
+          <w:tcPr/>
+          <w:p>
+            <w:pPr>
+              <w:pStyle w:val="Compact"/>
+              <w:jc w:val="left"/>
+            </w:pPr>
+            <w:r>
+              <w:t xml:space="preserve">shipped extension, natural pages flagged (of 2,555)</w:t>
+            </w:r>
+          </w:p>
+        </w:tc>
+        <w:tc>
+          <w:tcPr/>
+          <w:p>
+            <w:pPr>
+              <w:pStyle w:val="Compact"/>
+              <w:jc w:val="left"/>
+            </w:pPr>
+            <w:r>
+              <w:t xml:space="preserve">72 (2.82%)</w:t>
+            </w:r>
+          </w:p>
+        </w:tc>
+        <w:tc>
+          <w:tcPr/>
+          <w:p>
+            <w:pPr>
+              <w:pStyle w:val="Compact"/>
+              <w:jc w:val="left"/>
+            </w:pPr>
+            <w:r>
+              <w:t xml:space="preserve">8 (0.3%, none dangerous)</w:t>
+            </w:r>
+          </w:p>
+        </w:tc>
+      </w:tr>
+      <w:tr>
+        <w:tc>
+          <w:tcPr/>
+          <w:p>
+            <w:pPr>
+              <w:pStyle w:val="Compact"/>
+              <w:jc w:val="left"/>
+            </w:pPr>
+            <w:r>
+              <w:t xml:space="preserve">address model alone, natural pages flagged</w:t>
+            </w:r>
+          </w:p>
+        </w:tc>
+        <w:tc>
+          <w:tcPr/>
+          <w:p>
+            <w:pPr>
+              <w:pStyle w:val="Compact"/>
+              <w:jc w:val="left"/>
+            </w:pPr>
+            <w:r>
+              <w:t xml:space="preserve">115 (4.5%)</w:t>
+            </w:r>
+          </w:p>
+        </w:tc>
+        <w:tc>
+          <w:tcPr/>
+          <w:p>
+            <w:pPr>
+              <w:pStyle w:val="Compact"/>
+              <w:jc w:val="left"/>
+            </w:pPr>
+            <w:r>
+              <w:t xml:space="preserve">19 (0.7%)</w:t>
+            </w:r>
+          </w:p>
+        </w:tc>
+      </w:tr>
+      <w:tr>
+        <w:tc>
+          <w:tcPr/>
+          <w:p>
+            <w:pPr>
+              <w:pStyle w:val="Compact"/>
+              <w:jc w:val="left"/>
+            </w:pPr>
+            <w:r>
+              <w:t xml:space="preserve">sites outside the top 50,000, flagged</w:t>
+            </w:r>
+          </w:p>
+        </w:tc>
+        <w:tc>
+          <w:tcPr/>
+          <w:p>
+            <w:pPr>
+              <w:pStyle w:val="Compact"/>
+              <w:jc w:val="left"/>
+            </w:pPr>
+            <w:r>
+              <w:t xml:space="preserve">71 of 1,483 (4.8%)</w:t>
+            </w:r>
+          </w:p>
+        </w:tc>
+        <w:tc>
+          <w:tcPr/>
+          <w:p>
+            <w:pPr>
+              <w:pStyle w:val="Compact"/>
+              <w:jc w:val="left"/>
+            </w:pPr>
+            <w:r>
+              <w:t xml:space="preserve">8 of 1,579 (0.5%)</w:t>
+            </w:r>
+          </w:p>
+        </w:tc>
+      </w:tr>
+      <w:tr>
+        <w:tc>
+          <w:tcPr/>
+          <w:p>
+            <w:pPr>
+              <w:pStyle w:val="Compact"/>
+              <w:jc w:val="left"/>
+            </w:pPr>
+            <w:r>
+              <w:t xml:space="preserve">blend recall at FPR 1%, test</w:t>
+            </w:r>
+          </w:p>
+        </w:tc>
+        <w:tc>
+          <w:tcPr/>
+          <w:p>
+            <w:pPr>
+              <w:pStyle w:val="Compact"/>
+              <w:jc w:val="left"/>
+            </w:pPr>
+            <w:r>
+              <w:t xml:space="preserve">73.7 (10-split median)</w:t>
+            </w:r>
+          </w:p>
+        </w:tc>
+        <w:tc>
+          <w:tcPr/>
+          <w:p>
+            <w:pPr>
+              <w:pStyle w:val="Compact"/>
+              <w:jc w:val="left"/>
+            </w:pPr>
+            <w:r>
+              <w:t xml:space="preserve">74.2 (split 0)</w:t>
+            </w:r>
+          </w:p>
+        </w:tc>
+      </w:tr>
+      <w:tr>
+        <w:tc>
+          <w:tcPr/>
+          <w:p>
+            <w:pPr>
+              <w:pStyle w:val="Compact"/>
+              <w:jc w:val="left"/>
+            </w:pPr>
+            <w:r>
+              <w:t xml:space="preserve">blend recall at FPR 1%, held-out PhishStorm</w:t>
+            </w:r>
+          </w:p>
+        </w:tc>
+        <w:tc>
+          <w:tcPr/>
+          <w:p>
+            <w:pPr>
+              <w:pStyle w:val="Compact"/>
+              <w:jc w:val="left"/>
+            </w:pPr>
+            <w:r>
+              <w:t xml:space="preserve">71.5 (10-split median)</w:t>
+            </w:r>
+          </w:p>
+        </w:tc>
+        <w:tc>
+          <w:tcPr/>
+          <w:p>
+            <w:pPr>
+              <w:pStyle w:val="Compact"/>
+              <w:jc w:val="left"/>
+            </w:pPr>
+            <w:r>
+              <w:t xml:space="preserve">71.0 (split 0)</w:t>
+            </w:r>
+          </w:p>
+        </w:tc>
+      </w:tr>
+      <w:tr>
+        <w:tc>
+          <w:tcPr/>
+          <w:p>
+            <w:pPr>
+              <w:pStyle w:val="Compact"/>
+              <w:jc w:val="left"/>
+            </w:pPr>
+            <w:r>
+              <w:t xml:space="preserve">blend recall at FPR 1%, newest time slice</w:t>
+            </w:r>
+          </w:p>
+        </w:tc>
+        <w:tc>
+          <w:tcPr/>
+          <w:p>
+            <w:pPr>
+              <w:pStyle w:val="Compact"/>
+              <w:jc w:val="left"/>
+            </w:pPr>
+            <w:r>
+              <w:t xml:space="preserve">84.2 (10-split median)</w:t>
+            </w:r>
+          </w:p>
+        </w:tc>
+        <w:tc>
+          <w:tcPr/>
+          <w:p>
+            <w:pPr>
+              <w:pStyle w:val="Compact"/>
+              <w:jc w:val="left"/>
+            </w:pPr>
+            <w:r>
+              <w:t xml:space="preserve">81.7 (split 0)</w:t>
+            </w:r>
+          </w:p>
+        </w:tc>
+      </w:tr>
+    </w:tbl>
+    <w:p>
+      <w:pPr>
+        <w:pStyle w:val="BodyText"/>
+      </w:pPr>
+      <w:r>
+        <w:t xml:space="preserve">Table 8.7b. Natural-page false alarms and recall before and after the retrain (</w:t>
+      </w:r>
+      <w:r>
+        <w:rPr>
+          <w:rStyle w:val="VerbatimChar"/>
+        </w:rPr>
+        <w:t xml:space="preserve">docs/PROGRESS.md</w:t>
+      </w:r>
+      <w:r>
+        <w:t xml:space="preserve">, 2026-10-21 entry; PC reports</w:t>
+      </w:r>
+      <w:r>
+        <w:t xml:space="preserve"> </w:t>
+      </w:r>
+      <w:r>
+        <w:rPr>
+          <w:rStyle w:val="VerbatimChar"/>
+        </w:rPr>
+        <w:t xml:space="preserve">reports/shipped_verdicts.md</w:t>
+      </w:r>
+      <w:r>
+        <w:t xml:space="preserve"> </w:t>
+      </w:r>
+      <w:r>
+        <w:t xml:space="preserve">and</w:t>
+      </w:r>
+      <w:r>
+        <w:t xml:space="preserve"> </w:t>
+      </w:r>
+      <w:r>
+        <w:rPr>
+          <w:rStyle w:val="VerbatimChar"/>
+        </w:rPr>
+        <w:t xml:space="preserve">data/models/reports_split0/blend2.md</w:t>
+      </w:r>
+      <w:r>
+        <w:t xml:space="preserve">, which are not in the repository copy).</w:t>
+      </w:r>
+    </w:p>
+    <w:p>
+      <w:pPr>
+        <w:pStyle w:val="BodyText"/>
+      </w:pPr>
+      <w:r>
+        <w:t xml:space="preserve">Read these numbers with care. The</w:t>
+      </w:r>
+      <w:r>
+        <w:t xml:space="preserve"> </w:t>
+      </w:r>
+      <w:r>
+        <w:t xml:space="preserve">“</w:t>
+      </w:r>
+      <w:r>
+        <w:t xml:space="preserve">after</w:t>
+      </w:r>
+      <w:r>
+        <w:t xml:space="preserve">”</w:t>
+      </w:r>
+      <w:r>
+        <w:t xml:space="preserve"> </w:t>
+      </w:r>
+      <w:r>
+        <w:t xml:space="preserve">recall figures come from one split, the</w:t>
+      </w:r>
+      <w:r>
+        <w:t xml:space="preserve"> </w:t>
+      </w:r>
+      <w:r>
+        <w:t xml:space="preserve">“</w:t>
+      </w:r>
+      <w:r>
+        <w:t xml:space="preserve">before</w:t>
+      </w:r>
+      <w:r>
+        <w:t xml:space="preserve">”</w:t>
+      </w:r>
+      <w:r>
+        <w:t xml:space="preserve"> </w:t>
+      </w:r>
+      <w:r>
+        <w:t xml:space="preserve">figures are medians over ten, so the two are not strictly comparable. The crawl hosts and the natural pages both come from popular-site lists, so some of the drop may reflect that similarity. The brand-list change went in together with the new data, so the two effects are not separated. The false-alarm rate on PhishStorm at the cal-side 1% threshold stays at 3.2%. The ten-split tables elsewhere in this chapter were produced before the retrain and have not been refreshed.</w:t>
+      </w:r>
+    </w:p>
+    <w:bookmarkEnd w:id="139"/>
+    <w:bookmarkEnd w:id="140"/>
+    <w:bookmarkStart w:id="141" w:name="negative-controls-1"/>
     <w:p>
       <w:pPr>
         <w:pStyle w:val="Heading2"/>
@@ -16612,8 +17394,8 @@
         <w:t xml:space="preserve">, 2026-10-12). Tier C is the control with the widest range because its test side has only 24 phishing hosts.</w:t>
       </w:r>
     </w:p>
-    <w:bookmarkEnd w:id="135"/>
-    <w:bookmarkStart w:id="139" w:name="robustness-to-url-evasion"/>
+    <w:bookmarkEnd w:id="141"/>
+    <w:bookmarkStart w:id="145" w:name="robustness-to-url-evasion"/>
     <w:p>
       <w:pPr>
         <w:pStyle w:val="Heading2"/>
@@ -16713,18 +17495,18 @@
           <wp:inline>
             <wp:extent cx="5922922" cy="2821314"/>
             <wp:effectExtent b="0" l="0" r="0" t="0"/>
-            <wp:docPr descr="Figure 8.7. Evasion rate and false alarms before and after adversarial training, per family, at the suspicious threshold." title="" id="137" name="Picture"/>
+            <wp:docPr descr="Figure 8.7. Evasion rate and false alarms before and after adversarial training, per family, at the suspicious threshold." title="" id="143" name="Picture"/>
             <a:graphic>
               <a:graphicData uri="http://schemas.openxmlformats.org/drawingml/2006/picture">
                 <pic:pic>
                   <pic:nvPicPr>
-                    <pic:cNvPr descr="figures/fig05_evasion_adversarial.png" id="138" name="Picture"/>
+                    <pic:cNvPr descr="figures/fig05_evasion_adversarial.png" id="144" name="Picture"/>
                     <pic:cNvPicPr>
                       <a:picLocks noChangeArrowheads="1" noChangeAspect="1"/>
                     </pic:cNvPicPr>
                   </pic:nvPicPr>
                   <pic:blipFill>
-                    <a:blip r:embed="rId136"/>
+                    <a:blip r:embed="rId142"/>
                     <a:stretch>
                       <a:fillRect/>
                     </a:stretch>
@@ -16767,8 +17549,8 @@
         <w:t xml:space="preserve">The result is the opposite of the usual evasion story. The shipped model is hard to evade with these rewrites (2.4% evasion for stacked subdomains, 1.3% for padding, 2.9% for shortener wrapping, against 30.5% for unmodified phishing), but only because it treats the rewrite as suspicious: it also flags 63.5%, 72.5% and 97.2% of legitimate URLs rewritten the same way. Long legitimate URLs that were not rewritten are not a problem (0.7% flagged). Training on variants of both classes removes the false alarms for the families it saw (1.1% to 2.1%; 0.0% for shortener) and returns evasion to the clean rate (32% to 41%; shortener 100%, because a short link carries nothing for a URL model). A family the model never saw behaves like the base model on both sides, and each held-out column rests on one split. The apparent robustness of the base model is therefore over-suspicion rather than understanding, and the extension needs its other layers for real traffic: shorteners are expanded and scored at the target, and the allowlist and blocklists carry sites that a URL model would flag. The rewrites are synthetic (random lure words, brands from the project’s own list), so real attacker URLs may differ. Robustness of tier B was not measured.</w:t>
       </w:r>
     </w:p>
-    <w:bookmarkEnd w:id="139"/>
-    <w:bookmarkStart w:id="140" w:name="tier-c"/>
+    <w:bookmarkEnd w:id="145"/>
+    <w:bookmarkStart w:id="146" w:name="tier-c"/>
     <w:p>
       <w:pPr>
         <w:pStyle w:val="Heading2"/>
@@ -17390,8 +18172,8 @@
         <w:t xml:space="preserve">pairs, so collection method may leak into host-form features. The time check was skipped because the eligible rows span two capture days. Tier C is not wired into the backend: the backend’s run-time checks are the hand-set rules in section 7.5.</w:t>
       </w:r>
     </w:p>
-    <w:bookmarkEnd w:id="140"/>
-    <w:bookmarkStart w:id="141" w:name="real-world-and-stress-tests"/>
+    <w:bookmarkEnd w:id="146"/>
+    <w:bookmarkStart w:id="147" w:name="real-world-and-stress-tests"/>
     <w:p>
       <w:pPr>
         <w:pStyle w:val="Heading2"/>
@@ -17427,7 +18209,7 @@
       <w:pPr>
         <w:numPr>
           <w:ilvl w:val="0"/>
-          <w:numId w:val="1016"/>
+          <w:numId w:val="1008"/>
         </w:numPr>
         <w:pStyle w:val="Compact"/>
       </w:pPr>
@@ -17464,7 +18246,7 @@
       <w:pPr>
         <w:numPr>
           <w:ilvl w:val="0"/>
-          <w:numId w:val="1016"/>
+          <w:numId w:val="1008"/>
         </w:numPr>
         <w:pStyle w:val="Compact"/>
       </w:pPr>
@@ -17486,7 +18268,7 @@
       <w:pPr>
         <w:numPr>
           <w:ilvl w:val="0"/>
-          <w:numId w:val="1016"/>
+          <w:numId w:val="1008"/>
         </w:numPr>
         <w:pStyle w:val="Compact"/>
       </w:pPr>
@@ -17508,7 +18290,7 @@
       <w:pPr>
         <w:numPr>
           <w:ilvl w:val="0"/>
-          <w:numId w:val="1016"/>
+          <w:numId w:val="1008"/>
         </w:numPr>
         <w:pStyle w:val="Compact"/>
       </w:pPr>
@@ -17542,7 +18324,7 @@
       <w:pPr>
         <w:numPr>
           <w:ilvl w:val="0"/>
-          <w:numId w:val="1016"/>
+          <w:numId w:val="1008"/>
         </w:numPr>
         <w:pStyle w:val="Compact"/>
       </w:pPr>
@@ -17568,9 +18350,9 @@
         <w:t xml:space="preserve">Blocklist coverage on the corpus is not measurable, because the test URLs come from datasets collected in other periods than the live feeds. It can only be measured forward, as the share of newly listed feed URLs whose domain was already on an earlier list, once the collector has run for several days. This is not measured.</w:t>
       </w:r>
     </w:p>
-    <w:bookmarkEnd w:id="141"/>
-    <w:bookmarkEnd w:id="142"/>
-    <w:bookmarkStart w:id="143" w:name="limitations-and-what-is-not-done"/>
+    <w:bookmarkEnd w:id="147"/>
+    <w:bookmarkEnd w:id="148"/>
+    <w:bookmarkStart w:id="149" w:name="limitations-and-what-is-not-done"/>
     <w:p>
       <w:pPr>
         <w:pStyle w:val="Heading1"/>
@@ -17595,7 +18377,7 @@
       <w:pPr>
         <w:numPr>
           <w:ilvl w:val="0"/>
-          <w:numId w:val="1017"/>
+          <w:numId w:val="1009"/>
         </w:numPr>
         <w:pStyle w:val="Compact"/>
       </w:pPr>
@@ -17617,7 +18399,7 @@
       <w:pPr>
         <w:numPr>
           <w:ilvl w:val="0"/>
-          <w:numId w:val="1017"/>
+          <w:numId w:val="1009"/>
         </w:numPr>
         <w:pStyle w:val="Compact"/>
       </w:pPr>
@@ -17648,7 +18430,7 @@
       <w:pPr>
         <w:numPr>
           <w:ilvl w:val="0"/>
-          <w:numId w:val="1017"/>
+          <w:numId w:val="1009"/>
         </w:numPr>
         <w:pStyle w:val="Compact"/>
       </w:pPr>
@@ -17670,7 +18452,7 @@
       <w:pPr>
         <w:numPr>
           <w:ilvl w:val="0"/>
-          <w:numId w:val="1017"/>
+          <w:numId w:val="1009"/>
         </w:numPr>
         <w:pStyle w:val="Compact"/>
       </w:pPr>
@@ -17692,7 +18474,7 @@
       <w:pPr>
         <w:numPr>
           <w:ilvl w:val="0"/>
-          <w:numId w:val="1017"/>
+          <w:numId w:val="1009"/>
         </w:numPr>
         <w:pStyle w:val="Compact"/>
       </w:pPr>
@@ -17714,7 +18496,7 @@
       <w:pPr>
         <w:numPr>
           <w:ilvl w:val="0"/>
-          <w:numId w:val="1017"/>
+          <w:numId w:val="1009"/>
         </w:numPr>
         <w:pStyle w:val="Compact"/>
       </w:pPr>
@@ -17736,7 +18518,7 @@
       <w:pPr>
         <w:numPr>
           <w:ilvl w:val="0"/>
-          <w:numId w:val="1017"/>
+          <w:numId w:val="1009"/>
         </w:numPr>
         <w:pStyle w:val="Compact"/>
       </w:pPr>
@@ -17842,7 +18624,7 @@
       <w:pPr>
         <w:numPr>
           <w:ilvl w:val="0"/>
-          <w:numId w:val="1018"/>
+          <w:numId w:val="1010"/>
         </w:numPr>
         <w:pStyle w:val="Compact"/>
       </w:pPr>
@@ -17864,7 +18646,7 @@
       <w:pPr>
         <w:numPr>
           <w:ilvl w:val="0"/>
-          <w:numId w:val="1018"/>
+          <w:numId w:val="1010"/>
         </w:numPr>
         <w:pStyle w:val="Compact"/>
       </w:pPr>
@@ -17886,7 +18668,7 @@
       <w:pPr>
         <w:numPr>
           <w:ilvl w:val="0"/>
-          <w:numId w:val="1018"/>
+          <w:numId w:val="1010"/>
         </w:numPr>
         <w:pStyle w:val="Compact"/>
       </w:pPr>
@@ -17908,7 +18690,7 @@
       <w:pPr>
         <w:numPr>
           <w:ilvl w:val="0"/>
-          <w:numId w:val="1018"/>
+          <w:numId w:val="1010"/>
         </w:numPr>
         <w:pStyle w:val="Compact"/>
       </w:pPr>
@@ -17923,23 +18705,14 @@
         <w:t xml:space="preserve"> </w:t>
       </w:r>
       <w:r>
-        <w:t xml:space="preserve">The shipped address bundle was exported with the 67-name seed brand list while training used the reviewed list, and the brand list has since grown to 899; re-exporting on the project PC is pending, and the effect is not measured (</w:t>
-      </w:r>
-      <w:r>
-        <w:rPr>
-          <w:rStyle w:val="VerbatimChar"/>
-        </w:rPr>
-        <w:t xml:space="preserve">docs/PROGRESS.md</w:t>
-      </w:r>
-      <w:r>
-        <w:t xml:space="preserve">, 2026-10-19 and 2026-10-20). The popular-sites crawl, which should reduce false alarms on deep legitimate URLs, has not yet produced data.</w:t>
+        <w:t xml:space="preserve">The shipped model was retrained on 2026-10-21 for split 0 with the 899-name brand list and the popular-sites crawl (section 8.8.1). The ten-split tables in this chapter still describe the earlier model, and the effect of the new data and of the brand list is not separated.</w:t>
       </w:r>
     </w:p>
     <w:p>
       <w:pPr>
         <w:numPr>
           <w:ilvl w:val="0"/>
-          <w:numId w:val="1018"/>
+          <w:numId w:val="1010"/>
         </w:numPr>
         <w:pStyle w:val="Compact"/>
       </w:pPr>
@@ -18049,8 +18822,8 @@
         <w:t xml:space="preserve">, 2026-10-20).</w:t>
       </w:r>
     </w:p>
-    <w:bookmarkEnd w:id="143"/>
-    <w:bookmarkStart w:id="147" w:name="conclusion-and-future-work"/>
+    <w:bookmarkEnd w:id="149"/>
+    <w:bookmarkStart w:id="153" w:name="conclusion-and-future-work"/>
     <w:p>
       <w:pPr>
         <w:pStyle w:val="Heading1"/>
@@ -18059,7 +18832,7 @@
         <w:t xml:space="preserve">10. Conclusion and future work</w:t>
       </w:r>
     </w:p>
-    <w:bookmarkStart w:id="144" w:name="what-was-achieved"/>
+    <w:bookmarkStart w:id="150" w:name="what-was-achieved"/>
     <w:p>
       <w:pPr>
         <w:pStyle w:val="Heading2"/>
@@ -18072,7 +18845,7 @@
       <w:pPr>
         <w:numPr>
           <w:ilvl w:val="0"/>
-          <w:numId w:val="1019"/>
+          <w:numId w:val="1011"/>
         </w:numPr>
         <w:pStyle w:val="Compact"/>
       </w:pPr>
@@ -18094,7 +18867,7 @@
       <w:pPr>
         <w:numPr>
           <w:ilvl w:val="0"/>
-          <w:numId w:val="1019"/>
+          <w:numId w:val="1011"/>
         </w:numPr>
         <w:pStyle w:val="Compact"/>
       </w:pPr>
@@ -18116,7 +18889,7 @@
       <w:pPr>
         <w:numPr>
           <w:ilvl w:val="0"/>
-          <w:numId w:val="1019"/>
+          <w:numId w:val="1011"/>
         </w:numPr>
         <w:pStyle w:val="Compact"/>
       </w:pPr>
@@ -18146,8 +18919,8 @@
         <w:t xml:space="preserve">; seeds are fixed; the study’s plan and consistency rule were frozen before the run.</w:t>
       </w:r>
     </w:p>
-    <w:bookmarkEnd w:id="144"/>
-    <w:bookmarkStart w:id="145" w:name="limitations"/>
+    <w:bookmarkEnd w:id="150"/>
+    <w:bookmarkStart w:id="151" w:name="limitations"/>
     <w:p>
       <w:pPr>
         <w:pStyle w:val="Heading2"/>
@@ -18164,8 +18937,8 @@
         <w:t xml:space="preserve">See Sections 4.12 and Chapter 9. In short: public benchmarks only, two of them old or homepage-heavy; the HTML part rests on two sources with uneven coverage; one shuffled-label control is flagged; platform masking is untested; tier C of the detector rests on a small live capture; and the extension has been checked in test harnesses and on stored pages, not in a long field trial.</w:t>
       </w:r>
     </w:p>
-    <w:bookmarkEnd w:id="145"/>
-    <w:bookmarkStart w:id="146" w:name="future-work"/>
+    <w:bookmarkEnd w:id="151"/>
+    <w:bookmarkStart w:id="152" w:name="future-work"/>
     <w:p>
       <w:pPr>
         <w:pStyle w:val="Heading2"/>
@@ -18178,7 +18951,7 @@
       <w:pPr>
         <w:numPr>
           <w:ilvl w:val="0"/>
-          <w:numId w:val="1020"/>
+          <w:numId w:val="1012"/>
         </w:numPr>
         <w:pStyle w:val="Compact"/>
       </w:pPr>
@@ -18190,7 +18963,7 @@
       <w:pPr>
         <w:numPr>
           <w:ilvl w:val="0"/>
-          <w:numId w:val="1020"/>
+          <w:numId w:val="1012"/>
         </w:numPr>
         <w:pStyle w:val="Compact"/>
       </w:pPr>
@@ -18202,7 +18975,7 @@
       <w:pPr>
         <w:numPr>
           <w:ilvl w:val="0"/>
-          <w:numId w:val="1020"/>
+          <w:numId w:val="1012"/>
         </w:numPr>
         <w:pStyle w:val="Compact"/>
       </w:pPr>
@@ -18214,7 +18987,7 @@
       <w:pPr>
         <w:numPr>
           <w:ilvl w:val="0"/>
-          <w:numId w:val="1020"/>
+          <w:numId w:val="1012"/>
         </w:numPr>
         <w:pStyle w:val="Compact"/>
       </w:pPr>
@@ -18226,7 +18999,7 @@
       <w:pPr>
         <w:numPr>
           <w:ilvl w:val="0"/>
-          <w:numId w:val="1020"/>
+          <w:numId w:val="1012"/>
         </w:numPr>
         <w:pStyle w:val="Compact"/>
       </w:pPr>
@@ -18234,9 +19007,9 @@
         <w:t xml:space="preserve">Optional second-opinion layer for the grey zone (planned, not built).</w:t>
       </w:r>
     </w:p>
-    <w:bookmarkEnd w:id="146"/>
-    <w:bookmarkEnd w:id="147"/>
-    <w:bookmarkStart w:id="148" w:name="references"/>
+    <w:bookmarkEnd w:id="152"/>
+    <w:bookmarkEnd w:id="153"/>
+    <w:bookmarkStart w:id="154" w:name="references"/>
     <w:p>
       <w:pPr>
         <w:pStyle w:val="Heading1"/>
@@ -18249,7 +19022,7 @@
       <w:pPr>
         <w:numPr>
           <w:ilvl w:val="0"/>
-          <w:numId w:val="1021"/>
+          <w:numId w:val="1013"/>
         </w:numPr>
         <w:pStyle w:val="Compact"/>
       </w:pPr>
@@ -18289,7 +19062,7 @@
       <w:pPr>
         <w:numPr>
           <w:ilvl w:val="0"/>
-          <w:numId w:val="1021"/>
+          <w:numId w:val="1013"/>
         </w:numPr>
         <w:pStyle w:val="Compact"/>
       </w:pPr>
@@ -18329,7 +19102,7 @@
       <w:pPr>
         <w:numPr>
           <w:ilvl w:val="0"/>
-          <w:numId w:val="1021"/>
+          <w:numId w:val="1013"/>
         </w:numPr>
         <w:pStyle w:val="Compact"/>
       </w:pPr>
@@ -18353,7 +19126,7 @@
       <w:pPr>
         <w:numPr>
           <w:ilvl w:val="0"/>
-          <w:numId w:val="1021"/>
+          <w:numId w:val="1013"/>
         </w:numPr>
         <w:pStyle w:val="Compact"/>
       </w:pPr>
@@ -18365,7 +19138,7 @@
       <w:pPr>
         <w:numPr>
           <w:ilvl w:val="0"/>
-          <w:numId w:val="1021"/>
+          <w:numId w:val="1013"/>
         </w:numPr>
         <w:pStyle w:val="Compact"/>
       </w:pPr>
@@ -18405,7 +19178,7 @@
       <w:pPr>
         <w:numPr>
           <w:ilvl w:val="0"/>
-          <w:numId w:val="1021"/>
+          <w:numId w:val="1013"/>
         </w:numPr>
         <w:pStyle w:val="Compact"/>
       </w:pPr>
@@ -18445,7 +19218,7 @@
       <w:pPr>
         <w:numPr>
           <w:ilvl w:val="0"/>
-          <w:numId w:val="1021"/>
+          <w:numId w:val="1013"/>
         </w:numPr>
         <w:pStyle w:val="Compact"/>
       </w:pPr>
@@ -18485,7 +19258,7 @@
       <w:pPr>
         <w:numPr>
           <w:ilvl w:val="0"/>
-          <w:numId w:val="1021"/>
+          <w:numId w:val="1013"/>
         </w:numPr>
         <w:pStyle w:val="Compact"/>
       </w:pPr>
@@ -18505,7 +19278,7 @@
         <w:t xml:space="preserve">Citation details should be checked against the originals before submission.</w:t>
       </w:r>
     </w:p>
-    <w:bookmarkEnd w:id="148"/>
+    <w:bookmarkEnd w:id="154"/>
     <w:sectPr>
       <w:pgSz w:h="16838" w:w="11906"/>
       <w:pgMar w:bottom="1134" w:left="1020" w:right="1020" w:top="1134"/>
@@ -18768,601 +19541,6 @@
     </w:lvl>
     <w:lvl w:ilvl="8">
       <w:start w:val="1"/>
-      <w:numFmt w:val="decimal"/>
-      <w:lvlText w:val="%9."/>
-      <w:lvlJc w:val="left"/>
-      <w:pPr>
-        <w:ind w:left="6480" w:hanging="480"/>
-      </w:pPr>
-    </w:lvl>
-  </w:abstractNum>
-  <w:abstractNum w:abstractNumId="99412">
-    <w:nsid w:val="A99412"/>
-    <w:multiLevelType w:val="multilevel"/>
-    <w:lvl w:ilvl="0">
-      <w:start w:val="2"/>
-      <w:numFmt w:val="decimal"/>
-      <w:lvlText w:val="%1."/>
-      <w:lvlJc w:val="left"/>
-      <w:pPr>
-        <w:ind w:left="720" w:hanging="480"/>
-      </w:pPr>
-    </w:lvl>
-    <w:lvl w:ilvl="1">
-      <w:start w:val="2"/>
-      <w:numFmt w:val="decimal"/>
-      <w:lvlText w:val="%2."/>
-      <w:lvlJc w:val="left"/>
-      <w:pPr>
-        <w:ind w:left="1440" w:hanging="480"/>
-      </w:pPr>
-    </w:lvl>
-    <w:lvl w:ilvl="2">
-      <w:start w:val="2"/>
-      <w:numFmt w:val="decimal"/>
-      <w:lvlText w:val="%3."/>
-      <w:lvlJc w:val="left"/>
-      <w:pPr>
-        <w:ind w:left="2160" w:hanging="480"/>
-      </w:pPr>
-    </w:lvl>
-    <w:lvl w:ilvl="3">
-      <w:start w:val="2"/>
-      <w:numFmt w:val="decimal"/>
-      <w:lvlText w:val="%4."/>
-      <w:lvlJc w:val="left"/>
-      <w:pPr>
-        <w:ind w:left="2880" w:hanging="480"/>
-      </w:pPr>
-    </w:lvl>
-    <w:lvl w:ilvl="4">
-      <w:start w:val="2"/>
-      <w:numFmt w:val="decimal"/>
-      <w:lvlText w:val="%5."/>
-      <w:lvlJc w:val="left"/>
-      <w:pPr>
-        <w:ind w:left="3600" w:hanging="480"/>
-      </w:pPr>
-    </w:lvl>
-    <w:lvl w:ilvl="5">
-      <w:start w:val="2"/>
-      <w:numFmt w:val="decimal"/>
-      <w:lvlText w:val="%6."/>
-      <w:lvlJc w:val="left"/>
-      <w:pPr>
-        <w:ind w:left="4320" w:hanging="480"/>
-      </w:pPr>
-    </w:lvl>
-    <w:lvl w:ilvl="6">
-      <w:start w:val="2"/>
-      <w:numFmt w:val="decimal"/>
-      <w:lvlText w:val="%7."/>
-      <w:lvlJc w:val="left"/>
-      <w:pPr>
-        <w:ind w:left="5040" w:hanging="480"/>
-      </w:pPr>
-    </w:lvl>
-    <w:lvl w:ilvl="7">
-      <w:start w:val="2"/>
-      <w:numFmt w:val="decimal"/>
-      <w:lvlText w:val="%8."/>
-      <w:lvlJc w:val="left"/>
-      <w:pPr>
-        <w:ind w:left="5760" w:hanging="480"/>
-      </w:pPr>
-    </w:lvl>
-    <w:lvl w:ilvl="8">
-      <w:start w:val="2"/>
-      <w:numFmt w:val="decimal"/>
-      <w:lvlText w:val="%9."/>
-      <w:lvlJc w:val="left"/>
-      <w:pPr>
-        <w:ind w:left="6480" w:hanging="480"/>
-      </w:pPr>
-    </w:lvl>
-  </w:abstractNum>
-  <w:abstractNum w:abstractNumId="99413">
-    <w:nsid w:val="A99413"/>
-    <w:multiLevelType w:val="multilevel"/>
-    <w:lvl w:ilvl="0">
-      <w:start w:val="3"/>
-      <w:numFmt w:val="decimal"/>
-      <w:lvlText w:val="%1."/>
-      <w:lvlJc w:val="left"/>
-      <w:pPr>
-        <w:ind w:left="720" w:hanging="480"/>
-      </w:pPr>
-    </w:lvl>
-    <w:lvl w:ilvl="1">
-      <w:start w:val="3"/>
-      <w:numFmt w:val="decimal"/>
-      <w:lvlText w:val="%2."/>
-      <w:lvlJc w:val="left"/>
-      <w:pPr>
-        <w:ind w:left="1440" w:hanging="480"/>
-      </w:pPr>
-    </w:lvl>
-    <w:lvl w:ilvl="2">
-      <w:start w:val="3"/>
-      <w:numFmt w:val="decimal"/>
-      <w:lvlText w:val="%3."/>
-      <w:lvlJc w:val="left"/>
-      <w:pPr>
-        <w:ind w:left="2160" w:hanging="480"/>
-      </w:pPr>
-    </w:lvl>
-    <w:lvl w:ilvl="3">
-      <w:start w:val="3"/>
-      <w:numFmt w:val="decimal"/>
-      <w:lvlText w:val="%4."/>
-      <w:lvlJc w:val="left"/>
-      <w:pPr>
-        <w:ind w:left="2880" w:hanging="480"/>
-      </w:pPr>
-    </w:lvl>
-    <w:lvl w:ilvl="4">
-      <w:start w:val="3"/>
-      <w:numFmt w:val="decimal"/>
-      <w:lvlText w:val="%5."/>
-      <w:lvlJc w:val="left"/>
-      <w:pPr>
-        <w:ind w:left="3600" w:hanging="480"/>
-      </w:pPr>
-    </w:lvl>
-    <w:lvl w:ilvl="5">
-      <w:start w:val="3"/>
-      <w:numFmt w:val="decimal"/>
-      <w:lvlText w:val="%6."/>
-      <w:lvlJc w:val="left"/>
-      <w:pPr>
-        <w:ind w:left="4320" w:hanging="480"/>
-      </w:pPr>
-    </w:lvl>
-    <w:lvl w:ilvl="6">
-      <w:start w:val="3"/>
-      <w:numFmt w:val="decimal"/>
-      <w:lvlText w:val="%7."/>
-      <w:lvlJc w:val="left"/>
-      <w:pPr>
-        <w:ind w:left="5040" w:hanging="480"/>
-      </w:pPr>
-    </w:lvl>
-    <w:lvl w:ilvl="7">
-      <w:start w:val="3"/>
-      <w:numFmt w:val="decimal"/>
-      <w:lvlText w:val="%8."/>
-      <w:lvlJc w:val="left"/>
-      <w:pPr>
-        <w:ind w:left="5760" w:hanging="480"/>
-      </w:pPr>
-    </w:lvl>
-    <w:lvl w:ilvl="8">
-      <w:start w:val="3"/>
-      <w:numFmt w:val="decimal"/>
-      <w:lvlText w:val="%9."/>
-      <w:lvlJc w:val="left"/>
-      <w:pPr>
-        <w:ind w:left="6480" w:hanging="480"/>
-      </w:pPr>
-    </w:lvl>
-  </w:abstractNum>
-  <w:abstractNum w:abstractNumId="99416">
-    <w:nsid w:val="A99416"/>
-    <w:multiLevelType w:val="multilevel"/>
-    <w:lvl w:ilvl="0">
-      <w:start w:val="6"/>
-      <w:numFmt w:val="decimal"/>
-      <w:lvlText w:val="%1."/>
-      <w:lvlJc w:val="left"/>
-      <w:pPr>
-        <w:ind w:left="720" w:hanging="480"/>
-      </w:pPr>
-    </w:lvl>
-    <w:lvl w:ilvl="1">
-      <w:start w:val="6"/>
-      <w:numFmt w:val="decimal"/>
-      <w:lvlText w:val="%2."/>
-      <w:lvlJc w:val="left"/>
-      <w:pPr>
-        <w:ind w:left="1440" w:hanging="480"/>
-      </w:pPr>
-    </w:lvl>
-    <w:lvl w:ilvl="2">
-      <w:start w:val="6"/>
-      <w:numFmt w:val="decimal"/>
-      <w:lvlText w:val="%3."/>
-      <w:lvlJc w:val="left"/>
-      <w:pPr>
-        <w:ind w:left="2160" w:hanging="480"/>
-      </w:pPr>
-    </w:lvl>
-    <w:lvl w:ilvl="3">
-      <w:start w:val="6"/>
-      <w:numFmt w:val="decimal"/>
-      <w:lvlText w:val="%4."/>
-      <w:lvlJc w:val="left"/>
-      <w:pPr>
-        <w:ind w:left="2880" w:hanging="480"/>
-      </w:pPr>
-    </w:lvl>
-    <w:lvl w:ilvl="4">
-      <w:start w:val="6"/>
-      <w:numFmt w:val="decimal"/>
-      <w:lvlText w:val="%5."/>
-      <w:lvlJc w:val="left"/>
-      <w:pPr>
-        <w:ind w:left="3600" w:hanging="480"/>
-      </w:pPr>
-    </w:lvl>
-    <w:lvl w:ilvl="5">
-      <w:start w:val="6"/>
-      <w:numFmt w:val="decimal"/>
-      <w:lvlText w:val="%6."/>
-      <w:lvlJc w:val="left"/>
-      <w:pPr>
-        <w:ind w:left="4320" w:hanging="480"/>
-      </w:pPr>
-    </w:lvl>
-    <w:lvl w:ilvl="6">
-      <w:start w:val="6"/>
-      <w:numFmt w:val="decimal"/>
-      <w:lvlText w:val="%7."/>
-      <w:lvlJc w:val="left"/>
-      <w:pPr>
-        <w:ind w:left="5040" w:hanging="480"/>
-      </w:pPr>
-    </w:lvl>
-    <w:lvl w:ilvl="7">
-      <w:start w:val="6"/>
-      <w:numFmt w:val="decimal"/>
-      <w:lvlText w:val="%8."/>
-      <w:lvlJc w:val="left"/>
-      <w:pPr>
-        <w:ind w:left="5760" w:hanging="480"/>
-      </w:pPr>
-    </w:lvl>
-    <w:lvl w:ilvl="8">
-      <w:start w:val="6"/>
-      <w:numFmt w:val="decimal"/>
-      <w:lvlText w:val="%9."/>
-      <w:lvlJc w:val="left"/>
-      <w:pPr>
-        <w:ind w:left="6480" w:hanging="480"/>
-      </w:pPr>
-    </w:lvl>
-  </w:abstractNum>
-  <w:abstractNum w:abstractNumId="99417">
-    <w:nsid w:val="A99417"/>
-    <w:multiLevelType w:val="multilevel"/>
-    <w:lvl w:ilvl="0">
-      <w:start w:val="7"/>
-      <w:numFmt w:val="decimal"/>
-      <w:lvlText w:val="%1."/>
-      <w:lvlJc w:val="left"/>
-      <w:pPr>
-        <w:ind w:left="720" w:hanging="480"/>
-      </w:pPr>
-    </w:lvl>
-    <w:lvl w:ilvl="1">
-      <w:start w:val="7"/>
-      <w:numFmt w:val="decimal"/>
-      <w:lvlText w:val="%2."/>
-      <w:lvlJc w:val="left"/>
-      <w:pPr>
-        <w:ind w:left="1440" w:hanging="480"/>
-      </w:pPr>
-    </w:lvl>
-    <w:lvl w:ilvl="2">
-      <w:start w:val="7"/>
-      <w:numFmt w:val="decimal"/>
-      <w:lvlText w:val="%3."/>
-      <w:lvlJc w:val="left"/>
-      <w:pPr>
-        <w:ind w:left="2160" w:hanging="480"/>
-      </w:pPr>
-    </w:lvl>
-    <w:lvl w:ilvl="3">
-      <w:start w:val="7"/>
-      <w:numFmt w:val="decimal"/>
-      <w:lvlText w:val="%4."/>
-      <w:lvlJc w:val="left"/>
-      <w:pPr>
-        <w:ind w:left="2880" w:hanging="480"/>
-      </w:pPr>
-    </w:lvl>
-    <w:lvl w:ilvl="4">
-      <w:start w:val="7"/>
-      <w:numFmt w:val="decimal"/>
-      <w:lvlText w:val="%5."/>
-      <w:lvlJc w:val="left"/>
-      <w:pPr>
-        <w:ind w:left="3600" w:hanging="480"/>
-      </w:pPr>
-    </w:lvl>
-    <w:lvl w:ilvl="5">
-      <w:start w:val="7"/>
-      <w:numFmt w:val="decimal"/>
-      <w:lvlText w:val="%6."/>
-      <w:lvlJc w:val="left"/>
-      <w:pPr>
-        <w:ind w:left="4320" w:hanging="480"/>
-      </w:pPr>
-    </w:lvl>
-    <w:lvl w:ilvl="6">
-      <w:start w:val="7"/>
-      <w:numFmt w:val="decimal"/>
-      <w:lvlText w:val="%7."/>
-      <w:lvlJc w:val="left"/>
-      <w:pPr>
-        <w:ind w:left="5040" w:hanging="480"/>
-      </w:pPr>
-    </w:lvl>
-    <w:lvl w:ilvl="7">
-      <w:start w:val="7"/>
-      <w:numFmt w:val="decimal"/>
-      <w:lvlText w:val="%8."/>
-      <w:lvlJc w:val="left"/>
-      <w:pPr>
-        <w:ind w:left="5760" w:hanging="480"/>
-      </w:pPr>
-    </w:lvl>
-    <w:lvl w:ilvl="8">
-      <w:start w:val="7"/>
-      <w:numFmt w:val="decimal"/>
-      <w:lvlText w:val="%9."/>
-      <w:lvlJc w:val="left"/>
-      <w:pPr>
-        <w:ind w:left="6480" w:hanging="480"/>
-      </w:pPr>
-    </w:lvl>
-  </w:abstractNum>
-  <w:abstractNum w:abstractNumId="99418">
-    <w:nsid w:val="A99418"/>
-    <w:multiLevelType w:val="multilevel"/>
-    <w:lvl w:ilvl="0">
-      <w:start w:val="8"/>
-      <w:numFmt w:val="decimal"/>
-      <w:lvlText w:val="%1."/>
-      <w:lvlJc w:val="left"/>
-      <w:pPr>
-        <w:ind w:left="720" w:hanging="480"/>
-      </w:pPr>
-    </w:lvl>
-    <w:lvl w:ilvl="1">
-      <w:start w:val="8"/>
-      <w:numFmt w:val="decimal"/>
-      <w:lvlText w:val="%2."/>
-      <w:lvlJc w:val="left"/>
-      <w:pPr>
-        <w:ind w:left="1440" w:hanging="480"/>
-      </w:pPr>
-    </w:lvl>
-    <w:lvl w:ilvl="2">
-      <w:start w:val="8"/>
-      <w:numFmt w:val="decimal"/>
-      <w:lvlText w:val="%3."/>
-      <w:lvlJc w:val="left"/>
-      <w:pPr>
-        <w:ind w:left="2160" w:hanging="480"/>
-      </w:pPr>
-    </w:lvl>
-    <w:lvl w:ilvl="3">
-      <w:start w:val="8"/>
-      <w:numFmt w:val="decimal"/>
-      <w:lvlText w:val="%4."/>
-      <w:lvlJc w:val="left"/>
-      <w:pPr>
-        <w:ind w:left="2880" w:hanging="480"/>
-      </w:pPr>
-    </w:lvl>
-    <w:lvl w:ilvl="4">
-      <w:start w:val="8"/>
-      <w:numFmt w:val="decimal"/>
-      <w:lvlText w:val="%5."/>
-      <w:lvlJc w:val="left"/>
-      <w:pPr>
-        <w:ind w:left="3600" w:hanging="480"/>
-      </w:pPr>
-    </w:lvl>
-    <w:lvl w:ilvl="5">
-      <w:start w:val="8"/>
-      <w:numFmt w:val="decimal"/>
-      <w:lvlText w:val="%6."/>
-      <w:lvlJc w:val="left"/>
-      <w:pPr>
-        <w:ind w:left="4320" w:hanging="480"/>
-      </w:pPr>
-    </w:lvl>
-    <w:lvl w:ilvl="6">
-      <w:start w:val="8"/>
-      <w:numFmt w:val="decimal"/>
-      <w:lvlText w:val="%7."/>
-      <w:lvlJc w:val="left"/>
-      <w:pPr>
-        <w:ind w:left="5040" w:hanging="480"/>
-      </w:pPr>
-    </w:lvl>
-    <w:lvl w:ilvl="7">
-      <w:start w:val="8"/>
-      <w:numFmt w:val="decimal"/>
-      <w:lvlText w:val="%8."/>
-      <w:lvlJc w:val="left"/>
-      <w:pPr>
-        <w:ind w:left="5760" w:hanging="480"/>
-      </w:pPr>
-    </w:lvl>
-    <w:lvl w:ilvl="8">
-      <w:start w:val="8"/>
-      <w:numFmt w:val="decimal"/>
-      <w:lvlText w:val="%9."/>
-      <w:lvlJc w:val="left"/>
-      <w:pPr>
-        <w:ind w:left="6480" w:hanging="480"/>
-      </w:pPr>
-    </w:lvl>
-  </w:abstractNum>
-  <w:abstractNum w:abstractNumId="99419">
-    <w:nsid w:val="A99419"/>
-    <w:multiLevelType w:val="multilevel"/>
-    <w:lvl w:ilvl="0">
-      <w:start w:val="9"/>
-      <w:numFmt w:val="decimal"/>
-      <w:lvlText w:val="%1."/>
-      <w:lvlJc w:val="left"/>
-      <w:pPr>
-        <w:ind w:left="720" w:hanging="480"/>
-      </w:pPr>
-    </w:lvl>
-    <w:lvl w:ilvl="1">
-      <w:start w:val="9"/>
-      <w:numFmt w:val="decimal"/>
-      <w:lvlText w:val="%2."/>
-      <w:lvlJc w:val="left"/>
-      <w:pPr>
-        <w:ind w:left="1440" w:hanging="480"/>
-      </w:pPr>
-    </w:lvl>
-    <w:lvl w:ilvl="2">
-      <w:start w:val="9"/>
-      <w:numFmt w:val="decimal"/>
-      <w:lvlText w:val="%3."/>
-      <w:lvlJc w:val="left"/>
-      <w:pPr>
-        <w:ind w:left="2160" w:hanging="480"/>
-      </w:pPr>
-    </w:lvl>
-    <w:lvl w:ilvl="3">
-      <w:start w:val="9"/>
-      <w:numFmt w:val="decimal"/>
-      <w:lvlText w:val="%4."/>
-      <w:lvlJc w:val="left"/>
-      <w:pPr>
-        <w:ind w:left="2880" w:hanging="480"/>
-      </w:pPr>
-    </w:lvl>
-    <w:lvl w:ilvl="4">
-      <w:start w:val="9"/>
-      <w:numFmt w:val="decimal"/>
-      <w:lvlText w:val="%5."/>
-      <w:lvlJc w:val="left"/>
-      <w:pPr>
-        <w:ind w:left="3600" w:hanging="480"/>
-      </w:pPr>
-    </w:lvl>
-    <w:lvl w:ilvl="5">
-      <w:start w:val="9"/>
-      <w:numFmt w:val="decimal"/>
-      <w:lvlText w:val="%6."/>
-      <w:lvlJc w:val="left"/>
-      <w:pPr>
-        <w:ind w:left="4320" w:hanging="480"/>
-      </w:pPr>
-    </w:lvl>
-    <w:lvl w:ilvl="6">
-      <w:start w:val="9"/>
-      <w:numFmt w:val="decimal"/>
-      <w:lvlText w:val="%7."/>
-      <w:lvlJc w:val="left"/>
-      <w:pPr>
-        <w:ind w:left="5040" w:hanging="480"/>
-      </w:pPr>
-    </w:lvl>
-    <w:lvl w:ilvl="7">
-      <w:start w:val="9"/>
-      <w:numFmt w:val="decimal"/>
-      <w:lvlText w:val="%8."/>
-      <w:lvlJc w:val="left"/>
-      <w:pPr>
-        <w:ind w:left="5760" w:hanging="480"/>
-      </w:pPr>
-    </w:lvl>
-    <w:lvl w:ilvl="8">
-      <w:start w:val="9"/>
-      <w:numFmt w:val="decimal"/>
-      <w:lvlText w:val="%9."/>
-      <w:lvlJc w:val="left"/>
-      <w:pPr>
-        <w:ind w:left="6480" w:hanging="480"/>
-      </w:pPr>
-    </w:lvl>
-  </w:abstractNum>
-  <w:abstractNum w:abstractNumId="994110">
-    <w:nsid w:val="A994110"/>
-    <w:multiLevelType w:val="multilevel"/>
-    <w:lvl w:ilvl="0">
-      <w:start w:val="10"/>
-      <w:numFmt w:val="decimal"/>
-      <w:lvlText w:val="%1."/>
-      <w:lvlJc w:val="left"/>
-      <w:pPr>
-        <w:ind w:left="720" w:hanging="480"/>
-      </w:pPr>
-    </w:lvl>
-    <w:lvl w:ilvl="1">
-      <w:start w:val="10"/>
-      <w:numFmt w:val="decimal"/>
-      <w:lvlText w:val="%2."/>
-      <w:lvlJc w:val="left"/>
-      <w:pPr>
-        <w:ind w:left="1440" w:hanging="480"/>
-      </w:pPr>
-    </w:lvl>
-    <w:lvl w:ilvl="2">
-      <w:start w:val="10"/>
-      <w:numFmt w:val="decimal"/>
-      <w:lvlText w:val="%3."/>
-      <w:lvlJc w:val="left"/>
-      <w:pPr>
-        <w:ind w:left="2160" w:hanging="480"/>
-      </w:pPr>
-    </w:lvl>
-    <w:lvl w:ilvl="3">
-      <w:start w:val="10"/>
-      <w:numFmt w:val="decimal"/>
-      <w:lvlText w:val="%4."/>
-      <w:lvlJc w:val="left"/>
-      <w:pPr>
-        <w:ind w:left="2880" w:hanging="480"/>
-      </w:pPr>
-    </w:lvl>
-    <w:lvl w:ilvl="4">
-      <w:start w:val="10"/>
-      <w:numFmt w:val="decimal"/>
-      <w:lvlText w:val="%5."/>
-      <w:lvlJc w:val="left"/>
-      <w:pPr>
-        <w:ind w:left="3600" w:hanging="480"/>
-      </w:pPr>
-    </w:lvl>
-    <w:lvl w:ilvl="5">
-      <w:start w:val="10"/>
-      <w:numFmt w:val="decimal"/>
-      <w:lvlText w:val="%6."/>
-      <w:lvlJc w:val="left"/>
-      <w:pPr>
-        <w:ind w:left="4320" w:hanging="480"/>
-      </w:pPr>
-    </w:lvl>
-    <w:lvl w:ilvl="6">
-      <w:start w:val="10"/>
-      <w:numFmt w:val="decimal"/>
-      <w:lvlText w:val="%7."/>
-      <w:lvlJc w:val="left"/>
-      <w:pPr>
-        <w:ind w:left="5040" w:hanging="480"/>
-      </w:pPr>
-    </w:lvl>
-    <w:lvl w:ilvl="7">
-      <w:start w:val="10"/>
-      <w:numFmt w:val="decimal"/>
-      <w:lvlText w:val="%8."/>
-      <w:lvlJc w:val="left"/>
-      <w:pPr>
-        <w:ind w:left="5760" w:hanging="480"/>
-      </w:pPr>
-    </w:lvl>
-    <w:lvl w:ilvl="8">
-      <w:start w:val="10"/>
       <w:numFmt w:val="decimal"/>
       <w:lvlText w:val="%9."/>
       <w:lvlJc w:val="left"/>
@@ -19408,216 +19586,15 @@
     </w:lvlOverride>
   </w:num>
   <w:num w:numId="1003">
-    <w:abstractNumId w:val="99412"/>
-    <w:lvlOverride w:ilvl="0">
-      <w:startOverride w:val="2"/>
-    </w:lvlOverride>
-    <w:lvlOverride w:ilvl="1">
-      <w:startOverride w:val="2"/>
-    </w:lvlOverride>
-    <w:lvlOverride w:ilvl="2">
-      <w:startOverride w:val="2"/>
-    </w:lvlOverride>
-    <w:lvlOverride w:ilvl="3">
-      <w:startOverride w:val="2"/>
-    </w:lvlOverride>
-    <w:lvlOverride w:ilvl="4">
-      <w:startOverride w:val="2"/>
-    </w:lvlOverride>
-    <w:lvlOverride w:ilvl="5">
-      <w:startOverride w:val="2"/>
-    </w:lvlOverride>
-    <w:lvlOverride w:ilvl="6">
-      <w:startOverride w:val="2"/>
-    </w:lvlOverride>
-    <w:lvlOverride w:ilvl="7">
-      <w:startOverride w:val="2"/>
-    </w:lvlOverride>
-    <w:lvlOverride w:ilvl="8">
-      <w:startOverride w:val="2"/>
-    </w:lvlOverride>
+    <w:abstractNumId w:val="991"/>
   </w:num>
   <w:num w:numId="1004">
-    <w:abstractNumId w:val="99413"/>
-    <w:lvlOverride w:ilvl="0">
-      <w:startOverride w:val="3"/>
-    </w:lvlOverride>
-    <w:lvlOverride w:ilvl="1">
-      <w:startOverride w:val="3"/>
-    </w:lvlOverride>
-    <w:lvlOverride w:ilvl="2">
-      <w:startOverride w:val="3"/>
-    </w:lvlOverride>
-    <w:lvlOverride w:ilvl="3">
-      <w:startOverride w:val="3"/>
-    </w:lvlOverride>
-    <w:lvlOverride w:ilvl="4">
-      <w:startOverride w:val="3"/>
-    </w:lvlOverride>
-    <w:lvlOverride w:ilvl="5">
-      <w:startOverride w:val="3"/>
-    </w:lvlOverride>
-    <w:lvlOverride w:ilvl="6">
-      <w:startOverride w:val="3"/>
-    </w:lvlOverride>
-    <w:lvlOverride w:ilvl="7">
-      <w:startOverride w:val="3"/>
-    </w:lvlOverride>
-    <w:lvlOverride w:ilvl="8">
-      <w:startOverride w:val="3"/>
-    </w:lvlOverride>
+    <w:abstractNumId w:val="991"/>
   </w:num>
   <w:num w:numId="1005">
-    <w:abstractNumId w:val="99416"/>
-    <w:lvlOverride w:ilvl="0">
-      <w:startOverride w:val="6"/>
-    </w:lvlOverride>
-    <w:lvlOverride w:ilvl="1">
-      <w:startOverride w:val="6"/>
-    </w:lvlOverride>
-    <w:lvlOverride w:ilvl="2">
-      <w:startOverride w:val="6"/>
-    </w:lvlOverride>
-    <w:lvlOverride w:ilvl="3">
-      <w:startOverride w:val="6"/>
-    </w:lvlOverride>
-    <w:lvlOverride w:ilvl="4">
-      <w:startOverride w:val="6"/>
-    </w:lvlOverride>
-    <w:lvlOverride w:ilvl="5">
-      <w:startOverride w:val="6"/>
-    </w:lvlOverride>
-    <w:lvlOverride w:ilvl="6">
-      <w:startOverride w:val="6"/>
-    </w:lvlOverride>
-    <w:lvlOverride w:ilvl="7">
-      <w:startOverride w:val="6"/>
-    </w:lvlOverride>
-    <w:lvlOverride w:ilvl="8">
-      <w:startOverride w:val="6"/>
-    </w:lvlOverride>
+    <w:abstractNumId w:val="991"/>
   </w:num>
   <w:num w:numId="1006">
-    <w:abstractNumId w:val="99417"/>
-    <w:lvlOverride w:ilvl="0">
-      <w:startOverride w:val="7"/>
-    </w:lvlOverride>
-    <w:lvlOverride w:ilvl="1">
-      <w:startOverride w:val="7"/>
-    </w:lvlOverride>
-    <w:lvlOverride w:ilvl="2">
-      <w:startOverride w:val="7"/>
-    </w:lvlOverride>
-    <w:lvlOverride w:ilvl="3">
-      <w:startOverride w:val="7"/>
-    </w:lvlOverride>
-    <w:lvlOverride w:ilvl="4">
-      <w:startOverride w:val="7"/>
-    </w:lvlOverride>
-    <w:lvlOverride w:ilvl="5">
-      <w:startOverride w:val="7"/>
-    </w:lvlOverride>
-    <w:lvlOverride w:ilvl="6">
-      <w:startOverride w:val="7"/>
-    </w:lvlOverride>
-    <w:lvlOverride w:ilvl="7">
-      <w:startOverride w:val="7"/>
-    </w:lvlOverride>
-    <w:lvlOverride w:ilvl="8">
-      <w:startOverride w:val="7"/>
-    </w:lvlOverride>
-  </w:num>
-  <w:num w:numId="1007">
-    <w:abstractNumId w:val="99418"/>
-    <w:lvlOverride w:ilvl="0">
-      <w:startOverride w:val="8"/>
-    </w:lvlOverride>
-    <w:lvlOverride w:ilvl="1">
-      <w:startOverride w:val="8"/>
-    </w:lvlOverride>
-    <w:lvlOverride w:ilvl="2">
-      <w:startOverride w:val="8"/>
-    </w:lvlOverride>
-    <w:lvlOverride w:ilvl="3">
-      <w:startOverride w:val="8"/>
-    </w:lvlOverride>
-    <w:lvlOverride w:ilvl="4">
-      <w:startOverride w:val="8"/>
-    </w:lvlOverride>
-    <w:lvlOverride w:ilvl="5">
-      <w:startOverride w:val="8"/>
-    </w:lvlOverride>
-    <w:lvlOverride w:ilvl="6">
-      <w:startOverride w:val="8"/>
-    </w:lvlOverride>
-    <w:lvlOverride w:ilvl="7">
-      <w:startOverride w:val="8"/>
-    </w:lvlOverride>
-    <w:lvlOverride w:ilvl="8">
-      <w:startOverride w:val="8"/>
-    </w:lvlOverride>
-  </w:num>
-  <w:num w:numId="1008">
-    <w:abstractNumId w:val="99419"/>
-    <w:lvlOverride w:ilvl="0">
-      <w:startOverride w:val="9"/>
-    </w:lvlOverride>
-    <w:lvlOverride w:ilvl="1">
-      <w:startOverride w:val="9"/>
-    </w:lvlOverride>
-    <w:lvlOverride w:ilvl="2">
-      <w:startOverride w:val="9"/>
-    </w:lvlOverride>
-    <w:lvlOverride w:ilvl="3">
-      <w:startOverride w:val="9"/>
-    </w:lvlOverride>
-    <w:lvlOverride w:ilvl="4">
-      <w:startOverride w:val="9"/>
-    </w:lvlOverride>
-    <w:lvlOverride w:ilvl="5">
-      <w:startOverride w:val="9"/>
-    </w:lvlOverride>
-    <w:lvlOverride w:ilvl="6">
-      <w:startOverride w:val="9"/>
-    </w:lvlOverride>
-    <w:lvlOverride w:ilvl="7">
-      <w:startOverride w:val="9"/>
-    </w:lvlOverride>
-    <w:lvlOverride w:ilvl="8">
-      <w:startOverride w:val="9"/>
-    </w:lvlOverride>
-  </w:num>
-  <w:num w:numId="1009">
-    <w:abstractNumId w:val="994110"/>
-    <w:lvlOverride w:ilvl="0">
-      <w:startOverride w:val="10"/>
-    </w:lvlOverride>
-    <w:lvlOverride w:ilvl="1">
-      <w:startOverride w:val="10"/>
-    </w:lvlOverride>
-    <w:lvlOverride w:ilvl="2">
-      <w:startOverride w:val="10"/>
-    </w:lvlOverride>
-    <w:lvlOverride w:ilvl="3">
-      <w:startOverride w:val="10"/>
-    </w:lvlOverride>
-    <w:lvlOverride w:ilvl="4">
-      <w:startOverride w:val="10"/>
-    </w:lvlOverride>
-    <w:lvlOverride w:ilvl="5">
-      <w:startOverride w:val="10"/>
-    </w:lvlOverride>
-    <w:lvlOverride w:ilvl="6">
-      <w:startOverride w:val="10"/>
-    </w:lvlOverride>
-    <w:lvlOverride w:ilvl="7">
-      <w:startOverride w:val="10"/>
-    </w:lvlOverride>
-    <w:lvlOverride w:ilvl="8">
-      <w:startOverride w:val="10"/>
-    </w:lvlOverride>
-  </w:num>
-  <w:num w:numId="1010">
     <w:abstractNumId w:val="99411"/>
     <w:lvlOverride w:ilvl="0">
       <w:startOverride w:val="1"/>
@@ -19647,16 +19624,22 @@
       <w:startOverride w:val="1"/>
     </w:lvlOverride>
   </w:num>
+  <w:num w:numId="1007">
+    <w:abstractNumId w:val="991"/>
+  </w:num>
+  <w:num w:numId="1008">
+    <w:abstractNumId w:val="991"/>
+  </w:num>
+  <w:num w:numId="1009">
+    <w:abstractNumId w:val="991"/>
+  </w:num>
+  <w:num w:numId="1010">
+    <w:abstractNumId w:val="991"/>
+  </w:num>
   <w:num w:numId="1011">
     <w:abstractNumId w:val="991"/>
   </w:num>
   <w:num w:numId="1012">
-    <w:abstractNumId w:val="991"/>
-  </w:num>
-  <w:num w:numId="1013">
-    <w:abstractNumId w:val="991"/>
-  </w:num>
-  <w:num w:numId="1014">
     <w:abstractNumId w:val="99411"/>
     <w:lvlOverride w:ilvl="0">
       <w:startOverride w:val="1"/>
@@ -19686,52 +19669,7 @@
       <w:startOverride w:val="1"/>
     </w:lvlOverride>
   </w:num>
-  <w:num w:numId="1015">
-    <w:abstractNumId w:val="991"/>
-  </w:num>
-  <w:num w:numId="1016">
-    <w:abstractNumId w:val="991"/>
-  </w:num>
-  <w:num w:numId="1017">
-    <w:abstractNumId w:val="991"/>
-  </w:num>
-  <w:num w:numId="1018">
-    <w:abstractNumId w:val="991"/>
-  </w:num>
-  <w:num w:numId="1019">
-    <w:abstractNumId w:val="991"/>
-  </w:num>
-  <w:num w:numId="1020">
-    <w:abstractNumId w:val="99411"/>
-    <w:lvlOverride w:ilvl="0">
-      <w:startOverride w:val="1"/>
-    </w:lvlOverride>
-    <w:lvlOverride w:ilvl="1">
-      <w:startOverride w:val="1"/>
-    </w:lvlOverride>
-    <w:lvlOverride w:ilvl="2">
-      <w:startOverride w:val="1"/>
-    </w:lvlOverride>
-    <w:lvlOverride w:ilvl="3">
-      <w:startOverride w:val="1"/>
-    </w:lvlOverride>
-    <w:lvlOverride w:ilvl="4">
-      <w:startOverride w:val="1"/>
-    </w:lvlOverride>
-    <w:lvlOverride w:ilvl="5">
-      <w:startOverride w:val="1"/>
-    </w:lvlOverride>
-    <w:lvlOverride w:ilvl="6">
-      <w:startOverride w:val="1"/>
-    </w:lvlOverride>
-    <w:lvlOverride w:ilvl="7">
-      <w:startOverride w:val="1"/>
-    </w:lvlOverride>
-    <w:lvlOverride w:ilvl="8">
-      <w:startOverride w:val="1"/>
-    </w:lvlOverride>
-  </w:num>
-  <w:num w:numId="1021">
+  <w:num w:numId="1013">
     <w:abstractNumId w:val="99411"/>
     <w:lvlOverride w:ilvl="0">
       <w:startOverride w:val="1"/>

</xml_diff>

<commit_message>
Add uncleaned-data condition and platform-masking sections to the PBL report
Co-Authored-By: Claude Sonnet 5.5 <noreply@anthropic.com>
Claude-Session: https://claude.ai/code/session_01CcRevgLHUMr7Kjzc4fTXg4
</commit_message>
<xml_diff>
--- a/reports/pbl/pbl_report.docx
+++ b/reports/pbl/pbl_report.docx
@@ -578,7 +578,7 @@
         <w:pStyle w:val="BodyText"/>
       </w:pPr>
       <w:r>
-        <w:t xml:space="preserve">In Part I, the median score falls from 0.977 on raw URLs to 0.850 when a URL is reduced to its domain, and the fall appears in 100% of settings; transfer to datasets that share no source stays above chance. Source dependence holds in part (76% of settings) and the gap in false alarms on naturally browsed legitimate pages holds in part (76%): at the 1% threshold 15.2% of those pages are flagged against 1.0% on the model’s own test side. The share of the fall that sits in the host name does not hold across cells and depends on how the benchmark is prepared, and the larger split-to-split spread of the normalised score does not hold. The effect of masking hosting platforms could not be tested. Each result is stated as behaviour under one frozen design, not as a general claim.</w:t>
+        <w:t xml:space="preserve">In Part I, the median score falls from 0.977 on raw URLs to 0.850 when a URL is reduced to its domain, and the fall appears in 100% of settings; transfer to datasets that share no source stays above chance. Source dependence holds in part (76% of settings) and the gap in false alarms on naturally browsed legitimate pages holds in part (76%): at the 1% threshold 15.2% of those pages are flagged against 1.0% on the model’s own test side. The share of the fall that sits in the host name does not hold across cells and depends on how the benchmark is prepared, and the larger split-to-split spread of the normalised score does not hold. Masking hosting platforms showed no measurable effect in an exploratory test (Section 4.14), and a second condition without the data cleaning changes the answers to some questions (Section 4.13). Each result is stated as behaviour under one frozen design, not as a general claim.</w:t>
       </w:r>
     </w:p>
     <w:bookmarkEnd w:id="24"/>
@@ -2151,7 +2151,7 @@
     </w:p>
     <w:bookmarkEnd w:id="40"/>
     <w:bookmarkEnd w:id="41"/>
-    <w:bookmarkStart w:id="88" w:name="part-i-results"/>
+    <w:bookmarkStart w:id="90" w:name="part-i-results"/>
     <w:p>
       <w:pPr>
         <w:pStyle w:val="Heading1"/>
@@ -6775,13 +6775,1836 @@
       </w:r>
     </w:p>
     <w:bookmarkEnd w:id="86"/>
-    <w:bookmarkStart w:id="87" w:name="what-can-and-cannot-be-claimed"/>
+    <w:bookmarkStart w:id="87" w:name="X8df0bda2d0692696ae74dfc5c70ee2b43ff4e2b"/>
     <w:p>
       <w:pPr>
         <w:pStyle w:val="Heading2"/>
       </w:pPr>
       <w:r>
-        <w:t xml:space="preserve">4.13 What can and cannot be claimed</w:t>
+        <w:t xml:space="preserve">4.13 A second condition: data prepared without the cleaning</w:t>
+      </w:r>
+    </w:p>
+    <w:p>
+      <w:pPr>
+        <w:pStyle w:val="FirstParagraph"/>
+      </w:pPr>
+      <w:r>
+        <w:t xml:space="preserve">Questions 2 and 4 and the interaction check did not hold in the main design. The main design cleans its data: it caps URLs per registrable domain, removes domains shared by several phishing sources and balances URL depth. Before any result was seen, a second condition was written down in</w:t>
+      </w:r>
+      <w:r>
+        <w:t xml:space="preserve"> </w:t>
+      </w:r>
+      <w:r>
+        <w:rPr>
+          <w:rStyle w:val="VerbatimChar"/>
+        </w:rPr>
+        <w:t xml:space="preserve">docs/PHISHGUARD_SENSITIVITY_PLAN.md</w:t>
+      </w:r>
+      <w:r>
+        <w:t xml:space="preserve"> </w:t>
+      </w:r>
+      <w:r>
+        <w:t xml:space="preserve">that rebuilds the same populations</w:t>
+      </w:r>
+      <w:r>
+        <w:t xml:space="preserve"> </w:t>
+      </w:r>
+      <w:r>
+        <w:rPr>
+          <w:iCs/>
+          <w:i/>
+        </w:rPr>
+        <w:t xml:space="preserve">without</w:t>
+      </w:r>
+      <w:r>
+        <w:t xml:space="preserve"> </w:t>
+      </w:r>
+      <w:r>
+        <w:t xml:space="preserve">that cleaning (only exact duplicates and URLs labelled both ways are removed; each population is sampled to at most 10,000 URLs per class). Models, splits, bootstrap, the rule for</w:t>
+      </w:r>
+      <w:r>
+        <w:t xml:space="preserve"> </w:t>
+      </w:r>
+      <w:r>
+        <w:t xml:space="preserve">“</w:t>
+      </w:r>
+      <w:r>
+        <w:t xml:space="preserve">holds</w:t>
+      </w:r>
+      <w:r>
+        <w:t xml:space="preserve">”</w:t>
+      </w:r>
+      <w:r>
+        <w:t xml:space="preserve"> </w:t>
+      </w:r>
+      <w:r>
+        <w:t xml:space="preserve">and its cut-offs are unchanged. The crawled legitimate population cannot be rebuilt without the cleaning, so both conditions are compared on the same 20 cells (five phishing sources by four legitimate sources). The comparison was run once; nothing was changed after seeing it.</w:t>
+      </w:r>
+    </w:p>
+    <w:tbl>
+      <w:tblPr>
+        <w:tblStyle w:val="Table"/>
+        <w:tblW w:type="pct" w:w="5000"/>
+        <w:tblLook w:firstRow="1" w:lastRow="0" w:firstColumn="0" w:lastColumn="0" w:noHBand="0" w:noVBand="0" w:val="0020"/>
+        <w:jc w:val="start"/>
+      </w:tblPr>
+      <w:tblGrid>
+        <w:gridCol w:w="2640"/>
+        <w:gridCol w:w="2640"/>
+        <w:gridCol w:w="2640"/>
+      </w:tblGrid>
+      <w:tr>
+        <w:trPr>
+          <w:tblHeader w:val="true"/>
+        </w:trPr>
+        <w:tc>
+          <w:tcPr/>
+          <w:p>
+            <w:pPr>
+              <w:pStyle w:val="Compact"/>
+              <w:jc w:val="left"/>
+            </w:pPr>
+            <w:r>
+              <w:t xml:space="preserve">Question</w:t>
+            </w:r>
+          </w:p>
+        </w:tc>
+        <w:tc>
+          <w:tcPr/>
+          <w:p>
+            <w:pPr>
+              <w:pStyle w:val="Compact"/>
+              <w:jc w:val="left"/>
+            </w:pPr>
+            <w:r>
+              <w:t xml:space="preserve">Cleaned data (same 20 cells)</w:t>
+            </w:r>
+          </w:p>
+        </w:tc>
+        <w:tc>
+          <w:tcPr/>
+          <w:p>
+            <w:pPr>
+              <w:pStyle w:val="Compact"/>
+              <w:jc w:val="left"/>
+            </w:pPr>
+            <w:r>
+              <w:t xml:space="preserve">Without the cleaning</w:t>
+            </w:r>
+          </w:p>
+        </w:tc>
+      </w:tr>
+      <w:tr>
+        <w:tc>
+          <w:tcPr/>
+          <w:p>
+            <w:pPr>
+              <w:pStyle w:val="Compact"/>
+              <w:jc w:val="left"/>
+            </w:pPr>
+            <w:r>
+              <w:t xml:space="preserve">Q1</w:t>
+            </w:r>
+          </w:p>
+        </w:tc>
+        <w:tc>
+          <w:tcPr/>
+          <w:p>
+            <w:pPr>
+              <w:pStyle w:val="Compact"/>
+              <w:jc w:val="left"/>
+            </w:pPr>
+            <w:r>
+              <w:t xml:space="preserve">holds (80 of 80, 100%)</w:t>
+            </w:r>
+          </w:p>
+        </w:tc>
+        <w:tc>
+          <w:tcPr/>
+          <w:p>
+            <w:pPr>
+              <w:pStyle w:val="Compact"/>
+              <w:jc w:val="left"/>
+            </w:pPr>
+            <w:r>
+              <w:t xml:space="preserve">holds (79 of 80, 99%)</w:t>
+            </w:r>
+          </w:p>
+        </w:tc>
+      </w:tr>
+      <w:tr>
+        <w:tc>
+          <w:tcPr/>
+          <w:p>
+            <w:pPr>
+              <w:pStyle w:val="Compact"/>
+              <w:jc w:val="left"/>
+            </w:pPr>
+            <w:r>
+              <w:t xml:space="preserve">Q2</w:t>
+            </w:r>
+          </w:p>
+        </w:tc>
+        <w:tc>
+          <w:tcPr/>
+          <w:p>
+            <w:pPr>
+              <w:pStyle w:val="Compact"/>
+              <w:jc w:val="left"/>
+            </w:pPr>
+            <w:r>
+              <w:t xml:space="preserve">does not hold (0 of 80, 0%)</w:t>
+            </w:r>
+          </w:p>
+        </w:tc>
+        <w:tc>
+          <w:tcPr/>
+          <w:p>
+            <w:pPr>
+              <w:pStyle w:val="Compact"/>
+              <w:jc w:val="left"/>
+            </w:pPr>
+            <w:r>
+              <w:t xml:space="preserve">does not hold (0 of 80, 0%)</w:t>
+            </w:r>
+          </w:p>
+        </w:tc>
+      </w:tr>
+      <w:tr>
+        <w:tc>
+          <w:tcPr/>
+          <w:p>
+            <w:pPr>
+              <w:pStyle w:val="Compact"/>
+              <w:jc w:val="left"/>
+            </w:pPr>
+            <w:r>
+              <w:t xml:space="preserve">Q3</w:t>
+            </w:r>
+          </w:p>
+        </w:tc>
+        <w:tc>
+          <w:tcPr/>
+          <w:p>
+            <w:pPr>
+              <w:pStyle w:val="Compact"/>
+              <w:jc w:val="left"/>
+            </w:pPr>
+            <w:r>
+              <w:t xml:space="preserve">holds (232 of 280, 83%)</w:t>
+            </w:r>
+          </w:p>
+        </w:tc>
+        <w:tc>
+          <w:tcPr/>
+          <w:p>
+            <w:pPr>
+              <w:pStyle w:val="Compact"/>
+              <w:jc w:val="left"/>
+            </w:pPr>
+            <w:r>
+              <w:t xml:space="preserve">does not hold (27 of 280, 10%)</w:t>
+            </w:r>
+          </w:p>
+        </w:tc>
+      </w:tr>
+      <w:tr>
+        <w:tc>
+          <w:tcPr/>
+          <w:p>
+            <w:pPr>
+              <w:pStyle w:val="Compact"/>
+              <w:jc w:val="left"/>
+            </w:pPr>
+            <w:r>
+              <w:t xml:space="preserve">Q4</w:t>
+            </w:r>
+          </w:p>
+        </w:tc>
+        <w:tc>
+          <w:tcPr/>
+          <w:p>
+            <w:pPr>
+              <w:pStyle w:val="Compact"/>
+              <w:jc w:val="left"/>
+            </w:pPr>
+            <w:r>
+              <w:t xml:space="preserve">does not hold (31 of 80, 39%)</w:t>
+            </w:r>
+          </w:p>
+        </w:tc>
+        <w:tc>
+          <w:tcPr/>
+          <w:p>
+            <w:pPr>
+              <w:pStyle w:val="Compact"/>
+              <w:jc w:val="left"/>
+            </w:pPr>
+            <w:r>
+              <w:t xml:space="preserve">holds in part (55 of 80, 69%)</w:t>
+            </w:r>
+          </w:p>
+        </w:tc>
+      </w:tr>
+      <w:tr>
+        <w:tc>
+          <w:tcPr/>
+          <w:p>
+            <w:pPr>
+              <w:pStyle w:val="Compact"/>
+              <w:jc w:val="left"/>
+            </w:pPr>
+            <w:r>
+              <w:t xml:space="preserve">interaction</w:t>
+            </w:r>
+          </w:p>
+        </w:tc>
+        <w:tc>
+          <w:tcPr/>
+          <w:p>
+            <w:pPr>
+              <w:pStyle w:val="Compact"/>
+              <w:jc w:val="left"/>
+            </w:pPr>
+            <w:r>
+              <w:t xml:space="preserve">does not hold (78 of 240, 32%)</w:t>
+            </w:r>
+          </w:p>
+        </w:tc>
+        <w:tc>
+          <w:tcPr/>
+          <w:p>
+            <w:pPr>
+              <w:pStyle w:val="Compact"/>
+              <w:jc w:val="left"/>
+            </w:pPr>
+            <w:r>
+              <w:t xml:space="preserve">does not hold (0 of 240, 0%)</w:t>
+            </w:r>
+          </w:p>
+        </w:tc>
+      </w:tr>
+    </w:tbl>
+    <w:p>
+      <w:pPr>
+        <w:pStyle w:val="BodyText"/>
+      </w:pPr>
+      <w:r>
+        <w:t xml:space="preserve">The median score of the 20 cells is 0.976 on raw URLs and 0.857 on domain-only URLs with the cleaning, against 0.982 and 0.862 without it (the table below lists every cell). Source:</w:t>
+      </w:r>
+      <w:r>
+        <w:t xml:space="preserve"> </w:t>
+      </w:r>
+      <w:r>
+        <w:rPr>
+          <w:rStyle w:val="VerbatimChar"/>
+        </w:rPr>
+        <w:t xml:space="preserve">reports/phishguard/sensitivity_uncleaned.md</w:t>
+      </w:r>
+      <w:r>
+        <w:t xml:space="preserve">.</w:t>
+      </w:r>
+    </w:p>
+    <w:p>
+      <w:pPr>
+        <w:pStyle w:val="BodyText"/>
+      </w:pPr>
+      <w:r>
+        <w:rPr>
+          <w:bCs/>
+          <w:b/>
+        </w:rPr>
+        <w:t xml:space="preserve">What this shows.</w:t>
+      </w:r>
+    </w:p>
+    <w:p>
+      <w:pPr>
+        <w:numPr>
+          <w:ilvl w:val="0"/>
+          <w:numId w:val="1006"/>
+        </w:numPr>
+        <w:pStyle w:val="Compact"/>
+      </w:pPr>
+      <w:r>
+        <w:t xml:space="preserve">Question 1 holds in both conditions.</w:t>
+      </w:r>
+    </w:p>
+    <w:p>
+      <w:pPr>
+        <w:numPr>
+          <w:ilvl w:val="0"/>
+          <w:numId w:val="1006"/>
+        </w:numPr>
+        <w:pStyle w:val="Compact"/>
+      </w:pPr>
+      <w:r>
+        <w:t xml:space="preserve">Question 2 (how much of the fall sits in the host name) does not hold in either, so it is not explained by the cleaning.</w:t>
+      </w:r>
+    </w:p>
+    <w:p>
+      <w:pPr>
+        <w:numPr>
+          <w:ilvl w:val="0"/>
+          <w:numId w:val="1006"/>
+        </w:numPr>
+        <w:pStyle w:val="Compact"/>
+      </w:pPr>
+      <w:r>
+        <w:t xml:space="preserve">Question 4 (the spread of the domain-only score across splits) does not hold with the cleaning and holds in part without it, so it depends on how the data is prepared.</w:t>
+      </w:r>
+    </w:p>
+    <w:p>
+      <w:pPr>
+        <w:numPr>
+          <w:ilvl w:val="0"/>
+          <w:numId w:val="1006"/>
+        </w:numPr>
+        <w:pStyle w:val="Compact"/>
+      </w:pPr>
+      <w:r>
+        <w:t xml:space="preserve">Question 3 (source dependence) is the reverse: it holds with the cleaning (232 of 280 settings in these 20 cells) and does not hold without it (27 of 280). The cleaning is part of what makes the source effect show up, so Question 3 is a result of the cleaned design and should be reported that way.</w:t>
+      </w:r>
+    </w:p>
+    <w:p>
+      <w:pPr>
+        <w:numPr>
+          <w:ilvl w:val="0"/>
+          <w:numId w:val="1006"/>
+        </w:numPr>
+        <w:pStyle w:val="Compact"/>
+      </w:pPr>
+      <w:r>
+        <w:t xml:space="preserve">The interaction check does not hold in either condition.</w:t>
+      </w:r>
+    </w:p>
+    <w:p>
+      <w:pPr>
+        <w:pStyle w:val="FirstParagraph"/>
+      </w:pPr>
+      <w:r>
+        <w:t xml:space="preserve">The honest summary is that the answers to Questions 3 and 4 depend on how the benchmark is prepared, in opposite directions. Neither condition is the</w:t>
+      </w:r>
+      <w:r>
+        <w:t xml:space="preserve"> </w:t>
+      </w:r>
+      <w:r>
+        <w:t xml:space="preserve">“</w:t>
+      </w:r>
+      <w:r>
+        <w:t xml:space="preserve">true</w:t>
+      </w:r>
+      <w:r>
+        <w:t xml:space="preserve">”</w:t>
+      </w:r>
+      <w:r>
+        <w:t xml:space="preserve"> </w:t>
+      </w:r>
+      <w:r>
+        <w:t xml:space="preserve">one; both are reported.</w:t>
+      </w:r>
+    </w:p>
+    <w:tbl>
+      <w:tblPr>
+        <w:tblStyle w:val="Table"/>
+        <w:tblW w:type="auto" w:w="0"/>
+        <w:tblLook w:firstRow="1" w:lastRow="0" w:firstColumn="0" w:lastColumn="0" w:noHBand="0" w:noVBand="0" w:val="0020"/>
+        <w:jc w:val="start"/>
+      </w:tblPr>
+      <w:tblGrid>
+        <w:gridCol w:w="1584"/>
+        <w:gridCol w:w="1584"/>
+        <w:gridCol w:w="1584"/>
+        <w:gridCol w:w="1584"/>
+        <w:gridCol w:w="1584"/>
+      </w:tblGrid>
+      <w:tr>
+        <w:trPr>
+          <w:tblHeader w:val="true"/>
+        </w:trPr>
+        <w:tc>
+          <w:tcPr/>
+          <w:p>
+            <w:pPr>
+              <w:pStyle w:val="Compact"/>
+              <w:jc w:val="left"/>
+            </w:pPr>
+            <w:r>
+              <w:t xml:space="preserve">Cell</w:t>
+            </w:r>
+          </w:p>
+        </w:tc>
+        <w:tc>
+          <w:tcPr/>
+          <w:p>
+            <w:pPr>
+              <w:pStyle w:val="Compact"/>
+              <w:jc w:val="left"/>
+            </w:pPr>
+            <w:r>
+              <w:t xml:space="preserve">Cleaned R1</w:t>
+            </w:r>
+          </w:p>
+        </w:tc>
+        <w:tc>
+          <w:tcPr/>
+          <w:p>
+            <w:pPr>
+              <w:pStyle w:val="Compact"/>
+              <w:jc w:val="left"/>
+            </w:pPr>
+            <w:r>
+              <w:t xml:space="preserve">Cleaned R4</w:t>
+            </w:r>
+          </w:p>
+        </w:tc>
+        <w:tc>
+          <w:tcPr/>
+          <w:p>
+            <w:pPr>
+              <w:pStyle w:val="Compact"/>
+              <w:jc w:val="left"/>
+            </w:pPr>
+            <w:r>
+              <w:t xml:space="preserve">Uncleaned R1</w:t>
+            </w:r>
+          </w:p>
+        </w:tc>
+        <w:tc>
+          <w:tcPr/>
+          <w:p>
+            <w:pPr>
+              <w:pStyle w:val="Compact"/>
+              <w:jc w:val="left"/>
+            </w:pPr>
+            <w:r>
+              <w:t xml:space="preserve">Uncleaned R4</w:t>
+            </w:r>
+          </w:p>
+        </w:tc>
+      </w:tr>
+      <w:tr>
+        <w:tc>
+          <w:tcPr/>
+          <w:p>
+            <w:pPr>
+              <w:pStyle w:val="Compact"/>
+              <w:jc w:val="left"/>
+            </w:pPr>
+            <w:r>
+              <w:t xml:space="preserve">phishpedia__phishstorm</w:t>
+            </w:r>
+          </w:p>
+        </w:tc>
+        <w:tc>
+          <w:tcPr/>
+          <w:p>
+            <w:pPr>
+              <w:pStyle w:val="Compact"/>
+              <w:jc w:val="left"/>
+            </w:pPr>
+            <w:r>
+              <w:t xml:space="preserve">0.975</w:t>
+            </w:r>
+          </w:p>
+        </w:tc>
+        <w:tc>
+          <w:tcPr/>
+          <w:p>
+            <w:pPr>
+              <w:pStyle w:val="Compact"/>
+              <w:jc w:val="left"/>
+            </w:pPr>
+            <w:r>
+              <w:t xml:space="preserve">0.831</w:t>
+            </w:r>
+          </w:p>
+        </w:tc>
+        <w:tc>
+          <w:tcPr/>
+          <w:p>
+            <w:pPr>
+              <w:pStyle w:val="Compact"/>
+              <w:jc w:val="left"/>
+            </w:pPr>
+            <w:r>
+              <w:t xml:space="preserve">0.981</w:t>
+            </w:r>
+          </w:p>
+        </w:tc>
+        <w:tc>
+          <w:tcPr/>
+          <w:p>
+            <w:pPr>
+              <w:pStyle w:val="Compact"/>
+              <w:jc w:val="left"/>
+            </w:pPr>
+            <w:r>
+              <w:t xml:space="preserve">0.886</w:t>
+            </w:r>
+          </w:p>
+        </w:tc>
+      </w:tr>
+      <w:tr>
+        <w:tc>
+          <w:tcPr/>
+          <w:p>
+            <w:pPr>
+              <w:pStyle w:val="Compact"/>
+              <w:jc w:val="left"/>
+            </w:pPr>
+            <w:r>
+              <w:t xml:space="preserve">phishpedia__phiusiil</w:t>
+            </w:r>
+          </w:p>
+        </w:tc>
+        <w:tc>
+          <w:tcPr/>
+          <w:p>
+            <w:pPr>
+              <w:pStyle w:val="Compact"/>
+              <w:jc w:val="left"/>
+            </w:pPr>
+            <w:r>
+              <w:t xml:space="preserve">0.998</w:t>
+            </w:r>
+          </w:p>
+        </w:tc>
+        <w:tc>
+          <w:tcPr/>
+          <w:p>
+            <w:pPr>
+              <w:pStyle w:val="Compact"/>
+              <w:jc w:val="left"/>
+            </w:pPr>
+            <w:r>
+              <w:t xml:space="preserve">0.727</w:t>
+            </w:r>
+          </w:p>
+        </w:tc>
+        <w:tc>
+          <w:tcPr/>
+          <w:p>
+            <w:pPr>
+              <w:pStyle w:val="Compact"/>
+              <w:jc w:val="left"/>
+            </w:pPr>
+            <w:r>
+              <w:t xml:space="preserve">0.996</w:t>
+            </w:r>
+          </w:p>
+        </w:tc>
+        <w:tc>
+          <w:tcPr/>
+          <w:p>
+            <w:pPr>
+              <w:pStyle w:val="Compact"/>
+              <w:jc w:val="left"/>
+            </w:pPr>
+            <w:r>
+              <w:t xml:space="preserve">0.773</w:t>
+            </w:r>
+          </w:p>
+        </w:tc>
+      </w:tr>
+      <w:tr>
+        <w:tc>
+          <w:tcPr/>
+          <w:p>
+            <w:pPr>
+              <w:pStyle w:val="Compact"/>
+              <w:jc w:val="left"/>
+            </w:pPr>
+            <w:r>
+              <w:t xml:space="preserve">phishpedia__phreshphish</w:t>
+            </w:r>
+          </w:p>
+        </w:tc>
+        <w:tc>
+          <w:tcPr/>
+          <w:p>
+            <w:pPr>
+              <w:pStyle w:val="Compact"/>
+              <w:jc w:val="left"/>
+            </w:pPr>
+            <w:r>
+              <w:t xml:space="preserve">0.968</w:t>
+            </w:r>
+          </w:p>
+        </w:tc>
+        <w:tc>
+          <w:tcPr/>
+          <w:p>
+            <w:pPr>
+              <w:pStyle w:val="Compact"/>
+              <w:jc w:val="left"/>
+            </w:pPr>
+            <w:r>
+              <w:t xml:space="preserve">0.769</w:t>
+            </w:r>
+          </w:p>
+        </w:tc>
+        <w:tc>
+          <w:tcPr/>
+          <w:p>
+            <w:pPr>
+              <w:pStyle w:val="Compact"/>
+              <w:jc w:val="left"/>
+            </w:pPr>
+            <w:r>
+              <w:t xml:space="preserve">0.970</w:t>
+            </w:r>
+          </w:p>
+        </w:tc>
+        <w:tc>
+          <w:tcPr/>
+          <w:p>
+            <w:pPr>
+              <w:pStyle w:val="Compact"/>
+              <w:jc w:val="left"/>
+            </w:pPr>
+            <w:r>
+              <w:t xml:space="preserve">0.837</w:t>
+            </w:r>
+          </w:p>
+        </w:tc>
+      </w:tr>
+      <w:tr>
+        <w:tc>
+          <w:tcPr/>
+          <w:p>
+            <w:pPr>
+              <w:pStyle w:val="Compact"/>
+              <w:jc w:val="left"/>
+            </w:pPr>
+            <w:r>
+              <w:t xml:space="preserve">phishpedia__urlphish</w:t>
+            </w:r>
+          </w:p>
+        </w:tc>
+        <w:tc>
+          <w:tcPr/>
+          <w:p>
+            <w:pPr>
+              <w:pStyle w:val="Compact"/>
+              <w:jc w:val="left"/>
+            </w:pPr>
+            <w:r>
+              <w:t xml:space="preserve">0.993</w:t>
+            </w:r>
+          </w:p>
+        </w:tc>
+        <w:tc>
+          <w:tcPr/>
+          <w:p>
+            <w:pPr>
+              <w:pStyle w:val="Compact"/>
+              <w:jc w:val="left"/>
+            </w:pPr>
+            <w:r>
+              <w:t xml:space="preserve">0.872</w:t>
+            </w:r>
+          </w:p>
+        </w:tc>
+        <w:tc>
+          <w:tcPr/>
+          <w:p>
+            <w:pPr>
+              <w:pStyle w:val="Compact"/>
+              <w:jc w:val="left"/>
+            </w:pPr>
+            <w:r>
+              <w:t xml:space="preserve">0.994</w:t>
+            </w:r>
+          </w:p>
+        </w:tc>
+        <w:tc>
+          <w:tcPr/>
+          <w:p>
+            <w:pPr>
+              <w:pStyle w:val="Compact"/>
+              <w:jc w:val="left"/>
+            </w:pPr>
+            <w:r>
+              <w:t xml:space="preserve">0.893</w:t>
+            </w:r>
+          </w:p>
+        </w:tc>
+      </w:tr>
+      <w:tr>
+        <w:tc>
+          <w:tcPr/>
+          <w:p>
+            <w:pPr>
+              <w:pStyle w:val="Compact"/>
+              <w:jc w:val="left"/>
+            </w:pPr>
+            <w:r>
+              <w:t xml:space="preserve">phishstorm__phishstorm</w:t>
+            </w:r>
+          </w:p>
+        </w:tc>
+        <w:tc>
+          <w:tcPr/>
+          <w:p>
+            <w:pPr>
+              <w:pStyle w:val="Compact"/>
+              <w:jc w:val="left"/>
+            </w:pPr>
+            <w:r>
+              <w:t xml:space="preserve">0.972</w:t>
+            </w:r>
+          </w:p>
+        </w:tc>
+        <w:tc>
+          <w:tcPr/>
+          <w:p>
+            <w:pPr>
+              <w:pStyle w:val="Compact"/>
+              <w:jc w:val="left"/>
+            </w:pPr>
+            <w:r>
+              <w:t xml:space="preserve">0.798</w:t>
+            </w:r>
+          </w:p>
+        </w:tc>
+        <w:tc>
+          <w:tcPr/>
+          <w:p>
+            <w:pPr>
+              <w:pStyle w:val="Compact"/>
+              <w:jc w:val="left"/>
+            </w:pPr>
+            <w:r>
+              <w:t xml:space="preserve">0.968</w:t>
+            </w:r>
+          </w:p>
+        </w:tc>
+        <w:tc>
+          <w:tcPr/>
+          <w:p>
+            <w:pPr>
+              <w:pStyle w:val="Compact"/>
+              <w:jc w:val="left"/>
+            </w:pPr>
+            <w:r>
+              <w:t xml:space="preserve">0.821</w:t>
+            </w:r>
+          </w:p>
+        </w:tc>
+      </w:tr>
+      <w:tr>
+        <w:tc>
+          <w:tcPr/>
+          <w:p>
+            <w:pPr>
+              <w:pStyle w:val="Compact"/>
+              <w:jc w:val="left"/>
+            </w:pPr>
+            <w:r>
+              <w:t xml:space="preserve">phishstorm__phiusiil</w:t>
+            </w:r>
+          </w:p>
+        </w:tc>
+        <w:tc>
+          <w:tcPr/>
+          <w:p>
+            <w:pPr>
+              <w:pStyle w:val="Compact"/>
+              <w:jc w:val="left"/>
+            </w:pPr>
+            <w:r>
+              <w:t xml:space="preserve">0.995</w:t>
+            </w:r>
+          </w:p>
+        </w:tc>
+        <w:tc>
+          <w:tcPr/>
+          <w:p>
+            <w:pPr>
+              <w:pStyle w:val="Compact"/>
+              <w:jc w:val="left"/>
+            </w:pPr>
+            <w:r>
+              <w:t xml:space="preserve">0.725</w:t>
+            </w:r>
+          </w:p>
+        </w:tc>
+        <w:tc>
+          <w:tcPr/>
+          <w:p>
+            <w:pPr>
+              <w:pStyle w:val="Compact"/>
+              <w:jc w:val="left"/>
+            </w:pPr>
+            <w:r>
+              <w:t xml:space="preserve">0.995</w:t>
+            </w:r>
+          </w:p>
+        </w:tc>
+        <w:tc>
+          <w:tcPr/>
+          <w:p>
+            <w:pPr>
+              <w:pStyle w:val="Compact"/>
+              <w:jc w:val="left"/>
+            </w:pPr>
+            <w:r>
+              <w:t xml:space="preserve">0.742</w:t>
+            </w:r>
+          </w:p>
+        </w:tc>
+      </w:tr>
+      <w:tr>
+        <w:tc>
+          <w:tcPr/>
+          <w:p>
+            <w:pPr>
+              <w:pStyle w:val="Compact"/>
+              <w:jc w:val="left"/>
+            </w:pPr>
+            <w:r>
+              <w:t xml:space="preserve">phishstorm__phreshphish</w:t>
+            </w:r>
+          </w:p>
+        </w:tc>
+        <w:tc>
+          <w:tcPr/>
+          <w:p>
+            <w:pPr>
+              <w:pStyle w:val="Compact"/>
+              <w:jc w:val="left"/>
+            </w:pPr>
+            <w:r>
+              <w:t xml:space="preserve">0.978</w:t>
+            </w:r>
+          </w:p>
+        </w:tc>
+        <w:tc>
+          <w:tcPr/>
+          <w:p>
+            <w:pPr>
+              <w:pStyle w:val="Compact"/>
+              <w:jc w:val="left"/>
+            </w:pPr>
+            <w:r>
+              <w:t xml:space="preserve">0.776</w:t>
+            </w:r>
+          </w:p>
+        </w:tc>
+        <w:tc>
+          <w:tcPr/>
+          <w:p>
+            <w:pPr>
+              <w:pStyle w:val="Compact"/>
+              <w:jc w:val="left"/>
+            </w:pPr>
+            <w:r>
+              <w:t xml:space="preserve">0.976</w:t>
+            </w:r>
+          </w:p>
+        </w:tc>
+        <w:tc>
+          <w:tcPr/>
+          <w:p>
+            <w:pPr>
+              <w:pStyle w:val="Compact"/>
+              <w:jc w:val="left"/>
+            </w:pPr>
+            <w:r>
+              <w:t xml:space="preserve">0.801</w:t>
+            </w:r>
+          </w:p>
+        </w:tc>
+      </w:tr>
+      <w:tr>
+        <w:tc>
+          <w:tcPr/>
+          <w:p>
+            <w:pPr>
+              <w:pStyle w:val="Compact"/>
+              <w:jc w:val="left"/>
+            </w:pPr>
+            <w:r>
+              <w:t xml:space="preserve">phishstorm__urlphish</w:t>
+            </w:r>
+          </w:p>
+        </w:tc>
+        <w:tc>
+          <w:tcPr/>
+          <w:p>
+            <w:pPr>
+              <w:pStyle w:val="Compact"/>
+              <w:jc w:val="left"/>
+            </w:pPr>
+            <w:r>
+              <w:t xml:space="preserve">0.991</w:t>
+            </w:r>
+          </w:p>
+        </w:tc>
+        <w:tc>
+          <w:tcPr/>
+          <w:p>
+            <w:pPr>
+              <w:pStyle w:val="Compact"/>
+              <w:jc w:val="left"/>
+            </w:pPr>
+            <w:r>
+              <w:t xml:space="preserve">0.854</w:t>
+            </w:r>
+          </w:p>
+        </w:tc>
+        <w:tc>
+          <w:tcPr/>
+          <w:p>
+            <w:pPr>
+              <w:pStyle w:val="Compact"/>
+              <w:jc w:val="left"/>
+            </w:pPr>
+            <w:r>
+              <w:t xml:space="preserve">0.991</w:t>
+            </w:r>
+          </w:p>
+        </w:tc>
+        <w:tc>
+          <w:tcPr/>
+          <w:p>
+            <w:pPr>
+              <w:pStyle w:val="Compact"/>
+              <w:jc w:val="left"/>
+            </w:pPr>
+            <w:r>
+              <w:t xml:space="preserve">0.853</w:t>
+            </w:r>
+          </w:p>
+        </w:tc>
+      </w:tr>
+      <w:tr>
+        <w:tc>
+          <w:tcPr/>
+          <w:p>
+            <w:pPr>
+              <w:pStyle w:val="Compact"/>
+              <w:jc w:val="left"/>
+            </w:pPr>
+            <w:r>
+              <w:t xml:space="preserve">phiusiil__phishstorm</w:t>
+            </w:r>
+          </w:p>
+        </w:tc>
+        <w:tc>
+          <w:tcPr/>
+          <w:p>
+            <w:pPr>
+              <w:pStyle w:val="Compact"/>
+              <w:jc w:val="left"/>
+            </w:pPr>
+            <w:r>
+              <w:t xml:space="preserve">0.988</w:t>
+            </w:r>
+          </w:p>
+        </w:tc>
+        <w:tc>
+          <w:tcPr/>
+          <w:p>
+            <w:pPr>
+              <w:pStyle w:val="Compact"/>
+              <w:jc w:val="left"/>
+            </w:pPr>
+            <w:r>
+              <w:t xml:space="preserve">0.841</w:t>
+            </w:r>
+          </w:p>
+        </w:tc>
+        <w:tc>
+          <w:tcPr/>
+          <w:p>
+            <w:pPr>
+              <w:pStyle w:val="Compact"/>
+              <w:jc w:val="left"/>
+            </w:pPr>
+            <w:r>
+              <w:t xml:space="preserve">0.990</w:t>
+            </w:r>
+          </w:p>
+        </w:tc>
+        <w:tc>
+          <w:tcPr/>
+          <w:p>
+            <w:pPr>
+              <w:pStyle w:val="Compact"/>
+              <w:jc w:val="left"/>
+            </w:pPr>
+            <w:r>
+              <w:t xml:space="preserve">0.899</w:t>
+            </w:r>
+          </w:p>
+        </w:tc>
+      </w:tr>
+      <w:tr>
+        <w:tc>
+          <w:tcPr/>
+          <w:p>
+            <w:pPr>
+              <w:pStyle w:val="Compact"/>
+              <w:jc w:val="left"/>
+            </w:pPr>
+            <w:r>
+              <w:t xml:space="preserve">phiusiil__phiusiil</w:t>
+            </w:r>
+          </w:p>
+        </w:tc>
+        <w:tc>
+          <w:tcPr/>
+          <w:p>
+            <w:pPr>
+              <w:pStyle w:val="Compact"/>
+              <w:jc w:val="left"/>
+            </w:pPr>
+            <w:r>
+              <w:t xml:space="preserve">0.860</w:t>
+            </w:r>
+          </w:p>
+        </w:tc>
+        <w:tc>
+          <w:tcPr/>
+          <w:p>
+            <w:pPr>
+              <w:pStyle w:val="Compact"/>
+              <w:jc w:val="left"/>
+            </w:pPr>
+            <w:r>
+              <w:t xml:space="preserve">0.792</w:t>
+            </w:r>
+          </w:p>
+        </w:tc>
+        <w:tc>
+          <w:tcPr/>
+          <w:p>
+            <w:pPr>
+              <w:pStyle w:val="Compact"/>
+              <w:jc w:val="left"/>
+            </w:pPr>
+            <w:r>
+              <w:t xml:space="preserve">0.931</w:t>
+            </w:r>
+          </w:p>
+        </w:tc>
+        <w:tc>
+          <w:tcPr/>
+          <w:p>
+            <w:pPr>
+              <w:pStyle w:val="Compact"/>
+              <w:jc w:val="left"/>
+            </w:pPr>
+            <w:r>
+              <w:t xml:space="preserve">0.868</w:t>
+            </w:r>
+          </w:p>
+        </w:tc>
+      </w:tr>
+      <w:tr>
+        <w:tc>
+          <w:tcPr/>
+          <w:p>
+            <w:pPr>
+              <w:pStyle w:val="Compact"/>
+              <w:jc w:val="left"/>
+            </w:pPr>
+            <w:r>
+              <w:t xml:space="preserve">phiusiil__phreshphish</w:t>
+            </w:r>
+          </w:p>
+        </w:tc>
+        <w:tc>
+          <w:tcPr/>
+          <w:p>
+            <w:pPr>
+              <w:pStyle w:val="Compact"/>
+              <w:jc w:val="left"/>
+            </w:pPr>
+            <w:r>
+              <w:t xml:space="preserve">0.948</w:t>
+            </w:r>
+          </w:p>
+        </w:tc>
+        <w:tc>
+          <w:tcPr/>
+          <w:p>
+            <w:pPr>
+              <w:pStyle w:val="Compact"/>
+              <w:jc w:val="left"/>
+            </w:pPr>
+            <w:r>
+              <w:t xml:space="preserve">0.812</w:t>
+            </w:r>
+          </w:p>
+        </w:tc>
+        <w:tc>
+          <w:tcPr/>
+          <w:p>
+            <w:pPr>
+              <w:pStyle w:val="Compact"/>
+              <w:jc w:val="left"/>
+            </w:pPr>
+            <w:r>
+              <w:t xml:space="preserve">0.972</w:t>
+            </w:r>
+          </w:p>
+        </w:tc>
+        <w:tc>
+          <w:tcPr/>
+          <w:p>
+            <w:pPr>
+              <w:pStyle w:val="Compact"/>
+              <w:jc w:val="left"/>
+            </w:pPr>
+            <w:r>
+              <w:t xml:space="preserve">0.861</w:t>
+            </w:r>
+          </w:p>
+        </w:tc>
+      </w:tr>
+      <w:tr>
+        <w:tc>
+          <w:tcPr/>
+          <w:p>
+            <w:pPr>
+              <w:pStyle w:val="Compact"/>
+              <w:jc w:val="left"/>
+            </w:pPr>
+            <w:r>
+              <w:t xml:space="preserve">phiusiil__urlphish</w:t>
+            </w:r>
+          </w:p>
+        </w:tc>
+        <w:tc>
+          <w:tcPr/>
+          <w:p>
+            <w:pPr>
+              <w:pStyle w:val="Compact"/>
+              <w:jc w:val="left"/>
+            </w:pPr>
+            <w:r>
+              <w:t xml:space="preserve">0.923</w:t>
+            </w:r>
+          </w:p>
+        </w:tc>
+        <w:tc>
+          <w:tcPr/>
+          <w:p>
+            <w:pPr>
+              <w:pStyle w:val="Compact"/>
+              <w:jc w:val="left"/>
+            </w:pPr>
+            <w:r>
+              <w:t xml:space="preserve">0.895</w:t>
+            </w:r>
+          </w:p>
+        </w:tc>
+        <w:tc>
+          <w:tcPr/>
+          <w:p>
+            <w:pPr>
+              <w:pStyle w:val="Compact"/>
+              <w:jc w:val="left"/>
+            </w:pPr>
+            <w:r>
+              <w:t xml:space="preserve">0.959</w:t>
+            </w:r>
+          </w:p>
+        </w:tc>
+        <w:tc>
+          <w:tcPr/>
+          <w:p>
+            <w:pPr>
+              <w:pStyle w:val="Compact"/>
+              <w:jc w:val="left"/>
+            </w:pPr>
+            <w:r>
+              <w:t xml:space="preserve">0.927</w:t>
+            </w:r>
+          </w:p>
+        </w:tc>
+      </w:tr>
+      <w:tr>
+        <w:tc>
+          <w:tcPr/>
+          <w:p>
+            <w:pPr>
+              <w:pStyle w:val="Compact"/>
+              <w:jc w:val="left"/>
+            </w:pPr>
+            <w:r>
+              <w:t xml:space="preserve">phreshphish__phishstorm</w:t>
+            </w:r>
+          </w:p>
+        </w:tc>
+        <w:tc>
+          <w:tcPr/>
+          <w:p>
+            <w:pPr>
+              <w:pStyle w:val="Compact"/>
+              <w:jc w:val="left"/>
+            </w:pPr>
+            <w:r>
+              <w:t xml:space="preserve">0.983</w:t>
+            </w:r>
+          </w:p>
+        </w:tc>
+        <w:tc>
+          <w:tcPr/>
+          <w:p>
+            <w:pPr>
+              <w:pStyle w:val="Compact"/>
+              <w:jc w:val="left"/>
+            </w:pPr>
+            <w:r>
+              <w:t xml:space="preserve">0.907</w:t>
+            </w:r>
+          </w:p>
+        </w:tc>
+        <w:tc>
+          <w:tcPr/>
+          <w:p>
+            <w:pPr>
+              <w:pStyle w:val="Compact"/>
+              <w:jc w:val="left"/>
+            </w:pPr>
+            <w:r>
+              <w:t xml:space="preserve">0.985</w:t>
+            </w:r>
+          </w:p>
+        </w:tc>
+        <w:tc>
+          <w:tcPr/>
+          <w:p>
+            <w:pPr>
+              <w:pStyle w:val="Compact"/>
+              <w:jc w:val="left"/>
+            </w:pPr>
+            <w:r>
+              <w:t xml:space="preserve">0.905</w:t>
+            </w:r>
+          </w:p>
+        </w:tc>
+      </w:tr>
+      <w:tr>
+        <w:tc>
+          <w:tcPr/>
+          <w:p>
+            <w:pPr>
+              <w:pStyle w:val="Compact"/>
+              <w:jc w:val="left"/>
+            </w:pPr>
+            <w:r>
+              <w:t xml:space="preserve">phreshphish__phiusiil</w:t>
+            </w:r>
+          </w:p>
+        </w:tc>
+        <w:tc>
+          <w:tcPr/>
+          <w:p>
+            <w:pPr>
+              <w:pStyle w:val="Compact"/>
+              <w:jc w:val="left"/>
+            </w:pPr>
+            <w:r>
+              <w:t xml:space="preserve">0.958</w:t>
+            </w:r>
+          </w:p>
+        </w:tc>
+        <w:tc>
+          <w:tcPr/>
+          <w:p>
+            <w:pPr>
+              <w:pStyle w:val="Compact"/>
+              <w:jc w:val="left"/>
+            </w:pPr>
+            <w:r>
+              <w:t xml:space="preserve">0.860</w:t>
+            </w:r>
+          </w:p>
+        </w:tc>
+        <w:tc>
+          <w:tcPr/>
+          <w:p>
+            <w:pPr>
+              <w:pStyle w:val="Compact"/>
+              <w:jc w:val="left"/>
+            </w:pPr>
+            <w:r>
+              <w:t xml:space="preserve">0.984</w:t>
+            </w:r>
+          </w:p>
+        </w:tc>
+        <w:tc>
+          <w:tcPr/>
+          <w:p>
+            <w:pPr>
+              <w:pStyle w:val="Compact"/>
+              <w:jc w:val="left"/>
+            </w:pPr>
+            <w:r>
+              <w:t xml:space="preserve">0.885</w:t>
+            </w:r>
+          </w:p>
+        </w:tc>
+      </w:tr>
+      <w:tr>
+        <w:tc>
+          <w:tcPr/>
+          <w:p>
+            <w:pPr>
+              <w:pStyle w:val="Compact"/>
+              <w:jc w:val="left"/>
+            </w:pPr>
+            <w:r>
+              <w:t xml:space="preserve">phreshphish__phreshphish</w:t>
+            </w:r>
+          </w:p>
+        </w:tc>
+        <w:tc>
+          <w:tcPr/>
+          <w:p>
+            <w:pPr>
+              <w:pStyle w:val="Compact"/>
+              <w:jc w:val="left"/>
+            </w:pPr>
+            <w:r>
+              <w:t xml:space="preserve">0.955</w:t>
+            </w:r>
+          </w:p>
+        </w:tc>
+        <w:tc>
+          <w:tcPr/>
+          <w:p>
+            <w:pPr>
+              <w:pStyle w:val="Compact"/>
+              <w:jc w:val="left"/>
+            </w:pPr>
+            <w:r>
+              <w:t xml:space="preserve">0.870</w:t>
+            </w:r>
+          </w:p>
+        </w:tc>
+        <w:tc>
+          <w:tcPr/>
+          <w:p>
+            <w:pPr>
+              <w:pStyle w:val="Compact"/>
+              <w:jc w:val="left"/>
+            </w:pPr>
+            <w:r>
+              <w:t xml:space="preserve">0.956</w:t>
+            </w:r>
+          </w:p>
+        </w:tc>
+        <w:tc>
+          <w:tcPr/>
+          <w:p>
+            <w:pPr>
+              <w:pStyle w:val="Compact"/>
+              <w:jc w:val="left"/>
+            </w:pPr>
+            <w:r>
+              <w:t xml:space="preserve">0.852</w:t>
+            </w:r>
+          </w:p>
+        </w:tc>
+      </w:tr>
+      <w:tr>
+        <w:tc>
+          <w:tcPr/>
+          <w:p>
+            <w:pPr>
+              <w:pStyle w:val="Compact"/>
+              <w:jc w:val="left"/>
+            </w:pPr>
+            <w:r>
+              <w:t xml:space="preserve">phreshphish__urlphish</w:t>
+            </w:r>
+          </w:p>
+        </w:tc>
+        <w:tc>
+          <w:tcPr/>
+          <w:p>
+            <w:pPr>
+              <w:pStyle w:val="Compact"/>
+              <w:jc w:val="left"/>
+            </w:pPr>
+            <w:r>
+              <w:t xml:space="preserve">0.970</w:t>
+            </w:r>
+          </w:p>
+        </w:tc>
+        <w:tc>
+          <w:tcPr/>
+          <w:p>
+            <w:pPr>
+              <w:pStyle w:val="Compact"/>
+              <w:jc w:val="left"/>
+            </w:pPr>
+            <w:r>
+              <w:t xml:space="preserve">0.935</w:t>
+            </w:r>
+          </w:p>
+        </w:tc>
+        <w:tc>
+          <w:tcPr/>
+          <w:p>
+            <w:pPr>
+              <w:pStyle w:val="Compact"/>
+              <w:jc w:val="left"/>
+            </w:pPr>
+            <w:r>
+              <w:t xml:space="preserve">0.986</w:t>
+            </w:r>
+          </w:p>
+        </w:tc>
+        <w:tc>
+          <w:tcPr/>
+          <w:p>
+            <w:pPr>
+              <w:pStyle w:val="Compact"/>
+              <w:jc w:val="left"/>
+            </w:pPr>
+            <w:r>
+              <w:t xml:space="preserve">0.941</w:t>
+            </w:r>
+          </w:p>
+        </w:tc>
+      </w:tr>
+      <w:tr>
+        <w:tc>
+          <w:tcPr/>
+          <w:p>
+            <w:pPr>
+              <w:pStyle w:val="Compact"/>
+              <w:jc w:val="left"/>
+            </w:pPr>
+            <w:r>
+              <w:t xml:space="preserve">urlphish__phishstorm</w:t>
+            </w:r>
+          </w:p>
+        </w:tc>
+        <w:tc>
+          <w:tcPr/>
+          <w:p>
+            <w:pPr>
+              <w:pStyle w:val="Compact"/>
+              <w:jc w:val="left"/>
+            </w:pPr>
+            <w:r>
+              <w:t xml:space="preserve">0.977</w:t>
+            </w:r>
+          </w:p>
+        </w:tc>
+        <w:tc>
+          <w:tcPr/>
+          <w:p>
+            <w:pPr>
+              <w:pStyle w:val="Compact"/>
+              <w:jc w:val="left"/>
+            </w:pPr>
+            <w:r>
+              <w:t xml:space="preserve">0.923</w:t>
+            </w:r>
+          </w:p>
+        </w:tc>
+        <w:tc>
+          <w:tcPr/>
+          <w:p>
+            <w:pPr>
+              <w:pStyle w:val="Compact"/>
+              <w:jc w:val="left"/>
+            </w:pPr>
+            <w:r>
+              <w:t xml:space="preserve">0.970</w:t>
+            </w:r>
+          </w:p>
+        </w:tc>
+        <w:tc>
+          <w:tcPr/>
+          <w:p>
+            <w:pPr>
+              <w:pStyle w:val="Compact"/>
+              <w:jc w:val="left"/>
+            </w:pPr>
+            <w:r>
+              <w:t xml:space="preserve">0.829</w:t>
+            </w:r>
+          </w:p>
+        </w:tc>
+      </w:tr>
+      <w:tr>
+        <w:tc>
+          <w:tcPr/>
+          <w:p>
+            <w:pPr>
+              <w:pStyle w:val="Compact"/>
+              <w:jc w:val="left"/>
+            </w:pPr>
+            <w:r>
+              <w:t xml:space="preserve">urlphish__phiusiil</w:t>
+            </w:r>
+          </w:p>
+        </w:tc>
+        <w:tc>
+          <w:tcPr/>
+          <w:p>
+            <w:pPr>
+              <w:pStyle w:val="Compact"/>
+              <w:jc w:val="left"/>
+            </w:pPr>
+            <w:r>
+              <w:t xml:space="preserve">0.985</w:t>
+            </w:r>
+          </w:p>
+        </w:tc>
+        <w:tc>
+          <w:tcPr/>
+          <w:p>
+            <w:pPr>
+              <w:pStyle w:val="Compact"/>
+              <w:jc w:val="left"/>
+            </w:pPr>
+            <w:r>
+              <w:t xml:space="preserve">0.886</w:t>
+            </w:r>
+          </w:p>
+        </w:tc>
+        <w:tc>
+          <w:tcPr/>
+          <w:p>
+            <w:pPr>
+              <w:pStyle w:val="Compact"/>
+              <w:jc w:val="left"/>
+            </w:pPr>
+            <w:r>
+              <w:t xml:space="preserve">0.990</w:t>
+            </w:r>
+          </w:p>
+        </w:tc>
+        <w:tc>
+          <w:tcPr/>
+          <w:p>
+            <w:pPr>
+              <w:pStyle w:val="Compact"/>
+              <w:jc w:val="left"/>
+            </w:pPr>
+            <w:r>
+              <w:t xml:space="preserve">0.863</w:t>
+            </w:r>
+          </w:p>
+        </w:tc>
+      </w:tr>
+      <w:tr>
+        <w:tc>
+          <w:tcPr/>
+          <w:p>
+            <w:pPr>
+              <w:pStyle w:val="Compact"/>
+              <w:jc w:val="left"/>
+            </w:pPr>
+            <w:r>
+              <w:t xml:space="preserve">urlphish__phreshphish</w:t>
+            </w:r>
+          </w:p>
+        </w:tc>
+        <w:tc>
+          <w:tcPr/>
+          <w:p>
+            <w:pPr>
+              <w:pStyle w:val="Compact"/>
+              <w:jc w:val="left"/>
+            </w:pPr>
+            <w:r>
+              <w:t xml:space="preserve">0.967</w:t>
+            </w:r>
+          </w:p>
+        </w:tc>
+        <w:tc>
+          <w:tcPr/>
+          <w:p>
+            <w:pPr>
+              <w:pStyle w:val="Compact"/>
+              <w:jc w:val="left"/>
+            </w:pPr>
+            <w:r>
+              <w:t xml:space="preserve">0.903</w:t>
+            </w:r>
+          </w:p>
+        </w:tc>
+        <w:tc>
+          <w:tcPr/>
+          <w:p>
+            <w:pPr>
+              <w:pStyle w:val="Compact"/>
+              <w:jc w:val="left"/>
+            </w:pPr>
+            <w:r>
+              <w:t xml:space="preserve">0.955</w:t>
+            </w:r>
+          </w:p>
+        </w:tc>
+        <w:tc>
+          <w:tcPr/>
+          <w:p>
+            <w:pPr>
+              <w:pStyle w:val="Compact"/>
+              <w:jc w:val="left"/>
+            </w:pPr>
+            <w:r>
+              <w:t xml:space="preserve">0.737</w:t>
+            </w:r>
+          </w:p>
+        </w:tc>
+      </w:tr>
+      <w:tr>
+        <w:tc>
+          <w:tcPr/>
+          <w:p>
+            <w:pPr>
+              <w:pStyle w:val="Compact"/>
+              <w:jc w:val="left"/>
+            </w:pPr>
+            <w:r>
+              <w:t xml:space="preserve">urlphish__urlphish</w:t>
+            </w:r>
+          </w:p>
+        </w:tc>
+        <w:tc>
+          <w:tcPr/>
+          <w:p>
+            <w:pPr>
+              <w:pStyle w:val="Compact"/>
+              <w:jc w:val="left"/>
+            </w:pPr>
+            <w:r>
+              <w:t xml:space="preserve">0.980</w:t>
+            </w:r>
+          </w:p>
+        </w:tc>
+        <w:tc>
+          <w:tcPr/>
+          <w:p>
+            <w:pPr>
+              <w:pStyle w:val="Compact"/>
+              <w:jc w:val="left"/>
+            </w:pPr>
+            <w:r>
+              <w:t xml:space="preserve">0.939</w:t>
+            </w:r>
+          </w:p>
+        </w:tc>
+        <w:tc>
+          <w:tcPr/>
+          <w:p>
+            <w:pPr>
+              <w:pStyle w:val="Compact"/>
+              <w:jc w:val="left"/>
+            </w:pPr>
+            <w:r>
+              <w:t xml:space="preserve">0.983</w:t>
+            </w:r>
+          </w:p>
+        </w:tc>
+        <w:tc>
+          <w:tcPr/>
+          <w:p>
+            <w:pPr>
+              <w:pStyle w:val="Compact"/>
+              <w:jc w:val="left"/>
+            </w:pPr>
+            <w:r>
+              <w:t xml:space="preserve">0.906</w:t>
+            </w:r>
+          </w:p>
+        </w:tc>
+      </w:tr>
+    </w:tbl>
+    <w:p>
+      <w:pPr>
+        <w:pStyle w:val="BodyText"/>
+      </w:pPr>
+      <w:r>
+        <w:t xml:space="preserve">Median ROC-AUC per cell on raw (R1) and domain-only (R4) URLs in both conditions.</w:t>
+      </w:r>
+    </w:p>
+    <w:bookmarkEnd w:id="87"/>
+    <w:bookmarkStart w:id="88" w:name="hosting-platform-masking-exploratory"/>
+    <w:p>
+      <w:pPr>
+        <w:pStyle w:val="Heading2"/>
+      </w:pPr>
+      <w:r>
+        <w:t xml:space="preserve">4.14 Hosting-platform masking (exploratory)</w:t>
+      </w:r>
+    </w:p>
+    <w:p>
+      <w:pPr>
+        <w:pStyle w:val="FirstParagraph"/>
+      </w:pPr>
+      <w:r>
+        <w:t xml:space="preserve">Question 5 asks whether replacing the name of a hosting platform (for example</w:t>
+      </w:r>
+      <w:r>
+        <w:t xml:space="preserve"> </w:t>
+      </w:r>
+      <w:r>
+        <w:rPr>
+          <w:rStyle w:val="VerbatimChar"/>
+        </w:rPr>
+        <w:t xml:space="preserve">github.io</w:t>
+      </w:r>
+      <w:r>
+        <w:t xml:space="preserve">) with a neutral token helps a model on tenants it has not seen. It was not testable in the main design, because the cap per domain and the removal of shared domains leave almost no platform URLs. An exploratory test was therefore run outside the seven questions: platform URLs were taken straight from the source files, at most 5 URLs per tenant site were kept, splits were grouped by registrable domain, and a model trained with the platform name masked was compared with one trained without masking on domain-only URLs. Only one legitimate source (PhreshPhish) has enough platform URLs (1,019 URLs on 617 tenant sites), so the five tested pairs share the same legitimate set and are not independent.</w:t>
+      </w:r>
+    </w:p>
+    <w:p>
+      <w:pPr>
+        <w:pStyle w:val="BodyText"/>
+      </w:pPr>
+      <w:r>
+        <w:t xml:space="preserve">Masking raised the held-out score in none of the 10 settings (five phishing sources, two models, ten splits each). The median change ranges from -0.014 to +0.012 and every interval includes zero. The effect of masking is therefore</w:t>
+      </w:r>
+      <w:r>
+        <w:t xml:space="preserve"> </w:t>
+      </w:r>
+      <w:r>
+        <w:rPr>
+          <w:bCs/>
+          <w:b/>
+        </w:rPr>
+        <w:t xml:space="preserve">not shown</w:t>
+      </w:r>
+      <w:r>
+        <w:t xml:space="preserve"> </w:t>
+      </w:r>
+      <w:r>
+        <w:t xml:space="preserve">in this test. This does not show that masking never helps; it shows that no effect could be detected here. Source:</w:t>
+      </w:r>
+      <w:r>
+        <w:t xml:space="preserve"> </w:t>
+      </w:r>
+      <w:r>
+        <w:rPr>
+          <w:rStyle w:val="VerbatimChar"/>
+        </w:rPr>
+        <w:t xml:space="preserve">reports/phishguard/HP_platform.md</w:t>
+      </w:r>
+      <w:r>
+        <w:t xml:space="preserve">.</w:t>
+      </w:r>
+    </w:p>
+    <w:bookmarkEnd w:id="88"/>
+    <w:bookmarkStart w:id="89" w:name="what-can-and-cannot-be-claimed"/>
+    <w:p>
+      <w:pPr>
+        <w:pStyle w:val="Heading2"/>
+      </w:pPr>
+      <w:r>
+        <w:t xml:space="preserve">4.15 What can and cannot be claimed</w:t>
       </w:r>
     </w:p>
     <w:p>
@@ -7219,9 +9042,9 @@
         </w:tc>
       </w:tr>
     </w:tbl>
-    <w:bookmarkEnd w:id="87"/>
-    <w:bookmarkEnd w:id="88"/>
-    <w:bookmarkStart w:id="95" w:name="data-and-corpus"/>
+    <w:bookmarkEnd w:id="89"/>
+    <w:bookmarkEnd w:id="90"/>
+    <w:bookmarkStart w:id="97" w:name="data-and-corpus"/>
     <w:p>
       <w:pPr>
         <w:pStyle w:val="Heading1"/>
@@ -7368,7 +9191,7 @@
         <w:t xml:space="preserve">Corpus counts in chapter 5 come from the corpus data card as quoted in the 2026-10-13 report draft. The data card file itself is not in this checkout, so those counts are carried over and were not re-checked against it.</w:t>
       </w:r>
     </w:p>
-    <w:bookmarkStart w:id="89" w:name="why-the-corpus-is-built-this-way"/>
+    <w:bookmarkStart w:id="91" w:name="why-the-corpus-is-built-this-way"/>
     <w:p>
       <w:pPr>
         <w:pStyle w:val="Heading2"/>
@@ -7406,8 +9229,8 @@
         <w:t xml:space="preserve">: only URL, label, date and HTML are read from any dataset, never a precomputed feature column; one registrable-domain definition is used everywhere (public-suffix-only); and no model is trained until the corpus passes a depth check.</w:t>
       </w:r>
     </w:p>
-    <w:bookmarkEnd w:id="89"/>
-    <w:bookmarkStart w:id="90" w:name="sources-1"/>
+    <w:bookmarkEnd w:id="91"/>
+    <w:bookmarkStart w:id="92" w:name="sources-1"/>
     <w:p>
       <w:pPr>
         <w:pStyle w:val="Heading2"/>
@@ -8364,8 +10187,8 @@
         <w:t xml:space="preserve">, 2026-10-11). Because PhishStorm has no HTML, the page model has no held-out source at all. Third, the live feeds are still tiny in the pool (245 URLs); they matter mainly for tier C (section 6.4). Licences recorded in the data card: PhreshPhish CC BY 4.0 (anti-phishing research only), PhiUSIIL CC BY 4.0, Phishpedia research use, OpenPhish non-commercial, Phishing.Database MIT; the URL-Phish and Phish-Blitz terms are still to be confirmed.</w:t>
       </w:r>
     </w:p>
-    <w:bookmarkEnd w:id="90"/>
-    <w:bookmarkStart w:id="91" w:name="corpus-build"/>
+    <w:bookmarkEnd w:id="92"/>
+    <w:bookmarkStart w:id="93" w:name="corpus-build"/>
     <w:p>
       <w:pPr>
         <w:pStyle w:val="Heading2"/>
@@ -8818,8 +10641,8 @@
         <w:t xml:space="preserve">). Zero domain overlap and zero canonical-URL overlap between sides is a hard run-time failure, not a warning.</w:t>
       </w:r>
     </w:p>
-    <w:bookmarkEnd w:id="91"/>
-    <w:bookmarkStart w:id="92" w:name="depth-balance"/>
+    <w:bookmarkEnd w:id="93"/>
+    <w:bookmarkStart w:id="94" w:name="depth-balance"/>
     <w:p>
       <w:pPr>
         <w:pStyle w:val="Heading2"/>
@@ -8881,8 +10704,8 @@
         <w:t xml:space="preserve">). This is why chapter 8 adds a depth-matched evaluation and a representation check instead of trusting pooled numbers.</w:t>
       </w:r>
     </w:p>
-    <w:bookmarkEnd w:id="92"/>
-    <w:bookmarkStart w:id="93" w:name="benign-inner-pages"/>
+    <w:bookmarkEnd w:id="94"/>
+    <w:bookmarkStart w:id="95" w:name="benign-inner-pages"/>
     <w:p>
       <w:pPr>
         <w:pStyle w:val="Heading2"/>
@@ -8949,8 +10772,8 @@
         <w:t xml:space="preserve">, 2026-10-20). The corpus described above does not include it, and its effect on false alarms is not measured.</w:t>
       </w:r>
     </w:p>
-    <w:bookmarkEnd w:id="93"/>
-    <w:bookmarkStart w:id="94" w:name="evaluation-only-data"/>
+    <w:bookmarkEnd w:id="95"/>
+    <w:bookmarkStart w:id="96" w:name="evaluation-only-data"/>
     <w:p>
       <w:pPr>
         <w:pStyle w:val="Heading2"/>
@@ -9012,9 +10835,9 @@
         <w:t xml:space="preserve">). The natural pages were sampled from Tranco-listed sites, which makes them easier than a long-tail browsing history; this is a limitation of every false-alarm number below.</w:t>
       </w:r>
     </w:p>
-    <w:bookmarkEnd w:id="94"/>
-    <w:bookmarkEnd w:id="95"/>
-    <w:bookmarkStart w:id="101" w:name="feature-engine-and-models"/>
+    <w:bookmarkEnd w:id="96"/>
+    <w:bookmarkEnd w:id="97"/>
+    <w:bookmarkStart w:id="103" w:name="feature-engine-and-models"/>
     <w:p>
       <w:pPr>
         <w:pStyle w:val="Heading1"/>
@@ -9023,7 +10846,7 @@
         <w:t xml:space="preserve">6. Feature engine and models</w:t>
       </w:r>
     </w:p>
-    <w:bookmarkStart w:id="96" w:name="one-engine-three-tiers"/>
+    <w:bookmarkStart w:id="98" w:name="one-engine-three-tiers"/>
     <w:p>
       <w:pPr>
         <w:pStyle w:val="Heading2"/>
@@ -9522,8 +11345,8 @@
         <w:t xml:space="preserve">).</w:t>
       </w:r>
     </w:p>
-    <w:bookmarkEnd w:id="96"/>
-    <w:bookmarkStart w:id="97" w:name="Xd11bde47366ac7966d4a9d7083ebb37ade0493f"/>
+    <w:bookmarkEnd w:id="98"/>
+    <w:bookmarkStart w:id="99" w:name="Xd11bde47366ac7966d4a9d7083ebb37ade0493f"/>
     <w:p>
       <w:pPr>
         <w:pStyle w:val="Heading2"/>
@@ -9602,8 +11425,8 @@
         <w:t xml:space="preserve">).</w:t>
       </w:r>
     </w:p>
-    <w:bookmarkEnd w:id="97"/>
-    <w:bookmarkStart w:id="98" w:name="tier-b-the-page-model-and-the-blend"/>
+    <w:bookmarkEnd w:id="99"/>
+    <w:bookmarkStart w:id="100" w:name="tier-b-the-page-model-and-the-blend"/>
     <w:p>
       <w:pPr>
         <w:pStyle w:val="Heading2"/>
@@ -9733,8 +11556,8 @@
         <w:t xml:space="preserve">).</w:t>
       </w:r>
     </w:p>
-    <w:bookmarkEnd w:id="98"/>
-    <w:bookmarkStart w:id="99" w:name="tier-c-domain-dns-and-tls"/>
+    <w:bookmarkEnd w:id="100"/>
+    <w:bookmarkStart w:id="101" w:name="tier-c-domain-dns-and-tls"/>
     <w:p>
       <w:pPr>
         <w:pStyle w:val="Heading2"/>
@@ -9751,8 +11574,8 @@
         <w:t xml:space="preserve">Tier C features (registration age and expiry from RDAP, DNS records, certificate age, validity and issuer) can only be computed honestly when captured as soon as a URL is first seen, so the collector records them for live-feed hosts, and for legitimate Tranco hosts, twice a day. They are never computed today for old dataset URLs. Tier C is therefore trained on live data only, and its sample is small (section 8.9). A separate set of hand-set backend rules (section 7.5) uses the same facts at run time; it is not the tier C model.</w:t>
       </w:r>
     </w:p>
-    <w:bookmarkEnd w:id="99"/>
-    <w:bookmarkStart w:id="100" w:name="calibration-and-thresholds"/>
+    <w:bookmarkEnd w:id="101"/>
+    <w:bookmarkStart w:id="102" w:name="calibration-and-thresholds"/>
     <w:p>
       <w:pPr>
         <w:pStyle w:val="Heading2"/>
@@ -9814,9 +11637,9 @@
         <w:t xml:space="preserve">). Chapter 8 shows that the thresholds themselves do not transfer well to a new source.</w:t>
       </w:r>
     </w:p>
-    <w:bookmarkEnd w:id="100"/>
-    <w:bookmarkEnd w:id="101"/>
-    <w:bookmarkStart w:id="113" w:name="system-extension-and-backend"/>
+    <w:bookmarkEnd w:id="102"/>
+    <w:bookmarkEnd w:id="103"/>
+    <w:bookmarkStart w:id="115" w:name="system-extension-and-backend"/>
     <w:p>
       <w:pPr>
         <w:pStyle w:val="Heading1"/>
@@ -9825,7 +11648,7 @@
         <w:t xml:space="preserve">7. System: extension and backend</w:t>
       </w:r>
     </w:p>
-    <w:bookmarkStart w:id="105" w:name="runtime-layers"/>
+    <w:bookmarkStart w:id="107" w:name="runtime-layers"/>
     <w:p>
       <w:pPr>
         <w:pStyle w:val="Heading2"/>
@@ -9893,18 +11716,18 @@
           <wp:inline>
             <wp:extent cx="4810938" cy="4567405"/>
             <wp:effectExtent b="0" l="0" r="0" t="0"/>
-            <wp:docPr descr="Figure 7.1. Runtime layers of PhishDrift and where each runs. No data; drawn by scripts/pbl_figures.py." title="" id="103" name="Picture"/>
+            <wp:docPr descr="Figure 7.1. Runtime layers of PhishDrift and where each runs. No data; drawn by scripts/pbl_figures.py." title="" id="105" name="Picture"/>
             <a:graphic>
               <a:graphicData uri="http://schemas.openxmlformats.org/drawingml/2006/picture">
                 <pic:pic>
                   <pic:nvPicPr>
-                    <pic:cNvPr descr="figures/fig06_layers.png" id="104" name="Picture"/>
+                    <pic:cNvPr descr="figures/fig06_layers.png" id="106" name="Picture"/>
                     <pic:cNvPicPr>
                       <a:picLocks noChangeArrowheads="1" noChangeAspect="1"/>
                     </pic:cNvPicPr>
                   </pic:nvPicPr>
                   <pic:blipFill>
-                    <a:blip r:embed="rId102"/>
+                    <a:blip r:embed="rId104"/>
                     <a:stretch>
                       <a:fillRect/>
                     </a:stretch>
@@ -9943,7 +11766,7 @@
       <w:pPr>
         <w:numPr>
           <w:ilvl w:val="0"/>
-          <w:numId w:val="1006"/>
+          <w:numId w:val="1007"/>
         </w:numPr>
         <w:pStyle w:val="Compact"/>
       </w:pPr>
@@ -9959,168 +11782,6 @@
       </w:r>
       <w:r>
         <w:t xml:space="preserve">Tranco top 50,000, a list of popular tenant sites, and user-trusted sites, matched on the exact registrable domain. Shared-hosting domains and learned open-hosting zones are excluded. The bundled list is used until a synced list exists.</w:t>
-      </w:r>
-    </w:p>
-    <w:p>
-      <w:pPr>
-        <w:numPr>
-          <w:ilvl w:val="0"/>
-          <w:numId w:val="1006"/>
-        </w:numPr>
-        <w:pStyle w:val="Compact"/>
-      </w:pPr>
-      <w:r>
-        <w:rPr>
-          <w:bCs/>
-          <w:b/>
-        </w:rPr>
-        <w:t xml:space="preserve">Blocklist.</w:t>
-      </w:r>
-      <w:r>
-        <w:t xml:space="preserve"> </w:t>
-      </w:r>
-      <w:r>
-        <w:t xml:space="preserve">Hashed URLs and domains built by the backend from the live feeds and URLhaus. On shared hosts the full URL is matched, not the domain.</w:t>
-      </w:r>
-    </w:p>
-    <w:p>
-      <w:pPr>
-        <w:numPr>
-          <w:ilvl w:val="0"/>
-          <w:numId w:val="1006"/>
-        </w:numPr>
-        <w:pStyle w:val="Compact"/>
-      </w:pPr>
-      <w:r>
-        <w:rPr>
-          <w:bCs/>
-          <w:b/>
-        </w:rPr>
-        <w:t xml:space="preserve">Address model.</w:t>
-      </w:r>
-      <w:r>
-        <w:t xml:space="preserve"> </w:t>
-      </w:r>
-      <w:r>
-        <w:t xml:space="preserve">The tier A hybrid2 model, in the browser, followed by look-alike and brand rules that can only raise a verdict.</w:t>
-      </w:r>
-    </w:p>
-    <w:p>
-      <w:pPr>
-        <w:numPr>
-          <w:ilvl w:val="0"/>
-          <w:numId w:val="1006"/>
-        </w:numPr>
-        <w:pStyle w:val="Compact"/>
-      </w:pPr>
-      <w:r>
-        <w:rPr>
-          <w:bCs/>
-          <w:b/>
-        </w:rPr>
-        <w:t xml:space="preserve">Domain checks.</w:t>
-      </w:r>
-      <w:r>
-        <w:t xml:space="preserve"> </w:t>
-      </w:r>
-      <w:r>
-        <w:t xml:space="preserve">The backend runs RDAP, DNS and TLS checks for the domain, only for addresses the model already flagged.</w:t>
-      </w:r>
-    </w:p>
-    <w:p>
-      <w:pPr>
-        <w:numPr>
-          <w:ilvl w:val="0"/>
-          <w:numId w:val="1006"/>
-        </w:numPr>
-        <w:pStyle w:val="Compact"/>
-      </w:pPr>
-      <w:r>
-        <w:rPr>
-          <w:bCs/>
-          <w:b/>
-        </w:rPr>
-        <w:t xml:space="preserve">Page checks.</w:t>
-      </w:r>
-      <w:r>
-        <w:t xml:space="preserve"> </w:t>
-      </w:r>
-      <w:r>
-        <w:t xml:space="preserve">The content script sends the page to the service worker, where the tier B page model and a password-form rule read it.</w:t>
-      </w:r>
-    </w:p>
-    <w:p>
-      <w:pPr>
-        <w:pStyle w:val="FirstParagraph"/>
-      </w:pPr>
-      <w:r>
-        <w:t xml:space="preserve">A combiner turns the layers’ outputs into safe (no interface), suspicious (a dismissable banner) or dangerous (a warning page with</w:t>
-      </w:r>
-      <w:r>
-        <w:t xml:space="preserve"> </w:t>
-      </w:r>
-      <w:r>
-        <w:t xml:space="preserve">“</w:t>
-      </w:r>
-      <w:r>
-        <w:t xml:space="preserve">proceed anyway</w:t>
-      </w:r>
-      <w:r>
-        <w:t xml:space="preserve">”</w:t>
-      </w:r>
-      <w:r>
-        <w:t xml:space="preserve"> </w:t>
-      </w:r>
-      <w:r>
-        <w:t xml:space="preserve">and</w:t>
-      </w:r>
-      <w:r>
-        <w:t xml:space="preserve"> </w:t>
-      </w:r>
-      <w:r>
-        <w:t xml:space="preserve">“</w:t>
-      </w:r>
-      <w:r>
-        <w:t xml:space="preserve">report false positive</w:t>
-      </w:r>
-      <w:r>
-        <w:t xml:space="preserve">”</w:t>
-      </w:r>
-      <w:r>
-        <w:t xml:space="preserve">), each with plain-English reasons from TreeSHAP and rule hits. The optional language-model second opinion (layer 6 in the specification) was not built; it was first on the cut list.</w:t>
-      </w:r>
-    </w:p>
-    <w:bookmarkEnd w:id="105"/>
-    <w:bookmarkStart w:id="106" w:name="how-a-verdict-is-decided"/>
-    <w:p>
-      <w:pPr>
-        <w:pStyle w:val="Heading2"/>
-      </w:pPr>
-      <w:r>
-        <w:t xml:space="preserve">7.2 How a verdict is decided</w:t>
-      </w:r>
-    </w:p>
-    <w:p>
-      <w:pPr>
-        <w:pStyle w:val="FirstParagraph"/>
-      </w:pPr>
-      <w:r>
-        <w:t xml:space="preserve">The rules in</w:t>
-      </w:r>
-      <w:r>
-        <w:t xml:space="preserve"> </w:t>
-      </w:r>
-      <w:r>
-        <w:rPr>
-          <w:rStyle w:val="VerbatimChar"/>
-        </w:rPr>
-        <w:t xml:space="preserve">extension/src/combine.js</w:t>
-      </w:r>
-      <w:r>
-        <w:t xml:space="preserve"> </w:t>
-      </w:r>
-      <w:r>
-        <w:t xml:space="preserve">and the progress log are these.</w:t>
       </w:r>
     </w:p>
     <w:p>
@@ -10132,25 +11793,17 @@
         <w:pStyle w:val="Compact"/>
       </w:pPr>
       <w:r>
-        <w:t xml:space="preserve">A blocklist hit always warns. Neither</w:t>
-      </w:r>
-      <w:r>
-        <w:t xml:space="preserve"> </w:t>
-      </w:r>
-      <w:r>
-        <w:t xml:space="preserve">“</w:t>
-      </w:r>
-      <w:r>
-        <w:t xml:space="preserve">trust this site</w:t>
-      </w:r>
-      <w:r>
-        <w:t xml:space="preserve">”</w:t>
-      </w:r>
-      <w:r>
-        <w:t xml:space="preserve"> </w:t>
-      </w:r>
-      <w:r>
-        <w:t xml:space="preserve">nor the allowlist overrides an exact listed URL; a user’s trust entry expires after 30 days.</w:t>
+        <w:rPr>
+          <w:bCs/>
+          <w:b/>
+        </w:rPr>
+        <w:t xml:space="preserve">Blocklist.</w:t>
+      </w:r>
+      <w:r>
+        <w:t xml:space="preserve"> </w:t>
+      </w:r>
+      <w:r>
+        <w:t xml:space="preserve">Hashed URLs and domains built by the backend from the live feeds and URLhaus. On shared hosts the full URL is matched, not the domain.</w:t>
       </w:r>
     </w:p>
     <w:p>
@@ -10162,7 +11815,17 @@
         <w:pStyle w:val="Compact"/>
       </w:pPr>
       <w:r>
-        <w:t xml:space="preserve">The page model may raise any address verdict. It may lower one only on a page with no password, one-time-code, card or PIN field in the page or any of its frames, because on a login page the attacker controls the markup that the page model reads.</w:t>
+        <w:rPr>
+          <w:bCs/>
+          <w:b/>
+        </w:rPr>
+        <w:t xml:space="preserve">Address model.</w:t>
+      </w:r>
+      <w:r>
+        <w:t xml:space="preserve"> </w:t>
+      </w:r>
+      <w:r>
+        <w:t xml:space="preserve">The tier A hybrid2 model, in the browser, followed by look-alike and brand rules that can only raise a verdict.</w:t>
       </w:r>
     </w:p>
     <w:p>
@@ -10174,25 +11837,17 @@
         <w:pStyle w:val="Compact"/>
       </w:pPr>
       <w:r>
-        <w:t xml:space="preserve">The</w:t>
-      </w:r>
-      <w:r>
-        <w:t xml:space="preserve"> </w:t>
-      </w:r>
-      <w:r>
-        <w:t xml:space="preserve">“</w:t>
-      </w:r>
-      <w:r>
-        <w:t xml:space="preserve">agree</w:t>
-      </w:r>
-      <w:r>
-        <w:t xml:space="preserve">”</w:t>
-      </w:r>
-      <w:r>
-        <w:t xml:space="preserve"> </w:t>
-      </w:r>
-      <w:r>
-        <w:t xml:space="preserve">rule: on a page with usable HTML, a suspicious banner needs both the page model and the address model to exceed their 1% thresholds. Its effect is measured in section 8.5.</w:t>
+        <w:rPr>
+          <w:bCs/>
+          <w:b/>
+        </w:rPr>
+        <w:t xml:space="preserve">Domain checks.</w:t>
+      </w:r>
+      <w:r>
+        <w:t xml:space="preserve"> </w:t>
+      </w:r>
+      <w:r>
+        <w:t xml:space="preserve">The backend runs RDAP, DNS and TLS checks for the domain, only for addresses the model already flagged.</w:t>
       </w:r>
     </w:p>
     <w:p>
@@ -10204,7 +11859,76 @@
         <w:pStyle w:val="Compact"/>
       </w:pPr>
       <w:r>
-        <w:t xml:space="preserve">The address model alone does not open the warning page on a page that asks for nothing. A dangerous address verdict is shown as a banner unless the page asks for a credential, the page model also says dangerous, a second layer raises it, or no page check arrives within 5 seconds (extension 0.1.2,</w:t>
+        <w:rPr>
+          <w:bCs/>
+          <w:b/>
+        </w:rPr>
+        <w:t xml:space="preserve">Page checks.</w:t>
+      </w:r>
+      <w:r>
+        <w:t xml:space="preserve"> </w:t>
+      </w:r>
+      <w:r>
+        <w:t xml:space="preserve">The content script sends the page to the service worker, where the tier B page model and a password-form rule read it.</w:t>
+      </w:r>
+    </w:p>
+    <w:p>
+      <w:pPr>
+        <w:pStyle w:val="FirstParagraph"/>
+      </w:pPr>
+      <w:r>
+        <w:t xml:space="preserve">A combiner turns the layers’ outputs into safe (no interface), suspicious (a dismissable banner) or dangerous (a warning page with</w:t>
+      </w:r>
+      <w:r>
+        <w:t xml:space="preserve"> </w:t>
+      </w:r>
+      <w:r>
+        <w:t xml:space="preserve">“</w:t>
+      </w:r>
+      <w:r>
+        <w:t xml:space="preserve">proceed anyway</w:t>
+      </w:r>
+      <w:r>
+        <w:t xml:space="preserve">”</w:t>
+      </w:r>
+      <w:r>
+        <w:t xml:space="preserve"> </w:t>
+      </w:r>
+      <w:r>
+        <w:t xml:space="preserve">and</w:t>
+      </w:r>
+      <w:r>
+        <w:t xml:space="preserve"> </w:t>
+      </w:r>
+      <w:r>
+        <w:t xml:space="preserve">“</w:t>
+      </w:r>
+      <w:r>
+        <w:t xml:space="preserve">report false positive</w:t>
+      </w:r>
+      <w:r>
+        <w:t xml:space="preserve">”</w:t>
+      </w:r>
+      <w:r>
+        <w:t xml:space="preserve">), each with plain-English reasons from TreeSHAP and rule hits. The optional language-model second opinion (layer 6 in the specification) was not built; it was first on the cut list.</w:t>
+      </w:r>
+    </w:p>
+    <w:bookmarkEnd w:id="107"/>
+    <w:bookmarkStart w:id="108" w:name="how-a-verdict-is-decided"/>
+    <w:p>
+      <w:pPr>
+        <w:pStyle w:val="Heading2"/>
+      </w:pPr>
+      <w:r>
+        <w:t xml:space="preserve">7.2 How a verdict is decided</w:t>
+      </w:r>
+    </w:p>
+    <w:p>
+      <w:pPr>
+        <w:pStyle w:val="FirstParagraph"/>
+      </w:pPr>
+      <w:r>
+        <w:t xml:space="preserve">The rules in</w:t>
       </w:r>
       <w:r>
         <w:t xml:space="preserve"> </w:t>
@@ -10213,22 +11937,25 @@
         <w:rPr>
           <w:rStyle w:val="VerbatimChar"/>
         </w:rPr>
-        <w:t xml:space="preserve">reports/address_only_blocks.md</w:t>
-      </w:r>
-      <w:r>
-        <w:t xml:space="preserve">).</w:t>
+        <w:t xml:space="preserve">extension/src/combine.js</w:t>
+      </w:r>
+      <w:r>
+        <w:t xml:space="preserve"> </w:t>
+      </w:r>
+      <w:r>
+        <w:t xml:space="preserve">and the progress log are these.</w:t>
       </w:r>
     </w:p>
     <w:p>
       <w:pPr>
         <w:numPr>
           <w:ilvl w:val="0"/>
-          <w:numId w:val="1007"/>
+          <w:numId w:val="1008"/>
         </w:numPr>
         <w:pStyle w:val="Compact"/>
       </w:pPr>
       <w:r>
-        <w:t xml:space="preserve">Domain evidence from the backend can raise suspicious to dangerous but never turns a safe verdict into a warning. The backend is never waited for: the verdict shows at once and a late</w:t>
+        <w:t xml:space="preserve">A blocklist hit always warns. Neither</w:t>
       </w:r>
       <w:r>
         <w:t xml:space="preserve"> </w:t>
@@ -10237,7 +11964,7 @@
         <w:t xml:space="preserve">“</w:t>
       </w:r>
       <w:r>
-        <w:t xml:space="preserve">high</w:t>
+        <w:t xml:space="preserve">trust this site</w:t>
       </w:r>
       <w:r>
         <w:t xml:space="preserve">”</w:t>
@@ -10246,74 +11973,170 @@
         <w:t xml:space="preserve"> </w:t>
       </w:r>
       <w:r>
-        <w:t xml:space="preserve">answer raises it.</w:t>
+        <w:t xml:space="preserve">nor the allowlist overrides an exact listed URL; a user’s trust entry expires after 30 days.</w:t>
       </w:r>
     </w:p>
     <w:p>
       <w:pPr>
         <w:numPr>
           <w:ilvl w:val="0"/>
-          <w:numId w:val="1007"/>
+          <w:numId w:val="1008"/>
         </w:numPr>
         <w:pStyle w:val="Compact"/>
       </w:pPr>
       <w:r>
-        <w:t xml:space="preserve">Short links are never allowlisted and never judged by the address model; the redirect target is scored at</w:t>
-      </w:r>
-      <w:r>
-        <w:t xml:space="preserve"> </w:t>
-      </w:r>
-      <w:r>
-        <w:rPr>
-          <w:rStyle w:val="VerbatimChar"/>
-        </w:rPr>
-        <w:t xml:space="preserve">onCommitted</w:t>
-      </w:r>
-      <w:r>
-        <w:t xml:space="preserve">, before the page renders. A shortener’s own address carries no information for a URL model (section 8.10).</w:t>
+        <w:t xml:space="preserve">The page model may raise any address verdict. It may lower one only on a page with no password, one-time-code, card or PIN field in the page or any of its frames, because on a login page the attacker controls the markup that the page model reads.</w:t>
       </w:r>
     </w:p>
     <w:p>
       <w:pPr>
         <w:numPr>
           <w:ilvl w:val="0"/>
-          <w:numId w:val="1007"/>
+          <w:numId w:val="1008"/>
         </w:numPr>
         <w:pStyle w:val="Compact"/>
       </w:pPr>
       <w:r>
-        <w:t xml:space="preserve">A verdict cannot be lowered by the page itself:</w:t>
-      </w:r>
-      <w:r>
-        <w:t xml:space="preserve"> </w:t>
-      </w:r>
-      <w:r>
-        <w:rPr>
-          <w:rStyle w:val="VerbatimChar"/>
-        </w:rPr>
-        <w:t xml:space="preserve">history.replaceState</w:t>
-      </w:r>
-      <w:r>
-        <w:t xml:space="preserve"> </w:t>
-      </w:r>
-      <w:r>
-        <w:t xml:space="preserve">and later route changes keep the worst verdict per tab, login forms added after load are re-checked up to three times, frames are checked in their own right, and a page that hides or removes the banner gets the full warning page.</w:t>
+        <w:t xml:space="preserve">The</w:t>
+      </w:r>
+      <w:r>
+        <w:t xml:space="preserve"> </w:t>
+      </w:r>
+      <w:r>
+        <w:t xml:space="preserve">“</w:t>
+      </w:r>
+      <w:r>
+        <w:t xml:space="preserve">agree</w:t>
+      </w:r>
+      <w:r>
+        <w:t xml:space="preserve">”</w:t>
+      </w:r>
+      <w:r>
+        <w:t xml:space="preserve"> </w:t>
+      </w:r>
+      <w:r>
+        <w:t xml:space="preserve">rule: on a page with usable HTML, a suspicious banner needs both the page model and the address model to exceed their 1% thresholds. Its effect is measured in section 8.5.</w:t>
       </w:r>
     </w:p>
     <w:p>
       <w:pPr>
         <w:numPr>
           <w:ilvl w:val="0"/>
-          <w:numId w:val="1007"/>
+          <w:numId w:val="1008"/>
         </w:numPr>
         <w:pStyle w:val="Compact"/>
       </w:pPr>
       <w:r>
+        <w:t xml:space="preserve">The address model alone does not open the warning page on a page that asks for nothing. A dangerous address verdict is shown as a banner unless the page asks for a credential, the page model also says dangerous, a second layer raises it, or no page check arrives within 5 seconds (extension 0.1.2,</w:t>
+      </w:r>
+      <w:r>
+        <w:t xml:space="preserve"> </w:t>
+      </w:r>
+      <w:r>
+        <w:rPr>
+          <w:rStyle w:val="VerbatimChar"/>
+        </w:rPr>
+        <w:t xml:space="preserve">reports/address_only_blocks.md</w:t>
+      </w:r>
+      <w:r>
+        <w:t xml:space="preserve">).</w:t>
+      </w:r>
+    </w:p>
+    <w:p>
+      <w:pPr>
+        <w:numPr>
+          <w:ilvl w:val="0"/>
+          <w:numId w:val="1008"/>
+        </w:numPr>
+        <w:pStyle w:val="Compact"/>
+      </w:pPr>
+      <w:r>
+        <w:t xml:space="preserve">Domain evidence from the backend can raise suspicious to dangerous but never turns a safe verdict into a warning. The backend is never waited for: the verdict shows at once and a late</w:t>
+      </w:r>
+      <w:r>
+        <w:t xml:space="preserve"> </w:t>
+      </w:r>
+      <w:r>
+        <w:t xml:space="preserve">“</w:t>
+      </w:r>
+      <w:r>
+        <w:t xml:space="preserve">high</w:t>
+      </w:r>
+      <w:r>
+        <w:t xml:space="preserve">”</w:t>
+      </w:r>
+      <w:r>
+        <w:t xml:space="preserve"> </w:t>
+      </w:r>
+      <w:r>
+        <w:t xml:space="preserve">answer raises it.</w:t>
+      </w:r>
+    </w:p>
+    <w:p>
+      <w:pPr>
+        <w:numPr>
+          <w:ilvl w:val="0"/>
+          <w:numId w:val="1008"/>
+        </w:numPr>
+        <w:pStyle w:val="Compact"/>
+      </w:pPr>
+      <w:r>
+        <w:t xml:space="preserve">Short links are never allowlisted and never judged by the address model; the redirect target is scored at</w:t>
+      </w:r>
+      <w:r>
+        <w:t xml:space="preserve"> </w:t>
+      </w:r>
+      <w:r>
+        <w:rPr>
+          <w:rStyle w:val="VerbatimChar"/>
+        </w:rPr>
+        <w:t xml:space="preserve">onCommitted</w:t>
+      </w:r>
+      <w:r>
+        <w:t xml:space="preserve">, before the page renders. A shortener’s own address carries no information for a URL model (section 8.10).</w:t>
+      </w:r>
+    </w:p>
+    <w:p>
+      <w:pPr>
+        <w:numPr>
+          <w:ilvl w:val="0"/>
+          <w:numId w:val="1008"/>
+        </w:numPr>
+        <w:pStyle w:val="Compact"/>
+      </w:pPr>
+      <w:r>
+        <w:t xml:space="preserve">A verdict cannot be lowered by the page itself:</w:t>
+      </w:r>
+      <w:r>
+        <w:t xml:space="preserve"> </w:t>
+      </w:r>
+      <w:r>
+        <w:rPr>
+          <w:rStyle w:val="VerbatimChar"/>
+        </w:rPr>
+        <w:t xml:space="preserve">history.replaceState</w:t>
+      </w:r>
+      <w:r>
+        <w:t xml:space="preserve"> </w:t>
+      </w:r>
+      <w:r>
+        <w:t xml:space="preserve">and later route changes keep the worst verdict per tab, login forms added after load are re-checked up to three times, frames are checked in their own right, and a page that hides or removes the banner gets the full warning page.</w:t>
+      </w:r>
+    </w:p>
+    <w:p>
+      <w:pPr>
+        <w:numPr>
+          <w:ilvl w:val="0"/>
+          <w:numId w:val="1008"/>
+        </w:numPr>
+        <w:pStyle w:val="Compact"/>
+      </w:pPr>
+      <w:r>
         <w:t xml:space="preserve">Pages with no web address of their own (data URLs, sandboxed frames) are not scored and warn only if they ask for credentials.</w:t>
       </w:r>
     </w:p>
-    <w:bookmarkEnd w:id="106"/>
-    <w:bookmarkStart w:id="107" w:name="lists-zones-and-sync"/>
+    <w:bookmarkEnd w:id="108"/>
+    <w:bookmarkStart w:id="109" w:name="lists-zones-and-sync"/>
     <w:p>
       <w:pPr>
         <w:pStyle w:val="Heading2"/>
@@ -10535,8 +12358,8 @@
         <w:t xml:space="preserve">, 2026-10-19; this is a measurement on constructed variants). Signatures are off until a key is generated on the backend machine, and the bundled allowlist held 43,595 domains at the 2026-10-19 rebuild (137 tenant hosts were added later) because the cloud rebuild could not download Tranco; the PC rebuild restores 5,740 more (same entry).</w:t>
       </w:r>
     </w:p>
-    <w:bookmarkEnd w:id="107"/>
-    <w:bookmarkStart w:id="108" w:name="brand-and-look-alike-rules"/>
+    <w:bookmarkEnd w:id="109"/>
+    <w:bookmarkStart w:id="110" w:name="brand-and-look-alike-rules"/>
     <w:p>
       <w:pPr>
         <w:pStyle w:val="Heading2"/>
@@ -10609,8 +12432,8 @@
         <w:t xml:space="preserve">). The rules were tuned after the natural set was seen, so these false-alarm counts are not independent. TLD swaps such as a bank’s name on another suffix are not caught, because brands own many suffixes.</w:t>
       </w:r>
     </w:p>
-    <w:bookmarkEnd w:id="108"/>
-    <w:bookmarkStart w:id="109" w:name="backend-and-privacy"/>
+    <w:bookmarkEnd w:id="110"/>
+    <w:bookmarkStart w:id="111" w:name="backend-and-privacy"/>
     <w:p>
       <w:pPr>
         <w:pStyle w:val="Heading2"/>
@@ -10895,8 +12718,8 @@
         <w:t xml:space="preserve">. This is a small sample, and the severities are set from it.</w:t>
       </w:r>
     </w:p>
-    <w:bookmarkEnd w:id="109"/>
-    <w:bookmarkStart w:id="110" w:name="latency"/>
+    <w:bookmarkEnd w:id="111"/>
+    <w:bookmarkStart w:id="112" w:name="latency"/>
     <w:p>
       <w:pPr>
         <w:pStyle w:val="Heading2"/>
@@ -11105,8 +12928,8 @@
         <w:t xml:space="preserve">Start-up, once per browser session, takes 166 ms to parse the 11.7 MB model bundle and 73 ms to build the model. The extension scores every navigation without reasons and asks for reasons only when a warning is shown. Page-model latency and backend response times are not measured.</w:t>
       </w:r>
     </w:p>
-    <w:bookmarkEnd w:id="110"/>
-    <w:bookmarkStart w:id="111" w:name="url-check-page-and-user-interface"/>
+    <w:bookmarkEnd w:id="112"/>
+    <w:bookmarkStart w:id="113" w:name="url-check-page-and-user-interface"/>
     <w:p>
       <w:pPr>
         <w:pStyle w:val="Heading2"/>
@@ -11200,8 +13023,8 @@
         <w:t xml:space="preserve">(which sends only the domain). The toolbar popup shows the current verdict and its reasons. Screenshots of each state should be taken on the author’s own browser for the final report.</w:t>
       </w:r>
     </w:p>
-    <w:bookmarkEnd w:id="111"/>
-    <w:bookmarkStart w:id="112" w:name="screenshots"/>
+    <w:bookmarkEnd w:id="113"/>
+    <w:bookmarkStart w:id="114" w:name="screenshots"/>
     <w:p>
       <w:pPr>
         <w:pStyle w:val="Heading2"/>
@@ -11386,9 +13209,9 @@
         <w:t xml:space="preserve">Should show: the final verdict screen with the shield, reasons and score meter.</w:t>
       </w:r>
     </w:p>
-    <w:bookmarkEnd w:id="112"/>
-    <w:bookmarkEnd w:id="113"/>
-    <w:bookmarkStart w:id="148" w:name="evaluation-of-the-detector"/>
+    <w:bookmarkEnd w:id="114"/>
+    <w:bookmarkEnd w:id="115"/>
+    <w:bookmarkStart w:id="150" w:name="evaluation-of-the-detector"/>
     <w:p>
       <w:pPr>
         <w:pStyle w:val="Heading1"/>
@@ -11397,7 +13220,7 @@
         <w:t xml:space="preserve">8. Evaluation of the detector</w:t>
       </w:r>
     </w:p>
-    <w:bookmarkStart w:id="114" w:name="protocol"/>
+    <w:bookmarkStart w:id="116" w:name="protocol"/>
     <w:p>
       <w:pPr>
         <w:pStyle w:val="Heading2"/>
@@ -11423,8 +13246,8 @@
         <w:t xml:space="preserve">), so a 0.1% point allows about 61, 23 and 56 false positives respectively, and in per-bucket views fewer than ten (marked with an asterisk where it applies). No held-out-source result above 99% appears anywhere below, so the leakage tripwire did not fire there; the one place above 0.99 on the test side (tier B on HTML rows) was investigated separately (section 8.4).</w:t>
       </w:r>
     </w:p>
-    <w:bookmarkEnd w:id="114"/>
-    <w:bookmarkStart w:id="118" w:name="Xcc216b2b2525ecbb63550bba86da6a173801b8e"/>
+    <w:bookmarkEnd w:id="116"/>
+    <w:bookmarkStart w:id="120" w:name="Xcc216b2b2525ecbb63550bba86da6a173801b8e"/>
     <w:p>
       <w:pPr>
         <w:pStyle w:val="Heading2"/>
@@ -12762,18 +14585,18 @@
           <wp:inline>
             <wp:extent cx="5922922" cy="3000518"/>
             <wp:effectExtent b="0" l="0" r="0" t="0"/>
-            <wp:docPr descr="Figure 8.1. Recall at FPR 1% and 0.1% by model and evaluation set (median of 10 splits, whiskers min to max)." title="" id="116" name="Picture"/>
+            <wp:docPr descr="Figure 8.1. Recall at FPR 1% and 0.1% by model and evaluation set (median of 10 splits, whiskers min to max)." title="" id="118" name="Picture"/>
             <a:graphic>
               <a:graphicData uri="http://schemas.openxmlformats.org/drawingml/2006/picture">
                 <pic:pic>
                   <pic:nvPicPr>
-                    <pic:cNvPr descr="figures/fig01_recall_by_model.png" id="117" name="Picture"/>
+                    <pic:cNvPr descr="figures/fig01_recall_by_model.png" id="119" name="Picture"/>
                     <pic:cNvPicPr>
                       <a:picLocks noChangeArrowheads="1" noChangeAspect="1"/>
                     </pic:cNvPicPr>
                   </pic:nvPicPr>
                   <pic:blipFill>
-                    <a:blip r:embed="rId115"/>
+                    <a:blip r:embed="rId117"/>
                     <a:stretch>
                       <a:fillRect/>
                     </a:stretch>
@@ -12905,8 +14728,8 @@
         <w:t xml:space="preserve">). The address model lost about three points at 1% and nine at 0.1%.</w:t>
       </w:r>
     </w:p>
-    <w:bookmarkEnd w:id="118"/>
-    <w:bookmarkStart w:id="122" w:name="what-the-page-adds"/>
+    <w:bookmarkEnd w:id="120"/>
+    <w:bookmarkStart w:id="124" w:name="what-the-page-adds"/>
     <w:p>
       <w:pPr>
         <w:pStyle w:val="Heading2"/>
@@ -13296,18 +15119,18 @@
           <wp:inline>
             <wp:extent cx="5922922" cy="2614540"/>
             <wp:effectExtent b="0" l="0" r="0" t="0"/>
-            <wp:docPr descr="Figure 8.2. Address model against the blend, on URLs with and without usable HTML (reports/blend2.md)." title="" id="120" name="Picture"/>
+            <wp:docPr descr="Figure 8.2. Address model against the blend, on URLs with and without usable HTML (reports/blend2.md)." title="" id="122" name="Picture"/>
             <a:graphic>
               <a:graphicData uri="http://schemas.openxmlformats.org/drawingml/2006/picture">
                 <pic:pic>
                   <pic:nvPicPr>
-                    <pic:cNvPr descr="figures/fig02_html_gain.png" id="121" name="Picture"/>
+                    <pic:cNvPr descr="figures/fig02_html_gain.png" id="123" name="Picture"/>
                     <pic:cNvPicPr>
                       <a:picLocks noChangeArrowheads="1" noChangeAspect="1"/>
                     </pic:cNvPicPr>
                   </pic:nvPicPr>
                   <pic:blipFill>
-                    <a:blip r:embed="rId119"/>
+                    <a:blip r:embed="rId121"/>
                     <a:stretch>
                       <a:fillRect/>
                     </a:stretch>
@@ -13383,8 +15206,8 @@
         <w:t xml:space="preserve">).</w:t>
       </w:r>
     </w:p>
-    <w:bookmarkEnd w:id="122"/>
-    <w:bookmarkStart w:id="123" w:name="checks-on-the-page-model"/>
+    <w:bookmarkEnd w:id="124"/>
+    <w:bookmarkStart w:id="125" w:name="checks-on-the-page-model"/>
     <w:p>
       <w:pPr>
         <w:pStyle w:val="Heading2"/>
@@ -13451,8 +15274,8 @@
         <w:t xml:space="preserve">), so the HTML subset is not a random sample. Re-weighting each HTML row by the inverse of its estimated probability of having usable HTML (clipped at 20; effective sample sizes 4,788 phishing and 17,855 legitimate rows) lowers the blend’s warned recall on HTML rows from 93.0 to 91.9 and its dangerous recall from 85.7 to 82.5. On the time slice the corrected and uncorrected figures differ by less than one point (80.4 to 80.7 warned). The correction assumes HTML loss depends only on the URL features and source; if phishing pages whose HTML survives are easier than those whose HTML does not, even the corrected figure is optimistic.</w:t>
       </w:r>
     </w:p>
-    <w:bookmarkEnd w:id="123"/>
-    <w:bookmarkStart w:id="124" w:name="the-shipped-verdict-rules"/>
+    <w:bookmarkEnd w:id="125"/>
+    <w:bookmarkStart w:id="126" w:name="the-shipped-verdict-rules"/>
     <w:p>
       <w:pPr>
         <w:pStyle w:val="Heading2"/>
@@ -14426,8 +16249,8 @@
         <w:t xml:space="preserve">).</w:t>
       </w:r>
     </w:p>
-    <w:bookmarkEnd w:id="124"/>
-    <w:bookmarkStart w:id="128" w:name="Xe426f1dec27245d1838fe304132d4e0595d666a"/>
+    <w:bookmarkEnd w:id="126"/>
+    <w:bookmarkStart w:id="130" w:name="Xe426f1dec27245d1838fe304132d4e0595d666a"/>
     <w:p>
       <w:pPr>
         <w:pStyle w:val="Heading2"/>
@@ -15035,18 +16858,18 @@
           <wp:inline>
             <wp:extent cx="5844808" cy="2522641"/>
             <wp:effectExtent b="0" l="0" r="0" t="0"/>
-            <wp:docPr descr="Figure 8.3. False-positive rate on the left-out source at the threshold chosen for 1% on the other sources." title="" id="126" name="Picture"/>
+            <wp:docPr descr="Figure 8.3. False-positive rate on the left-out source at the threshold chosen for 1% on the other sources." title="" id="128" name="Picture"/>
             <a:graphic>
               <a:graphicData uri="http://schemas.openxmlformats.org/drawingml/2006/picture">
                 <pic:pic>
                   <pic:nvPicPr>
-                    <pic:cNvPr descr="figures/fig03_loso_threshold_transfer.png" id="127" name="Picture"/>
+                    <pic:cNvPr descr="figures/fig03_loso_threshold_transfer.png" id="129" name="Picture"/>
                     <pic:cNvPicPr>
                       <a:picLocks noChangeArrowheads="1" noChangeAspect="1"/>
                     </pic:cNvPicPr>
                   </pic:nvPicPr>
                   <pic:blipFill>
-                    <a:blip r:embed="rId125"/>
+                    <a:blip r:embed="rId127"/>
                     <a:stretch>
                       <a:fillRect/>
                     </a:stretch>
@@ -15104,8 +16927,8 @@
         <w:t xml:space="preserve">baseline (43.4% recall at 1% FPR) beat both trained models (29.5% and 8.2%). The models partly learn source style, and thresholds tuned on some sources do not transfer to another. The live-feed row rests on 245 URLs and is shown for completeness only.</w:t>
       </w:r>
     </w:p>
-    <w:bookmarkEnd w:id="128"/>
-    <w:bookmarkStart w:id="135" w:name="depth-and-representation-checks"/>
+    <w:bookmarkEnd w:id="130"/>
+    <w:bookmarkStart w:id="137" w:name="depth-and-representation-checks"/>
     <w:p>
       <w:pPr>
         <w:pStyle w:val="Heading2"/>
@@ -15530,18 +17353,18 @@
           <wp:inline>
             <wp:extent cx="5922922" cy="2637515"/>
             <wp:effectExtent b="0" l="0" r="0" t="0"/>
-            <wp:docPr descr="Figure 8.4. Raw against normalised URLs: recall at FPR 1% and 0.1%." title="" id="130" name="Picture"/>
+            <wp:docPr descr="Figure 8.4. Raw against normalised URLs: recall at FPR 1% and 0.1%." title="" id="132" name="Picture"/>
             <a:graphic>
               <a:graphicData uri="http://schemas.openxmlformats.org/drawingml/2006/picture">
                 <pic:pic>
                   <pic:nvPicPr>
-                    <pic:cNvPr descr="figures/fig07_representation.png" id="131" name="Picture"/>
+                    <pic:cNvPr descr="figures/fig07_representation.png" id="133" name="Picture"/>
                     <pic:cNvPicPr>
                       <a:picLocks noChangeArrowheads="1" noChangeAspect="1"/>
                     </pic:cNvPicPr>
                   </pic:nvPicPr>
                   <pic:blipFill>
-                    <a:blip r:embed="rId129"/>
+                    <a:blip r:embed="rId131"/>
                     <a:stretch>
                       <a:fillRect/>
                     </a:stretch>
@@ -15602,18 +17425,18 @@
           <wp:inline>
             <wp:extent cx="5922922" cy="2522641"/>
             <wp:effectExtent b="0" l="0" r="0" t="0"/>
-            <wp:docPr descr="Figure 8.5. Shipped address model (hybrid2), ROC-AUC by URL depth bucket on three sets." title="" id="133" name="Picture"/>
+            <wp:docPr descr="Figure 8.5. Shipped address model (hybrid2), ROC-AUC by URL depth bucket on three sets." title="" id="135" name="Picture"/>
             <a:graphic>
               <a:graphicData uri="http://schemas.openxmlformats.org/drawingml/2006/picture">
                 <pic:pic>
                   <pic:nvPicPr>
-                    <pic:cNvPr descr="figures/fig08_depth_buckets.png" id="134" name="Picture"/>
+                    <pic:cNvPr descr="figures/fig08_depth_buckets.png" id="136" name="Picture"/>
                     <pic:cNvPicPr>
                       <a:picLocks noChangeArrowheads="1" noChangeAspect="1"/>
                     </pic:cNvPicPr>
                   </pic:nvPicPr>
                   <pic:blipFill>
-                    <a:blip r:embed="rId132"/>
+                    <a:blip r:embed="rId134"/>
                     <a:stretch>
                       <a:fillRect/>
                     </a:stretch>
@@ -15668,8 +17491,8 @@
         <w:t xml:space="preserve">) shows that the result does not rest on depth alone. Depth 0 (bare domains) is the weakest bucket on every set: 0.9209 on test, 0.9270 on the time slice and 0.7985 on PhishStorm, where it holds only 91 legitimate URLs and the cal 1% threshold flags 30.2% of them. On PhishStorm depths 1 to 3 give 0.954 to 0.960, about the overall 0.9587, so the held-out result is not an artefact of PhishStorm’s depth imbalance.</w:t>
       </w:r>
     </w:p>
-    <w:bookmarkEnd w:id="135"/>
-    <w:bookmarkStart w:id="140" w:name="Xcd7faad2695b1e803ca25dd0fcfbd11dee0a145"/>
+    <w:bookmarkEnd w:id="137"/>
+    <w:bookmarkStart w:id="142" w:name="Xcd7faad2695b1e803ca25dd0fcfbd11dee0a145"/>
     <w:p>
       <w:pPr>
         <w:pStyle w:val="Heading2"/>
@@ -16191,18 +18014,18 @@
           <wp:inline>
             <wp:extent cx="6024012" cy="2798339"/>
             <wp:effectExtent b="0" l="0" r="0" t="0"/>
-            <wp:docPr descr="Figure 8.6. Natural-page false alarms by model and by layer set (reports/ood_fpr.md, reports/blend2_rules.md, reports/shipped_verdicts.md, reports/page_fixes_fpr.md)." title="" id="137" name="Picture"/>
+            <wp:docPr descr="Figure 8.6. Natural-page false alarms by model and by layer set (reports/ood_fpr.md, reports/blend2_rules.md, reports/shipped_verdicts.md, reports/page_fixes_fpr.md)." title="" id="139" name="Picture"/>
             <a:graphic>
               <a:graphicData uri="http://schemas.openxmlformats.org/drawingml/2006/picture">
                 <pic:pic>
                   <pic:nvPicPr>
-                    <pic:cNvPr descr="figures/fig04_false_alarms_natural_pages.png" id="138" name="Picture"/>
+                    <pic:cNvPr descr="figures/fig04_false_alarms_natural_pages.png" id="140" name="Picture"/>
                     <pic:cNvPicPr>
                       <a:picLocks noChangeArrowheads="1" noChangeAspect="1"/>
                     </pic:cNvPicPr>
                   </pic:nvPicPr>
                   <pic:blipFill>
-                    <a:blip r:embed="rId136"/>
+                    <a:blip r:embed="rId138"/>
                     <a:stretch>
                       <a:fillRect/>
                     </a:stretch>
@@ -16343,7 +18166,7 @@
         <w:t xml:space="preserve">). All of these are measured on stored HTML, not on a live page, and the natural set is Tranco-seeded.</w:t>
       </w:r>
     </w:p>
-    <w:bookmarkStart w:id="139" w:name="X52a89796c9262ce33fe1ffd1a665247df49ea0d"/>
+    <w:bookmarkStart w:id="141" w:name="X52a89796c9262ce33fe1ffd1a665247df49ea0d"/>
     <w:p>
       <w:pPr>
         <w:pStyle w:val="Heading3"/>
@@ -16754,9 +18577,9 @@
         <w:t xml:space="preserve">figures are medians over ten, so the two are not strictly comparable. The crawl hosts and the natural pages both come from popular-site lists, so some of the drop may reflect that similarity. The brand-list change went in together with the new data, so the two effects are not separated. The false-alarm rate on PhishStorm at the cal-side 1% threshold stays at 3.2%. The ten-split tables elsewhere in this chapter were produced before the retrain and have not been refreshed.</w:t>
       </w:r>
     </w:p>
-    <w:bookmarkEnd w:id="139"/>
-    <w:bookmarkEnd w:id="140"/>
-    <w:bookmarkStart w:id="141" w:name="negative-controls-1"/>
+    <w:bookmarkEnd w:id="141"/>
+    <w:bookmarkEnd w:id="142"/>
+    <w:bookmarkStart w:id="143" w:name="negative-controls-1"/>
     <w:p>
       <w:pPr>
         <w:pStyle w:val="Heading2"/>
@@ -17394,8 +19217,8 @@
         <w:t xml:space="preserve">, 2026-10-12). Tier C is the control with the widest range because its test side has only 24 phishing hosts.</w:t>
       </w:r>
     </w:p>
-    <w:bookmarkEnd w:id="141"/>
-    <w:bookmarkStart w:id="145" w:name="robustness-to-url-evasion"/>
+    <w:bookmarkEnd w:id="143"/>
+    <w:bookmarkStart w:id="147" w:name="robustness-to-url-evasion"/>
     <w:p>
       <w:pPr>
         <w:pStyle w:val="Heading2"/>
@@ -17495,18 +19318,18 @@
           <wp:inline>
             <wp:extent cx="5922922" cy="2821314"/>
             <wp:effectExtent b="0" l="0" r="0" t="0"/>
-            <wp:docPr descr="Figure 8.7. Evasion rate and false alarms before and after adversarial training, per family, at the suspicious threshold." title="" id="143" name="Picture"/>
+            <wp:docPr descr="Figure 8.7. Evasion rate and false alarms before and after adversarial training, per family, at the suspicious threshold." title="" id="145" name="Picture"/>
             <a:graphic>
               <a:graphicData uri="http://schemas.openxmlformats.org/drawingml/2006/picture">
                 <pic:pic>
                   <pic:nvPicPr>
-                    <pic:cNvPr descr="figures/fig05_evasion_adversarial.png" id="144" name="Picture"/>
+                    <pic:cNvPr descr="figures/fig05_evasion_adversarial.png" id="146" name="Picture"/>
                     <pic:cNvPicPr>
                       <a:picLocks noChangeArrowheads="1" noChangeAspect="1"/>
                     </pic:cNvPicPr>
                   </pic:nvPicPr>
                   <pic:blipFill>
-                    <a:blip r:embed="rId142"/>
+                    <a:blip r:embed="rId144"/>
                     <a:stretch>
                       <a:fillRect/>
                     </a:stretch>
@@ -17549,8 +19372,8 @@
         <w:t xml:space="preserve">The result is the opposite of the usual evasion story. The shipped model is hard to evade with these rewrites (2.4% evasion for stacked subdomains, 1.3% for padding, 2.9% for shortener wrapping, against 30.5% for unmodified phishing), but only because it treats the rewrite as suspicious: it also flags 63.5%, 72.5% and 97.2% of legitimate URLs rewritten the same way. Long legitimate URLs that were not rewritten are not a problem (0.7% flagged). Training on variants of both classes removes the false alarms for the families it saw (1.1% to 2.1%; 0.0% for shortener) and returns evasion to the clean rate (32% to 41%; shortener 100%, because a short link carries nothing for a URL model). A family the model never saw behaves like the base model on both sides, and each held-out column rests on one split. The apparent robustness of the base model is therefore over-suspicion rather than understanding, and the extension needs its other layers for real traffic: shorteners are expanded and scored at the target, and the allowlist and blocklists carry sites that a URL model would flag. The rewrites are synthetic (random lure words, brands from the project’s own list), so real attacker URLs may differ. Robustness of tier B was not measured.</w:t>
       </w:r>
     </w:p>
-    <w:bookmarkEnd w:id="145"/>
-    <w:bookmarkStart w:id="146" w:name="tier-c"/>
+    <w:bookmarkEnd w:id="147"/>
+    <w:bookmarkStart w:id="148" w:name="tier-c"/>
     <w:p>
       <w:pPr>
         <w:pStyle w:val="Heading2"/>
@@ -18172,8 +19995,8 @@
         <w:t xml:space="preserve">pairs, so collection method may leak into host-form features. The time check was skipped because the eligible rows span two capture days. Tier C is not wired into the backend: the backend’s run-time checks are the hand-set rules in section 7.5.</w:t>
       </w:r>
     </w:p>
-    <w:bookmarkEnd w:id="146"/>
-    <w:bookmarkStart w:id="147" w:name="real-world-and-stress-tests"/>
+    <w:bookmarkEnd w:id="148"/>
+    <w:bookmarkStart w:id="149" w:name="real-world-and-stress-tests"/>
     <w:p>
       <w:pPr>
         <w:pStyle w:val="Heading2"/>
@@ -18203,174 +20026,6 @@
       </w:r>
       <w:r>
         <w:t xml:space="preserve">unless a report is named.</w:t>
-      </w:r>
-    </w:p>
-    <w:p>
-      <w:pPr>
-        <w:numPr>
-          <w:ilvl w:val="0"/>
-          <w:numId w:val="1008"/>
-        </w:numPr>
-        <w:pStyle w:val="Compact"/>
-      </w:pPr>
-      <w:r>
-        <w:rPr>
-          <w:bCs/>
-          <w:b/>
-        </w:rPr>
-        <w:t xml:space="preserve">First real-site use (2026-10-13).</w:t>
-      </w:r>
-      <w:r>
-        <w:t xml:space="preserve"> </w:t>
-      </w:r>
-      <w:r>
-        <w:t xml:space="preserve">The author’s first browsing test found</w:t>
-      </w:r>
-      <w:r>
-        <w:t xml:space="preserve"> </w:t>
-      </w:r>
-      <w:r>
-        <w:rPr>
-          <w:rStyle w:val="VerbatimChar"/>
-        </w:rPr>
-        <w:t xml:space="preserve">web.whatsapp.com</w:t>
-      </w:r>
-      <w:r>
-        <w:t xml:space="preserve"> </w:t>
-      </w:r>
-      <w:r>
-        <w:t xml:space="preserve">called dangerous: the model scored it 0.991 against a 0.990 threshold, and without a backend the extension had no allowlist. The address model alone flags 161 of the Tranco top 1,000 homepages. This led to the bundled allowlist (section 7.3).</w:t>
-      </w:r>
-    </w:p>
-    <w:p>
-      <w:pPr>
-        <w:numPr>
-          <w:ilvl w:val="0"/>
-          <w:numId w:val="1008"/>
-        </w:numPr>
-        <w:pStyle w:val="Compact"/>
-      </w:pPr>
-      <w:r>
-        <w:rPr>
-          <w:bCs/>
-          <w:b/>
-        </w:rPr>
-        <w:t xml:space="preserve">URL layer on fresh feed URLs (2026-10-14).</w:t>
-      </w:r>
-      <w:r>
-        <w:t xml:space="preserve"> </w:t>
-      </w:r>
-      <w:r>
-        <w:t xml:space="preserve">On 200 active phishing hosts from Phishing.Database and 104 regional brand URLs, 62.5% of phishing was warned before the zone fix, 12 model-flagged hosts were silenced by allowlisted hosting domains, and 0 of 104 brand URLs were flagged. After zones were learned from phishing history, 68.5% were warned (73 dangerous, 64 suspicious), none were silenced, and 0 of 104 brand URLs were flagged. The 200 hosts were left out of the zone evidence.</w:t>
-      </w:r>
-    </w:p>
-    <w:p>
-      <w:pPr>
-        <w:numPr>
-          <w:ilvl w:val="0"/>
-          <w:numId w:val="1008"/>
-        </w:numPr>
-        <w:pStyle w:val="Compact"/>
-      </w:pPr>
-      <w:r>
-        <w:rPr>
-          <w:bCs/>
-          <w:b/>
-        </w:rPr>
-        <w:t xml:space="preserve">Stress test (2026-10-15).</w:t>
-      </w:r>
-      <w:r>
-        <w:t xml:space="preserve"> </w:t>
-      </w:r>
-      <w:r>
-        <w:t xml:space="preserve">A headless-browser and Node test with fresh feed phishing, hosting-platform phishing, six evasion families, long URLs and 138 legitimate login pages found five real gaps (a very long URL threw an error that disabled every check; allowlisted sites were never page-checked; short links failed both ways; redirect targets were judged only after render; the page could choose which address was scored). All five were fixed. Before to after: hosting-platform phishing warned 81.0% to 85.9%, OpenPhish 92.3% to 92.7%, Phishing.Database active 82.0% to 82.2%; natural legitimate pages flagged unchanged at 2.7%; legitimate links wrapped in a shortener flagged 29.6% to 0.0% and phishing wrapped in a shortener 24.6% to 0.0% at the address, now decided at the target (the last step is inferred from the code path, not measured in a browser). Part of the Phishing.Database sample overlaps the data the zones were learned from, so that row flatters the system.</w:t>
-      </w:r>
-    </w:p>
-    <w:p>
-      <w:pPr>
-        <w:numPr>
-          <w:ilvl w:val="0"/>
-          <w:numId w:val="1008"/>
-        </w:numPr>
-        <w:pStyle w:val="Compact"/>
-      </w:pPr>
-      <w:r>
-        <w:rPr>
-          <w:bCs/>
-          <w:b/>
-        </w:rPr>
-        <w:t xml:space="preserve">Tester rounds on local attack pages (2026-10-19).</w:t>
-      </w:r>
-      <w:r>
-        <w:t xml:space="preserve"> </w:t>
-      </w:r>
-      <w:r>
-        <w:t xml:space="preserve">A separate test thread ran 35 attack cases in real Chromium on locally served pages (late-injected forms, frames, shadow roots,</w:t>
-      </w:r>
-      <w:r>
-        <w:t xml:space="preserve"> </w:t>
-      </w:r>
-      <w:r>
-        <w:rPr>
-          <w:rStyle w:val="VerbatimChar"/>
-        </w:rPr>
-        <w:t xml:space="preserve">replaceState</w:t>
-      </w:r>
-      <w:r>
-        <w:t xml:space="preserve">, back-to-safety). The first build passed 21 of 35, the next 31 of 35, then 34 of 35, and after the fourth round of fixes 35 of 35 in four full runs in a row. After the 2026-10-20 address-only change the same harness gave 33 of 35, with the two trust cases failing only because the harness’s stub serves lists without the signed manifest. These are constructed pages, so they test the logic, not detection of live phishing.</w:t>
-      </w:r>
-    </w:p>
-    <w:p>
-      <w:pPr>
-        <w:numPr>
-          <w:ilvl w:val="0"/>
-          <w:numId w:val="1008"/>
-        </w:numPr>
-        <w:pStyle w:val="Compact"/>
-      </w:pPr>
-      <w:r>
-        <w:rPr>
-          <w:bCs/>
-          <w:b/>
-        </w:rPr>
-        <w:t xml:space="preserve">Address rules and tenant sites.</w:t>
-      </w:r>
-      <w:r>
-        <w:t xml:space="preserve"> </w:t>
-      </w:r>
-      <w:r>
-        <w:t xml:space="preserve">Section 7.3 and 7.4 report their own before and after counts.</w:t>
-      </w:r>
-    </w:p>
-    <w:p>
-      <w:pPr>
-        <w:pStyle w:val="FirstParagraph"/>
-      </w:pPr>
-      <w:r>
-        <w:t xml:space="preserve">Blocklist coverage on the corpus is not measurable, because the test URLs come from datasets collected in other periods than the live feeds. It can only be measured forward, as the share of newly listed feed URLs whose domain was already on an earlier list, once the collector has run for several days. This is not measured.</w:t>
-      </w:r>
-    </w:p>
-    <w:bookmarkEnd w:id="147"/>
-    <w:bookmarkEnd w:id="148"/>
-    <w:bookmarkStart w:id="149" w:name="limitations-and-what-is-not-done"/>
-    <w:p>
-      <w:pPr>
-        <w:pStyle w:val="Heading1"/>
-      </w:pPr>
-      <w:r>
-        <w:t xml:space="preserve">9. Limitations and what is not done</w:t>
-      </w:r>
-    </w:p>
-    <w:p>
-      <w:pPr>
-        <w:pStyle w:val="FirstParagraph"/>
-      </w:pPr>
-      <w:r>
-        <w:rPr>
-          <w:bCs/>
-          <w:b/>
-        </w:rPr>
-        <w:t xml:space="preserve">What the results do and do not support.</w:t>
       </w:r>
     </w:p>
     <w:p>
@@ -18386,13 +20041,28 @@
           <w:bCs/>
           <w:b/>
         </w:rPr>
-        <w:t xml:space="preserve">Thresholds do not transfer across sources.</w:t>
-      </w:r>
-      <w:r>
-        <w:t xml:space="preserve"> </w:t>
-      </w:r>
-      <w:r>
-        <w:t xml:space="preserve">The cal-side 1% threshold gives 20.1% FPR when PhreshPhish is held out (Table 8.5), 3.8% to 4.8% on PhishStorm (Table 8.2), and 3.4% to 5.3% on natural pages (Table 8.7), against a 1% target. A conservative suspicious threshold or per-source calibration is the obvious next step; one such variant was tested and not shipped (section 8.5).</w:t>
+        <w:t xml:space="preserve">First real-site use (2026-10-13).</w:t>
+      </w:r>
+      <w:r>
+        <w:t xml:space="preserve"> </w:t>
+      </w:r>
+      <w:r>
+        <w:t xml:space="preserve">The author’s first browsing test found</w:t>
+      </w:r>
+      <w:r>
+        <w:t xml:space="preserve"> </w:t>
+      </w:r>
+      <w:r>
+        <w:rPr>
+          <w:rStyle w:val="VerbatimChar"/>
+        </w:rPr>
+        <w:t xml:space="preserve">web.whatsapp.com</w:t>
+      </w:r>
+      <w:r>
+        <w:t xml:space="preserve"> </w:t>
+      </w:r>
+      <w:r>
+        <w:t xml:space="preserve">called dangerous: the model scored it 0.991 against a 0.990 threshold, and without a backend the extension had no allowlist. The address model alone flags 161 of the Tranco top 1,000 homepages. This led to the bundled allowlist (section 7.3).</w:t>
       </w:r>
     </w:p>
     <w:p>
@@ -18408,22 +20078,13 @@
           <w:bCs/>
           <w:b/>
         </w:rPr>
-        <w:t xml:space="preserve">The bare-domain ceiling.</w:t>
-      </w:r>
-      <w:r>
-        <w:t xml:space="preserve"> </w:t>
-      </w:r>
-      <w:r>
-        <w:t xml:space="preserve">PhiUSIIL phishing is mostly bare domains, and hybrid2 reached only 38.5% recall at FPR 0.1% on PhiUSIIL test rows (</w:t>
-      </w:r>
-      <w:r>
-        <w:rPr>
-          <w:rStyle w:val="VerbatimChar"/>
-        </w:rPr>
-        <w:t xml:space="preserve">reports/hybrid2.md</w:t>
-      </w:r>
-      <w:r>
-        <w:t xml:space="preserve">). Without a path or a page the domain name carries little signal. Normalising URLs lowers recall at 1% FPR from 69.5 to 44.3 (Table 8.6).</w:t>
+        <w:t xml:space="preserve">URL layer on fresh feed URLs (2026-10-14).</w:t>
+      </w:r>
+      <w:r>
+        <w:t xml:space="preserve"> </w:t>
+      </w:r>
+      <w:r>
+        <w:t xml:space="preserve">On 200 active phishing hosts from Phishing.Database and 104 regional brand URLs, 62.5% of phishing was warned before the zone fix, 12 model-flagged hosts were silenced by allowlisted hosting domains, and 0 of 104 brand URLs were flagged. After zones were learned from phishing history, 68.5% were warned (73 dangerous, 64 suspicious), none were silenced, and 0 of 104 brand URLs were flagged. The 200 hosts were left out of the zone evidence.</w:t>
       </w:r>
     </w:p>
     <w:p>
@@ -18439,13 +20100,13 @@
           <w:bCs/>
           <w:b/>
         </w:rPr>
-        <w:t xml:space="preserve">The page model is effectively single-source.</w:t>
-      </w:r>
-      <w:r>
-        <w:t xml:space="preserve"> </w:t>
-      </w:r>
-      <w:r>
-        <w:t xml:space="preserve">Almost all HTML rows come from PhreshPhish, the held-out source has no HTML, and a PhreshPhish-specific page artefact cannot be excluded. Survivorship in saved HTML (taken-down or cloaked pages are missing) is handled only by an assumption-based correction (section 8.4). Dated phishing HTML (Phishpedia, 2019 to 2020) differs from current pages, and the page model drifted more than the address model.</w:t>
+        <w:t xml:space="preserve">Stress test (2026-10-15).</w:t>
+      </w:r>
+      <w:r>
+        <w:t xml:space="preserve"> </w:t>
+      </w:r>
+      <w:r>
+        <w:t xml:space="preserve">A headless-browser and Node test with fresh feed phishing, hosting-platform phishing, six evasion families, long URLs and 138 legitimate login pages found five real gaps (a very long URL threw an error that disabled every check; allowlisted sites were never page-checked; short links failed both ways; redirect targets were judged only after render; the page could choose which address was scored). All five were fixed. Before to after: hosting-platform phishing warned 81.0% to 85.9%, OpenPhish 92.3% to 92.7%, Phishing.Database active 82.0% to 82.2%; natural legitimate pages flagged unchanged at 2.7%; legitimate links wrapped in a shortener flagged 29.6% to 0.0% and phishing wrapped in a shortener 24.6% to 0.0% at the address, now decided at the target (the last step is inferred from the code path, not measured in a browser). Part of the Phishing.Database sample overlaps the data the zones were learned from, so that row flatters the system.</w:t>
       </w:r>
     </w:p>
     <w:p>
@@ -18461,13 +20122,25 @@
           <w:bCs/>
           <w:b/>
         </w:rPr>
-        <w:t xml:space="preserve">Evaluation coverage is uneven.</w:t>
-      </w:r>
-      <w:r>
-        <w:t xml:space="preserve"> </w:t>
-      </w:r>
-      <w:r>
-        <w:t xml:space="preserve">Leave-one-source-out used three splits and the original tier A models; robustness used six splits and synthetic rewrites; tier B robustness and a tier B held-out source do not exist; the extra hybrid2 text scorers were chosen on calibration slices that are also used for thresholds.</w:t>
+        <w:t xml:space="preserve">Tester rounds on local attack pages (2026-10-19).</w:t>
+      </w:r>
+      <w:r>
+        <w:t xml:space="preserve"> </w:t>
+      </w:r>
+      <w:r>
+        <w:t xml:space="preserve">A separate test thread ran 35 attack cases in real Chromium on locally served pages (late-injected forms, frames, shadow roots,</w:t>
+      </w:r>
+      <w:r>
+        <w:t xml:space="preserve"> </w:t>
+      </w:r>
+      <w:r>
+        <w:rPr>
+          <w:rStyle w:val="VerbatimChar"/>
+        </w:rPr>
+        <w:t xml:space="preserve">replaceState</w:t>
+      </w:r>
+      <w:r>
+        <w:t xml:space="preserve">, back-to-safety). The first build passed 21 of 35, the next 31 of 35, then 34 of 35, and after the fourth round of fixes 35 of 35 in four full runs in a row. After the 2026-10-20 address-only change the same harness gave 33 of 35, with the two trust cases failing only because the harness’s stub serves lists without the signed manifest. These are constructed pages, so they test the logic, not detection of live phishing.</w:t>
       </w:r>
     </w:p>
     <w:p>
@@ -18483,141 +20156,44 @@
           <w:bCs/>
           <w:b/>
         </w:rPr>
-        <w:t xml:space="preserve">Tier C is a pilot.</w:t>
-      </w:r>
-      <w:r>
-        <w:t xml:space="preserve"> </w:t>
-      </w:r>
-      <w:r>
-        <w:t xml:space="preserve">119 phishing hosts from 91 domains, every fixed-FPR point granularity-limited, no second live source, Tranco-sampled legitimate hosts, and no time check. The backend does not run a tier C model.</w:t>
-      </w:r>
-    </w:p>
-    <w:p>
-      <w:pPr>
-        <w:numPr>
-          <w:ilvl w:val="0"/>
-          <w:numId w:val="1009"/>
-        </w:numPr>
-        <w:pStyle w:val="Compact"/>
+        <w:t xml:space="preserve">Address rules and tenant sites.</w:t>
+      </w:r>
+      <w:r>
+        <w:t xml:space="preserve"> </w:t>
+      </w:r>
+      <w:r>
+        <w:t xml:space="preserve">Section 7.3 and 7.4 report their own before and after counts.</w:t>
+      </w:r>
+    </w:p>
+    <w:p>
+      <w:pPr>
+        <w:pStyle w:val="FirstParagraph"/>
+      </w:pPr>
+      <w:r>
+        <w:t xml:space="preserve">Blocklist coverage on the corpus is not measurable, because the test URLs come from datasets collected in other periods than the live feeds. It can only be measured forward, as the share of newly listed feed URLs whose domain was already on an earlier list, once the collector has run for several days. This is not measured.</w:t>
+      </w:r>
+    </w:p>
+    <w:bookmarkEnd w:id="149"/>
+    <w:bookmarkEnd w:id="150"/>
+    <w:bookmarkStart w:id="151" w:name="limitations-and-what-is-not-done"/>
+    <w:p>
+      <w:pPr>
+        <w:pStyle w:val="Heading1"/>
+      </w:pPr>
+      <w:r>
+        <w:t xml:space="preserve">9. Limitations and what is not done</w:t>
+      </w:r>
+    </w:p>
+    <w:p>
+      <w:pPr>
+        <w:pStyle w:val="FirstParagraph"/>
       </w:pPr>
       <w:r>
         <w:rPr>
           <w:bCs/>
           <w:b/>
         </w:rPr>
-        <w:t xml:space="preserve">The false-alarm numbers are optimistic.</w:t>
-      </w:r>
-      <w:r>
-        <w:t xml:space="preserve"> </w:t>
-      </w:r>
-      <w:r>
-        <w:t xml:space="preserve">The natural pages are Tranco-seeded, most were measured on stored HTML, and the brand rules and several fixes were tuned after the natural set was seen.</w:t>
-      </w:r>
-    </w:p>
-    <w:p>
-      <w:pPr>
-        <w:numPr>
-          <w:ilvl w:val="0"/>
-          <w:numId w:val="1009"/>
-        </w:numPr>
-        <w:pStyle w:val="Compact"/>
-      </w:pPr>
-      <w:r>
-        <w:rPr>
-          <w:bCs/>
-          <w:b/>
-        </w:rPr>
-        <w:t xml:space="preserve">The</w:t>
-      </w:r>
-      <w:r>
-        <w:rPr>
-          <w:bCs/>
-          <w:b/>
-        </w:rPr>
-        <w:t xml:space="preserve"> </w:t>
-      </w:r>
-      <w:r>
-        <w:rPr>
-          <w:bCs/>
-          <w:b/>
-        </w:rPr>
-        <w:t xml:space="preserve">“</w:t>
-      </w:r>
-      <w:r>
-        <w:rPr>
-          <w:bCs/>
-          <w:b/>
-        </w:rPr>
-        <w:t xml:space="preserve">blend</w:t>
-      </w:r>
-      <w:r>
-        <w:rPr>
-          <w:bCs/>
-          <w:b/>
-        </w:rPr>
-        <w:t xml:space="preserve">”</w:t>
-      </w:r>
-      <w:r>
-        <w:rPr>
-          <w:bCs/>
-          <w:b/>
-        </w:rPr>
-        <w:t xml:space="preserve"> </w:t>
-      </w:r>
-      <w:r>
-        <w:rPr>
-          <w:bCs/>
-          <w:b/>
-        </w:rPr>
-        <w:t xml:space="preserve">has two runs.</w:t>
-      </w:r>
-      <w:r>
-        <w:t xml:space="preserve"> </w:t>
-      </w:r>
-      <w:r>
-        <w:t xml:space="preserve">The blend and hybrid2 appear with slightly different numbers in</w:t>
-      </w:r>
-      <w:r>
-        <w:t xml:space="preserve"> </w:t>
-      </w:r>
-      <w:r>
-        <w:rPr>
-          <w:rStyle w:val="VerbatimChar"/>
-        </w:rPr>
-        <w:t xml:space="preserve">reports/blend.md</w:t>
-      </w:r>
-      <w:r>
-        <w:t xml:space="preserve"> </w:t>
-      </w:r>
-      <w:r>
-        <w:t xml:space="preserve">and</w:t>
-      </w:r>
-      <w:r>
-        <w:t xml:space="preserve"> </w:t>
-      </w:r>
-      <w:r>
-        <w:rPr>
-          <w:rStyle w:val="VerbatimChar"/>
-        </w:rPr>
-        <w:t xml:space="preserve">reports/blend2.md</w:t>
-      </w:r>
-      <w:r>
-        <w:t xml:space="preserve"> </w:t>
-      </w:r>
-      <w:r>
-        <w:t xml:space="preserve">(for example blend recall at 1% FPR on test 73.7 against 74.6), because they are separate training runs; Table 8.1 uses the newer one and Table 8.6 the older one.</w:t>
-      </w:r>
-    </w:p>
-    <w:p>
-      <w:pPr>
-        <w:pStyle w:val="FirstParagraph"/>
-      </w:pPr>
-      <w:r>
-        <w:rPr>
-          <w:bCs/>
-          <w:b/>
-        </w:rPr>
-        <w:t xml:space="preserve">What is not done or not measured.</w:t>
+        <w:t xml:space="preserve">What the results do and do not support.</w:t>
       </w:r>
     </w:p>
     <w:p>
@@ -18633,13 +20209,13 @@
           <w:bCs/>
           <w:b/>
         </w:rPr>
-        <w:t xml:space="preserve">Browsing study.</w:t>
-      </w:r>
-      <w:r>
-        <w:t xml:space="preserve"> </w:t>
-      </w:r>
-      <w:r>
-        <w:t xml:space="preserve">No systematic test on real sites with screenshots of false alarms. The sandbox cannot open real sites; the author’s own use found one false alarm (section 8.12).</w:t>
+        <w:t xml:space="preserve">Thresholds do not transfer across sources.</w:t>
+      </w:r>
+      <w:r>
+        <w:t xml:space="preserve"> </w:t>
+      </w:r>
+      <w:r>
+        <w:t xml:space="preserve">The cal-side 1% threshold gives 20.1% FPR when PhreshPhish is held out (Table 8.5), 3.8% to 4.8% on PhishStorm (Table 8.2), and 3.4% to 5.3% on natural pages (Table 8.7), against a 1% target. A conservative suspicious threshold or per-source calibration is the obvious next step; one such variant was tested and not shipped (section 8.5).</w:t>
       </w:r>
     </w:p>
     <w:p>
@@ -18655,13 +20231,22 @@
           <w:bCs/>
           <w:b/>
         </w:rPr>
-        <w:t xml:space="preserve">Live backend lookups.</w:t>
-      </w:r>
-      <w:r>
-        <w:t xml:space="preserve"> </w:t>
-      </w:r>
-      <w:r>
-        <w:t xml:space="preserve">Backend response times and a live RDAP, DNS and TLS lookup against real feeds have not been measured; the extension’s backend answers are placeholder rules.</w:t>
+        <w:t xml:space="preserve">The bare-domain ceiling.</w:t>
+      </w:r>
+      <w:r>
+        <w:t xml:space="preserve"> </w:t>
+      </w:r>
+      <w:r>
+        <w:t xml:space="preserve">PhiUSIIL phishing is mostly bare domains, and hybrid2 reached only 38.5% recall at FPR 0.1% on PhiUSIIL test rows (</w:t>
+      </w:r>
+      <w:r>
+        <w:rPr>
+          <w:rStyle w:val="VerbatimChar"/>
+        </w:rPr>
+        <w:t xml:space="preserve">reports/hybrid2.md</w:t>
+      </w:r>
+      <w:r>
+        <w:t xml:space="preserve">). Without a path or a page the domain name carries little signal. Normalising URLs lowers recall at 1% FPR from 69.5 to 44.3 (Table 8.6).</w:t>
       </w:r>
     </w:p>
     <w:p>
@@ -18677,13 +20262,13 @@
           <w:bCs/>
           <w:b/>
         </w:rPr>
-        <w:t xml:space="preserve">Safe Browsing and the language-model layer.</w:t>
-      </w:r>
-      <w:r>
-        <w:t xml:space="preserve"> </w:t>
-      </w:r>
-      <w:r>
-        <w:t xml:space="preserve">Google Safe Browsing is not integrated, and the optional second-opinion layer was not built. List signatures are off until a key is made on the backend machine.</w:t>
+        <w:t xml:space="preserve">The page model is effectively single-source.</w:t>
+      </w:r>
+      <w:r>
+        <w:t xml:space="preserve"> </w:t>
+      </w:r>
+      <w:r>
+        <w:t xml:space="preserve">Almost all HTML rows come from PhreshPhish, the held-out source has no HTML, and a PhreshPhish-specific page artefact cannot be excluded. Survivorship in saved HTML (taken-down or cloaked pages are missing) is handled only by an assumption-based correction (section 8.4). Dated phishing HTML (Phishpedia, 2019 to 2020) differs from current pages, and the page model drifted more than the address model.</w:t>
       </w:r>
     </w:p>
     <w:p>
@@ -18699,13 +20284,13 @@
           <w:bCs/>
           <w:b/>
         </w:rPr>
-        <w:t xml:space="preserve">Model refresh.</w:t>
-      </w:r>
-      <w:r>
-        <w:t xml:space="preserve"> </w:t>
-      </w:r>
-      <w:r>
-        <w:t xml:space="preserve">The shipped model was retrained on 2026-10-21 for split 0 with the 899-name brand list and the popular-sites crawl (section 8.8.1). The ten-split tables in this chapter still describe the earlier model, and the effect of the new data and of the brand list is not separated.</w:t>
+        <w:t xml:space="preserve">Evaluation coverage is uneven.</w:t>
+      </w:r>
+      <w:r>
+        <w:t xml:space="preserve"> </w:t>
+      </w:r>
+      <w:r>
+        <w:t xml:space="preserve">Leave-one-source-out used three splits and the original tier A models; robustness used six splits and synthetic rewrites; tier B robustness and a tier B held-out source do not exist; the extra hybrid2 text scorers were chosen on calibration slices that are also used for thresholds.</w:t>
       </w:r>
     </w:p>
     <w:p>
@@ -18721,81 +20306,99 @@
           <w:bCs/>
           <w:b/>
         </w:rPr>
-        <w:t xml:space="preserve">Blocklist coverage</w:t>
-      </w:r>
-      <w:r>
-        <w:t xml:space="preserve"> </w:t>
-      </w:r>
-      <w:r>
-        <w:t xml:space="preserve">(section 8.12),</w:t>
-      </w:r>
-      <w:r>
-        <w:t xml:space="preserve"> </w:t>
-      </w:r>
+        <w:t xml:space="preserve">Tier C is a pilot.</w:t>
+      </w:r>
+      <w:r>
+        <w:t xml:space="preserve"> </w:t>
+      </w:r>
+      <w:r>
+        <w:t xml:space="preserve">119 phishing hosts from 91 domains, every fixed-FPR point granularity-limited, no second live source, Tranco-sampled legitimate hosts, and no time check. The backend does not run a tier C model.</w:t>
+      </w:r>
+    </w:p>
+    <w:p>
+      <w:pPr>
+        <w:numPr>
+          <w:ilvl w:val="0"/>
+          <w:numId w:val="1010"/>
+        </w:numPr>
+        <w:pStyle w:val="Compact"/>
+      </w:pPr>
       <w:r>
         <w:rPr>
           <w:bCs/>
           <w:b/>
         </w:rPr>
-        <w:t xml:space="preserve">screenshots</w:t>
-      </w:r>
-      <w:r>
-        <w:t xml:space="preserve"> </w:t>
-      </w:r>
-      <w:r>
-        <w:t xml:space="preserve">and</w:t>
-      </w:r>
-      <w:r>
-        <w:t xml:space="preserve"> </w:t>
-      </w:r>
+        <w:t xml:space="preserve">The false-alarm numbers are optimistic.</w:t>
+      </w:r>
+      <w:r>
+        <w:t xml:space="preserve"> </w:t>
+      </w:r>
+      <w:r>
+        <w:t xml:space="preserve">The natural pages are Tranco-seeded, most were measured on stored HTML, and the brand rules and several fixes were tuned after the natural set was seen.</w:t>
+      </w:r>
+    </w:p>
+    <w:p>
+      <w:pPr>
+        <w:numPr>
+          <w:ilvl w:val="0"/>
+          <w:numId w:val="1010"/>
+        </w:numPr>
+        <w:pStyle w:val="Compact"/>
+      </w:pPr>
       <w:r>
         <w:rPr>
           <w:bCs/>
           <w:b/>
         </w:rPr>
-        <w:t xml:space="preserve">demo video</w:t>
-      </w:r>
-      <w:r>
-        <w:t xml:space="preserve"> </w:t>
-      </w:r>
-      <w:r>
-        <w:t xml:space="preserve">are not done.</w:t>
-      </w:r>
-    </w:p>
-    <w:p>
-      <w:pPr>
-        <w:pStyle w:val="FirstParagraph"/>
-      </w:pPr>
+        <w:t xml:space="preserve">The</w:t>
+      </w:r>
       <w:r>
         <w:rPr>
           <w:bCs/>
           <w:b/>
         </w:rPr>
-        <w:t xml:space="preserve">Out of scope.</w:t>
-      </w:r>
-      <w:r>
-        <w:t xml:space="preserve"> </w:t>
-      </w:r>
-      <w:r>
-        <w:t xml:space="preserve">Phishing hosted on trusted platforms is masked in the URL tier and removed from tier C, so it is invisible to those tiers. Phishing on compromised legitimate sites and behind cloaking is largely invisible to all three. A learn-from-mistakes loop was designed (opt-in reports confirmed by an independent signal before they become labels, then a scheduled retrain that ships only if the held-out source, time slice and natural-page check are no worse) but not built; users can currently report only a false alarm, with the domain alone.</w:t>
-      </w:r>
-    </w:p>
-    <w:p>
-      <w:pPr>
-        <w:pStyle w:val="BodyText"/>
-      </w:pPr>
+        <w:t xml:space="preserve"> </w:t>
+      </w:r>
       <w:r>
         <w:rPr>
           <w:bCs/>
           <w:b/>
         </w:rPr>
-        <w:t xml:space="preserve">Known weaknesses of the extension.</w:t>
-      </w:r>
-      <w:r>
-        <w:t xml:space="preserve"> </w:t>
-      </w:r>
-      <w:r>
-        <w:t xml:space="preserve">A dangerous page can start loading before the warning replaces it, because</w:t>
+        <w:t xml:space="preserve">“</w:t>
+      </w:r>
+      <w:r>
+        <w:rPr>
+          <w:bCs/>
+          <w:b/>
+        </w:rPr>
+        <w:t xml:space="preserve">blend</w:t>
+      </w:r>
+      <w:r>
+        <w:rPr>
+          <w:bCs/>
+          <w:b/>
+        </w:rPr>
+        <w:t xml:space="preserve">”</w:t>
+      </w:r>
+      <w:r>
+        <w:rPr>
+          <w:bCs/>
+          <w:b/>
+        </w:rPr>
+        <w:t xml:space="preserve"> </w:t>
+      </w:r>
+      <w:r>
+        <w:rPr>
+          <w:bCs/>
+          <w:b/>
+        </w:rPr>
+        <w:t xml:space="preserve">has two runs.</w:t>
+      </w:r>
+      <w:r>
+        <w:t xml:space="preserve"> </w:t>
+      </w:r>
+      <w:r>
+        <w:t xml:space="preserve">The blend and hybrid2 appear with slightly different numbers in</w:t>
       </w:r>
       <w:r>
         <w:t xml:space="preserve"> </w:t>
@@ -18804,41 +20407,40 @@
         <w:rPr>
           <w:rStyle w:val="VerbatimChar"/>
         </w:rPr>
-        <w:t xml:space="preserve">webNavigation</w:t>
-      </w:r>
-      <w:r>
-        <w:t xml:space="preserve"> </w:t>
-      </w:r>
-      <w:r>
-        <w:t xml:space="preserve">cannot block a navigation. A hosting zone that nobody has abused in the data is still trusted until it appears in a feed. A phishing page whose address alone is dangerous now renders with the banner until the page check completes (at most 5 seconds) before the warning page replaces it (</w:t>
+        <w:t xml:space="preserve">reports/blend.md</w:t>
+      </w:r>
+      <w:r>
+        <w:t xml:space="preserve"> </w:t>
+      </w:r>
+      <w:r>
+        <w:t xml:space="preserve">and</w:t>
+      </w:r>
+      <w:r>
+        <w:t xml:space="preserve"> </w:t>
       </w:r>
       <w:r>
         <w:rPr>
           <w:rStyle w:val="VerbatimChar"/>
         </w:rPr>
-        <w:t xml:space="preserve">docs/PROGRESS.md</w:t>
-      </w:r>
-      <w:r>
-        <w:t xml:space="preserve">, 2026-10-20).</w:t>
-      </w:r>
-    </w:p>
-    <w:bookmarkEnd w:id="149"/>
-    <w:bookmarkStart w:id="153" w:name="conclusion-and-future-work"/>
-    <w:p>
-      <w:pPr>
-        <w:pStyle w:val="Heading1"/>
-      </w:pPr>
-      <w:r>
-        <w:t xml:space="preserve">10. Conclusion and future work</w:t>
-      </w:r>
-    </w:p>
-    <w:bookmarkStart w:id="150" w:name="what-was-achieved"/>
-    <w:p>
-      <w:pPr>
-        <w:pStyle w:val="Heading2"/>
-      </w:pPr>
-      <w:r>
-        <w:t xml:space="preserve">10.1 What was achieved</w:t>
+        <w:t xml:space="preserve">reports/blend2.md</w:t>
+      </w:r>
+      <w:r>
+        <w:t xml:space="preserve"> </w:t>
+      </w:r>
+      <w:r>
+        <w:t xml:space="preserve">(for example blend recall at 1% FPR on test 73.7 against 74.6), because they are separate training runs; Table 8.1 uses the newer one and Table 8.6 the older one.</w:t>
+      </w:r>
+    </w:p>
+    <w:p>
+      <w:pPr>
+        <w:pStyle w:val="FirstParagraph"/>
+      </w:pPr>
+      <w:r>
+        <w:rPr>
+          <w:bCs/>
+          <w:b/>
+        </w:rPr>
+        <w:t xml:space="preserve">What is not done or not measured.</w:t>
       </w:r>
     </w:p>
     <w:p>
@@ -18854,13 +20456,13 @@
           <w:bCs/>
           <w:b/>
         </w:rPr>
-        <w:t xml:space="preserve">An evaluation study.</w:t>
-      </w:r>
-      <w:r>
-        <w:t xml:space="preserve"> </w:t>
-      </w:r>
-      <w:r>
-        <w:t xml:space="preserve">A URL model’s score depends heavily on URL form: it holds across 25 source cells, four model families and ten splits. Transfer to independent datasets stays above chance (holds). Source dependence holds in part and the natural-page false-alarm gap holds in part. The share of the fall that sits in the host name and the size of the split-to-split spread did not hold across the cells, and an extra check ties the first to how the raw benchmark is prepared.</w:t>
+        <w:t xml:space="preserve">Browsing study.</w:t>
+      </w:r>
+      <w:r>
+        <w:t xml:space="preserve"> </w:t>
+      </w:r>
+      <w:r>
+        <w:t xml:space="preserve">No systematic test on real sites with screenshots of false alarms. The sandbox cannot open real sites; the author’s own use found one false alarm (section 8.12).</w:t>
       </w:r>
     </w:p>
     <w:p>
@@ -18876,13 +20478,13 @@
           <w:bCs/>
           <w:b/>
         </w:rPr>
-        <w:t xml:space="preserve">A working detector.</w:t>
-      </w:r>
-      <w:r>
-        <w:t xml:space="preserve"> </w:t>
-      </w:r>
-      <w:r>
-        <w:t xml:space="preserve">PhishDrift runs as a Chrome extension with a FastAPI backend and layered checks (allowlist, blocklist, URL model, page model, domain checks), evaluated with recall at fixed false-alarm rates, a held-out source, a newest time slice and natural-page false alarms (Chapter 8).</w:t>
+        <w:t xml:space="preserve">Live backend lookups.</w:t>
+      </w:r>
+      <w:r>
+        <w:t xml:space="preserve"> </w:t>
+      </w:r>
+      <w:r>
+        <w:t xml:space="preserve">Backend response times and a live RDAP, DNS and TLS lookup against real feeds have not been measured; the extension’s backend answers are placeholder rules.</w:t>
       </w:r>
     </w:p>
     <w:p>
@@ -18898,13 +20500,125 @@
           <w:bCs/>
           <w:b/>
         </w:rPr>
-        <w:t xml:space="preserve">A reproducible record.</w:t>
-      </w:r>
-      <w:r>
-        <w:t xml:space="preserve"> </w:t>
-      </w:r>
-      <w:r>
-        <w:t xml:space="preserve">Every reported number comes from a script in the repository that writes to</w:t>
+        <w:t xml:space="preserve">Safe Browsing and the language-model layer.</w:t>
+      </w:r>
+      <w:r>
+        <w:t xml:space="preserve"> </w:t>
+      </w:r>
+      <w:r>
+        <w:t xml:space="preserve">Google Safe Browsing is not integrated, and the optional second-opinion layer was not built. List signatures are off until a key is made on the backend machine.</w:t>
+      </w:r>
+    </w:p>
+    <w:p>
+      <w:pPr>
+        <w:numPr>
+          <w:ilvl w:val="0"/>
+          <w:numId w:val="1011"/>
+        </w:numPr>
+        <w:pStyle w:val="Compact"/>
+      </w:pPr>
+      <w:r>
+        <w:rPr>
+          <w:bCs/>
+          <w:b/>
+        </w:rPr>
+        <w:t xml:space="preserve">Model refresh.</w:t>
+      </w:r>
+      <w:r>
+        <w:t xml:space="preserve"> </w:t>
+      </w:r>
+      <w:r>
+        <w:t xml:space="preserve">The shipped model was retrained on 2026-10-21 for split 0 with the 899-name brand list and the popular-sites crawl (section 8.8.1). The ten-split tables in this chapter still describe the earlier model, and the effect of the new data and of the brand list is not separated.</w:t>
+      </w:r>
+    </w:p>
+    <w:p>
+      <w:pPr>
+        <w:numPr>
+          <w:ilvl w:val="0"/>
+          <w:numId w:val="1011"/>
+        </w:numPr>
+        <w:pStyle w:val="Compact"/>
+      </w:pPr>
+      <w:r>
+        <w:rPr>
+          <w:bCs/>
+          <w:b/>
+        </w:rPr>
+        <w:t xml:space="preserve">Blocklist coverage</w:t>
+      </w:r>
+      <w:r>
+        <w:t xml:space="preserve"> </w:t>
+      </w:r>
+      <w:r>
+        <w:t xml:space="preserve">(section 8.12),</w:t>
+      </w:r>
+      <w:r>
+        <w:t xml:space="preserve"> </w:t>
+      </w:r>
+      <w:r>
+        <w:rPr>
+          <w:bCs/>
+          <w:b/>
+        </w:rPr>
+        <w:t xml:space="preserve">screenshots</w:t>
+      </w:r>
+      <w:r>
+        <w:t xml:space="preserve"> </w:t>
+      </w:r>
+      <w:r>
+        <w:t xml:space="preserve">and</w:t>
+      </w:r>
+      <w:r>
+        <w:t xml:space="preserve"> </w:t>
+      </w:r>
+      <w:r>
+        <w:rPr>
+          <w:bCs/>
+          <w:b/>
+        </w:rPr>
+        <w:t xml:space="preserve">demo video</w:t>
+      </w:r>
+      <w:r>
+        <w:t xml:space="preserve"> </w:t>
+      </w:r>
+      <w:r>
+        <w:t xml:space="preserve">are not done.</w:t>
+      </w:r>
+    </w:p>
+    <w:p>
+      <w:pPr>
+        <w:pStyle w:val="FirstParagraph"/>
+      </w:pPr>
+      <w:r>
+        <w:rPr>
+          <w:bCs/>
+          <w:b/>
+        </w:rPr>
+        <w:t xml:space="preserve">Out of scope.</w:t>
+      </w:r>
+      <w:r>
+        <w:t xml:space="preserve"> </w:t>
+      </w:r>
+      <w:r>
+        <w:t xml:space="preserve">Phishing hosted on trusted platforms is masked in the URL tier and removed from tier C, so it is invisible to those tiers. Phishing on compromised legitimate sites and behind cloaking is largely invisible to all three. A learn-from-mistakes loop was designed (opt-in reports confirmed by an independent signal before they become labels, then a scheduled retrain that ships only if the held-out source, time slice and natural-page check are no worse) but not built; users can currently report only a false alarm, with the domain alone.</w:t>
+      </w:r>
+    </w:p>
+    <w:p>
+      <w:pPr>
+        <w:pStyle w:val="BodyText"/>
+      </w:pPr>
+      <w:r>
+        <w:rPr>
+          <w:bCs/>
+          <w:b/>
+        </w:rPr>
+        <w:t xml:space="preserve">Known weaknesses of the extension.</w:t>
+      </w:r>
+      <w:r>
+        <w:t xml:space="preserve"> </w:t>
+      </w:r>
+      <w:r>
+        <w:t xml:space="preserve">A dangerous page can start loading before the warning replaces it, because</w:t>
       </w:r>
       <w:r>
         <w:t xml:space="preserve"> </w:t>
@@ -18913,38 +20627,41 @@
         <w:rPr>
           <w:rStyle w:val="VerbatimChar"/>
         </w:rPr>
-        <w:t xml:space="preserve">reports/</w:t>
-      </w:r>
-      <w:r>
-        <w:t xml:space="preserve">; seeds are fixed; the study’s plan and consistency rule were frozen before the run.</w:t>
-      </w:r>
-    </w:p>
-    <w:bookmarkEnd w:id="150"/>
-    <w:bookmarkStart w:id="151" w:name="limitations"/>
+        <w:t xml:space="preserve">webNavigation</w:t>
+      </w:r>
+      <w:r>
+        <w:t xml:space="preserve"> </w:t>
+      </w:r>
+      <w:r>
+        <w:t xml:space="preserve">cannot block a navigation. A hosting zone that nobody has abused in the data is still trusted until it appears in a feed. A phishing page whose address alone is dangerous now renders with the banner until the page check completes (at most 5 seconds) before the warning page replaces it (</w:t>
+      </w:r>
+      <w:r>
+        <w:rPr>
+          <w:rStyle w:val="VerbatimChar"/>
+        </w:rPr>
+        <w:t xml:space="preserve">docs/PROGRESS.md</w:t>
+      </w:r>
+      <w:r>
+        <w:t xml:space="preserve">, 2026-10-20).</w:t>
+      </w:r>
+    </w:p>
+    <w:bookmarkEnd w:id="151"/>
+    <w:bookmarkStart w:id="155" w:name="conclusion-and-future-work"/>
+    <w:p>
+      <w:pPr>
+        <w:pStyle w:val="Heading1"/>
+      </w:pPr>
+      <w:r>
+        <w:t xml:space="preserve">10. Conclusion and future work</w:t>
+      </w:r>
+    </w:p>
+    <w:bookmarkStart w:id="152" w:name="what-was-achieved"/>
     <w:p>
       <w:pPr>
         <w:pStyle w:val="Heading2"/>
       </w:pPr>
       <w:r>
-        <w:t xml:space="preserve">10.2 Limitations</w:t>
-      </w:r>
-    </w:p>
-    <w:p>
-      <w:pPr>
-        <w:pStyle w:val="FirstParagraph"/>
-      </w:pPr>
-      <w:r>
-        <w:t xml:space="preserve">See Sections 4.12 and Chapter 9. In short: public benchmarks only, two of them old or homepage-heavy; the HTML part rests on two sources with uneven coverage; one shuffled-label control is flagged; platform masking is untested; tier C of the detector rests on a small live capture; and the extension has been checked in test harnesses and on stored pages, not in a long field trial.</w:t>
-      </w:r>
-    </w:p>
-    <w:bookmarkEnd w:id="151"/>
-    <w:bookmarkStart w:id="152" w:name="future-work"/>
-    <w:p>
-      <w:pPr>
-        <w:pStyle w:val="Heading2"/>
-      </w:pPr>
-      <w:r>
-        <w:t xml:space="preserve">10.3 Future work</w:t>
+        <w:t xml:space="preserve">10.1 What was achieved</w:t>
       </w:r>
     </w:p>
     <w:p>
@@ -18956,7 +20673,17 @@
         <w:pStyle w:val="Compact"/>
       </w:pPr>
       <w:r>
-        <w:t xml:space="preserve">Add PhishTank and further live-feed sources to the study, and re-run it with hosting-platform domains kept so platform masking can be tested.</w:t>
+        <w:rPr>
+          <w:bCs/>
+          <w:b/>
+        </w:rPr>
+        <w:t xml:space="preserve">An evaluation study.</w:t>
+      </w:r>
+      <w:r>
+        <w:t xml:space="preserve"> </w:t>
+      </w:r>
+      <w:r>
+        <w:t xml:space="preserve">A URL model’s score depends heavily on URL form: it holds across 25 source cells, four model families and ten splits. Transfer to independent datasets stays above chance (holds). Source dependence holds in part and the natural-page false-alarm gap holds in part. The share of the fall that sits in the host name and the size of the split-to-split spread did not hold across the cells, and an extra check ties the first to how the raw benchmark is prepared.</w:t>
       </w:r>
     </w:p>
     <w:p>
@@ -18968,7 +20695,17 @@
         <w:pStyle w:val="Compact"/>
       </w:pPr>
       <w:r>
-        <w:t xml:space="preserve">Test the benchmark-preparation explanation for the host-share result on more datasets.</w:t>
+        <w:rPr>
+          <w:bCs/>
+          <w:b/>
+        </w:rPr>
+        <w:t xml:space="preserve">A working detector.</w:t>
+      </w:r>
+      <w:r>
+        <w:t xml:space="preserve"> </w:t>
+      </w:r>
+      <w:r>
+        <w:t xml:space="preserve">PhishDrift runs as a Chrome extension with a FastAPI backend and layered checks (allowlist, blocklist, URL model, page model, domain checks), evaluated with recall at fixed false-alarm rates, a held-out source, a newest time slice and natural-page false alarms (Chapter 8).</w:t>
       </w:r>
     </w:p>
     <w:p>
@@ -18980,42 +20717,57 @@
         <w:pStyle w:val="Compact"/>
       </w:pPr>
       <w:r>
-        <w:t xml:space="preserve">Add a held-out source that has page HTML, so the page model’s gain can be measured out of source.</w:t>
-      </w:r>
-    </w:p>
-    <w:p>
-      <w:pPr>
-        <w:numPr>
-          <w:ilvl w:val="0"/>
-          <w:numId w:val="1012"/>
-        </w:numPr>
-        <w:pStyle w:val="Compact"/>
-      </w:pPr>
-      <w:r>
-        <w:t xml:space="preserve">Grow the tier C capture over more days, and measure blocklist coverage forward in time.</w:t>
-      </w:r>
-    </w:p>
-    <w:p>
-      <w:pPr>
-        <w:numPr>
-          <w:ilvl w:val="0"/>
-          <w:numId w:val="1012"/>
-        </w:numPr>
-        <w:pStyle w:val="Compact"/>
-      </w:pPr>
-      <w:r>
-        <w:t xml:space="preserve">Optional second-opinion layer for the grey zone (planned, not built).</w:t>
+        <w:rPr>
+          <w:bCs/>
+          <w:b/>
+        </w:rPr>
+        <w:t xml:space="preserve">A reproducible record.</w:t>
+      </w:r>
+      <w:r>
+        <w:t xml:space="preserve"> </w:t>
+      </w:r>
+      <w:r>
+        <w:t xml:space="preserve">Every reported number comes from a script in the repository that writes to</w:t>
+      </w:r>
+      <w:r>
+        <w:t xml:space="preserve"> </w:t>
+      </w:r>
+      <w:r>
+        <w:rPr>
+          <w:rStyle w:val="VerbatimChar"/>
+        </w:rPr>
+        <w:t xml:space="preserve">reports/</w:t>
+      </w:r>
+      <w:r>
+        <w:t xml:space="preserve">; seeds are fixed; the study’s plan and consistency rule were frozen before the run.</w:t>
       </w:r>
     </w:p>
     <w:bookmarkEnd w:id="152"/>
+    <w:bookmarkStart w:id="153" w:name="limitations"/>
+    <w:p>
+      <w:pPr>
+        <w:pStyle w:val="Heading2"/>
+      </w:pPr>
+      <w:r>
+        <w:t xml:space="preserve">10.2 Limitations</w:t>
+      </w:r>
+    </w:p>
+    <w:p>
+      <w:pPr>
+        <w:pStyle w:val="FirstParagraph"/>
+      </w:pPr>
+      <w:r>
+        <w:t xml:space="preserve">See Sections 4.12 and Chapter 9. In short: public benchmarks only, two of them old or homepage-heavy; the HTML part rests on two sources with uneven coverage; one shuffled-label control is flagged; platform masking showed no effect in a test that rests on one legitimate source; tier C of the detector rests on a small live capture; and the extension has been checked in test harnesses and on stored pages, not in a long field trial.</w:t>
+      </w:r>
+    </w:p>
     <w:bookmarkEnd w:id="153"/>
-    <w:bookmarkStart w:id="154" w:name="references"/>
-    <w:p>
-      <w:pPr>
-        <w:pStyle w:val="Heading1"/>
-      </w:pPr>
-      <w:r>
-        <w:t xml:space="preserve">References</w:t>
+    <w:bookmarkStart w:id="154" w:name="future-work"/>
+    <w:p>
+      <w:pPr>
+        <w:pStyle w:val="Heading2"/>
+      </w:pPr>
+      <w:r>
+        <w:t xml:space="preserve">10.3 Future work</w:t>
       </w:r>
     </w:p>
     <w:p>
@@ -19027,35 +20779,7 @@
         <w:pStyle w:val="Compact"/>
       </w:pPr>
       <w:r>
-        <w:t xml:space="preserve">A. Hannousse and S. Yahiouche,</w:t>
-      </w:r>
-      <w:r>
-        <w:t xml:space="preserve"> </w:t>
-      </w:r>
-      <w:r>
-        <w:t xml:space="preserve">“</w:t>
-      </w:r>
-      <w:r>
-        <w:t xml:space="preserve">Towards benchmark datasets for machine learning based website phishing detection</w:t>
-      </w:r>
-      <w:r>
-        <w:t xml:space="preserve">”</w:t>
-      </w:r>
-      <w:r>
-        <w:t xml:space="preserve">,</w:t>
-      </w:r>
-      <w:r>
-        <w:t xml:space="preserve"> </w:t>
-      </w:r>
-      <w:r>
-        <w:rPr>
-          <w:iCs/>
-          <w:i/>
-        </w:rPr>
-        <w:t xml:space="preserve">Engineering Applications of Artificial Intelligence</w:t>
-      </w:r>
-      <w:r>
-        <w:t xml:space="preserve">, 2021.</w:t>
+        <w:t xml:space="preserve">Add PhishTank and further live-feed sources to the study, and re-run it with hosting-platform domains kept so platform masking can be tested.</w:t>
       </w:r>
     </w:p>
     <w:p>
@@ -19067,35 +20791,7 @@
         <w:pStyle w:val="Compact"/>
       </w:pPr>
       <w:r>
-        <w:t xml:space="preserve">A. Prasad and S. Chandra,</w:t>
-      </w:r>
-      <w:r>
-        <w:t xml:space="preserve"> </w:t>
-      </w:r>
-      <w:r>
-        <w:t xml:space="preserve">“</w:t>
-      </w:r>
-      <w:r>
-        <w:t xml:space="preserve">PhiUSIIL: a diverse security profile empowered phishing URL detection framework based on similarity index and incremental learning</w:t>
-      </w:r>
-      <w:r>
-        <w:t xml:space="preserve">”</w:t>
-      </w:r>
-      <w:r>
-        <w:t xml:space="preserve">,</w:t>
-      </w:r>
-      <w:r>
-        <w:t xml:space="preserve"> </w:t>
-      </w:r>
-      <w:r>
-        <w:rPr>
-          <w:iCs/>
-          <w:i/>
-        </w:rPr>
-        <w:t xml:space="preserve">Computers &amp; Security</w:t>
-      </w:r>
-      <w:r>
-        <w:t xml:space="preserve">, 2024.</w:t>
+        <w:t xml:space="preserve">Test the benchmark-preparation explanation for the host-share result on more datasets.</w:t>
       </w:r>
     </w:p>
     <w:p>
@@ -19107,19 +20803,7 @@
         <w:pStyle w:val="Compact"/>
       </w:pPr>
       <w:r>
-        <w:t xml:space="preserve">PhreshPhish dataset, Hugging Face</w:t>
-      </w:r>
-      <w:r>
-        <w:t xml:space="preserve"> </w:t>
-      </w:r>
-      <w:r>
-        <w:rPr>
-          <w:rStyle w:val="VerbatimChar"/>
-        </w:rPr>
-        <w:t xml:space="preserve">phreshphish/phreshphish</w:t>
-      </w:r>
-      <w:r>
-        <w:t xml:space="preserve">.</w:t>
+        <w:t xml:space="preserve">Add a held-out source that has page HTML, so the page model’s gain can be measured out of source.</w:t>
       </w:r>
     </w:p>
     <w:p>
@@ -19131,7 +20815,7 @@
         <w:pStyle w:val="Compact"/>
       </w:pPr>
       <w:r>
-        <w:t xml:space="preserve">URL-Phish dataset (Mendeley Data); PhishStorm dataset (Aalto University); Phish-Blitz and Phishpedia datasets as released by their authors.</w:t>
+        <w:t xml:space="preserve">Grow the tier C capture over more days, and measure blocklist coverage forward in time.</w:t>
       </w:r>
     </w:p>
     <w:p>
@@ -19143,7 +20827,30 @@
         <w:pStyle w:val="Compact"/>
       </w:pPr>
       <w:r>
-        <w:t xml:space="preserve">G. Ke et al.,</w:t>
+        <w:t xml:space="preserve">Optional second-opinion layer for the grey zone (planned, not built).</w:t>
+      </w:r>
+    </w:p>
+    <w:bookmarkEnd w:id="154"/>
+    <w:bookmarkEnd w:id="155"/>
+    <w:bookmarkStart w:id="156" w:name="references"/>
+    <w:p>
+      <w:pPr>
+        <w:pStyle w:val="Heading1"/>
+      </w:pPr>
+      <w:r>
+        <w:t xml:space="preserve">References</w:t>
+      </w:r>
+    </w:p>
+    <w:p>
+      <w:pPr>
+        <w:numPr>
+          <w:ilvl w:val="0"/>
+          <w:numId w:val="1014"/>
+        </w:numPr>
+        <w:pStyle w:val="Compact"/>
+      </w:pPr>
+      <w:r>
+        <w:t xml:space="preserve">A. Hannousse and S. Yahiouche,</w:t>
       </w:r>
       <w:r>
         <w:t xml:space="preserve"> </w:t>
@@ -19152,7 +20859,7 @@
         <w:t xml:space="preserve">“</w:t>
       </w:r>
       <w:r>
-        <w:t xml:space="preserve">LightGBM: a highly efficient gradient boosting decision tree</w:t>
+        <w:t xml:space="preserve">Towards benchmark datasets for machine learning based website phishing detection</w:t>
       </w:r>
       <w:r>
         <w:t xml:space="preserve">”</w:t>
@@ -19168,22 +20875,22 @@
           <w:iCs/>
           <w:i/>
         </w:rPr>
-        <w:t xml:space="preserve">NeurIPS</w:t>
-      </w:r>
-      <w:r>
-        <w:t xml:space="preserve">, 2017.</w:t>
+        <w:t xml:space="preserve">Engineering Applications of Artificial Intelligence</w:t>
+      </w:r>
+      <w:r>
+        <w:t xml:space="preserve">, 2021.</w:t>
       </w:r>
     </w:p>
     <w:p>
       <w:pPr>
         <w:numPr>
           <w:ilvl w:val="0"/>
-          <w:numId w:val="1013"/>
+          <w:numId w:val="1014"/>
         </w:numPr>
         <w:pStyle w:val="Compact"/>
       </w:pPr>
       <w:r>
-        <w:t xml:space="preserve">T. Chen and C. Guestrin,</w:t>
+        <w:t xml:space="preserve">A. Prasad and S. Chandra,</w:t>
       </w:r>
       <w:r>
         <w:t xml:space="preserve"> </w:t>
@@ -19192,7 +20899,7 @@
         <w:t xml:space="preserve">“</w:t>
       </w:r>
       <w:r>
-        <w:t xml:space="preserve">XGBoost: a scalable tree boosting system</w:t>
+        <w:t xml:space="preserve">PhiUSIIL: a diverse security profile empowered phishing URL detection framework based on similarity index and incremental learning</w:t>
       </w:r>
       <w:r>
         <w:t xml:space="preserve">”</w:t>
@@ -19208,22 +20915,58 @@
           <w:iCs/>
           <w:i/>
         </w:rPr>
-        <w:t xml:space="preserve">KDD</w:t>
-      </w:r>
-      <w:r>
-        <w:t xml:space="preserve">, 2016.</w:t>
+        <w:t xml:space="preserve">Computers &amp; Security</w:t>
+      </w:r>
+      <w:r>
+        <w:t xml:space="preserve">, 2024.</w:t>
       </w:r>
     </w:p>
     <w:p>
       <w:pPr>
         <w:numPr>
           <w:ilvl w:val="0"/>
-          <w:numId w:val="1013"/>
+          <w:numId w:val="1014"/>
         </w:numPr>
         <w:pStyle w:val="Compact"/>
       </w:pPr>
       <w:r>
-        <w:t xml:space="preserve">V. Le Pochat et al.,</w:t>
+        <w:t xml:space="preserve">PhreshPhish dataset, Hugging Face</w:t>
+      </w:r>
+      <w:r>
+        <w:t xml:space="preserve"> </w:t>
+      </w:r>
+      <w:r>
+        <w:rPr>
+          <w:rStyle w:val="VerbatimChar"/>
+        </w:rPr>
+        <w:t xml:space="preserve">phreshphish/phreshphish</w:t>
+      </w:r>
+      <w:r>
+        <w:t xml:space="preserve">.</w:t>
+      </w:r>
+    </w:p>
+    <w:p>
+      <w:pPr>
+        <w:numPr>
+          <w:ilvl w:val="0"/>
+          <w:numId w:val="1014"/>
+        </w:numPr>
+        <w:pStyle w:val="Compact"/>
+      </w:pPr>
+      <w:r>
+        <w:t xml:space="preserve">URL-Phish dataset (Mendeley Data); PhishStorm dataset (Aalto University); Phish-Blitz and Phishpedia datasets as released by their authors.</w:t>
+      </w:r>
+    </w:p>
+    <w:p>
+      <w:pPr>
+        <w:numPr>
+          <w:ilvl w:val="0"/>
+          <w:numId w:val="1014"/>
+        </w:numPr>
+        <w:pStyle w:val="Compact"/>
+      </w:pPr>
+      <w:r>
+        <w:t xml:space="preserve">G. Ke et al.,</w:t>
       </w:r>
       <w:r>
         <w:t xml:space="preserve"> </w:t>
@@ -19232,7 +20975,7 @@
         <w:t xml:space="preserve">“</w:t>
       </w:r>
       <w:r>
-        <w:t xml:space="preserve">Tranco: a research-oriented top sites ranking hardened against manipulation</w:t>
+        <w:t xml:space="preserve">LightGBM: a highly efficient gradient boosting decision tree</w:t>
       </w:r>
       <w:r>
         <w:t xml:space="preserve">”</w:t>
@@ -19248,37 +20991,117 @@
           <w:iCs/>
           <w:i/>
         </w:rPr>
-        <w:t xml:space="preserve">NDSS</w:t>
-      </w:r>
-      <w:r>
-        <w:t xml:space="preserve">, 2019.</w:t>
+        <w:t xml:space="preserve">NeurIPS</w:t>
+      </w:r>
+      <w:r>
+        <w:t xml:space="preserve">, 2017.</w:t>
       </w:r>
     </w:p>
     <w:p>
       <w:pPr>
         <w:numPr>
           <w:ilvl w:val="0"/>
-          <w:numId w:val="1013"/>
+          <w:numId w:val="1014"/>
         </w:numPr>
         <w:pStyle w:val="Compact"/>
       </w:pPr>
       <w:r>
-        <w:t xml:space="preserve">OpenPhish community feed; Phishing.Database (MIT licence); Google Safe Browsing Update API.</w:t>
-      </w:r>
-    </w:p>
-    <w:p>
-      <w:pPr>
-        <w:pStyle w:val="FirstParagraph"/>
-      </w:pPr>
+        <w:t xml:space="preserve">T. Chen and C. Guestrin,</w:t>
+      </w:r>
+      <w:r>
+        <w:t xml:space="preserve"> </w:t>
+      </w:r>
+      <w:r>
+        <w:t xml:space="preserve">“</w:t>
+      </w:r>
+      <w:r>
+        <w:t xml:space="preserve">XGBoost: a scalable tree boosting system</w:t>
+      </w:r>
+      <w:r>
+        <w:t xml:space="preserve">”</w:t>
+      </w:r>
+      <w:r>
+        <w:t xml:space="preserve">,</w:t>
+      </w:r>
+      <w:r>
+        <w:t xml:space="preserve"> </w:t>
+      </w:r>
       <w:r>
         <w:rPr>
           <w:iCs/>
           <w:i/>
         </w:rPr>
+        <w:t xml:space="preserve">KDD</w:t>
+      </w:r>
+      <w:r>
+        <w:t xml:space="preserve">, 2016.</w:t>
+      </w:r>
+    </w:p>
+    <w:p>
+      <w:pPr>
+        <w:numPr>
+          <w:ilvl w:val="0"/>
+          <w:numId w:val="1014"/>
+        </w:numPr>
+        <w:pStyle w:val="Compact"/>
+      </w:pPr>
+      <w:r>
+        <w:t xml:space="preserve">V. Le Pochat et al.,</w:t>
+      </w:r>
+      <w:r>
+        <w:t xml:space="preserve"> </w:t>
+      </w:r>
+      <w:r>
+        <w:t xml:space="preserve">“</w:t>
+      </w:r>
+      <w:r>
+        <w:t xml:space="preserve">Tranco: a research-oriented top sites ranking hardened against manipulation</w:t>
+      </w:r>
+      <w:r>
+        <w:t xml:space="preserve">”</w:t>
+      </w:r>
+      <w:r>
+        <w:t xml:space="preserve">,</w:t>
+      </w:r>
+      <w:r>
+        <w:t xml:space="preserve"> </w:t>
+      </w:r>
+      <w:r>
+        <w:rPr>
+          <w:iCs/>
+          <w:i/>
+        </w:rPr>
+        <w:t xml:space="preserve">NDSS</w:t>
+      </w:r>
+      <w:r>
+        <w:t xml:space="preserve">, 2019.</w:t>
+      </w:r>
+    </w:p>
+    <w:p>
+      <w:pPr>
+        <w:numPr>
+          <w:ilvl w:val="0"/>
+          <w:numId w:val="1014"/>
+        </w:numPr>
+        <w:pStyle w:val="Compact"/>
+      </w:pPr>
+      <w:r>
+        <w:t xml:space="preserve">OpenPhish community feed; Phishing.Database (MIT licence); Google Safe Browsing Update API.</w:t>
+      </w:r>
+    </w:p>
+    <w:p>
+      <w:pPr>
+        <w:pStyle w:val="FirstParagraph"/>
+      </w:pPr>
+      <w:r>
+        <w:rPr>
+          <w:iCs/>
+          <w:i/>
+        </w:rPr>
         <w:t xml:space="preserve">Citation details should be checked against the originals before submission.</w:t>
       </w:r>
     </w:p>
-    <w:bookmarkEnd w:id="154"/>
+    <w:bookmarkEnd w:id="156"/>
     <w:sectPr>
       <w:pgSz w:h="16838" w:w="11906"/>
       <w:pgMar w:bottom="1134" w:left="1020" w:right="1020" w:top="1134"/>
@@ -19595,6 +21418,9 @@
     <w:abstractNumId w:val="991"/>
   </w:num>
   <w:num w:numId="1006">
+    <w:abstractNumId w:val="991"/>
+  </w:num>
+  <w:num w:numId="1007">
     <w:abstractNumId w:val="99411"/>
     <w:lvlOverride w:ilvl="0">
       <w:startOverride w:val="1"/>
@@ -19624,9 +21450,6 @@
       <w:startOverride w:val="1"/>
     </w:lvlOverride>
   </w:num>
-  <w:num w:numId="1007">
-    <w:abstractNumId w:val="991"/>
-  </w:num>
   <w:num w:numId="1008">
     <w:abstractNumId w:val="991"/>
   </w:num>
@@ -19640,6 +21463,9 @@
     <w:abstractNumId w:val="991"/>
   </w:num>
   <w:num w:numId="1012">
+    <w:abstractNumId w:val="991"/>
+  </w:num>
+  <w:num w:numId="1013">
     <w:abstractNumId w:val="99411"/>
     <w:lvlOverride w:ilvl="0">
       <w:startOverride w:val="1"/>
@@ -19669,7 +21495,7 @@
       <w:startOverride w:val="1"/>
     </w:lvlOverride>
   </w:num>
-  <w:num w:numId="1013">
+  <w:num w:numId="1014">
     <w:abstractNumId w:val="99411"/>
     <w:lvlOverride w:ilvl="0">
       <w:startOverride w:val="1"/>

</xml_diff>

<commit_message>
PBL report: align Q5 wording with the exploratory masking test
Co-Authored-By: Claude Sonnet 5.5 <noreply@anthropic.com>
Claude-Session: https://claude.ai/code/session_01CcRevgLHUMr7Kjzc4fTXg4
</commit_message>
<xml_diff>
--- a/reports/pbl/pbl_report.docx
+++ b/reports/pbl/pbl_report.docx
@@ -1041,7 +1041,7 @@
     </w:p>
     <w:bookmarkEnd w:id="32"/>
     <w:bookmarkEnd w:id="33"/>
-    <w:bookmarkStart w:id="41" w:name="part-i-design-and-method"/>
+    <w:bookmarkStart w:id="38" w:name="part-i-design-and-method"/>
     <w:p>
       <w:pPr>
         <w:pStyle w:val="Heading1"/>
@@ -1934,7 +1934,7 @@
       </w:r>
     </w:p>
     <w:bookmarkEnd w:id="35"/>
-    <w:bookmarkStart w:id="39" w:name="models-and-splits"/>
+    <w:bookmarkStart w:id="36" w:name="models-and-splits"/>
     <w:p>
       <w:pPr>
         <w:pStyle w:val="Heading2"/>
@@ -1951,53 +1951,31 @@
         <w:t xml:space="preserve">LightGBM, XGBoost, logistic regression on the 99 URL features, and character n-gram TF-IDF with logistic regression. Ten splits per cell are grouped by registrable domain (train 70%, calibration 10%, test 20%; a deterministic hash of seed, split and domain). Fitted features (TLD risk, bigram likelihood) are refitted on each split’s training side. Uncertainty comes from a domain-cluster bootstrap with 200 draws per split. Transfer is tested only on cells sharing no source with the training cell.</w:t>
       </w:r>
     </w:p>
-    <w:p>
-      <w:pPr>
-        <w:pStyle w:val="CaptionedFigure"/>
-      </w:pPr>
-      <w:r>
-        <w:drawing>
-          <wp:inline>
-            <wp:extent cx="6261100" cy="2787097"/>
-            <wp:effectExtent b="0" l="0" r="0" t="0"/>
-            <wp:docPr descr="Figure 4.1. Study design. Seven questions are tested across 25 source cells, four models, four URL forms and ten splits." title="" id="37" name="Picture"/>
-            <a:graphic>
-              <a:graphicData uri="http://schemas.openxmlformats.org/drawingml/2006/picture">
-                <pic:pic>
-                  <pic:nvPicPr>
-                    <pic:cNvPr descr="fig01_design.png" id="38" name="Picture"/>
-                    <pic:cNvPicPr>
-                      <a:picLocks noChangeArrowheads="1" noChangeAspect="1"/>
-                    </pic:cNvPicPr>
-                  </pic:nvPicPr>
-                  <pic:blipFill>
-                    <a:blip r:embed="rId36"/>
-                    <a:stretch>
-                      <a:fillRect/>
-                    </a:stretch>
-                  </pic:blipFill>
-                  <pic:spPr bwMode="auto">
-                    <a:xfrm>
-                      <a:off x="0" y="0"/>
-                      <a:ext cx="6261100" cy="2787097"/>
-                    </a:xfrm>
-                    <a:prstGeom prst="rect">
-                      <a:avLst/>
-                    </a:prstGeom>
-                    <a:noFill/>
-                    <a:ln w="9525">
-                      <a:noFill/>
-                      <a:headEnd/>
-                      <a:tailEnd/>
-                    </a:ln>
-                  </pic:spPr>
-                </pic:pic>
-              </a:graphicData>
-            </a:graphic>
-          </wp:inline>
-        </w:drawing>
-      </w:r>
-    </w:p>
+    <w:tbl>
+      <w:tblPr>
+        <w:tblStyle w:val="FigureTable"/>
+        <w:tblW w:type="auto" w:w="0"/>
+        <w:tblLook w:firstRow="0" w:lastRow="0" w:firstColumn="0" w:lastColumn="0"/>
+        <w:jc w:val="center"/>
+      </w:tblPr>
+      <w:tblGrid>
+        <w:gridCol w:w="7920"/>
+      </w:tblGrid>
+      <w:tr>
+        <w:tc>
+          <w:tcPr/>
+          <w:p>
+            <w:pPr>
+              <w:pStyle w:val="Compact"/>
+              <w:jc w:val="center"/>
+            </w:pPr>
+            <w:r>
+              <w:t xml:space="preserve">Figure 4.1. Study design. Seven questions are tested across 25 source cells, four models, four URL forms and ten splits.</w:t>
+            </w:r>
+          </w:p>
+        </w:tc>
+      </w:tr>
+    </w:tbl>
     <w:p>
       <w:pPr>
         <w:pStyle w:val="ImageCaption"/>
@@ -2006,8 +1984,8 @@
         <w:t xml:space="preserve">Figure 4.1. Study design. Seven questions are tested across 25 source cells, four models, four URL forms and ten splits.</w:t>
       </w:r>
     </w:p>
-    <w:bookmarkEnd w:id="39"/>
-    <w:bookmarkStart w:id="40" w:name="the-rule-for-calling-a-result-consistent"/>
+    <w:bookmarkEnd w:id="36"/>
+    <w:bookmarkStart w:id="37" w:name="the-rule-for-calling-a-result-consistent"/>
     <w:p>
       <w:pPr>
         <w:pStyle w:val="Heading2"/>
@@ -2149,9 +2127,9 @@
         <w:t xml:space="preserve">describes this design’s data; it is not a claim that the effect is absent elsewhere.</w:t>
       </w:r>
     </w:p>
-    <w:bookmarkEnd w:id="40"/>
-    <w:bookmarkEnd w:id="41"/>
-    <w:bookmarkStart w:id="90" w:name="part-i-results"/>
+    <w:bookmarkEnd w:id="37"/>
+    <w:bookmarkEnd w:id="38"/>
+    <w:bookmarkStart w:id="54" w:name="part-i-results"/>
     <w:p>
       <w:pPr>
         <w:pStyle w:val="Heading1"/>
@@ -2160,7 +2138,7 @@
         <w:t xml:space="preserve">4. Part I: results</w:t>
       </w:r>
     </w:p>
-    <w:bookmarkStart w:id="48" w:name="q1-representation-sensitivity-holds"/>
+    <w:bookmarkStart w:id="39" w:name="q1-representation-sensitivity-holds"/>
     <w:p>
       <w:pPr>
         <w:pStyle w:val="Heading2"/>
@@ -2177,53 +2155,31 @@
         <w:t xml:space="preserve">AUC falls from R1 to R4 in all 100 model-cell settings. The median R1 AUC is 0.977, R2/R3 0.877 and R4 0.850; the smallest drop in any setting is 0.024. All four model families show it (Figure 4.3).</w:t>
       </w:r>
     </w:p>
-    <w:p>
-      <w:pPr>
-        <w:pStyle w:val="CaptionedFigure"/>
-      </w:pPr>
-      <w:r>
-        <w:drawing>
-          <wp:inline>
-            <wp:extent cx="6261100" cy="2635836"/>
-            <wp:effectExtent b="0" l="0" r="0" t="0"/>
-            <wp:docPr descr="Figure 4.2. Representation ladder, 25 cells. Thin lines are cells; the thick line is the median." title="" id="43" name="Picture"/>
-            <a:graphic>
-              <a:graphicData uri="http://schemas.openxmlformats.org/drawingml/2006/picture">
-                <pic:pic>
-                  <pic:nvPicPr>
-                    <pic:cNvPr descr="fig02_ladder.png" id="44" name="Picture"/>
-                    <pic:cNvPicPr>
-                      <a:picLocks noChangeArrowheads="1" noChangeAspect="1"/>
-                    </pic:cNvPicPr>
-                  </pic:nvPicPr>
-                  <pic:blipFill>
-                    <a:blip r:embed="rId42"/>
-                    <a:stretch>
-                      <a:fillRect/>
-                    </a:stretch>
-                  </pic:blipFill>
-                  <pic:spPr bwMode="auto">
-                    <a:xfrm>
-                      <a:off x="0" y="0"/>
-                      <a:ext cx="6261100" cy="2635836"/>
-                    </a:xfrm>
-                    <a:prstGeom prst="rect">
-                      <a:avLst/>
-                    </a:prstGeom>
-                    <a:noFill/>
-                    <a:ln w="9525">
-                      <a:noFill/>
-                      <a:headEnd/>
-                      <a:tailEnd/>
-                    </a:ln>
-                  </pic:spPr>
-                </pic:pic>
-              </a:graphicData>
-            </a:graphic>
-          </wp:inline>
-        </w:drawing>
-      </w:r>
-    </w:p>
+    <w:tbl>
+      <w:tblPr>
+        <w:tblStyle w:val="FigureTable"/>
+        <w:tblW w:type="auto" w:w="0"/>
+        <w:tblLook w:firstRow="0" w:lastRow="0" w:firstColumn="0" w:lastColumn="0"/>
+        <w:jc w:val="center"/>
+      </w:tblPr>
+      <w:tblGrid>
+        <w:gridCol w:w="7920"/>
+      </w:tblGrid>
+      <w:tr>
+        <w:tc>
+          <w:tcPr/>
+          <w:p>
+            <w:pPr>
+              <w:pStyle w:val="Compact"/>
+              <w:jc w:val="center"/>
+            </w:pPr>
+            <w:r>
+              <w:t xml:space="preserve">Figure 4.2. Representation ladder, 25 cells. Thin lines are cells; the thick line is the median.</w:t>
+            </w:r>
+          </w:p>
+        </w:tc>
+      </w:tr>
+    </w:tbl>
     <w:p>
       <w:pPr>
         <w:pStyle w:val="ImageCaption"/>
@@ -2232,53 +2188,31 @@
         <w:t xml:space="preserve">Figure 4.2. Representation ladder, 25 cells. Thin lines are cells; the thick line is the median.</w:t>
       </w:r>
     </w:p>
-    <w:p>
-      <w:pPr>
-        <w:pStyle w:val="CaptionedFigure"/>
-      </w:pPr>
-      <w:r>
-        <w:drawing>
-          <wp:inline>
-            <wp:extent cx="5909137" cy="3060253"/>
-            <wp:effectExtent b="0" l="0" r="0" t="0"/>
-            <wp:docPr descr="Figure 4.3. Median AUC by representation and model, with the range across the 25 cells." title="" id="46" name="Picture"/>
-            <a:graphic>
-              <a:graphicData uri="http://schemas.openxmlformats.org/drawingml/2006/picture">
-                <pic:pic>
-                  <pic:nvPicPr>
-                    <pic:cNvPr descr="fig03_models.png" id="47" name="Picture"/>
-                    <pic:cNvPicPr>
-                      <a:picLocks noChangeArrowheads="1" noChangeAspect="1"/>
-                    </pic:cNvPicPr>
-                  </pic:nvPicPr>
-                  <pic:blipFill>
-                    <a:blip r:embed="rId45"/>
-                    <a:stretch>
-                      <a:fillRect/>
-                    </a:stretch>
-                  </pic:blipFill>
-                  <pic:spPr bwMode="auto">
-                    <a:xfrm>
-                      <a:off x="0" y="0"/>
-                      <a:ext cx="5909137" cy="3060253"/>
-                    </a:xfrm>
-                    <a:prstGeom prst="rect">
-                      <a:avLst/>
-                    </a:prstGeom>
-                    <a:noFill/>
-                    <a:ln w="9525">
-                      <a:noFill/>
-                      <a:headEnd/>
-                      <a:tailEnd/>
-                    </a:ln>
-                  </pic:spPr>
-                </pic:pic>
-              </a:graphicData>
-            </a:graphic>
-          </wp:inline>
-        </w:drawing>
-      </w:r>
-    </w:p>
+    <w:tbl>
+      <w:tblPr>
+        <w:tblStyle w:val="FigureTable"/>
+        <w:tblW w:type="auto" w:w="0"/>
+        <w:tblLook w:firstRow="0" w:lastRow="0" w:firstColumn="0" w:lastColumn="0"/>
+        <w:jc w:val="center"/>
+      </w:tblPr>
+      <w:tblGrid>
+        <w:gridCol w:w="7920"/>
+      </w:tblGrid>
+      <w:tr>
+        <w:tc>
+          <w:tcPr/>
+          <w:p>
+            <w:pPr>
+              <w:pStyle w:val="Compact"/>
+              <w:jc w:val="center"/>
+            </w:pPr>
+            <w:r>
+              <w:t xml:space="preserve">Figure 4.3. Median AUC by representation and model, with the range across the 25 cells.</w:t>
+            </w:r>
+          </w:p>
+        </w:tc>
+      </w:tr>
+    </w:tbl>
     <w:p>
       <w:pPr>
         <w:pStyle w:val="ImageCaption"/>
@@ -3622,8 +3556,8 @@
         </w:tc>
       </w:tr>
     </w:tbl>
-    <w:bookmarkEnd w:id="48"/>
-    <w:bookmarkStart w:id="52" w:name="q2-where-the-drop-sits-does-not-hold"/>
+    <w:bookmarkEnd w:id="39"/>
+    <w:bookmarkStart w:id="40" w:name="q2-where-the-drop-sits-does-not-hold"/>
     <w:p>
       <w:pPr>
         <w:pStyle w:val="Heading2"/>
@@ -3938,53 +3872,31 @@
         </w:tc>
       </w:tr>
     </w:tbl>
-    <w:p>
-      <w:pPr>
-        <w:pStyle w:val="CaptionedFigure"/>
-      </w:pPr>
-      <w:r>
-        <w:drawing>
-          <wp:inline>
-            <wp:extent cx="6261100" cy="4454144"/>
-            <wp:effectExtent b="0" l="0" r="0" t="0"/>
-            <wp:docPr descr="Figure 4.4. Share of the R1 to R4 drop by step, LightGBM, per cell." title="" id="50" name="Picture"/>
-            <a:graphic>
-              <a:graphicData uri="http://schemas.openxmlformats.org/drawingml/2006/picture">
-                <pic:pic>
-                  <pic:nvPicPr>
-                    <pic:cNvPr descr="fig04_share.png" id="51" name="Picture"/>
-                    <pic:cNvPicPr>
-                      <a:picLocks noChangeArrowheads="1" noChangeAspect="1"/>
-                    </pic:cNvPicPr>
-                  </pic:nvPicPr>
-                  <pic:blipFill>
-                    <a:blip r:embed="rId49"/>
-                    <a:stretch>
-                      <a:fillRect/>
-                    </a:stretch>
-                  </pic:blipFill>
-                  <pic:spPr bwMode="auto">
-                    <a:xfrm>
-                      <a:off x="0" y="0"/>
-                      <a:ext cx="6261100" cy="4454144"/>
-                    </a:xfrm>
-                    <a:prstGeom prst="rect">
-                      <a:avLst/>
-                    </a:prstGeom>
-                    <a:noFill/>
-                    <a:ln w="9525">
-                      <a:noFill/>
-                      <a:headEnd/>
-                      <a:tailEnd/>
-                    </a:ln>
-                  </pic:spPr>
-                </pic:pic>
-              </a:graphicData>
-            </a:graphic>
-          </wp:inline>
-        </w:drawing>
-      </w:r>
-    </w:p>
+    <w:tbl>
+      <w:tblPr>
+        <w:tblStyle w:val="FigureTable"/>
+        <w:tblW w:type="auto" w:w="0"/>
+        <w:tblLook w:firstRow="0" w:lastRow="0" w:firstColumn="0" w:lastColumn="0"/>
+        <w:jc w:val="center"/>
+      </w:tblPr>
+      <w:tblGrid>
+        <w:gridCol w:w="7920"/>
+      </w:tblGrid>
+      <w:tr>
+        <w:tc>
+          <w:tcPr/>
+          <w:p>
+            <w:pPr>
+              <w:pStyle w:val="Compact"/>
+              <w:jc w:val="center"/>
+            </w:pPr>
+            <w:r>
+              <w:t xml:space="preserve">Figure 4.4. Share of the R1 to R4 drop by step, LightGBM, per cell.</w:t>
+            </w:r>
+          </w:p>
+        </w:tc>
+      </w:tr>
+    </w:tbl>
     <w:p>
       <w:pPr>
         <w:pStyle w:val="ImageCaption"/>
@@ -3993,8 +3905,8 @@
         <w:t xml:space="preserve">Figure 4.4. Share of the R1 to R4 drop by step, LightGBM, per cell.</w:t>
       </w:r>
     </w:p>
-    <w:bookmarkEnd w:id="52"/>
-    <w:bookmarkStart w:id="56" w:name="q3-source-dependence-holds-in-part"/>
+    <w:bookmarkEnd w:id="40"/>
+    <w:bookmarkStart w:id="41" w:name="q3-source-dependence-holds-in-part"/>
     <w:p>
       <w:pPr>
         <w:pStyle w:val="Heading2"/>
@@ -4011,53 +3923,31 @@
         <w:t xml:space="preserve">Swapping one source while holding the other fixed moves R4 AUC by a median 0.058 (phishing source swapped 0.050, legitimate source swapped 0.067). The interval excludes zero in 76% of 400 swaps. After reweighting the test side to equalise URL depth across classes it falls to 53%, so part of the source effect is URL depth. The heatmap shows the pattern: R4 AUC ranges from 0.71 to 0.94; against URL-Phish legitimate URLs every phishing source scores highest (0.85 to 0.94), and the lowest cells pair PhishStorm, PhiUSIIL or Phishpedia phishing with PhiUSIIL or crawled legitimate URLs.</w:t>
       </w:r>
     </w:p>
-    <w:p>
-      <w:pPr>
-        <w:pStyle w:val="CaptionedFigure"/>
-      </w:pPr>
-      <w:r>
-        <w:drawing>
-          <wp:inline>
-            <wp:extent cx="6261100" cy="2822223"/>
-            <wp:effectExtent b="0" l="0" r="0" t="0"/>
-            <wp:docPr descr="Figure 4.5. R4 AUC for every phishing-by-legitimate cell (left) and the distribution of swap effects (right)." title="" id="54" name="Picture"/>
-            <a:graphic>
-              <a:graphicData uri="http://schemas.openxmlformats.org/drawingml/2006/picture">
-                <pic:pic>
-                  <pic:nvPicPr>
-                    <pic:cNvPr descr="fig05_source.png" id="55" name="Picture"/>
-                    <pic:cNvPicPr>
-                      <a:picLocks noChangeArrowheads="1" noChangeAspect="1"/>
-                    </pic:cNvPicPr>
-                  </pic:nvPicPr>
-                  <pic:blipFill>
-                    <a:blip r:embed="rId53"/>
-                    <a:stretch>
-                      <a:fillRect/>
-                    </a:stretch>
-                  </pic:blipFill>
-                  <pic:spPr bwMode="auto">
-                    <a:xfrm>
-                      <a:off x="0" y="0"/>
-                      <a:ext cx="6261100" cy="2822223"/>
-                    </a:xfrm>
-                    <a:prstGeom prst="rect">
-                      <a:avLst/>
-                    </a:prstGeom>
-                    <a:noFill/>
-                    <a:ln w="9525">
-                      <a:noFill/>
-                      <a:headEnd/>
-                      <a:tailEnd/>
-                    </a:ln>
-                  </pic:spPr>
-                </pic:pic>
-              </a:graphicData>
-            </a:graphic>
-          </wp:inline>
-        </w:drawing>
-      </w:r>
-    </w:p>
+    <w:tbl>
+      <w:tblPr>
+        <w:tblStyle w:val="FigureTable"/>
+        <w:tblW w:type="auto" w:w="0"/>
+        <w:tblLook w:firstRow="0" w:lastRow="0" w:firstColumn="0" w:lastColumn="0"/>
+        <w:jc w:val="center"/>
+      </w:tblPr>
+      <w:tblGrid>
+        <w:gridCol w:w="7920"/>
+      </w:tblGrid>
+      <w:tr>
+        <w:tc>
+          <w:tcPr/>
+          <w:p>
+            <w:pPr>
+              <w:pStyle w:val="Compact"/>
+              <w:jc w:val="center"/>
+            </w:pPr>
+            <w:r>
+              <w:t xml:space="preserve">Figure 4.5. R4 AUC for every phishing-by-legitimate cell (left) and the distribution of swap effects (right).</w:t>
+            </w:r>
+          </w:p>
+        </w:tc>
+      </w:tr>
+    </w:tbl>
     <w:p>
       <w:pPr>
         <w:pStyle w:val="ImageCaption"/>
@@ -4074,8 +3964,8 @@
         <w:t xml:space="preserve">the interaction check, an interaction between phishing and legitimate source, holds in 26% of settings; an interaction is hard to establish with this many settings, so it is treated as inconclusive.</w:t>
       </w:r>
     </w:p>
-    <w:bookmarkEnd w:id="56"/>
-    <w:bookmarkStart w:id="60" w:name="q4-split-sensitivity-does-not-hold"/>
+    <w:bookmarkEnd w:id="41"/>
+    <w:bookmarkStart w:id="42" w:name="q4-split-sensitivity-does-not-hold"/>
     <w:p>
       <w:pPr>
         <w:pStyle w:val="Heading2"/>
@@ -4092,53 +3982,31 @@
         <w:t xml:space="preserve">The median SD is 0.006 for R4 and 0.002 for R1, and the largest R4 SD is 0.019. R4 is the more variable in 100% of settings, but exceeds three times the raw SD in only 45% of them. With 5 to 10 thousand URLs per cell and domain-grouped splits the variability is small.</w:t>
       </w:r>
     </w:p>
-    <w:p>
-      <w:pPr>
-        <w:pStyle w:val="CaptionedFigure"/>
-      </w:pPr>
-      <w:r>
-        <w:drawing>
-          <wp:inline>
-            <wp:extent cx="4714444" cy="3795449"/>
-            <wp:effectExtent b="0" l="0" r="0" t="0"/>
-            <wp:docPr descr="Figure 4.6. SD of AUC across ten splits, raw against R4, one point per cell and model." title="" id="58" name="Picture"/>
-            <a:graphic>
-              <a:graphicData uri="http://schemas.openxmlformats.org/drawingml/2006/picture">
-                <pic:pic>
-                  <pic:nvPicPr>
-                    <pic:cNvPr descr="fig06_split.png" id="59" name="Picture"/>
-                    <pic:cNvPicPr>
-                      <a:picLocks noChangeArrowheads="1" noChangeAspect="1"/>
-                    </pic:cNvPicPr>
-                  </pic:nvPicPr>
-                  <pic:blipFill>
-                    <a:blip r:embed="rId57"/>
-                    <a:stretch>
-                      <a:fillRect/>
-                    </a:stretch>
-                  </pic:blipFill>
-                  <pic:spPr bwMode="auto">
-                    <a:xfrm>
-                      <a:off x="0" y="0"/>
-                      <a:ext cx="4714444" cy="3795449"/>
-                    </a:xfrm>
-                    <a:prstGeom prst="rect">
-                      <a:avLst/>
-                    </a:prstGeom>
-                    <a:noFill/>
-                    <a:ln w="9525">
-                      <a:noFill/>
-                      <a:headEnd/>
-                      <a:tailEnd/>
-                    </a:ln>
-                  </pic:spPr>
-                </pic:pic>
-              </a:graphicData>
-            </a:graphic>
-          </wp:inline>
-        </w:drawing>
-      </w:r>
-    </w:p>
+    <w:tbl>
+      <w:tblPr>
+        <w:tblStyle w:val="FigureTable"/>
+        <w:tblW w:type="auto" w:w="0"/>
+        <w:tblLook w:firstRow="0" w:lastRow="0" w:firstColumn="0" w:lastColumn="0"/>
+        <w:jc w:val="center"/>
+      </w:tblPr>
+      <w:tblGrid>
+        <w:gridCol w:w="7920"/>
+      </w:tblGrid>
+      <w:tr>
+        <w:tc>
+          <w:tcPr/>
+          <w:p>
+            <w:pPr>
+              <w:pStyle w:val="Compact"/>
+              <w:jc w:val="center"/>
+            </w:pPr>
+            <w:r>
+              <w:t xml:space="preserve">Figure 4.6. SD of AUC across ten splits, raw against R4, one point per cell and model.</w:t>
+            </w:r>
+          </w:p>
+        </w:tc>
+      </w:tr>
+    </w:tbl>
     <w:p>
       <w:pPr>
         <w:pStyle w:val="ImageCaption"/>
@@ -4147,14 +4015,14 @@
         <w:t xml:space="preserve">Figure 4.6. SD of AUC across ten splits, raw against R4, one point per cell and model.</w:t>
       </w:r>
     </w:p>
-    <w:bookmarkEnd w:id="60"/>
-    <w:bookmarkStart w:id="61" w:name="q5-platform-masking-not-testable"/>
+    <w:bookmarkEnd w:id="42"/>
+    <w:bookmarkStart w:id="43" w:name="X0ed11e4c8b3b3a411482757d8a6875a4e1d17de"/>
     <w:p>
       <w:pPr>
         <w:pStyle w:val="Heading2"/>
       </w:pPr>
       <w:r>
-        <w:t xml:space="preserve">4.5 Q5: platform masking (not testable)</w:t>
+        <w:t xml:space="preserve">4.5 Q5: platform masking (not testable in the main design)</w:t>
       </w:r>
     </w:p>
     <w:p>
@@ -4162,11 +4030,11 @@
         <w:pStyle w:val="FirstParagraph"/>
       </w:pPr>
       <w:r>
-        <w:t xml:space="preserve">Masking replaces hosting-platform domains with a neutral token. The caps used here leave no registrable domain on a hosting platform in any cell, so there is nothing to mask and the finding cannot be tested. A design that keeps platform domains is future work.</w:t>
-      </w:r>
-    </w:p>
-    <w:bookmarkEnd w:id="61"/>
-    <w:bookmarkStart w:id="65" w:name="q6-independent-benign-transfer-holds"/>
+        <w:t xml:space="preserve">Masking replaces hosting-platform domains with a neutral token. The caps used here leave no registrable domain on a hosting platform in any cell, so there is nothing to mask and the finding cannot be tested in this design. A separate exploratory test that keeps platform domains found no measurable effect of masking (Section 4.14).</w:t>
+      </w:r>
+    </w:p>
+    <w:bookmarkEnd w:id="43"/>
+    <w:bookmarkStart w:id="44" w:name="q6-independent-benign-transfer-holds"/>
     <w:p>
       <w:pPr>
         <w:pStyle w:val="Heading2"/>
@@ -4183,53 +4051,31 @@
         <w:t xml:space="preserve">Models trained on one cell and evaluated on cells that share no source with it keep an R4 AUC above 0.5 in every setting (median 0.699, lowest 0.554; 392 train-test pairs across the two transfer models). Each pair uses thousands of legitimate domains.</w:t>
       </w:r>
     </w:p>
-    <w:p>
-      <w:pPr>
-        <w:pStyle w:val="CaptionedFigure"/>
-      </w:pPr>
-      <w:r>
-        <w:drawing>
-          <wp:inline>
-            <wp:extent cx="5449640" cy="3060253"/>
-            <wp:effectExtent b="0" l="0" r="0" t="0"/>
-            <wp:docPr descr="Figure 4.7. Transfer AUC on fully independent cells." title="" id="63" name="Picture"/>
-            <a:graphic>
-              <a:graphicData uri="http://schemas.openxmlformats.org/drawingml/2006/picture">
-                <pic:pic>
-                  <pic:nvPicPr>
-                    <pic:cNvPr descr="fig07_transfer.png" id="64" name="Picture"/>
-                    <pic:cNvPicPr>
-                      <a:picLocks noChangeArrowheads="1" noChangeAspect="1"/>
-                    </pic:cNvPicPr>
-                  </pic:nvPicPr>
-                  <pic:blipFill>
-                    <a:blip r:embed="rId62"/>
-                    <a:stretch>
-                      <a:fillRect/>
-                    </a:stretch>
-                  </pic:blipFill>
-                  <pic:spPr bwMode="auto">
-                    <a:xfrm>
-                      <a:off x="0" y="0"/>
-                      <a:ext cx="5449640" cy="3060253"/>
-                    </a:xfrm>
-                    <a:prstGeom prst="rect">
-                      <a:avLst/>
-                    </a:prstGeom>
-                    <a:noFill/>
-                    <a:ln w="9525">
-                      <a:noFill/>
-                      <a:headEnd/>
-                      <a:tailEnd/>
-                    </a:ln>
-                  </pic:spPr>
-                </pic:pic>
-              </a:graphicData>
-            </a:graphic>
-          </wp:inline>
-        </w:drawing>
-      </w:r>
-    </w:p>
+    <w:tbl>
+      <w:tblPr>
+        <w:tblStyle w:val="FigureTable"/>
+        <w:tblW w:type="auto" w:w="0"/>
+        <w:tblLook w:firstRow="0" w:lastRow="0" w:firstColumn="0" w:lastColumn="0"/>
+        <w:jc w:val="center"/>
+      </w:tblPr>
+      <w:tblGrid>
+        <w:gridCol w:w="7920"/>
+      </w:tblGrid>
+      <w:tr>
+        <w:tc>
+          <w:tcPr/>
+          <w:p>
+            <w:pPr>
+              <w:pStyle w:val="Compact"/>
+              <w:jc w:val="center"/>
+            </w:pPr>
+            <w:r>
+              <w:t xml:space="preserve">Figure 4.7. Transfer AUC on fully independent cells.</w:t>
+            </w:r>
+          </w:p>
+        </w:tc>
+      </w:tr>
+    </w:tbl>
     <w:p>
       <w:pPr>
         <w:pStyle w:val="ImageCaption"/>
@@ -4238,8 +4084,8 @@
         <w:t xml:space="preserve">Figure 4.7. Transfer AUC on fully independent cells.</w:t>
       </w:r>
     </w:p>
-    <w:bookmarkEnd w:id="65"/>
-    <w:bookmarkStart w:id="69" w:name="Xd8634e9584e2c3a5f552c1d6de4e9353b6f0ee6"/>
+    <w:bookmarkEnd w:id="44"/>
+    <w:bookmarkStart w:id="45" w:name="Xd8634e9584e2c3a5f552c1d6de4e9353b6f0ee6"/>
     <w:p>
       <w:pPr>
         <w:pStyle w:val="Heading2"/>
@@ -4256,53 +4102,31 @@
         <w:t xml:space="preserve">A model’s false-alarm rate on 2,555 natural legitimate pages from 562 sites, none in any training source, is compared with its own test side at the same 1% threshold. The median is 15.2% on natural pages against 1.0% in-cell; at the 0.1% threshold 4.5%; at the default 0.5 threshold 33%. The natural rate exceeds five times the in-cell rate in 76% of settings. No model flags every natural page, but a benchmark threshold still understates real-world false alarms.</w:t>
       </w:r>
     </w:p>
-    <w:p>
-      <w:pPr>
-        <w:pStyle w:val="CaptionedFigure"/>
-      </w:pPr>
-      <w:r>
-        <w:drawing>
-          <wp:inline>
-            <wp:extent cx="5082042" cy="3974653"/>
-            <wp:effectExtent b="0" l="0" r="0" t="0"/>
-            <wp:docPr descr="Figure 4.8. False alarms on natural pages against the cell’s own test side, log scale." title="" id="67" name="Picture"/>
-            <a:graphic>
-              <a:graphicData uri="http://schemas.openxmlformats.org/drawingml/2006/picture">
-                <pic:pic>
-                  <pic:nvPicPr>
-                    <pic:cNvPr descr="fig08_ood.png" id="68" name="Picture"/>
-                    <pic:cNvPicPr>
-                      <a:picLocks noChangeArrowheads="1" noChangeAspect="1"/>
-                    </pic:cNvPicPr>
-                  </pic:nvPicPr>
-                  <pic:blipFill>
-                    <a:blip r:embed="rId66"/>
-                    <a:stretch>
-                      <a:fillRect/>
-                    </a:stretch>
-                  </pic:blipFill>
-                  <pic:spPr bwMode="auto">
-                    <a:xfrm>
-                      <a:off x="0" y="0"/>
-                      <a:ext cx="5082042" cy="3974653"/>
-                    </a:xfrm>
-                    <a:prstGeom prst="rect">
-                      <a:avLst/>
-                    </a:prstGeom>
-                    <a:noFill/>
-                    <a:ln w="9525">
-                      <a:noFill/>
-                      <a:headEnd/>
-                      <a:tailEnd/>
-                    </a:ln>
-                  </pic:spPr>
-                </pic:pic>
-              </a:graphicData>
-            </a:graphic>
-          </wp:inline>
-        </w:drawing>
-      </w:r>
-    </w:p>
+    <w:tbl>
+      <w:tblPr>
+        <w:tblStyle w:val="FigureTable"/>
+        <w:tblW w:type="auto" w:w="0"/>
+        <w:tblLook w:firstRow="0" w:lastRow="0" w:firstColumn="0" w:lastColumn="0"/>
+        <w:jc w:val="center"/>
+      </w:tblPr>
+      <w:tblGrid>
+        <w:gridCol w:w="7920"/>
+      </w:tblGrid>
+      <w:tr>
+        <w:tc>
+          <w:tcPr/>
+          <w:p>
+            <w:pPr>
+              <w:pStyle w:val="Compact"/>
+              <w:jc w:val="center"/>
+            </w:pPr>
+            <w:r>
+              <w:t xml:space="preserve">Figure 4.8. False alarms on natural pages against the cell’s own test side, log scale.</w:t>
+            </w:r>
+          </w:p>
+        </w:tc>
+      </w:tr>
+    </w:tbl>
     <w:p>
       <w:pPr>
         <w:pStyle w:val="ImageCaption"/>
@@ -4311,8 +4135,8 @@
         <w:t xml:space="preserve">Figure 4.8. False alarms on natural pages against the cell’s own test side, log scale.</w:t>
       </w:r>
     </w:p>
-    <w:bookmarkEnd w:id="69"/>
-    <w:bookmarkStart w:id="73" w:name="negative-controls"/>
+    <w:bookmarkEnd w:id="45"/>
+    <w:bookmarkStart w:id="46" w:name="negative-controls"/>
     <w:p>
       <w:pPr>
         <w:pStyle w:val="Heading2"/>
@@ -4329,53 +4153,31 @@
         <w:t xml:space="preserve">With shuffled training labels, mean AUC stays between 0.448 and 0.525 over 100 conditions (cell, representation, model); 1 is flagged under the |mean - 0.5| &gt; 0.05 rule. The flagged condition is examined in Section 4.10.</w:t>
       </w:r>
     </w:p>
-    <w:p>
-      <w:pPr>
-        <w:pStyle w:val="CaptionedFigure"/>
-      </w:pPr>
-      <w:r>
-        <w:drawing>
-          <wp:inline>
-            <wp:extent cx="5909137" cy="2876454"/>
-            <wp:effectExtent b="0" l="0" r="0" t="0"/>
-            <wp:docPr descr="Figure 4.9. Shuffled-label controls, 100 conditions." title="" id="71" name="Picture"/>
-            <a:graphic>
-              <a:graphicData uri="http://schemas.openxmlformats.org/drawingml/2006/picture">
-                <pic:pic>
-                  <pic:nvPicPr>
-                    <pic:cNvPr descr="fig09_controls.png" id="72" name="Picture"/>
-                    <pic:cNvPicPr>
-                      <a:picLocks noChangeArrowheads="1" noChangeAspect="1"/>
-                    </pic:cNvPicPr>
-                  </pic:nvPicPr>
-                  <pic:blipFill>
-                    <a:blip r:embed="rId70"/>
-                    <a:stretch>
-                      <a:fillRect/>
-                    </a:stretch>
-                  </pic:blipFill>
-                  <pic:spPr bwMode="auto">
-                    <a:xfrm>
-                      <a:off x="0" y="0"/>
-                      <a:ext cx="5909137" cy="2876454"/>
-                    </a:xfrm>
-                    <a:prstGeom prst="rect">
-                      <a:avLst/>
-                    </a:prstGeom>
-                    <a:noFill/>
-                    <a:ln w="9525">
-                      <a:noFill/>
-                      <a:headEnd/>
-                      <a:tailEnd/>
-                    </a:ln>
-                  </pic:spPr>
-                </pic:pic>
-              </a:graphicData>
-            </a:graphic>
-          </wp:inline>
-        </w:drawing>
-      </w:r>
-    </w:p>
+    <w:tbl>
+      <w:tblPr>
+        <w:tblStyle w:val="FigureTable"/>
+        <w:tblW w:type="auto" w:w="0"/>
+        <w:tblLook w:firstRow="0" w:lastRow="0" w:firstColumn="0" w:lastColumn="0"/>
+        <w:jc w:val="center"/>
+      </w:tblPr>
+      <w:tblGrid>
+        <w:gridCol w:w="7920"/>
+      </w:tblGrid>
+      <w:tr>
+        <w:tc>
+          <w:tcPr/>
+          <w:p>
+            <w:pPr>
+              <w:pStyle w:val="Compact"/>
+              <w:jc w:val="center"/>
+            </w:pPr>
+            <w:r>
+              <w:t xml:space="preserve">Figure 4.9. Shuffled-label controls, 100 conditions.</w:t>
+            </w:r>
+          </w:p>
+        </w:tc>
+      </w:tr>
+    </w:tbl>
     <w:p>
       <w:pPr>
         <w:pStyle w:val="ImageCaption"/>
@@ -4384,8 +4186,8 @@
         <w:t xml:space="preserve">Figure 4.9. Shuffled-label controls, 100 conditions.</w:t>
       </w:r>
     </w:p>
-    <w:bookmarkEnd w:id="73"/>
-    <w:bookmarkStart w:id="74" w:name="dataset-fingerprints"/>
+    <w:bookmarkEnd w:id="46"/>
+    <w:bookmarkStart w:id="47" w:name="dataset-fingerprints"/>
     <w:p>
       <w:pPr>
         <w:pStyle w:val="Heading2"/>
@@ -4957,8 +4759,8 @@
         </w:tc>
       </w:tr>
     </w:tbl>
-    <w:bookmarkEnd w:id="74"/>
-    <w:bookmarkStart w:id="78" w:name="follow-up-checks"/>
+    <w:bookmarkEnd w:id="47"/>
+    <w:bookmarkStart w:id="48" w:name="follow-up-checks"/>
     <w:p>
       <w:pPr>
         <w:pStyle w:val="Heading2"/>
@@ -5003,53 +4805,31 @@
         <w:t xml:space="preserve">In the URL-Phish phishing against PhiUSIIL legitimate cell, LightGBM trained on shuffled labels scores below chance at every seed: mean 0.449 (SD 0.031, 50 runs); the character n-gram model scores 0.506. A leak raises a control above 0.5, so this is read as a model artefact in one cell and listed as a limitation.</w:t>
       </w:r>
     </w:p>
-    <w:p>
-      <w:pPr>
-        <w:pStyle w:val="CaptionedFigure"/>
-      </w:pPr>
-      <w:r>
-        <w:drawing>
-          <wp:inline>
-            <wp:extent cx="6261100" cy="2334766"/>
-            <wp:effectExtent b="0" l="0" r="0" t="0"/>
-            <wp:docPr descr="Figure 4.10. Left: XGBoost AUC from raw PhiUSIIL to the study cell. Right: the flagged control." title="" id="76" name="Picture"/>
-            <a:graphic>
-              <a:graphicData uri="http://schemas.openxmlformats.org/drawingml/2006/picture">
-                <pic:pic>
-                  <pic:nvPicPr>
-                    <pic:cNvPr descr="fig12_followup.png" id="77" name="Picture"/>
-                    <pic:cNvPicPr>
-                      <a:picLocks noChangeArrowheads="1" noChangeAspect="1"/>
-                    </pic:cNvPicPr>
-                  </pic:nvPicPr>
-                  <pic:blipFill>
-                    <a:blip r:embed="rId75"/>
-                    <a:stretch>
-                      <a:fillRect/>
-                    </a:stretch>
-                  </pic:blipFill>
-                  <pic:spPr bwMode="auto">
-                    <a:xfrm>
-                      <a:off x="0" y="0"/>
-                      <a:ext cx="6261100" cy="2334766"/>
-                    </a:xfrm>
-                    <a:prstGeom prst="rect">
-                      <a:avLst/>
-                    </a:prstGeom>
-                    <a:noFill/>
-                    <a:ln w="9525">
-                      <a:noFill/>
-                      <a:headEnd/>
-                      <a:tailEnd/>
-                    </a:ln>
-                  </pic:spPr>
-                </pic:pic>
-              </a:graphicData>
-            </a:graphic>
-          </wp:inline>
-        </w:drawing>
-      </w:r>
-    </w:p>
+    <w:tbl>
+      <w:tblPr>
+        <w:tblStyle w:val="FigureTable"/>
+        <w:tblW w:type="auto" w:w="0"/>
+        <w:tblLook w:firstRow="0" w:lastRow="0" w:firstColumn="0" w:lastColumn="0"/>
+        <w:jc w:val="center"/>
+      </w:tblPr>
+      <w:tblGrid>
+        <w:gridCol w:w="7920"/>
+      </w:tblGrid>
+      <w:tr>
+        <w:tc>
+          <w:tcPr/>
+          <w:p>
+            <w:pPr>
+              <w:pStyle w:val="Compact"/>
+              <w:jc w:val="center"/>
+            </w:pPr>
+            <w:r>
+              <w:t xml:space="preserve">Figure 4.10. Left: XGBoost AUC from raw PhiUSIIL to the study cell. Right: the flagged control.</w:t>
+            </w:r>
+          </w:p>
+        </w:tc>
+      </w:tr>
+    </w:tbl>
     <w:p>
       <w:pPr>
         <w:pStyle w:val="ImageCaption"/>
@@ -5058,8 +4838,8 @@
         <w:t xml:space="preserve">Figure 4.10. Left: XGBoost AUC from raw PhiUSIIL to the study cell. Right: the flagged control.</w:t>
       </w:r>
     </w:p>
-    <w:bookmarkEnd w:id="78"/>
-    <w:bookmarkStart w:id="85" w:name="page-html-exploratory"/>
+    <w:bookmarkEnd w:id="48"/>
+    <w:bookmarkStart w:id="49" w:name="page-html-exploratory"/>
     <w:p>
       <w:pPr>
         <w:pStyle w:val="Heading2"/>
@@ -5758,53 +5538,31 @@
         <w:t xml:space="preserve">predicts phishing with ROC-AUC 0.639. Page numbers may therefore be optimistic.</w:t>
       </w:r>
     </w:p>
-    <w:p>
-      <w:pPr>
-        <w:pStyle w:val="CaptionedFigure"/>
-      </w:pPr>
-      <w:r>
-        <w:drawing>
-          <wp:inline>
-            <wp:extent cx="6261100" cy="2974654"/>
-            <wp:effectExtent b="0" l="0" r="0" t="0"/>
-            <wp:docPr descr="Figure 4.11. Page and URL representations, LightGBM." title="" id="80" name="Picture"/>
-            <a:graphic>
-              <a:graphicData uri="http://schemas.openxmlformats.org/drawingml/2006/picture">
-                <pic:pic>
-                  <pic:nvPicPr>
-                    <pic:cNvPr descr="fig10_pageb.png" id="81" name="Picture"/>
-                    <pic:cNvPicPr>
-                      <a:picLocks noChangeArrowheads="1" noChangeAspect="1"/>
-                    </pic:cNvPicPr>
-                  </pic:nvPicPr>
-                  <pic:blipFill>
-                    <a:blip r:embed="rId79"/>
-                    <a:stretch>
-                      <a:fillRect/>
-                    </a:stretch>
-                  </pic:blipFill>
-                  <pic:spPr bwMode="auto">
-                    <a:xfrm>
-                      <a:off x="0" y="0"/>
-                      <a:ext cx="6261100" cy="2974654"/>
-                    </a:xfrm>
-                    <a:prstGeom prst="rect">
-                      <a:avLst/>
-                    </a:prstGeom>
-                    <a:noFill/>
-                    <a:ln w="9525">
-                      <a:noFill/>
-                      <a:headEnd/>
-                      <a:tailEnd/>
-                    </a:ln>
-                  </pic:spPr>
-                </pic:pic>
-              </a:graphicData>
-            </a:graphic>
-          </wp:inline>
-        </w:drawing>
-      </w:r>
-    </w:p>
+    <w:tbl>
+      <w:tblPr>
+        <w:tblStyle w:val="FigureTable"/>
+        <w:tblW w:type="auto" w:w="0"/>
+        <w:tblLook w:firstRow="0" w:lastRow="0" w:firstColumn="0" w:lastColumn="0"/>
+        <w:jc w:val="center"/>
+      </w:tblPr>
+      <w:tblGrid>
+        <w:gridCol w:w="7920"/>
+      </w:tblGrid>
+      <w:tr>
+        <w:tc>
+          <w:tcPr/>
+          <w:p>
+            <w:pPr>
+              <w:pStyle w:val="Compact"/>
+              <w:jc w:val="center"/>
+            </w:pPr>
+            <w:r>
+              <w:t xml:space="preserve">Figure 4.11. Page and URL representations, LightGBM.</w:t>
+            </w:r>
+          </w:p>
+        </w:tc>
+      </w:tr>
+    </w:tbl>
     <w:p>
       <w:pPr>
         <w:pStyle w:val="ImageCaption"/>
@@ -5813,53 +5571,31 @@
         <w:t xml:space="preserve">Figure 4.11. Page and URL representations, LightGBM.</w:t>
       </w:r>
     </w:p>
-    <w:p>
-      <w:pPr>
-        <w:pStyle w:val="CaptionedFigure"/>
-      </w:pPr>
-      <w:r>
-        <w:drawing>
-          <wp:inline>
-            <wp:extent cx="5909137" cy="2876454"/>
-            <wp:effectExtent b="0" l="0" r="0" t="0"/>
-            <wp:docPr descr="Figure 4.12. Share of rows with usable HTML, by source and class." title="" id="83" name="Picture"/>
-            <a:graphic>
-              <a:graphicData uri="http://schemas.openxmlformats.org/drawingml/2006/picture">
-                <pic:pic>
-                  <pic:nvPicPr>
-                    <pic:cNvPr descr="fig11_html_coverage.png" id="84" name="Picture"/>
-                    <pic:cNvPicPr>
-                      <a:picLocks noChangeArrowheads="1" noChangeAspect="1"/>
-                    </pic:cNvPicPr>
-                  </pic:nvPicPr>
-                  <pic:blipFill>
-                    <a:blip r:embed="rId82"/>
-                    <a:stretch>
-                      <a:fillRect/>
-                    </a:stretch>
-                  </pic:blipFill>
-                  <pic:spPr bwMode="auto">
-                    <a:xfrm>
-                      <a:off x="0" y="0"/>
-                      <a:ext cx="5909137" cy="2876454"/>
-                    </a:xfrm>
-                    <a:prstGeom prst="rect">
-                      <a:avLst/>
-                    </a:prstGeom>
-                    <a:noFill/>
-                    <a:ln w="9525">
-                      <a:noFill/>
-                      <a:headEnd/>
-                      <a:tailEnd/>
-                    </a:ln>
-                  </pic:spPr>
-                </pic:pic>
-              </a:graphicData>
-            </a:graphic>
-          </wp:inline>
-        </w:drawing>
-      </w:r>
-    </w:p>
+    <w:tbl>
+      <w:tblPr>
+        <w:tblStyle w:val="FigureTable"/>
+        <w:tblW w:type="auto" w:w="0"/>
+        <w:tblLook w:firstRow="0" w:lastRow="0" w:firstColumn="0" w:lastColumn="0"/>
+        <w:jc w:val="center"/>
+      </w:tblPr>
+      <w:tblGrid>
+        <w:gridCol w:w="7920"/>
+      </w:tblGrid>
+      <w:tr>
+        <w:tc>
+          <w:tcPr/>
+          <w:p>
+            <w:pPr>
+              <w:pStyle w:val="Compact"/>
+              <w:jc w:val="center"/>
+            </w:pPr>
+            <w:r>
+              <w:t xml:space="preserve">Figure 4.12. Share of rows with usable HTML, by source and class.</w:t>
+            </w:r>
+          </w:p>
+        </w:tc>
+      </w:tr>
+    </w:tbl>
     <w:p>
       <w:pPr>
         <w:pStyle w:val="ImageCaption"/>
@@ -6571,8 +6307,8 @@
         </w:tc>
       </w:tr>
     </w:tbl>
-    <w:bookmarkEnd w:id="85"/>
-    <w:bookmarkStart w:id="86" w:name="limitations-of-the-study"/>
+    <w:bookmarkEnd w:id="49"/>
+    <w:bookmarkStart w:id="50" w:name="limitations-of-the-study"/>
     <w:p>
       <w:pPr>
         <w:pStyle w:val="Heading2"/>
@@ -6616,13 +6352,13 @@
           <w:bCs/>
           <w:b/>
         </w:rPr>
-        <w:t xml:space="preserve">Not testable.</w:t>
-      </w:r>
-      <w:r>
-        <w:t xml:space="preserve"> </w:t>
-      </w:r>
-      <w:r>
-        <w:t xml:space="preserve">Q5, and per-source temporal effects: PhiUSIIL carries no per-row dates.</w:t>
+        <w:t xml:space="preserve">Not testable in the main design.</w:t>
+      </w:r>
+      <w:r>
+        <w:t xml:space="preserve"> </w:t>
+      </w:r>
+      <w:r>
+        <w:t xml:space="preserve">Q5 (an exploratory test is in Section 4.14), and per-source temporal effects: PhiUSIIL carries no per-row dates.</w:t>
       </w:r>
     </w:p>
     <w:p>
@@ -6774,8 +6510,8 @@
         <w:t xml:space="preserve">; seeds are fixed.</w:t>
       </w:r>
     </w:p>
-    <w:bookmarkEnd w:id="86"/>
-    <w:bookmarkStart w:id="87" w:name="X8df0bda2d0692696ae74dfc5c70ee2b43ff4e2b"/>
+    <w:bookmarkEnd w:id="50"/>
+    <w:bookmarkStart w:id="51" w:name="X8df0bda2d0692696ae74dfc5c70ee2b43ff4e2b"/>
     <w:p>
       <w:pPr>
         <w:pStyle w:val="Heading2"/>
@@ -8531,8 +8267,8 @@
         <w:t xml:space="preserve">Median ROC-AUC per cell on raw (R1) and domain-only (R4) URLs in both conditions.</w:t>
       </w:r>
     </w:p>
-    <w:bookmarkEnd w:id="87"/>
-    <w:bookmarkStart w:id="88" w:name="hosting-platform-masking-exploratory"/>
+    <w:bookmarkEnd w:id="51"/>
+    <w:bookmarkStart w:id="52" w:name="hosting-platform-masking-exploratory"/>
     <w:p>
       <w:pPr>
         <w:pStyle w:val="Heading2"/>
@@ -8597,8 +8333,8 @@
         <w:t xml:space="preserve">.</w:t>
       </w:r>
     </w:p>
-    <w:bookmarkEnd w:id="88"/>
-    <w:bookmarkStart w:id="89" w:name="what-can-and-cannot-be-claimed"/>
+    <w:bookmarkEnd w:id="52"/>
+    <w:bookmarkStart w:id="53" w:name="what-can-and-cannot-be-claimed"/>
     <w:p>
       <w:pPr>
         <w:pStyle w:val="Heading2"/>
@@ -8924,19 +8660,19 @@
               <w:jc w:val="left"/>
             </w:pPr>
             <w:r>
-              <w:t xml:space="preserve">Not testable</w:t>
-            </w:r>
-          </w:p>
-        </w:tc>
-        <w:tc>
-          <w:tcPr/>
-          <w:p>
-            <w:pPr>
-              <w:pStyle w:val="Compact"/>
-              <w:jc w:val="left"/>
-            </w:pPr>
-            <w:r>
-              <w:t xml:space="preserve">Leave to a design that keeps platform domains.</w:t>
+              <w:t xml:space="preserve">Not testable in the main design</w:t>
+            </w:r>
+          </w:p>
+        </w:tc>
+        <w:tc>
+          <w:tcPr/>
+          <w:p>
+            <w:pPr>
+              <w:pStyle w:val="Compact"/>
+              <w:jc w:val="left"/>
+            </w:pPr>
+            <w:r>
+              <w:t xml:space="preserve">Exploratory test (Section 4.14): no effect detected.</w:t>
             </w:r>
           </w:p>
         </w:tc>
@@ -9042,9 +8778,9 @@
         </w:tc>
       </w:tr>
     </w:tbl>
-    <w:bookmarkEnd w:id="89"/>
-    <w:bookmarkEnd w:id="90"/>
-    <w:bookmarkStart w:id="97" w:name="data-and-corpus"/>
+    <w:bookmarkEnd w:id="53"/>
+    <w:bookmarkEnd w:id="54"/>
+    <w:bookmarkStart w:id="61" w:name="data-and-corpus"/>
     <w:p>
       <w:pPr>
         <w:pStyle w:val="Heading1"/>
@@ -9191,7 +8927,7 @@
         <w:t xml:space="preserve">Corpus counts in chapter 5 come from the corpus data card as quoted in the 2026-10-13 report draft. The data card file itself is not in this checkout, so those counts are carried over and were not re-checked against it.</w:t>
       </w:r>
     </w:p>
-    <w:bookmarkStart w:id="91" w:name="why-the-corpus-is-built-this-way"/>
+    <w:bookmarkStart w:id="55" w:name="why-the-corpus-is-built-this-way"/>
     <w:p>
       <w:pPr>
         <w:pStyle w:val="Heading2"/>
@@ -9229,8 +8965,8 @@
         <w:t xml:space="preserve">: only URL, label, date and HTML are read from any dataset, never a precomputed feature column; one registrable-domain definition is used everywhere (public-suffix-only); and no model is trained until the corpus passes a depth check.</w:t>
       </w:r>
     </w:p>
-    <w:bookmarkEnd w:id="91"/>
-    <w:bookmarkStart w:id="92" w:name="sources-1"/>
+    <w:bookmarkEnd w:id="55"/>
+    <w:bookmarkStart w:id="56" w:name="sources-1"/>
     <w:p>
       <w:pPr>
         <w:pStyle w:val="Heading2"/>
@@ -10187,8 +9923,8 @@
         <w:t xml:space="preserve">, 2026-10-11). Because PhishStorm has no HTML, the page model has no held-out source at all. Third, the live feeds are still tiny in the pool (245 URLs); they matter mainly for tier C (section 6.4). Licences recorded in the data card: PhreshPhish CC BY 4.0 (anti-phishing research only), PhiUSIIL CC BY 4.0, Phishpedia research use, OpenPhish non-commercial, Phishing.Database MIT; the URL-Phish and Phish-Blitz terms are still to be confirmed.</w:t>
       </w:r>
     </w:p>
-    <w:bookmarkEnd w:id="92"/>
-    <w:bookmarkStart w:id="93" w:name="corpus-build"/>
+    <w:bookmarkEnd w:id="56"/>
+    <w:bookmarkStart w:id="57" w:name="corpus-build"/>
     <w:p>
       <w:pPr>
         <w:pStyle w:val="Heading2"/>
@@ -10641,8 +10377,8 @@
         <w:t xml:space="preserve">). Zero domain overlap and zero canonical-URL overlap between sides is a hard run-time failure, not a warning.</w:t>
       </w:r>
     </w:p>
-    <w:bookmarkEnd w:id="93"/>
-    <w:bookmarkStart w:id="94" w:name="depth-balance"/>
+    <w:bookmarkEnd w:id="57"/>
+    <w:bookmarkStart w:id="58" w:name="depth-balance"/>
     <w:p>
       <w:pPr>
         <w:pStyle w:val="Heading2"/>
@@ -10704,8 +10440,8 @@
         <w:t xml:space="preserve">). This is why chapter 8 adds a depth-matched evaluation and a representation check instead of trusting pooled numbers.</w:t>
       </w:r>
     </w:p>
-    <w:bookmarkEnd w:id="94"/>
-    <w:bookmarkStart w:id="95" w:name="benign-inner-pages"/>
+    <w:bookmarkEnd w:id="58"/>
+    <w:bookmarkStart w:id="59" w:name="benign-inner-pages"/>
     <w:p>
       <w:pPr>
         <w:pStyle w:val="Heading2"/>
@@ -10772,8 +10508,8 @@
         <w:t xml:space="preserve">, 2026-10-20). The corpus described above does not include it, and its effect on false alarms is not measured.</w:t>
       </w:r>
     </w:p>
-    <w:bookmarkEnd w:id="95"/>
-    <w:bookmarkStart w:id="96" w:name="evaluation-only-data"/>
+    <w:bookmarkEnd w:id="59"/>
+    <w:bookmarkStart w:id="60" w:name="evaluation-only-data"/>
     <w:p>
       <w:pPr>
         <w:pStyle w:val="Heading2"/>
@@ -10835,9 +10571,9 @@
         <w:t xml:space="preserve">). The natural pages were sampled from Tranco-listed sites, which makes them easier than a long-tail browsing history; this is a limitation of every false-alarm number below.</w:t>
       </w:r>
     </w:p>
-    <w:bookmarkEnd w:id="96"/>
-    <w:bookmarkEnd w:id="97"/>
-    <w:bookmarkStart w:id="103" w:name="feature-engine-and-models"/>
+    <w:bookmarkEnd w:id="60"/>
+    <w:bookmarkEnd w:id="61"/>
+    <w:bookmarkStart w:id="67" w:name="feature-engine-and-models"/>
     <w:p>
       <w:pPr>
         <w:pStyle w:val="Heading1"/>
@@ -10846,7 +10582,7 @@
         <w:t xml:space="preserve">6. Feature engine and models</w:t>
       </w:r>
     </w:p>
-    <w:bookmarkStart w:id="98" w:name="one-engine-three-tiers"/>
+    <w:bookmarkStart w:id="62" w:name="one-engine-three-tiers"/>
     <w:p>
       <w:pPr>
         <w:pStyle w:val="Heading2"/>
@@ -11259,7 +10995,7 @@
         <w:t xml:space="preserve"> </w:t>
       </w:r>
       <w:r>
-        <w:t xml:space="preserve">is exposed, so that platform identity cannot stand in for phishing (the effect of masking was not testable in Chapter 4: no platform domains remain in the study cells). Tier A features are ported to JavaScript and checked against Python on 272 fixed URLs in both test suites (</w:t>
+        <w:t xml:space="preserve">is exposed, so that platform identity cannot stand in for phishing (in Chapter 4 the main design left no platform domains to mask, and an exploratory test in Section 4.14 detected no effect). Tier A features are ported to JavaScript and checked against Python on 272 fixed URLs in both test suites (</w:t>
       </w:r>
       <w:r>
         <w:rPr>
@@ -11345,8 +11081,8 @@
         <w:t xml:space="preserve">).</w:t>
       </w:r>
     </w:p>
-    <w:bookmarkEnd w:id="98"/>
-    <w:bookmarkStart w:id="99" w:name="Xd11bde47366ac7966d4a9d7083ebb37ade0493f"/>
+    <w:bookmarkEnd w:id="62"/>
+    <w:bookmarkStart w:id="63" w:name="Xd11bde47366ac7966d4a9d7083ebb37ade0493f"/>
     <w:p>
       <w:pPr>
         <w:pStyle w:val="Heading2"/>
@@ -11425,8 +11161,8 @@
         <w:t xml:space="preserve">).</w:t>
       </w:r>
     </w:p>
-    <w:bookmarkEnd w:id="99"/>
-    <w:bookmarkStart w:id="100" w:name="tier-b-the-page-model-and-the-blend"/>
+    <w:bookmarkEnd w:id="63"/>
+    <w:bookmarkStart w:id="64" w:name="tier-b-the-page-model-and-the-blend"/>
     <w:p>
       <w:pPr>
         <w:pStyle w:val="Heading2"/>
@@ -11556,8 +11292,8 @@
         <w:t xml:space="preserve">).</w:t>
       </w:r>
     </w:p>
-    <w:bookmarkEnd w:id="100"/>
-    <w:bookmarkStart w:id="101" w:name="tier-c-domain-dns-and-tls"/>
+    <w:bookmarkEnd w:id="64"/>
+    <w:bookmarkStart w:id="65" w:name="tier-c-domain-dns-and-tls"/>
     <w:p>
       <w:pPr>
         <w:pStyle w:val="Heading2"/>
@@ -11574,8 +11310,8 @@
         <w:t xml:space="preserve">Tier C features (registration age and expiry from RDAP, DNS records, certificate age, validity and issuer) can only be computed honestly when captured as soon as a URL is first seen, so the collector records them for live-feed hosts, and for legitimate Tranco hosts, twice a day. They are never computed today for old dataset URLs. Tier C is therefore trained on live data only, and its sample is small (section 8.9). A separate set of hand-set backend rules (section 7.5) uses the same facts at run time; it is not the tier C model.</w:t>
       </w:r>
     </w:p>
-    <w:bookmarkEnd w:id="101"/>
-    <w:bookmarkStart w:id="102" w:name="calibration-and-thresholds"/>
+    <w:bookmarkEnd w:id="65"/>
+    <w:bookmarkStart w:id="66" w:name="calibration-and-thresholds"/>
     <w:p>
       <w:pPr>
         <w:pStyle w:val="Heading2"/>
@@ -11637,9 +11373,9 @@
         <w:t xml:space="preserve">). Chapter 8 shows that the thresholds themselves do not transfer well to a new source.</w:t>
       </w:r>
     </w:p>
-    <w:bookmarkEnd w:id="102"/>
-    <w:bookmarkEnd w:id="103"/>
-    <w:bookmarkStart w:id="115" w:name="system-extension-and-backend"/>
+    <w:bookmarkEnd w:id="66"/>
+    <w:bookmarkEnd w:id="67"/>
+    <w:bookmarkStart w:id="76" w:name="system-extension-and-backend"/>
     <w:p>
       <w:pPr>
         <w:pStyle w:val="Heading1"/>
@@ -11648,7 +11384,7 @@
         <w:t xml:space="preserve">7. System: extension and backend</w:t>
       </w:r>
     </w:p>
-    <w:bookmarkStart w:id="107" w:name="runtime-layers"/>
+    <w:bookmarkStart w:id="68" w:name="runtime-layers"/>
     <w:p>
       <w:pPr>
         <w:pStyle w:val="Heading2"/>
@@ -11707,53 +11443,31 @@
         <w:t xml:space="preserve">.</w:t>
       </w:r>
     </w:p>
-    <w:p>
-      <w:pPr>
-        <w:pStyle w:val="CaptionedFigure"/>
-      </w:pPr>
-      <w:r>
-        <w:drawing>
-          <wp:inline>
-            <wp:extent cx="4810938" cy="4567405"/>
-            <wp:effectExtent b="0" l="0" r="0" t="0"/>
-            <wp:docPr descr="Figure 7.1. Runtime layers of PhishDrift and where each runs. No data; drawn by scripts/pbl_figures.py." title="" id="105" name="Picture"/>
-            <a:graphic>
-              <a:graphicData uri="http://schemas.openxmlformats.org/drawingml/2006/picture">
-                <pic:pic>
-                  <pic:nvPicPr>
-                    <pic:cNvPr descr="figures/fig06_layers.png" id="106" name="Picture"/>
-                    <pic:cNvPicPr>
-                      <a:picLocks noChangeArrowheads="1" noChangeAspect="1"/>
-                    </pic:cNvPicPr>
-                  </pic:nvPicPr>
-                  <pic:blipFill>
-                    <a:blip r:embed="rId104"/>
-                    <a:stretch>
-                      <a:fillRect/>
-                    </a:stretch>
-                  </pic:blipFill>
-                  <pic:spPr bwMode="auto">
-                    <a:xfrm>
-                      <a:off x="0" y="0"/>
-                      <a:ext cx="4810938" cy="4567405"/>
-                    </a:xfrm>
-                    <a:prstGeom prst="rect">
-                      <a:avLst/>
-                    </a:prstGeom>
-                    <a:noFill/>
-                    <a:ln w="9525">
-                      <a:noFill/>
-                      <a:headEnd/>
-                      <a:tailEnd/>
-                    </a:ln>
-                  </pic:spPr>
-                </pic:pic>
-              </a:graphicData>
-            </a:graphic>
-          </wp:inline>
-        </w:drawing>
-      </w:r>
-    </w:p>
+    <w:tbl>
+      <w:tblPr>
+        <w:tblStyle w:val="FigureTable"/>
+        <w:tblW w:type="auto" w:w="0"/>
+        <w:tblLook w:firstRow="0" w:lastRow="0" w:firstColumn="0" w:lastColumn="0"/>
+        <w:jc w:val="center"/>
+      </w:tblPr>
+      <w:tblGrid>
+        <w:gridCol w:w="7920"/>
+      </w:tblGrid>
+      <w:tr>
+        <w:tc>
+          <w:tcPr/>
+          <w:p>
+            <w:pPr>
+              <w:pStyle w:val="Compact"/>
+              <w:jc w:val="center"/>
+            </w:pPr>
+            <w:r>
+              <w:t xml:space="preserve">Figure 7.1. Runtime layers of PhishDrift and where each runs. No data; drawn by scripts/pbl_figures.py.</w:t>
+            </w:r>
+          </w:p>
+        </w:tc>
+      </w:tr>
+    </w:tbl>
     <w:p>
       <w:pPr>
         <w:pStyle w:val="ImageCaption"/>
@@ -11913,8 +11627,8 @@
         <w:t xml:space="preserve">), each with plain-English reasons from TreeSHAP and rule hits. The optional language-model second opinion (layer 6 in the specification) was not built; it was first on the cut list.</w:t>
       </w:r>
     </w:p>
-    <w:bookmarkEnd w:id="107"/>
-    <w:bookmarkStart w:id="108" w:name="how-a-verdict-is-decided"/>
+    <w:bookmarkEnd w:id="68"/>
+    <w:bookmarkStart w:id="69" w:name="how-a-verdict-is-decided"/>
     <w:p>
       <w:pPr>
         <w:pStyle w:val="Heading2"/>
@@ -12135,8 +11849,8 @@
         <w:t xml:space="preserve">Pages with no web address of their own (data URLs, sandboxed frames) are not scored and warn only if they ask for credentials.</w:t>
       </w:r>
     </w:p>
-    <w:bookmarkEnd w:id="108"/>
-    <w:bookmarkStart w:id="109" w:name="lists-zones-and-sync"/>
+    <w:bookmarkEnd w:id="69"/>
+    <w:bookmarkStart w:id="70" w:name="lists-zones-and-sync"/>
     <w:p>
       <w:pPr>
         <w:pStyle w:val="Heading2"/>
@@ -12358,8 +12072,8 @@
         <w:t xml:space="preserve">, 2026-10-19; this is a measurement on constructed variants). Signatures are off until a key is generated on the backend machine, and the bundled allowlist held 43,595 domains at the 2026-10-19 rebuild (137 tenant hosts were added later) because the cloud rebuild could not download Tranco; the PC rebuild restores 5,740 more (same entry).</w:t>
       </w:r>
     </w:p>
-    <w:bookmarkEnd w:id="109"/>
-    <w:bookmarkStart w:id="110" w:name="brand-and-look-alike-rules"/>
+    <w:bookmarkEnd w:id="70"/>
+    <w:bookmarkStart w:id="71" w:name="brand-and-look-alike-rules"/>
     <w:p>
       <w:pPr>
         <w:pStyle w:val="Heading2"/>
@@ -12432,8 +12146,8 @@
         <w:t xml:space="preserve">). The rules were tuned after the natural set was seen, so these false-alarm counts are not independent. TLD swaps such as a bank’s name on another suffix are not caught, because brands own many suffixes.</w:t>
       </w:r>
     </w:p>
-    <w:bookmarkEnd w:id="110"/>
-    <w:bookmarkStart w:id="111" w:name="backend-and-privacy"/>
+    <w:bookmarkEnd w:id="71"/>
+    <w:bookmarkStart w:id="72" w:name="backend-and-privacy"/>
     <w:p>
       <w:pPr>
         <w:pStyle w:val="Heading2"/>
@@ -12718,8 +12432,8 @@
         <w:t xml:space="preserve">. This is a small sample, and the severities are set from it.</w:t>
       </w:r>
     </w:p>
-    <w:bookmarkEnd w:id="111"/>
-    <w:bookmarkStart w:id="112" w:name="latency"/>
+    <w:bookmarkEnd w:id="72"/>
+    <w:bookmarkStart w:id="73" w:name="latency"/>
     <w:p>
       <w:pPr>
         <w:pStyle w:val="Heading2"/>
@@ -12928,8 +12642,8 @@
         <w:t xml:space="preserve">Start-up, once per browser session, takes 166 ms to parse the 11.7 MB model bundle and 73 ms to build the model. The extension scores every navigation without reasons and asks for reasons only when a warning is shown. Page-model latency and backend response times are not measured.</w:t>
       </w:r>
     </w:p>
-    <w:bookmarkEnd w:id="112"/>
-    <w:bookmarkStart w:id="113" w:name="url-check-page-and-user-interface"/>
+    <w:bookmarkEnd w:id="73"/>
+    <w:bookmarkStart w:id="74" w:name="url-check-page-and-user-interface"/>
     <w:p>
       <w:pPr>
         <w:pStyle w:val="Heading2"/>
@@ -13023,8 +12737,8 @@
         <w:t xml:space="preserve">(which sends only the domain). The toolbar popup shows the current verdict and its reasons. Screenshots of each state should be taken on the author’s own browser for the final report.</w:t>
       </w:r>
     </w:p>
-    <w:bookmarkEnd w:id="113"/>
-    <w:bookmarkStart w:id="114" w:name="screenshots"/>
+    <w:bookmarkEnd w:id="74"/>
+    <w:bookmarkStart w:id="75" w:name="screenshots"/>
     <w:p>
       <w:pPr>
         <w:pStyle w:val="Heading2"/>
@@ -13209,9 +12923,9 @@
         <w:t xml:space="preserve">Should show: the final verdict screen with the shield, reasons and score meter.</w:t>
       </w:r>
     </w:p>
-    <w:bookmarkEnd w:id="114"/>
-    <w:bookmarkEnd w:id="115"/>
-    <w:bookmarkStart w:id="150" w:name="evaluation-of-the-detector"/>
+    <w:bookmarkEnd w:id="75"/>
+    <w:bookmarkEnd w:id="76"/>
+    <w:bookmarkStart w:id="90" w:name="evaluation-of-the-detector"/>
     <w:p>
       <w:pPr>
         <w:pStyle w:val="Heading1"/>
@@ -13220,7 +12934,7 @@
         <w:t xml:space="preserve">8. Evaluation of the detector</w:t>
       </w:r>
     </w:p>
-    <w:bookmarkStart w:id="116" w:name="protocol"/>
+    <w:bookmarkStart w:id="77" w:name="protocol"/>
     <w:p>
       <w:pPr>
         <w:pStyle w:val="Heading2"/>
@@ -13246,8 +12960,8 @@
         <w:t xml:space="preserve">), so a 0.1% point allows about 61, 23 and 56 false positives respectively, and in per-bucket views fewer than ten (marked with an asterisk where it applies). No held-out-source result above 99% appears anywhere below, so the leakage tripwire did not fire there; the one place above 0.99 on the test side (tier B on HTML rows) was investigated separately (section 8.4).</w:t>
       </w:r>
     </w:p>
-    <w:bookmarkEnd w:id="116"/>
-    <w:bookmarkStart w:id="120" w:name="Xcc216b2b2525ecbb63550bba86da6a173801b8e"/>
+    <w:bookmarkEnd w:id="77"/>
+    <w:bookmarkStart w:id="78" w:name="Xcc216b2b2525ecbb63550bba86da6a173801b8e"/>
     <w:p>
       <w:pPr>
         <w:pStyle w:val="Heading2"/>
@@ -14576,53 +14290,31 @@
         <w:t xml:space="preserve">Table 8.2. Held-out source (59,485 URLs, 33,056 domains; no HTML, so the blend equals hybrid2 there) and newest time slice (80,653 URLs, 58,054 domains) (same sources as Table 8.1). The blend row on the held-out source uses the same address model with its own thresholds.</w:t>
       </w:r>
     </w:p>
-    <w:p>
-      <w:pPr>
-        <w:pStyle w:val="CaptionedFigure"/>
-      </w:pPr>
-      <w:r>
-        <w:drawing>
-          <wp:inline>
-            <wp:extent cx="5922922" cy="3000518"/>
-            <wp:effectExtent b="0" l="0" r="0" t="0"/>
-            <wp:docPr descr="Figure 8.1. Recall at FPR 1% and 0.1% by model and evaluation set (median of 10 splits, whiskers min to max)." title="" id="118" name="Picture"/>
-            <a:graphic>
-              <a:graphicData uri="http://schemas.openxmlformats.org/drawingml/2006/picture">
-                <pic:pic>
-                  <pic:nvPicPr>
-                    <pic:cNvPr descr="figures/fig01_recall_by_model.png" id="119" name="Picture"/>
-                    <pic:cNvPicPr>
-                      <a:picLocks noChangeArrowheads="1" noChangeAspect="1"/>
-                    </pic:cNvPicPr>
-                  </pic:nvPicPr>
-                  <pic:blipFill>
-                    <a:blip r:embed="rId117"/>
-                    <a:stretch>
-                      <a:fillRect/>
-                    </a:stretch>
-                  </pic:blipFill>
-                  <pic:spPr bwMode="auto">
-                    <a:xfrm>
-                      <a:off x="0" y="0"/>
-                      <a:ext cx="5922922" cy="3000518"/>
-                    </a:xfrm>
-                    <a:prstGeom prst="rect">
-                      <a:avLst/>
-                    </a:prstGeom>
-                    <a:noFill/>
-                    <a:ln w="9525">
-                      <a:noFill/>
-                      <a:headEnd/>
-                      <a:tailEnd/>
-                    </a:ln>
-                  </pic:spPr>
-                </pic:pic>
-              </a:graphicData>
-            </a:graphic>
-          </wp:inline>
-        </w:drawing>
-      </w:r>
-    </w:p>
+    <w:tbl>
+      <w:tblPr>
+        <w:tblStyle w:val="FigureTable"/>
+        <w:tblW w:type="auto" w:w="0"/>
+        <w:tblLook w:firstRow="0" w:lastRow="0" w:firstColumn="0" w:lastColumn="0"/>
+        <w:jc w:val="center"/>
+      </w:tblPr>
+      <w:tblGrid>
+        <w:gridCol w:w="7920"/>
+      </w:tblGrid>
+      <w:tr>
+        <w:tc>
+          <w:tcPr/>
+          <w:p>
+            <w:pPr>
+              <w:pStyle w:val="Compact"/>
+              <w:jc w:val="center"/>
+            </w:pPr>
+            <w:r>
+              <w:t xml:space="preserve">Figure 8.1. Recall at FPR 1% and 0.1% by model and evaluation set (median of 10 splits, whiskers min to max).</w:t>
+            </w:r>
+          </w:p>
+        </w:tc>
+      </w:tr>
+    </w:tbl>
     <w:p>
       <w:pPr>
         <w:pStyle w:val="ImageCaption"/>
@@ -14728,8 +14420,8 @@
         <w:t xml:space="preserve">). The address model lost about three points at 1% and nine at 0.1%.</w:t>
       </w:r>
     </w:p>
-    <w:bookmarkEnd w:id="120"/>
-    <w:bookmarkStart w:id="124" w:name="what-the-page-adds"/>
+    <w:bookmarkEnd w:id="78"/>
+    <w:bookmarkStart w:id="79" w:name="what-the-page-adds"/>
     <w:p>
       <w:pPr>
         <w:pStyle w:val="Heading2"/>
@@ -15110,53 +14802,40 @@
         <w:t xml:space="preserve">; thresholds from the calibration rows that also have HTML).</w:t>
       </w:r>
     </w:p>
-    <w:p>
-      <w:pPr>
-        <w:pStyle w:val="CaptionedFigure"/>
-      </w:pPr>
-      <w:r>
-        <w:drawing>
-          <wp:inline>
-            <wp:extent cx="5922922" cy="2614540"/>
-            <wp:effectExtent b="0" l="0" r="0" t="0"/>
-            <wp:docPr descr="Figure 8.2. Address model against the blend, on URLs with and without usable HTML (reports/blend2.md)." title="" id="122" name="Picture"/>
-            <a:graphic>
-              <a:graphicData uri="http://schemas.openxmlformats.org/drawingml/2006/picture">
-                <pic:pic>
-                  <pic:nvPicPr>
-                    <pic:cNvPr descr="figures/fig02_html_gain.png" id="123" name="Picture"/>
-                    <pic:cNvPicPr>
-                      <a:picLocks noChangeArrowheads="1" noChangeAspect="1"/>
-                    </pic:cNvPicPr>
-                  </pic:nvPicPr>
-                  <pic:blipFill>
-                    <a:blip r:embed="rId121"/>
-                    <a:stretch>
-                      <a:fillRect/>
-                    </a:stretch>
-                  </pic:blipFill>
-                  <pic:spPr bwMode="auto">
-                    <a:xfrm>
-                      <a:off x="0" y="0"/>
-                      <a:ext cx="5922922" cy="2614540"/>
-                    </a:xfrm>
-                    <a:prstGeom prst="rect">
-                      <a:avLst/>
-                    </a:prstGeom>
-                    <a:noFill/>
-                    <a:ln w="9525">
-                      <a:noFill/>
-                      <a:headEnd/>
-                      <a:tailEnd/>
-                    </a:ln>
-                  </pic:spPr>
-                </pic:pic>
-              </a:graphicData>
-            </a:graphic>
-          </wp:inline>
-        </w:drawing>
-      </w:r>
-    </w:p>
+    <w:tbl>
+      <w:tblPr>
+        <w:tblStyle w:val="FigureTable"/>
+        <w:tblW w:type="auto" w:w="0"/>
+        <w:tblLook w:firstRow="0" w:lastRow="0" w:firstColumn="0" w:lastColumn="0"/>
+        <w:jc w:val="center"/>
+      </w:tblPr>
+      <w:tblGrid>
+        <w:gridCol w:w="7920"/>
+      </w:tblGrid>
+      <w:tr>
+        <w:tc>
+          <w:tcPr/>
+          <w:p>
+            <w:pPr>
+              <w:pStyle w:val="Compact"/>
+              <w:jc w:val="center"/>
+            </w:pPr>
+            <w:r>
+              <w:t xml:space="preserve">Figure 8.2. Address model against the blend, on URLs with and without usable HTML (</w:t>
+            </w:r>
+            <w:r>
+              <w:rPr>
+                <w:rStyle w:val="VerbatimChar"/>
+              </w:rPr>
+              <w:t xml:space="preserve">reports/blend2.md</w:t>
+            </w:r>
+            <w:r>
+              <w:t xml:space="preserve">).</w:t>
+            </w:r>
+          </w:p>
+        </w:tc>
+      </w:tr>
+    </w:tbl>
     <w:p>
       <w:pPr>
         <w:pStyle w:val="ImageCaption"/>
@@ -15206,8 +14885,8 @@
         <w:t xml:space="preserve">).</w:t>
       </w:r>
     </w:p>
-    <w:bookmarkEnd w:id="124"/>
-    <w:bookmarkStart w:id="125" w:name="checks-on-the-page-model"/>
+    <w:bookmarkEnd w:id="79"/>
+    <w:bookmarkStart w:id="80" w:name="checks-on-the-page-model"/>
     <w:p>
       <w:pPr>
         <w:pStyle w:val="Heading2"/>
@@ -15274,8 +14953,8 @@
         <w:t xml:space="preserve">), so the HTML subset is not a random sample. Re-weighting each HTML row by the inverse of its estimated probability of having usable HTML (clipped at 20; effective sample sizes 4,788 phishing and 17,855 legitimate rows) lowers the blend’s warned recall on HTML rows from 93.0 to 91.9 and its dangerous recall from 85.7 to 82.5. On the time slice the corrected and uncorrected figures differ by less than one point (80.4 to 80.7 warned). The correction assumes HTML loss depends only on the URL features and source; if phishing pages whose HTML survives are easier than those whose HTML does not, even the corrected figure is optimistic.</w:t>
       </w:r>
     </w:p>
-    <w:bookmarkEnd w:id="125"/>
-    <w:bookmarkStart w:id="126" w:name="the-shipped-verdict-rules"/>
+    <w:bookmarkEnd w:id="80"/>
+    <w:bookmarkStart w:id="81" w:name="the-shipped-verdict-rules"/>
     <w:p>
       <w:pPr>
         <w:pStyle w:val="Heading2"/>
@@ -16249,8 +15928,8 @@
         <w:t xml:space="preserve">).</w:t>
       </w:r>
     </w:p>
-    <w:bookmarkEnd w:id="126"/>
-    <w:bookmarkStart w:id="130" w:name="Xe426f1dec27245d1838fe304132d4e0595d666a"/>
+    <w:bookmarkEnd w:id="81"/>
+    <w:bookmarkStart w:id="82" w:name="Xe426f1dec27245d1838fe304132d4e0595d666a"/>
     <w:p>
       <w:pPr>
         <w:pStyle w:val="Heading2"/>
@@ -16849,53 +16528,31 @@
         <w:t xml:space="preserve">). Phishpedia and Phish-Blitz have only phishing rows and give no FPR.</w:t>
       </w:r>
     </w:p>
-    <w:p>
-      <w:pPr>
-        <w:pStyle w:val="CaptionedFigure"/>
-      </w:pPr>
-      <w:r>
-        <w:drawing>
-          <wp:inline>
-            <wp:extent cx="5844808" cy="2522641"/>
-            <wp:effectExtent b="0" l="0" r="0" t="0"/>
-            <wp:docPr descr="Figure 8.3. False-positive rate on the left-out source at the threshold chosen for 1% on the other sources." title="" id="128" name="Picture"/>
-            <a:graphic>
-              <a:graphicData uri="http://schemas.openxmlformats.org/drawingml/2006/picture">
-                <pic:pic>
-                  <pic:nvPicPr>
-                    <pic:cNvPr descr="figures/fig03_loso_threshold_transfer.png" id="129" name="Picture"/>
-                    <pic:cNvPicPr>
-                      <a:picLocks noChangeArrowheads="1" noChangeAspect="1"/>
-                    </pic:cNvPicPr>
-                  </pic:nvPicPr>
-                  <pic:blipFill>
-                    <a:blip r:embed="rId127"/>
-                    <a:stretch>
-                      <a:fillRect/>
-                    </a:stretch>
-                  </pic:blipFill>
-                  <pic:spPr bwMode="auto">
-                    <a:xfrm>
-                      <a:off x="0" y="0"/>
-                      <a:ext cx="5844808" cy="2522641"/>
-                    </a:xfrm>
-                    <a:prstGeom prst="rect">
-                      <a:avLst/>
-                    </a:prstGeom>
-                    <a:noFill/>
-                    <a:ln w="9525">
-                      <a:noFill/>
-                      <a:headEnd/>
-                      <a:tailEnd/>
-                    </a:ln>
-                  </pic:spPr>
-                </pic:pic>
-              </a:graphicData>
-            </a:graphic>
-          </wp:inline>
-        </w:drawing>
-      </w:r>
-    </w:p>
+    <w:tbl>
+      <w:tblPr>
+        <w:tblStyle w:val="FigureTable"/>
+        <w:tblW w:type="auto" w:w="0"/>
+        <w:tblLook w:firstRow="0" w:lastRow="0" w:firstColumn="0" w:lastColumn="0"/>
+        <w:jc w:val="center"/>
+      </w:tblPr>
+      <w:tblGrid>
+        <w:gridCol w:w="7920"/>
+      </w:tblGrid>
+      <w:tr>
+        <w:tc>
+          <w:tcPr/>
+          <w:p>
+            <w:pPr>
+              <w:pStyle w:val="Compact"/>
+              <w:jc w:val="center"/>
+            </w:pPr>
+            <w:r>
+              <w:t xml:space="preserve">Figure 8.3. False-positive rate on the left-out source at the threshold chosen for 1% on the other sources.</w:t>
+            </w:r>
+          </w:p>
+        </w:tc>
+      </w:tr>
+    </w:tbl>
     <w:p>
       <w:pPr>
         <w:pStyle w:val="ImageCaption"/>
@@ -16927,8 +16584,8 @@
         <w:t xml:space="preserve">baseline (43.4% recall at 1% FPR) beat both trained models (29.5% and 8.2%). The models partly learn source style, and thresholds tuned on some sources do not transfer to another. The live-feed row rests on 245 URLs and is shown for completeness only.</w:t>
       </w:r>
     </w:p>
-    <w:bookmarkEnd w:id="130"/>
-    <w:bookmarkStart w:id="137" w:name="depth-and-representation-checks"/>
+    <w:bookmarkEnd w:id="82"/>
+    <w:bookmarkStart w:id="83" w:name="depth-and-representation-checks"/>
     <w:p>
       <w:pPr>
         <w:pStyle w:val="Heading2"/>
@@ -17344,53 +17001,31 @@
         <w:t xml:space="preserve">). The blend rows come from an earlier blend run (raw ROC-AUC 0.9618, recall 73.7 / 58.6) than Table 8.1.</w:t>
       </w:r>
     </w:p>
-    <w:p>
-      <w:pPr>
-        <w:pStyle w:val="CaptionedFigure"/>
-      </w:pPr>
-      <w:r>
-        <w:drawing>
-          <wp:inline>
-            <wp:extent cx="5922922" cy="2637515"/>
-            <wp:effectExtent b="0" l="0" r="0" t="0"/>
-            <wp:docPr descr="Figure 8.4. Raw against normalised URLs: recall at FPR 1% and 0.1%." title="" id="132" name="Picture"/>
-            <a:graphic>
-              <a:graphicData uri="http://schemas.openxmlformats.org/drawingml/2006/picture">
-                <pic:pic>
-                  <pic:nvPicPr>
-                    <pic:cNvPr descr="figures/fig07_representation.png" id="133" name="Picture"/>
-                    <pic:cNvPicPr>
-                      <a:picLocks noChangeArrowheads="1" noChangeAspect="1"/>
-                    </pic:cNvPicPr>
-                  </pic:nvPicPr>
-                  <pic:blipFill>
-                    <a:blip r:embed="rId131"/>
-                    <a:stretch>
-                      <a:fillRect/>
-                    </a:stretch>
-                  </pic:blipFill>
-                  <pic:spPr bwMode="auto">
-                    <a:xfrm>
-                      <a:off x="0" y="0"/>
-                      <a:ext cx="5922922" cy="2637515"/>
-                    </a:xfrm>
-                    <a:prstGeom prst="rect">
-                      <a:avLst/>
-                    </a:prstGeom>
-                    <a:noFill/>
-                    <a:ln w="9525">
-                      <a:noFill/>
-                      <a:headEnd/>
-                      <a:tailEnd/>
-                    </a:ln>
-                  </pic:spPr>
-                </pic:pic>
-              </a:graphicData>
-            </a:graphic>
-          </wp:inline>
-        </w:drawing>
-      </w:r>
-    </w:p>
+    <w:tbl>
+      <w:tblPr>
+        <w:tblStyle w:val="FigureTable"/>
+        <w:tblW w:type="auto" w:w="0"/>
+        <w:tblLook w:firstRow="0" w:lastRow="0" w:firstColumn="0" w:lastColumn="0"/>
+        <w:jc w:val="center"/>
+      </w:tblPr>
+      <w:tblGrid>
+        <w:gridCol w:w="7920"/>
+      </w:tblGrid>
+      <w:tr>
+        <w:tc>
+          <w:tcPr/>
+          <w:p>
+            <w:pPr>
+              <w:pStyle w:val="Compact"/>
+              <w:jc w:val="center"/>
+            </w:pPr>
+            <w:r>
+              <w:t xml:space="preserve">Figure 8.4. Raw against normalised URLs: recall at FPR 1% and 0.1%.</w:t>
+            </w:r>
+          </w:p>
+        </w:tc>
+      </w:tr>
+    </w:tbl>
     <w:p>
       <w:pPr>
         <w:pStyle w:val="ImageCaption"/>
@@ -17416,53 +17051,31 @@
         <w:t xml:space="preserve">).</w:t>
       </w:r>
     </w:p>
-    <w:p>
-      <w:pPr>
-        <w:pStyle w:val="CaptionedFigure"/>
-      </w:pPr>
-      <w:r>
-        <w:drawing>
-          <wp:inline>
-            <wp:extent cx="5922922" cy="2522641"/>
-            <wp:effectExtent b="0" l="0" r="0" t="0"/>
-            <wp:docPr descr="Figure 8.5. Shipped address model (hybrid2), ROC-AUC by URL depth bucket on three sets." title="" id="135" name="Picture"/>
-            <a:graphic>
-              <a:graphicData uri="http://schemas.openxmlformats.org/drawingml/2006/picture">
-                <pic:pic>
-                  <pic:nvPicPr>
-                    <pic:cNvPr descr="figures/fig08_depth_buckets.png" id="136" name="Picture"/>
-                    <pic:cNvPicPr>
-                      <a:picLocks noChangeArrowheads="1" noChangeAspect="1"/>
-                    </pic:cNvPicPr>
-                  </pic:nvPicPr>
-                  <pic:blipFill>
-                    <a:blip r:embed="rId134"/>
-                    <a:stretch>
-                      <a:fillRect/>
-                    </a:stretch>
-                  </pic:blipFill>
-                  <pic:spPr bwMode="auto">
-                    <a:xfrm>
-                      <a:off x="0" y="0"/>
-                      <a:ext cx="5922922" cy="2522641"/>
-                    </a:xfrm>
-                    <a:prstGeom prst="rect">
-                      <a:avLst/>
-                    </a:prstGeom>
-                    <a:noFill/>
-                    <a:ln w="9525">
-                      <a:noFill/>
-                      <a:headEnd/>
-                      <a:tailEnd/>
-                    </a:ln>
-                  </pic:spPr>
-                </pic:pic>
-              </a:graphicData>
-            </a:graphic>
-          </wp:inline>
-        </w:drawing>
-      </w:r>
-    </w:p>
+    <w:tbl>
+      <w:tblPr>
+        <w:tblStyle w:val="FigureTable"/>
+        <w:tblW w:type="auto" w:w="0"/>
+        <w:tblLook w:firstRow="0" w:lastRow="0" w:firstColumn="0" w:lastColumn="0"/>
+        <w:jc w:val="center"/>
+      </w:tblPr>
+      <w:tblGrid>
+        <w:gridCol w:w="7920"/>
+      </w:tblGrid>
+      <w:tr>
+        <w:tc>
+          <w:tcPr/>
+          <w:p>
+            <w:pPr>
+              <w:pStyle w:val="Compact"/>
+              <w:jc w:val="center"/>
+            </w:pPr>
+            <w:r>
+              <w:t xml:space="preserve">Figure 8.5. Shipped address model (hybrid2), ROC-AUC by URL depth bucket on three sets.</w:t>
+            </w:r>
+          </w:p>
+        </w:tc>
+      </w:tr>
+    </w:tbl>
     <w:p>
       <w:pPr>
         <w:pStyle w:val="ImageCaption"/>
@@ -17491,8 +17104,8 @@
         <w:t xml:space="preserve">) shows that the result does not rest on depth alone. Depth 0 (bare domains) is the weakest bucket on every set: 0.9209 on test, 0.9270 on the time slice and 0.7985 on PhishStorm, where it holds only 91 legitimate URLs and the cal 1% threshold flags 30.2% of them. On PhishStorm depths 1 to 3 give 0.954 to 0.960, about the overall 0.9587, so the held-out result is not an artefact of PhishStorm’s depth imbalance.</w:t>
       </w:r>
     </w:p>
-    <w:bookmarkEnd w:id="137"/>
-    <w:bookmarkStart w:id="142" w:name="Xcd7faad2695b1e803ca25dd0fcfbd11dee0a145"/>
+    <w:bookmarkEnd w:id="83"/>
+    <w:bookmarkStart w:id="85" w:name="Xcd7faad2695b1e803ca25dd0fcfbd11dee0a145"/>
     <w:p>
       <w:pPr>
         <w:pStyle w:val="Heading2"/>
@@ -18005,53 +17618,76 @@
         <w:t xml:space="preserve">; 562 sites, 512 with HTML).</w:t>
       </w:r>
     </w:p>
-    <w:p>
-      <w:pPr>
-        <w:pStyle w:val="CaptionedFigure"/>
-      </w:pPr>
-      <w:r>
-        <w:drawing>
-          <wp:inline>
-            <wp:extent cx="6024012" cy="2798339"/>
-            <wp:effectExtent b="0" l="0" r="0" t="0"/>
-            <wp:docPr descr="Figure 8.6. Natural-page false alarms by model and by layer set (reports/ood_fpr.md, reports/blend2_rules.md, reports/shipped_verdicts.md, reports/page_fixes_fpr.md)." title="" id="139" name="Picture"/>
-            <a:graphic>
-              <a:graphicData uri="http://schemas.openxmlformats.org/drawingml/2006/picture">
-                <pic:pic>
-                  <pic:nvPicPr>
-                    <pic:cNvPr descr="figures/fig04_false_alarms_natural_pages.png" id="140" name="Picture"/>
-                    <pic:cNvPicPr>
-                      <a:picLocks noChangeArrowheads="1" noChangeAspect="1"/>
-                    </pic:cNvPicPr>
-                  </pic:nvPicPr>
-                  <pic:blipFill>
-                    <a:blip r:embed="rId138"/>
-                    <a:stretch>
-                      <a:fillRect/>
-                    </a:stretch>
-                  </pic:blipFill>
-                  <pic:spPr bwMode="auto">
-                    <a:xfrm>
-                      <a:off x="0" y="0"/>
-                      <a:ext cx="6024012" cy="2798339"/>
-                    </a:xfrm>
-                    <a:prstGeom prst="rect">
-                      <a:avLst/>
-                    </a:prstGeom>
-                    <a:noFill/>
-                    <a:ln w="9525">
-                      <a:noFill/>
-                      <a:headEnd/>
-                      <a:tailEnd/>
-                    </a:ln>
-                  </pic:spPr>
-                </pic:pic>
-              </a:graphicData>
-            </a:graphic>
-          </wp:inline>
-        </w:drawing>
-      </w:r>
-    </w:p>
+    <w:tbl>
+      <w:tblPr>
+        <w:tblStyle w:val="FigureTable"/>
+        <w:tblW w:type="auto" w:w="0"/>
+        <w:tblLook w:firstRow="0" w:lastRow="0" w:firstColumn="0" w:lastColumn="0"/>
+        <w:jc w:val="center"/>
+      </w:tblPr>
+      <w:tblGrid>
+        <w:gridCol w:w="7920"/>
+      </w:tblGrid>
+      <w:tr>
+        <w:tc>
+          <w:tcPr/>
+          <w:p>
+            <w:pPr>
+              <w:pStyle w:val="Compact"/>
+              <w:jc w:val="center"/>
+            </w:pPr>
+            <w:r>
+              <w:t xml:space="preserve">Figure 8.6. Natural-page false alarms by model and by layer set (</w:t>
+            </w:r>
+            <w:r>
+              <w:rPr>
+                <w:rStyle w:val="VerbatimChar"/>
+              </w:rPr>
+              <w:t xml:space="preserve">reports/ood_fpr.md</w:t>
+            </w:r>
+            <w:r>
+              <w:t xml:space="preserve">,</w:t>
+            </w:r>
+            <w:r>
+              <w:t xml:space="preserve"> </w:t>
+            </w:r>
+            <w:r>
+              <w:rPr>
+                <w:rStyle w:val="VerbatimChar"/>
+              </w:rPr>
+              <w:t xml:space="preserve">reports/blend2_rules.md</w:t>
+            </w:r>
+            <w:r>
+              <w:t xml:space="preserve">,</w:t>
+            </w:r>
+            <w:r>
+              <w:t xml:space="preserve"> </w:t>
+            </w:r>
+            <w:r>
+              <w:rPr>
+                <w:rStyle w:val="VerbatimChar"/>
+              </w:rPr>
+              <w:t xml:space="preserve">reports/shipped_verdicts.md</w:t>
+            </w:r>
+            <w:r>
+              <w:t xml:space="preserve">,</w:t>
+            </w:r>
+            <w:r>
+              <w:t xml:space="preserve"> </w:t>
+            </w:r>
+            <w:r>
+              <w:rPr>
+                <w:rStyle w:val="VerbatimChar"/>
+              </w:rPr>
+              <w:t xml:space="preserve">reports/page_fixes_fpr.md</w:t>
+            </w:r>
+            <w:r>
+              <w:t xml:space="preserve">).</w:t>
+            </w:r>
+          </w:p>
+        </w:tc>
+      </w:tr>
+    </w:tbl>
     <w:p>
       <w:pPr>
         <w:pStyle w:val="ImageCaption"/>
@@ -18166,7 +17802,7 @@
         <w:t xml:space="preserve">). All of these are measured on stored HTML, not on a live page, and the natural set is Tranco-seeded.</w:t>
       </w:r>
     </w:p>
-    <w:bookmarkStart w:id="141" w:name="X52a89796c9262ce33fe1ffd1a665247df49ea0d"/>
+    <w:bookmarkStart w:id="84" w:name="X52a89796c9262ce33fe1ffd1a665247df49ea0d"/>
     <w:p>
       <w:pPr>
         <w:pStyle w:val="Heading3"/>
@@ -18577,9 +18213,9 @@
         <w:t xml:space="preserve">figures are medians over ten, so the two are not strictly comparable. The crawl hosts and the natural pages both come from popular-site lists, so some of the drop may reflect that similarity. The brand-list change went in together with the new data, so the two effects are not separated. The false-alarm rate on PhishStorm at the cal-side 1% threshold stays at 3.2%. The ten-split tables elsewhere in this chapter were produced before the retrain and have not been refreshed.</w:t>
       </w:r>
     </w:p>
-    <w:bookmarkEnd w:id="141"/>
-    <w:bookmarkEnd w:id="142"/>
-    <w:bookmarkStart w:id="143" w:name="negative-controls-1"/>
+    <w:bookmarkEnd w:id="84"/>
+    <w:bookmarkEnd w:id="85"/>
+    <w:bookmarkStart w:id="86" w:name="negative-controls-1"/>
     <w:p>
       <w:pPr>
         <w:pStyle w:val="Heading2"/>
@@ -19217,8 +18853,8 @@
         <w:t xml:space="preserve">, 2026-10-12). Tier C is the control with the widest range because its test side has only 24 phishing hosts.</w:t>
       </w:r>
     </w:p>
-    <w:bookmarkEnd w:id="143"/>
-    <w:bookmarkStart w:id="147" w:name="robustness-to-url-evasion"/>
+    <w:bookmarkEnd w:id="86"/>
+    <w:bookmarkStart w:id="87" w:name="robustness-to-url-evasion"/>
     <w:p>
       <w:pPr>
         <w:pStyle w:val="Heading2"/>
@@ -19309,53 +18945,31 @@
         <w:t xml:space="preserve">has 68.6 / 50.2, so adversarial training costs about one point.</w:t>
       </w:r>
     </w:p>
-    <w:p>
-      <w:pPr>
-        <w:pStyle w:val="CaptionedFigure"/>
-      </w:pPr>
-      <w:r>
-        <w:drawing>
-          <wp:inline>
-            <wp:extent cx="5922922" cy="2821314"/>
-            <wp:effectExtent b="0" l="0" r="0" t="0"/>
-            <wp:docPr descr="Figure 8.7. Evasion rate and false alarms before and after adversarial training, per family, at the suspicious threshold." title="" id="145" name="Picture"/>
-            <a:graphic>
-              <a:graphicData uri="http://schemas.openxmlformats.org/drawingml/2006/picture">
-                <pic:pic>
-                  <pic:nvPicPr>
-                    <pic:cNvPr descr="figures/fig05_evasion_adversarial.png" id="146" name="Picture"/>
-                    <pic:cNvPicPr>
-                      <a:picLocks noChangeArrowheads="1" noChangeAspect="1"/>
-                    </pic:cNvPicPr>
-                  </pic:nvPicPr>
-                  <pic:blipFill>
-                    <a:blip r:embed="rId144"/>
-                    <a:stretch>
-                      <a:fillRect/>
-                    </a:stretch>
-                  </pic:blipFill>
-                  <pic:spPr bwMode="auto">
-                    <a:xfrm>
-                      <a:off x="0" y="0"/>
-                      <a:ext cx="5922922" cy="2821314"/>
-                    </a:xfrm>
-                    <a:prstGeom prst="rect">
-                      <a:avLst/>
-                    </a:prstGeom>
-                    <a:noFill/>
-                    <a:ln w="9525">
-                      <a:noFill/>
-                      <a:headEnd/>
-                      <a:tailEnd/>
-                    </a:ln>
-                  </pic:spPr>
-                </pic:pic>
-              </a:graphicData>
-            </a:graphic>
-          </wp:inline>
-        </w:drawing>
-      </w:r>
-    </w:p>
+    <w:tbl>
+      <w:tblPr>
+        <w:tblStyle w:val="FigureTable"/>
+        <w:tblW w:type="auto" w:w="0"/>
+        <w:tblLook w:firstRow="0" w:lastRow="0" w:firstColumn="0" w:lastColumn="0"/>
+        <w:jc w:val="center"/>
+      </w:tblPr>
+      <w:tblGrid>
+        <w:gridCol w:w="7920"/>
+      </w:tblGrid>
+      <w:tr>
+        <w:tc>
+          <w:tcPr/>
+          <w:p>
+            <w:pPr>
+              <w:pStyle w:val="Compact"/>
+              <w:jc w:val="center"/>
+            </w:pPr>
+            <w:r>
+              <w:t xml:space="preserve">Figure 8.7. Evasion rate and false alarms before and after adversarial training, per family, at the suspicious threshold.</w:t>
+            </w:r>
+          </w:p>
+        </w:tc>
+      </w:tr>
+    </w:tbl>
     <w:p>
       <w:pPr>
         <w:pStyle w:val="ImageCaption"/>
@@ -19372,8 +18986,8 @@
         <w:t xml:space="preserve">The result is the opposite of the usual evasion story. The shipped model is hard to evade with these rewrites (2.4% evasion for stacked subdomains, 1.3% for padding, 2.9% for shortener wrapping, against 30.5% for unmodified phishing), but only because it treats the rewrite as suspicious: it also flags 63.5%, 72.5% and 97.2% of legitimate URLs rewritten the same way. Long legitimate URLs that were not rewritten are not a problem (0.7% flagged). Training on variants of both classes removes the false alarms for the families it saw (1.1% to 2.1%; 0.0% for shortener) and returns evasion to the clean rate (32% to 41%; shortener 100%, because a short link carries nothing for a URL model). A family the model never saw behaves like the base model on both sides, and each held-out column rests on one split. The apparent robustness of the base model is therefore over-suspicion rather than understanding, and the extension needs its other layers for real traffic: shorteners are expanded and scored at the target, and the allowlist and blocklists carry sites that a URL model would flag. The rewrites are synthetic (random lure words, brands from the project’s own list), so real attacker URLs may differ. Robustness of tier B was not measured.</w:t>
       </w:r>
     </w:p>
-    <w:bookmarkEnd w:id="147"/>
-    <w:bookmarkStart w:id="148" w:name="tier-c"/>
+    <w:bookmarkEnd w:id="87"/>
+    <w:bookmarkStart w:id="88" w:name="tier-c"/>
     <w:p>
       <w:pPr>
         <w:pStyle w:val="Heading2"/>
@@ -19995,8 +19609,8 @@
         <w:t xml:space="preserve">pairs, so collection method may leak into host-form features. The time check was skipped because the eligible rows span two capture days. Tier C is not wired into the backend: the backend’s run-time checks are the hand-set rules in section 7.5.</w:t>
       </w:r>
     </w:p>
-    <w:bookmarkEnd w:id="148"/>
-    <w:bookmarkStart w:id="149" w:name="real-world-and-stress-tests"/>
+    <w:bookmarkEnd w:id="88"/>
+    <w:bookmarkStart w:id="89" w:name="real-world-and-stress-tests"/>
     <w:p>
       <w:pPr>
         <w:pStyle w:val="Heading2"/>
@@ -20173,9 +19787,9 @@
         <w:t xml:space="preserve">Blocklist coverage on the corpus is not measurable, because the test URLs come from datasets collected in other periods than the live feeds. It can only be measured forward, as the share of newly listed feed URLs whose domain was already on an earlier list, once the collector has run for several days. This is not measured.</w:t>
       </w:r>
     </w:p>
-    <w:bookmarkEnd w:id="149"/>
-    <w:bookmarkEnd w:id="150"/>
-    <w:bookmarkStart w:id="151" w:name="limitations-and-what-is-not-done"/>
+    <w:bookmarkEnd w:id="89"/>
+    <w:bookmarkEnd w:id="90"/>
+    <w:bookmarkStart w:id="91" w:name="limitations-and-what-is-not-done"/>
     <w:p>
       <w:pPr>
         <w:pStyle w:val="Heading1"/>
@@ -20645,8 +20259,8 @@
         <w:t xml:space="preserve">, 2026-10-20).</w:t>
       </w:r>
     </w:p>
-    <w:bookmarkEnd w:id="151"/>
-    <w:bookmarkStart w:id="155" w:name="conclusion-and-future-work"/>
+    <w:bookmarkEnd w:id="91"/>
+    <w:bookmarkStart w:id="95" w:name="conclusion-and-future-work"/>
     <w:p>
       <w:pPr>
         <w:pStyle w:val="Heading1"/>
@@ -20655,7 +20269,7 @@
         <w:t xml:space="preserve">10. Conclusion and future work</w:t>
       </w:r>
     </w:p>
-    <w:bookmarkStart w:id="152" w:name="what-was-achieved"/>
+    <w:bookmarkStart w:id="92" w:name="what-was-achieved"/>
     <w:p>
       <w:pPr>
         <w:pStyle w:val="Heading2"/>
@@ -20742,8 +20356,8 @@
         <w:t xml:space="preserve">; seeds are fixed; the study’s plan and consistency rule were frozen before the run.</w:t>
       </w:r>
     </w:p>
-    <w:bookmarkEnd w:id="152"/>
-    <w:bookmarkStart w:id="153" w:name="limitations"/>
+    <w:bookmarkEnd w:id="92"/>
+    <w:bookmarkStart w:id="93" w:name="limitations"/>
     <w:p>
       <w:pPr>
         <w:pStyle w:val="Heading2"/>
@@ -20760,8 +20374,8 @@
         <w:t xml:space="preserve">See Sections 4.12 and Chapter 9. In short: public benchmarks only, two of them old or homepage-heavy; the HTML part rests on two sources with uneven coverage; one shuffled-label control is flagged; platform masking showed no effect in a test that rests on one legitimate source; tier C of the detector rests on a small live capture; and the extension has been checked in test harnesses and on stored pages, not in a long field trial.</w:t>
       </w:r>
     </w:p>
-    <w:bookmarkEnd w:id="153"/>
-    <w:bookmarkStart w:id="154" w:name="future-work"/>
+    <w:bookmarkEnd w:id="93"/>
+    <w:bookmarkStart w:id="94" w:name="future-work"/>
     <w:p>
       <w:pPr>
         <w:pStyle w:val="Heading2"/>
@@ -20830,9 +20444,9 @@
         <w:t xml:space="preserve">Optional second-opinion layer for the grey zone (planned, not built).</w:t>
       </w:r>
     </w:p>
-    <w:bookmarkEnd w:id="154"/>
-    <w:bookmarkEnd w:id="155"/>
-    <w:bookmarkStart w:id="156" w:name="references"/>
+    <w:bookmarkEnd w:id="94"/>
+    <w:bookmarkEnd w:id="95"/>
+    <w:bookmarkStart w:id="96" w:name="references"/>
     <w:p>
       <w:pPr>
         <w:pStyle w:val="Heading1"/>
@@ -21101,7 +20715,7 @@
         <w:t xml:space="preserve">Citation details should be checked against the originals before submission.</w:t>
       </w:r>
     </w:p>
-    <w:bookmarkEnd w:id="156"/>
+    <w:bookmarkEnd w:id="96"/>
     <w:sectPr>
       <w:pgSz w:h="16838" w:w="11906"/>
       <w:pgMar w:bottom="1134" w:left="1020" w:right="1020" w:top="1134"/>

</xml_diff>

<commit_message>
PBL report: rebuild docx with figures
Co-Authored-By: Claude Sonnet 5.5 <noreply@anthropic.com>
Claude-Session: https://claude.ai/code/session_01CcRevgLHUMr7Kjzc4fTXg4
</commit_message>
<xml_diff>
--- a/reports/pbl/pbl_report.docx
+++ b/reports/pbl/pbl_report.docx
@@ -1041,7 +1041,7 @@
     </w:p>
     <w:bookmarkEnd w:id="32"/>
     <w:bookmarkEnd w:id="33"/>
-    <w:bookmarkStart w:id="38" w:name="part-i-design-and-method"/>
+    <w:bookmarkStart w:id="41" w:name="part-i-design-and-method"/>
     <w:p>
       <w:pPr>
         <w:pStyle w:val="Heading1"/>
@@ -1934,7 +1934,7 @@
       </w:r>
     </w:p>
     <w:bookmarkEnd w:id="35"/>
-    <w:bookmarkStart w:id="36" w:name="models-and-splits"/>
+    <w:bookmarkStart w:id="39" w:name="models-and-splits"/>
     <w:p>
       <w:pPr>
         <w:pStyle w:val="Heading2"/>
@@ -1951,31 +1951,53 @@
         <w:t xml:space="preserve">LightGBM, XGBoost, logistic regression on the 99 URL features, and character n-gram TF-IDF with logistic regression. Ten splits per cell are grouped by registrable domain (train 70%, calibration 10%, test 20%; a deterministic hash of seed, split and domain). Fitted features (TLD risk, bigram likelihood) are refitted on each split’s training side. Uncertainty comes from a domain-cluster bootstrap with 200 draws per split. Transfer is tested only on cells sharing no source with the training cell.</w:t>
       </w:r>
     </w:p>
-    <w:tbl>
-      <w:tblPr>
-        <w:tblStyle w:val="FigureTable"/>
-        <w:tblW w:type="auto" w:w="0"/>
-        <w:tblLook w:firstRow="0" w:lastRow="0" w:firstColumn="0" w:lastColumn="0"/>
-        <w:jc w:val="center"/>
-      </w:tblPr>
-      <w:tblGrid>
-        <w:gridCol w:w="7920"/>
-      </w:tblGrid>
-      <w:tr>
-        <w:tc>
-          <w:tcPr/>
-          <w:p>
-            <w:pPr>
-              <w:pStyle w:val="Compact"/>
-              <w:jc w:val="center"/>
-            </w:pPr>
-            <w:r>
-              <w:t xml:space="preserve">Figure 4.1. Study design. Seven questions are tested across 25 source cells, four models, four URL forms and ten splits.</w:t>
-            </w:r>
-          </w:p>
-        </w:tc>
-      </w:tr>
-    </w:tbl>
+    <w:p>
+      <w:pPr>
+        <w:pStyle w:val="CaptionedFigure"/>
+      </w:pPr>
+      <w:r>
+        <w:drawing>
+          <wp:inline>
+            <wp:extent cx="6261100" cy="2787097"/>
+            <wp:effectExtent b="0" l="0" r="0" t="0"/>
+            <wp:docPr descr="Figure 4.1. Study design. Seven questions are tested across 25 source cells, four models, four URL forms and ten splits." title="" id="37" name="Picture"/>
+            <a:graphic>
+              <a:graphicData uri="http://schemas.openxmlformats.org/drawingml/2006/picture">
+                <pic:pic>
+                  <pic:nvPicPr>
+                    <pic:cNvPr descr="fig01_design.png" id="38" name="Picture"/>
+                    <pic:cNvPicPr>
+                      <a:picLocks noChangeArrowheads="1" noChangeAspect="1"/>
+                    </pic:cNvPicPr>
+                  </pic:nvPicPr>
+                  <pic:blipFill>
+                    <a:blip r:embed="rId36"/>
+                    <a:stretch>
+                      <a:fillRect/>
+                    </a:stretch>
+                  </pic:blipFill>
+                  <pic:spPr bwMode="auto">
+                    <a:xfrm>
+                      <a:off x="0" y="0"/>
+                      <a:ext cx="6261100" cy="2787097"/>
+                    </a:xfrm>
+                    <a:prstGeom prst="rect">
+                      <a:avLst/>
+                    </a:prstGeom>
+                    <a:noFill/>
+                    <a:ln w="9525">
+                      <a:noFill/>
+                      <a:headEnd/>
+                      <a:tailEnd/>
+                    </a:ln>
+                  </pic:spPr>
+                </pic:pic>
+              </a:graphicData>
+            </a:graphic>
+          </wp:inline>
+        </w:drawing>
+      </w:r>
+    </w:p>
     <w:p>
       <w:pPr>
         <w:pStyle w:val="ImageCaption"/>
@@ -1984,8 +2006,8 @@
         <w:t xml:space="preserve">Figure 4.1. Study design. Seven questions are tested across 25 source cells, four models, four URL forms and ten splits.</w:t>
       </w:r>
     </w:p>
-    <w:bookmarkEnd w:id="36"/>
-    <w:bookmarkStart w:id="37" w:name="the-rule-for-calling-a-result-consistent"/>
+    <w:bookmarkEnd w:id="39"/>
+    <w:bookmarkStart w:id="40" w:name="the-rule-for-calling-a-result-consistent"/>
     <w:p>
       <w:pPr>
         <w:pStyle w:val="Heading2"/>
@@ -2127,9 +2149,9 @@
         <w:t xml:space="preserve">describes this design’s data; it is not a claim that the effect is absent elsewhere.</w:t>
       </w:r>
     </w:p>
-    <w:bookmarkEnd w:id="37"/>
-    <w:bookmarkEnd w:id="38"/>
-    <w:bookmarkStart w:id="54" w:name="part-i-results"/>
+    <w:bookmarkEnd w:id="40"/>
+    <w:bookmarkEnd w:id="41"/>
+    <w:bookmarkStart w:id="90" w:name="part-i-results"/>
     <w:p>
       <w:pPr>
         <w:pStyle w:val="Heading1"/>
@@ -2138,7 +2160,7 @@
         <w:t xml:space="preserve">4. Part I: results</w:t>
       </w:r>
     </w:p>
-    <w:bookmarkStart w:id="39" w:name="q1-representation-sensitivity-holds"/>
+    <w:bookmarkStart w:id="48" w:name="q1-representation-sensitivity-holds"/>
     <w:p>
       <w:pPr>
         <w:pStyle w:val="Heading2"/>
@@ -2155,31 +2177,53 @@
         <w:t xml:space="preserve">AUC falls from R1 to R4 in all 100 model-cell settings. The median R1 AUC is 0.977, R2/R3 0.877 and R4 0.850; the smallest drop in any setting is 0.024. All four model families show it (Figure 4.3).</w:t>
       </w:r>
     </w:p>
-    <w:tbl>
-      <w:tblPr>
-        <w:tblStyle w:val="FigureTable"/>
-        <w:tblW w:type="auto" w:w="0"/>
-        <w:tblLook w:firstRow="0" w:lastRow="0" w:firstColumn="0" w:lastColumn="0"/>
-        <w:jc w:val="center"/>
-      </w:tblPr>
-      <w:tblGrid>
-        <w:gridCol w:w="7920"/>
-      </w:tblGrid>
-      <w:tr>
-        <w:tc>
-          <w:tcPr/>
-          <w:p>
-            <w:pPr>
-              <w:pStyle w:val="Compact"/>
-              <w:jc w:val="center"/>
-            </w:pPr>
-            <w:r>
-              <w:t xml:space="preserve">Figure 4.2. Representation ladder, 25 cells. Thin lines are cells; the thick line is the median.</w:t>
-            </w:r>
-          </w:p>
-        </w:tc>
-      </w:tr>
-    </w:tbl>
+    <w:p>
+      <w:pPr>
+        <w:pStyle w:val="CaptionedFigure"/>
+      </w:pPr>
+      <w:r>
+        <w:drawing>
+          <wp:inline>
+            <wp:extent cx="6261100" cy="2635836"/>
+            <wp:effectExtent b="0" l="0" r="0" t="0"/>
+            <wp:docPr descr="Figure 4.2. Representation ladder, 25 cells. Thin lines are cells; the thick line is the median." title="" id="43" name="Picture"/>
+            <a:graphic>
+              <a:graphicData uri="http://schemas.openxmlformats.org/drawingml/2006/picture">
+                <pic:pic>
+                  <pic:nvPicPr>
+                    <pic:cNvPr descr="fig02_ladder.png" id="44" name="Picture"/>
+                    <pic:cNvPicPr>
+                      <a:picLocks noChangeArrowheads="1" noChangeAspect="1"/>
+                    </pic:cNvPicPr>
+                  </pic:nvPicPr>
+                  <pic:blipFill>
+                    <a:blip r:embed="rId42"/>
+                    <a:stretch>
+                      <a:fillRect/>
+                    </a:stretch>
+                  </pic:blipFill>
+                  <pic:spPr bwMode="auto">
+                    <a:xfrm>
+                      <a:off x="0" y="0"/>
+                      <a:ext cx="6261100" cy="2635836"/>
+                    </a:xfrm>
+                    <a:prstGeom prst="rect">
+                      <a:avLst/>
+                    </a:prstGeom>
+                    <a:noFill/>
+                    <a:ln w="9525">
+                      <a:noFill/>
+                      <a:headEnd/>
+                      <a:tailEnd/>
+                    </a:ln>
+                  </pic:spPr>
+                </pic:pic>
+              </a:graphicData>
+            </a:graphic>
+          </wp:inline>
+        </w:drawing>
+      </w:r>
+    </w:p>
     <w:p>
       <w:pPr>
         <w:pStyle w:val="ImageCaption"/>
@@ -2188,31 +2232,53 @@
         <w:t xml:space="preserve">Figure 4.2. Representation ladder, 25 cells. Thin lines are cells; the thick line is the median.</w:t>
       </w:r>
     </w:p>
-    <w:tbl>
-      <w:tblPr>
-        <w:tblStyle w:val="FigureTable"/>
-        <w:tblW w:type="auto" w:w="0"/>
-        <w:tblLook w:firstRow="0" w:lastRow="0" w:firstColumn="0" w:lastColumn="0"/>
-        <w:jc w:val="center"/>
-      </w:tblPr>
-      <w:tblGrid>
-        <w:gridCol w:w="7920"/>
-      </w:tblGrid>
-      <w:tr>
-        <w:tc>
-          <w:tcPr/>
-          <w:p>
-            <w:pPr>
-              <w:pStyle w:val="Compact"/>
-              <w:jc w:val="center"/>
-            </w:pPr>
-            <w:r>
-              <w:t xml:space="preserve">Figure 4.3. Median AUC by representation and model, with the range across the 25 cells.</w:t>
-            </w:r>
-          </w:p>
-        </w:tc>
-      </w:tr>
-    </w:tbl>
+    <w:p>
+      <w:pPr>
+        <w:pStyle w:val="CaptionedFigure"/>
+      </w:pPr>
+      <w:r>
+        <w:drawing>
+          <wp:inline>
+            <wp:extent cx="5909137" cy="3060253"/>
+            <wp:effectExtent b="0" l="0" r="0" t="0"/>
+            <wp:docPr descr="Figure 4.3. Median AUC by representation and model, with the range across the 25 cells." title="" id="46" name="Picture"/>
+            <a:graphic>
+              <a:graphicData uri="http://schemas.openxmlformats.org/drawingml/2006/picture">
+                <pic:pic>
+                  <pic:nvPicPr>
+                    <pic:cNvPr descr="fig03_models.png" id="47" name="Picture"/>
+                    <pic:cNvPicPr>
+                      <a:picLocks noChangeArrowheads="1" noChangeAspect="1"/>
+                    </pic:cNvPicPr>
+                  </pic:nvPicPr>
+                  <pic:blipFill>
+                    <a:blip r:embed="rId45"/>
+                    <a:stretch>
+                      <a:fillRect/>
+                    </a:stretch>
+                  </pic:blipFill>
+                  <pic:spPr bwMode="auto">
+                    <a:xfrm>
+                      <a:off x="0" y="0"/>
+                      <a:ext cx="5909137" cy="3060253"/>
+                    </a:xfrm>
+                    <a:prstGeom prst="rect">
+                      <a:avLst/>
+                    </a:prstGeom>
+                    <a:noFill/>
+                    <a:ln w="9525">
+                      <a:noFill/>
+                      <a:headEnd/>
+                      <a:tailEnd/>
+                    </a:ln>
+                  </pic:spPr>
+                </pic:pic>
+              </a:graphicData>
+            </a:graphic>
+          </wp:inline>
+        </w:drawing>
+      </w:r>
+    </w:p>
     <w:p>
       <w:pPr>
         <w:pStyle w:val="ImageCaption"/>
@@ -3556,8 +3622,8 @@
         </w:tc>
       </w:tr>
     </w:tbl>
-    <w:bookmarkEnd w:id="39"/>
-    <w:bookmarkStart w:id="40" w:name="q2-where-the-drop-sits-does-not-hold"/>
+    <w:bookmarkEnd w:id="48"/>
+    <w:bookmarkStart w:id="52" w:name="q2-where-the-drop-sits-does-not-hold"/>
     <w:p>
       <w:pPr>
         <w:pStyle w:val="Heading2"/>
@@ -3872,31 +3938,53 @@
         </w:tc>
       </w:tr>
     </w:tbl>
-    <w:tbl>
-      <w:tblPr>
-        <w:tblStyle w:val="FigureTable"/>
-        <w:tblW w:type="auto" w:w="0"/>
-        <w:tblLook w:firstRow="0" w:lastRow="0" w:firstColumn="0" w:lastColumn="0"/>
-        <w:jc w:val="center"/>
-      </w:tblPr>
-      <w:tblGrid>
-        <w:gridCol w:w="7920"/>
-      </w:tblGrid>
-      <w:tr>
-        <w:tc>
-          <w:tcPr/>
-          <w:p>
-            <w:pPr>
-              <w:pStyle w:val="Compact"/>
-              <w:jc w:val="center"/>
-            </w:pPr>
-            <w:r>
-              <w:t xml:space="preserve">Figure 4.4. Share of the R1 to R4 drop by step, LightGBM, per cell.</w:t>
-            </w:r>
-          </w:p>
-        </w:tc>
-      </w:tr>
-    </w:tbl>
+    <w:p>
+      <w:pPr>
+        <w:pStyle w:val="CaptionedFigure"/>
+      </w:pPr>
+      <w:r>
+        <w:drawing>
+          <wp:inline>
+            <wp:extent cx="6261100" cy="4454144"/>
+            <wp:effectExtent b="0" l="0" r="0" t="0"/>
+            <wp:docPr descr="Figure 4.4. Share of the R1 to R4 drop by step, LightGBM, per cell." title="" id="50" name="Picture"/>
+            <a:graphic>
+              <a:graphicData uri="http://schemas.openxmlformats.org/drawingml/2006/picture">
+                <pic:pic>
+                  <pic:nvPicPr>
+                    <pic:cNvPr descr="fig04_share.png" id="51" name="Picture"/>
+                    <pic:cNvPicPr>
+                      <a:picLocks noChangeArrowheads="1" noChangeAspect="1"/>
+                    </pic:cNvPicPr>
+                  </pic:nvPicPr>
+                  <pic:blipFill>
+                    <a:blip r:embed="rId49"/>
+                    <a:stretch>
+                      <a:fillRect/>
+                    </a:stretch>
+                  </pic:blipFill>
+                  <pic:spPr bwMode="auto">
+                    <a:xfrm>
+                      <a:off x="0" y="0"/>
+                      <a:ext cx="6261100" cy="4454144"/>
+                    </a:xfrm>
+                    <a:prstGeom prst="rect">
+                      <a:avLst/>
+                    </a:prstGeom>
+                    <a:noFill/>
+                    <a:ln w="9525">
+                      <a:noFill/>
+                      <a:headEnd/>
+                      <a:tailEnd/>
+                    </a:ln>
+                  </pic:spPr>
+                </pic:pic>
+              </a:graphicData>
+            </a:graphic>
+          </wp:inline>
+        </w:drawing>
+      </w:r>
+    </w:p>
     <w:p>
       <w:pPr>
         <w:pStyle w:val="ImageCaption"/>
@@ -3905,8 +3993,8 @@
         <w:t xml:space="preserve">Figure 4.4. Share of the R1 to R4 drop by step, LightGBM, per cell.</w:t>
       </w:r>
     </w:p>
-    <w:bookmarkEnd w:id="40"/>
-    <w:bookmarkStart w:id="41" w:name="q3-source-dependence-holds-in-part"/>
+    <w:bookmarkEnd w:id="52"/>
+    <w:bookmarkStart w:id="56" w:name="q3-source-dependence-holds-in-part"/>
     <w:p>
       <w:pPr>
         <w:pStyle w:val="Heading2"/>
@@ -3923,31 +4011,53 @@
         <w:t xml:space="preserve">Swapping one source while holding the other fixed moves R4 AUC by a median 0.058 (phishing source swapped 0.050, legitimate source swapped 0.067). The interval excludes zero in 76% of 400 swaps. After reweighting the test side to equalise URL depth across classes it falls to 53%, so part of the source effect is URL depth. The heatmap shows the pattern: R4 AUC ranges from 0.71 to 0.94; against URL-Phish legitimate URLs every phishing source scores highest (0.85 to 0.94), and the lowest cells pair PhishStorm, PhiUSIIL or Phishpedia phishing with PhiUSIIL or crawled legitimate URLs.</w:t>
       </w:r>
     </w:p>
-    <w:tbl>
-      <w:tblPr>
-        <w:tblStyle w:val="FigureTable"/>
-        <w:tblW w:type="auto" w:w="0"/>
-        <w:tblLook w:firstRow="0" w:lastRow="0" w:firstColumn="0" w:lastColumn="0"/>
-        <w:jc w:val="center"/>
-      </w:tblPr>
-      <w:tblGrid>
-        <w:gridCol w:w="7920"/>
-      </w:tblGrid>
-      <w:tr>
-        <w:tc>
-          <w:tcPr/>
-          <w:p>
-            <w:pPr>
-              <w:pStyle w:val="Compact"/>
-              <w:jc w:val="center"/>
-            </w:pPr>
-            <w:r>
-              <w:t xml:space="preserve">Figure 4.5. R4 AUC for every phishing-by-legitimate cell (left) and the distribution of swap effects (right).</w:t>
-            </w:r>
-          </w:p>
-        </w:tc>
-      </w:tr>
-    </w:tbl>
+    <w:p>
+      <w:pPr>
+        <w:pStyle w:val="CaptionedFigure"/>
+      </w:pPr>
+      <w:r>
+        <w:drawing>
+          <wp:inline>
+            <wp:extent cx="6261100" cy="2822223"/>
+            <wp:effectExtent b="0" l="0" r="0" t="0"/>
+            <wp:docPr descr="Figure 4.5. R4 AUC for every phishing-by-legitimate cell (left) and the distribution of swap effects (right)." title="" id="54" name="Picture"/>
+            <a:graphic>
+              <a:graphicData uri="http://schemas.openxmlformats.org/drawingml/2006/picture">
+                <pic:pic>
+                  <pic:nvPicPr>
+                    <pic:cNvPr descr="fig05_source.png" id="55" name="Picture"/>
+                    <pic:cNvPicPr>
+                      <a:picLocks noChangeArrowheads="1" noChangeAspect="1"/>
+                    </pic:cNvPicPr>
+                  </pic:nvPicPr>
+                  <pic:blipFill>
+                    <a:blip r:embed="rId53"/>
+                    <a:stretch>
+                      <a:fillRect/>
+                    </a:stretch>
+                  </pic:blipFill>
+                  <pic:spPr bwMode="auto">
+                    <a:xfrm>
+                      <a:off x="0" y="0"/>
+                      <a:ext cx="6261100" cy="2822223"/>
+                    </a:xfrm>
+                    <a:prstGeom prst="rect">
+                      <a:avLst/>
+                    </a:prstGeom>
+                    <a:noFill/>
+                    <a:ln w="9525">
+                      <a:noFill/>
+                      <a:headEnd/>
+                      <a:tailEnd/>
+                    </a:ln>
+                  </pic:spPr>
+                </pic:pic>
+              </a:graphicData>
+            </a:graphic>
+          </wp:inline>
+        </w:drawing>
+      </w:r>
+    </w:p>
     <w:p>
       <w:pPr>
         <w:pStyle w:val="ImageCaption"/>
@@ -3964,8 +4074,8 @@
         <w:t xml:space="preserve">the interaction check, an interaction between phishing and legitimate source, holds in 26% of settings; an interaction is hard to establish with this many settings, so it is treated as inconclusive.</w:t>
       </w:r>
     </w:p>
-    <w:bookmarkEnd w:id="41"/>
-    <w:bookmarkStart w:id="42" w:name="q4-split-sensitivity-does-not-hold"/>
+    <w:bookmarkEnd w:id="56"/>
+    <w:bookmarkStart w:id="60" w:name="q4-split-sensitivity-does-not-hold"/>
     <w:p>
       <w:pPr>
         <w:pStyle w:val="Heading2"/>
@@ -3982,31 +4092,53 @@
         <w:t xml:space="preserve">The median SD is 0.006 for R4 and 0.002 for R1, and the largest R4 SD is 0.019. R4 is the more variable in 100% of settings, but exceeds three times the raw SD in only 45% of them. With 5 to 10 thousand URLs per cell and domain-grouped splits the variability is small.</w:t>
       </w:r>
     </w:p>
-    <w:tbl>
-      <w:tblPr>
-        <w:tblStyle w:val="FigureTable"/>
-        <w:tblW w:type="auto" w:w="0"/>
-        <w:tblLook w:firstRow="0" w:lastRow="0" w:firstColumn="0" w:lastColumn="0"/>
-        <w:jc w:val="center"/>
-      </w:tblPr>
-      <w:tblGrid>
-        <w:gridCol w:w="7920"/>
-      </w:tblGrid>
-      <w:tr>
-        <w:tc>
-          <w:tcPr/>
-          <w:p>
-            <w:pPr>
-              <w:pStyle w:val="Compact"/>
-              <w:jc w:val="center"/>
-            </w:pPr>
-            <w:r>
-              <w:t xml:space="preserve">Figure 4.6. SD of AUC across ten splits, raw against R4, one point per cell and model.</w:t>
-            </w:r>
-          </w:p>
-        </w:tc>
-      </w:tr>
-    </w:tbl>
+    <w:p>
+      <w:pPr>
+        <w:pStyle w:val="CaptionedFigure"/>
+      </w:pPr>
+      <w:r>
+        <w:drawing>
+          <wp:inline>
+            <wp:extent cx="4714444" cy="3795449"/>
+            <wp:effectExtent b="0" l="0" r="0" t="0"/>
+            <wp:docPr descr="Figure 4.6. SD of AUC across ten splits, raw against R4, one point per cell and model." title="" id="58" name="Picture"/>
+            <a:graphic>
+              <a:graphicData uri="http://schemas.openxmlformats.org/drawingml/2006/picture">
+                <pic:pic>
+                  <pic:nvPicPr>
+                    <pic:cNvPr descr="fig06_split.png" id="59" name="Picture"/>
+                    <pic:cNvPicPr>
+                      <a:picLocks noChangeArrowheads="1" noChangeAspect="1"/>
+                    </pic:cNvPicPr>
+                  </pic:nvPicPr>
+                  <pic:blipFill>
+                    <a:blip r:embed="rId57"/>
+                    <a:stretch>
+                      <a:fillRect/>
+                    </a:stretch>
+                  </pic:blipFill>
+                  <pic:spPr bwMode="auto">
+                    <a:xfrm>
+                      <a:off x="0" y="0"/>
+                      <a:ext cx="4714444" cy="3795449"/>
+                    </a:xfrm>
+                    <a:prstGeom prst="rect">
+                      <a:avLst/>
+                    </a:prstGeom>
+                    <a:noFill/>
+                    <a:ln w="9525">
+                      <a:noFill/>
+                      <a:headEnd/>
+                      <a:tailEnd/>
+                    </a:ln>
+                  </pic:spPr>
+                </pic:pic>
+              </a:graphicData>
+            </a:graphic>
+          </wp:inline>
+        </w:drawing>
+      </w:r>
+    </w:p>
     <w:p>
       <w:pPr>
         <w:pStyle w:val="ImageCaption"/>
@@ -4015,8 +4147,8 @@
         <w:t xml:space="preserve">Figure 4.6. SD of AUC across ten splits, raw against R4, one point per cell and model.</w:t>
       </w:r>
     </w:p>
-    <w:bookmarkEnd w:id="42"/>
-    <w:bookmarkStart w:id="43" w:name="X0ed11e4c8b3b3a411482757d8a6875a4e1d17de"/>
+    <w:bookmarkEnd w:id="60"/>
+    <w:bookmarkStart w:id="61" w:name="X0ed11e4c8b3b3a411482757d8a6875a4e1d17de"/>
     <w:p>
       <w:pPr>
         <w:pStyle w:val="Heading2"/>
@@ -4033,8 +4165,8 @@
         <w:t xml:space="preserve">Masking replaces hosting-platform domains with a neutral token. The caps used here leave no registrable domain on a hosting platform in any cell, so there is nothing to mask and the finding cannot be tested in this design. A separate exploratory test that keeps platform domains found no measurable effect of masking (Section 4.14).</w:t>
       </w:r>
     </w:p>
-    <w:bookmarkEnd w:id="43"/>
-    <w:bookmarkStart w:id="44" w:name="q6-independent-benign-transfer-holds"/>
+    <w:bookmarkEnd w:id="61"/>
+    <w:bookmarkStart w:id="65" w:name="q6-independent-benign-transfer-holds"/>
     <w:p>
       <w:pPr>
         <w:pStyle w:val="Heading2"/>
@@ -4051,31 +4183,53 @@
         <w:t xml:space="preserve">Models trained on one cell and evaluated on cells that share no source with it keep an R4 AUC above 0.5 in every setting (median 0.699, lowest 0.554; 392 train-test pairs across the two transfer models). Each pair uses thousands of legitimate domains.</w:t>
       </w:r>
     </w:p>
-    <w:tbl>
-      <w:tblPr>
-        <w:tblStyle w:val="FigureTable"/>
-        <w:tblW w:type="auto" w:w="0"/>
-        <w:tblLook w:firstRow="0" w:lastRow="0" w:firstColumn="0" w:lastColumn="0"/>
-        <w:jc w:val="center"/>
-      </w:tblPr>
-      <w:tblGrid>
-        <w:gridCol w:w="7920"/>
-      </w:tblGrid>
-      <w:tr>
-        <w:tc>
-          <w:tcPr/>
-          <w:p>
-            <w:pPr>
-              <w:pStyle w:val="Compact"/>
-              <w:jc w:val="center"/>
-            </w:pPr>
-            <w:r>
-              <w:t xml:space="preserve">Figure 4.7. Transfer AUC on fully independent cells.</w:t>
-            </w:r>
-          </w:p>
-        </w:tc>
-      </w:tr>
-    </w:tbl>
+    <w:p>
+      <w:pPr>
+        <w:pStyle w:val="CaptionedFigure"/>
+      </w:pPr>
+      <w:r>
+        <w:drawing>
+          <wp:inline>
+            <wp:extent cx="5449640" cy="3060253"/>
+            <wp:effectExtent b="0" l="0" r="0" t="0"/>
+            <wp:docPr descr="Figure 4.7. Transfer AUC on fully independent cells." title="" id="63" name="Picture"/>
+            <a:graphic>
+              <a:graphicData uri="http://schemas.openxmlformats.org/drawingml/2006/picture">
+                <pic:pic>
+                  <pic:nvPicPr>
+                    <pic:cNvPr descr="fig07_transfer.png" id="64" name="Picture"/>
+                    <pic:cNvPicPr>
+                      <a:picLocks noChangeArrowheads="1" noChangeAspect="1"/>
+                    </pic:cNvPicPr>
+                  </pic:nvPicPr>
+                  <pic:blipFill>
+                    <a:blip r:embed="rId62"/>
+                    <a:stretch>
+                      <a:fillRect/>
+                    </a:stretch>
+                  </pic:blipFill>
+                  <pic:spPr bwMode="auto">
+                    <a:xfrm>
+                      <a:off x="0" y="0"/>
+                      <a:ext cx="5449640" cy="3060253"/>
+                    </a:xfrm>
+                    <a:prstGeom prst="rect">
+                      <a:avLst/>
+                    </a:prstGeom>
+                    <a:noFill/>
+                    <a:ln w="9525">
+                      <a:noFill/>
+                      <a:headEnd/>
+                      <a:tailEnd/>
+                    </a:ln>
+                  </pic:spPr>
+                </pic:pic>
+              </a:graphicData>
+            </a:graphic>
+          </wp:inline>
+        </w:drawing>
+      </w:r>
+    </w:p>
     <w:p>
       <w:pPr>
         <w:pStyle w:val="ImageCaption"/>
@@ -4084,8 +4238,8 @@
         <w:t xml:space="preserve">Figure 4.7. Transfer AUC on fully independent cells.</w:t>
       </w:r>
     </w:p>
-    <w:bookmarkEnd w:id="44"/>
-    <w:bookmarkStart w:id="45" w:name="Xd8634e9584e2c3a5f552c1d6de4e9353b6f0ee6"/>
+    <w:bookmarkEnd w:id="65"/>
+    <w:bookmarkStart w:id="69" w:name="Xd8634e9584e2c3a5f552c1d6de4e9353b6f0ee6"/>
     <w:p>
       <w:pPr>
         <w:pStyle w:val="Heading2"/>
@@ -4102,31 +4256,53 @@
         <w:t xml:space="preserve">A model’s false-alarm rate on 2,555 natural legitimate pages from 562 sites, none in any training source, is compared with its own test side at the same 1% threshold. The median is 15.2% on natural pages against 1.0% in-cell; at the 0.1% threshold 4.5%; at the default 0.5 threshold 33%. The natural rate exceeds five times the in-cell rate in 76% of settings. No model flags every natural page, but a benchmark threshold still understates real-world false alarms.</w:t>
       </w:r>
     </w:p>
-    <w:tbl>
-      <w:tblPr>
-        <w:tblStyle w:val="FigureTable"/>
-        <w:tblW w:type="auto" w:w="0"/>
-        <w:tblLook w:firstRow="0" w:lastRow="0" w:firstColumn="0" w:lastColumn="0"/>
-        <w:jc w:val="center"/>
-      </w:tblPr>
-      <w:tblGrid>
-        <w:gridCol w:w="7920"/>
-      </w:tblGrid>
-      <w:tr>
-        <w:tc>
-          <w:tcPr/>
-          <w:p>
-            <w:pPr>
-              <w:pStyle w:val="Compact"/>
-              <w:jc w:val="center"/>
-            </w:pPr>
-            <w:r>
-              <w:t xml:space="preserve">Figure 4.8. False alarms on natural pages against the cell’s own test side, log scale.</w:t>
-            </w:r>
-          </w:p>
-        </w:tc>
-      </w:tr>
-    </w:tbl>
+    <w:p>
+      <w:pPr>
+        <w:pStyle w:val="CaptionedFigure"/>
+      </w:pPr>
+      <w:r>
+        <w:drawing>
+          <wp:inline>
+            <wp:extent cx="5082042" cy="3974653"/>
+            <wp:effectExtent b="0" l="0" r="0" t="0"/>
+            <wp:docPr descr="Figure 4.8. False alarms on natural pages against the cell’s own test side, log scale." title="" id="67" name="Picture"/>
+            <a:graphic>
+              <a:graphicData uri="http://schemas.openxmlformats.org/drawingml/2006/picture">
+                <pic:pic>
+                  <pic:nvPicPr>
+                    <pic:cNvPr descr="fig08_ood.png" id="68" name="Picture"/>
+                    <pic:cNvPicPr>
+                      <a:picLocks noChangeArrowheads="1" noChangeAspect="1"/>
+                    </pic:cNvPicPr>
+                  </pic:nvPicPr>
+                  <pic:blipFill>
+                    <a:blip r:embed="rId66"/>
+                    <a:stretch>
+                      <a:fillRect/>
+                    </a:stretch>
+                  </pic:blipFill>
+                  <pic:spPr bwMode="auto">
+                    <a:xfrm>
+                      <a:off x="0" y="0"/>
+                      <a:ext cx="5082042" cy="3974653"/>
+                    </a:xfrm>
+                    <a:prstGeom prst="rect">
+                      <a:avLst/>
+                    </a:prstGeom>
+                    <a:noFill/>
+                    <a:ln w="9525">
+                      <a:noFill/>
+                      <a:headEnd/>
+                      <a:tailEnd/>
+                    </a:ln>
+                  </pic:spPr>
+                </pic:pic>
+              </a:graphicData>
+            </a:graphic>
+          </wp:inline>
+        </w:drawing>
+      </w:r>
+    </w:p>
     <w:p>
       <w:pPr>
         <w:pStyle w:val="ImageCaption"/>
@@ -4135,8 +4311,8 @@
         <w:t xml:space="preserve">Figure 4.8. False alarms on natural pages against the cell’s own test side, log scale.</w:t>
       </w:r>
     </w:p>
-    <w:bookmarkEnd w:id="45"/>
-    <w:bookmarkStart w:id="46" w:name="negative-controls"/>
+    <w:bookmarkEnd w:id="69"/>
+    <w:bookmarkStart w:id="73" w:name="negative-controls"/>
     <w:p>
       <w:pPr>
         <w:pStyle w:val="Heading2"/>
@@ -4153,31 +4329,53 @@
         <w:t xml:space="preserve">With shuffled training labels, mean AUC stays between 0.448 and 0.525 over 100 conditions (cell, representation, model); 1 is flagged under the |mean - 0.5| &gt; 0.05 rule. The flagged condition is examined in Section 4.10.</w:t>
       </w:r>
     </w:p>
-    <w:tbl>
-      <w:tblPr>
-        <w:tblStyle w:val="FigureTable"/>
-        <w:tblW w:type="auto" w:w="0"/>
-        <w:tblLook w:firstRow="0" w:lastRow="0" w:firstColumn="0" w:lastColumn="0"/>
-        <w:jc w:val="center"/>
-      </w:tblPr>
-      <w:tblGrid>
-        <w:gridCol w:w="7920"/>
-      </w:tblGrid>
-      <w:tr>
-        <w:tc>
-          <w:tcPr/>
-          <w:p>
-            <w:pPr>
-              <w:pStyle w:val="Compact"/>
-              <w:jc w:val="center"/>
-            </w:pPr>
-            <w:r>
-              <w:t xml:space="preserve">Figure 4.9. Shuffled-label controls, 100 conditions.</w:t>
-            </w:r>
-          </w:p>
-        </w:tc>
-      </w:tr>
-    </w:tbl>
+    <w:p>
+      <w:pPr>
+        <w:pStyle w:val="CaptionedFigure"/>
+      </w:pPr>
+      <w:r>
+        <w:drawing>
+          <wp:inline>
+            <wp:extent cx="5909137" cy="2876454"/>
+            <wp:effectExtent b="0" l="0" r="0" t="0"/>
+            <wp:docPr descr="Figure 4.9. Shuffled-label controls, 100 conditions." title="" id="71" name="Picture"/>
+            <a:graphic>
+              <a:graphicData uri="http://schemas.openxmlformats.org/drawingml/2006/picture">
+                <pic:pic>
+                  <pic:nvPicPr>
+                    <pic:cNvPr descr="fig09_controls.png" id="72" name="Picture"/>
+                    <pic:cNvPicPr>
+                      <a:picLocks noChangeArrowheads="1" noChangeAspect="1"/>
+                    </pic:cNvPicPr>
+                  </pic:nvPicPr>
+                  <pic:blipFill>
+                    <a:blip r:embed="rId70"/>
+                    <a:stretch>
+                      <a:fillRect/>
+                    </a:stretch>
+                  </pic:blipFill>
+                  <pic:spPr bwMode="auto">
+                    <a:xfrm>
+                      <a:off x="0" y="0"/>
+                      <a:ext cx="5909137" cy="2876454"/>
+                    </a:xfrm>
+                    <a:prstGeom prst="rect">
+                      <a:avLst/>
+                    </a:prstGeom>
+                    <a:noFill/>
+                    <a:ln w="9525">
+                      <a:noFill/>
+                      <a:headEnd/>
+                      <a:tailEnd/>
+                    </a:ln>
+                  </pic:spPr>
+                </pic:pic>
+              </a:graphicData>
+            </a:graphic>
+          </wp:inline>
+        </w:drawing>
+      </w:r>
+    </w:p>
     <w:p>
       <w:pPr>
         <w:pStyle w:val="ImageCaption"/>
@@ -4186,8 +4384,8 @@
         <w:t xml:space="preserve">Figure 4.9. Shuffled-label controls, 100 conditions.</w:t>
       </w:r>
     </w:p>
-    <w:bookmarkEnd w:id="46"/>
-    <w:bookmarkStart w:id="47" w:name="dataset-fingerprints"/>
+    <w:bookmarkEnd w:id="73"/>
+    <w:bookmarkStart w:id="74" w:name="dataset-fingerprints"/>
     <w:p>
       <w:pPr>
         <w:pStyle w:val="Heading2"/>
@@ -4759,8 +4957,8 @@
         </w:tc>
       </w:tr>
     </w:tbl>
-    <w:bookmarkEnd w:id="47"/>
-    <w:bookmarkStart w:id="48" w:name="follow-up-checks"/>
+    <w:bookmarkEnd w:id="74"/>
+    <w:bookmarkStart w:id="78" w:name="follow-up-checks"/>
     <w:p>
       <w:pPr>
         <w:pStyle w:val="Heading2"/>
@@ -4805,31 +5003,53 @@
         <w:t xml:space="preserve">In the URL-Phish phishing against PhiUSIIL legitimate cell, LightGBM trained on shuffled labels scores below chance at every seed: mean 0.449 (SD 0.031, 50 runs); the character n-gram model scores 0.506. A leak raises a control above 0.5, so this is read as a model artefact in one cell and listed as a limitation.</w:t>
       </w:r>
     </w:p>
-    <w:tbl>
-      <w:tblPr>
-        <w:tblStyle w:val="FigureTable"/>
-        <w:tblW w:type="auto" w:w="0"/>
-        <w:tblLook w:firstRow="0" w:lastRow="0" w:firstColumn="0" w:lastColumn="0"/>
-        <w:jc w:val="center"/>
-      </w:tblPr>
-      <w:tblGrid>
-        <w:gridCol w:w="7920"/>
-      </w:tblGrid>
-      <w:tr>
-        <w:tc>
-          <w:tcPr/>
-          <w:p>
-            <w:pPr>
-              <w:pStyle w:val="Compact"/>
-              <w:jc w:val="center"/>
-            </w:pPr>
-            <w:r>
-              <w:t xml:space="preserve">Figure 4.10. Left: XGBoost AUC from raw PhiUSIIL to the study cell. Right: the flagged control.</w:t>
-            </w:r>
-          </w:p>
-        </w:tc>
-      </w:tr>
-    </w:tbl>
+    <w:p>
+      <w:pPr>
+        <w:pStyle w:val="CaptionedFigure"/>
+      </w:pPr>
+      <w:r>
+        <w:drawing>
+          <wp:inline>
+            <wp:extent cx="6261100" cy="2334766"/>
+            <wp:effectExtent b="0" l="0" r="0" t="0"/>
+            <wp:docPr descr="Figure 4.10. Left: XGBoost AUC from raw PhiUSIIL to the study cell. Right: the flagged control." title="" id="76" name="Picture"/>
+            <a:graphic>
+              <a:graphicData uri="http://schemas.openxmlformats.org/drawingml/2006/picture">
+                <pic:pic>
+                  <pic:nvPicPr>
+                    <pic:cNvPr descr="fig12_followup.png" id="77" name="Picture"/>
+                    <pic:cNvPicPr>
+                      <a:picLocks noChangeArrowheads="1" noChangeAspect="1"/>
+                    </pic:cNvPicPr>
+                  </pic:nvPicPr>
+                  <pic:blipFill>
+                    <a:blip r:embed="rId75"/>
+                    <a:stretch>
+                      <a:fillRect/>
+                    </a:stretch>
+                  </pic:blipFill>
+                  <pic:spPr bwMode="auto">
+                    <a:xfrm>
+                      <a:off x="0" y="0"/>
+                      <a:ext cx="6261100" cy="2334766"/>
+                    </a:xfrm>
+                    <a:prstGeom prst="rect">
+                      <a:avLst/>
+                    </a:prstGeom>
+                    <a:noFill/>
+                    <a:ln w="9525">
+                      <a:noFill/>
+                      <a:headEnd/>
+                      <a:tailEnd/>
+                    </a:ln>
+                  </pic:spPr>
+                </pic:pic>
+              </a:graphicData>
+            </a:graphic>
+          </wp:inline>
+        </w:drawing>
+      </w:r>
+    </w:p>
     <w:p>
       <w:pPr>
         <w:pStyle w:val="ImageCaption"/>
@@ -4838,8 +5058,8 @@
         <w:t xml:space="preserve">Figure 4.10. Left: XGBoost AUC from raw PhiUSIIL to the study cell. Right: the flagged control.</w:t>
       </w:r>
     </w:p>
-    <w:bookmarkEnd w:id="48"/>
-    <w:bookmarkStart w:id="49" w:name="page-html-exploratory"/>
+    <w:bookmarkEnd w:id="78"/>
+    <w:bookmarkStart w:id="85" w:name="page-html-exploratory"/>
     <w:p>
       <w:pPr>
         <w:pStyle w:val="Heading2"/>
@@ -5538,31 +5758,53 @@
         <w:t xml:space="preserve">predicts phishing with ROC-AUC 0.639. Page numbers may therefore be optimistic.</w:t>
       </w:r>
     </w:p>
-    <w:tbl>
-      <w:tblPr>
-        <w:tblStyle w:val="FigureTable"/>
-        <w:tblW w:type="auto" w:w="0"/>
-        <w:tblLook w:firstRow="0" w:lastRow="0" w:firstColumn="0" w:lastColumn="0"/>
-        <w:jc w:val="center"/>
-      </w:tblPr>
-      <w:tblGrid>
-        <w:gridCol w:w="7920"/>
-      </w:tblGrid>
-      <w:tr>
-        <w:tc>
-          <w:tcPr/>
-          <w:p>
-            <w:pPr>
-              <w:pStyle w:val="Compact"/>
-              <w:jc w:val="center"/>
-            </w:pPr>
-            <w:r>
-              <w:t xml:space="preserve">Figure 4.11. Page and URL representations, LightGBM.</w:t>
-            </w:r>
-          </w:p>
-        </w:tc>
-      </w:tr>
-    </w:tbl>
+    <w:p>
+      <w:pPr>
+        <w:pStyle w:val="CaptionedFigure"/>
+      </w:pPr>
+      <w:r>
+        <w:drawing>
+          <wp:inline>
+            <wp:extent cx="6261100" cy="2974654"/>
+            <wp:effectExtent b="0" l="0" r="0" t="0"/>
+            <wp:docPr descr="Figure 4.11. Page and URL representations, LightGBM." title="" id="80" name="Picture"/>
+            <a:graphic>
+              <a:graphicData uri="http://schemas.openxmlformats.org/drawingml/2006/picture">
+                <pic:pic>
+                  <pic:nvPicPr>
+                    <pic:cNvPr descr="fig10_pageb.png" id="81" name="Picture"/>
+                    <pic:cNvPicPr>
+                      <a:picLocks noChangeArrowheads="1" noChangeAspect="1"/>
+                    </pic:cNvPicPr>
+                  </pic:nvPicPr>
+                  <pic:blipFill>
+                    <a:blip r:embed="rId79"/>
+                    <a:stretch>
+                      <a:fillRect/>
+                    </a:stretch>
+                  </pic:blipFill>
+                  <pic:spPr bwMode="auto">
+                    <a:xfrm>
+                      <a:off x="0" y="0"/>
+                      <a:ext cx="6261100" cy="2974654"/>
+                    </a:xfrm>
+                    <a:prstGeom prst="rect">
+                      <a:avLst/>
+                    </a:prstGeom>
+                    <a:noFill/>
+                    <a:ln w="9525">
+                      <a:noFill/>
+                      <a:headEnd/>
+                      <a:tailEnd/>
+                    </a:ln>
+                  </pic:spPr>
+                </pic:pic>
+              </a:graphicData>
+            </a:graphic>
+          </wp:inline>
+        </w:drawing>
+      </w:r>
+    </w:p>
     <w:p>
       <w:pPr>
         <w:pStyle w:val="ImageCaption"/>
@@ -5571,31 +5813,53 @@
         <w:t xml:space="preserve">Figure 4.11. Page and URL representations, LightGBM.</w:t>
       </w:r>
     </w:p>
-    <w:tbl>
-      <w:tblPr>
-        <w:tblStyle w:val="FigureTable"/>
-        <w:tblW w:type="auto" w:w="0"/>
-        <w:tblLook w:firstRow="0" w:lastRow="0" w:firstColumn="0" w:lastColumn="0"/>
-        <w:jc w:val="center"/>
-      </w:tblPr>
-      <w:tblGrid>
-        <w:gridCol w:w="7920"/>
-      </w:tblGrid>
-      <w:tr>
-        <w:tc>
-          <w:tcPr/>
-          <w:p>
-            <w:pPr>
-              <w:pStyle w:val="Compact"/>
-              <w:jc w:val="center"/>
-            </w:pPr>
-            <w:r>
-              <w:t xml:space="preserve">Figure 4.12. Share of rows with usable HTML, by source and class.</w:t>
-            </w:r>
-          </w:p>
-        </w:tc>
-      </w:tr>
-    </w:tbl>
+    <w:p>
+      <w:pPr>
+        <w:pStyle w:val="CaptionedFigure"/>
+      </w:pPr>
+      <w:r>
+        <w:drawing>
+          <wp:inline>
+            <wp:extent cx="5909137" cy="2876454"/>
+            <wp:effectExtent b="0" l="0" r="0" t="0"/>
+            <wp:docPr descr="Figure 4.12. Share of rows with usable HTML, by source and class." title="" id="83" name="Picture"/>
+            <a:graphic>
+              <a:graphicData uri="http://schemas.openxmlformats.org/drawingml/2006/picture">
+                <pic:pic>
+                  <pic:nvPicPr>
+                    <pic:cNvPr descr="fig11_html_coverage.png" id="84" name="Picture"/>
+                    <pic:cNvPicPr>
+                      <a:picLocks noChangeArrowheads="1" noChangeAspect="1"/>
+                    </pic:cNvPicPr>
+                  </pic:nvPicPr>
+                  <pic:blipFill>
+                    <a:blip r:embed="rId82"/>
+                    <a:stretch>
+                      <a:fillRect/>
+                    </a:stretch>
+                  </pic:blipFill>
+                  <pic:spPr bwMode="auto">
+                    <a:xfrm>
+                      <a:off x="0" y="0"/>
+                      <a:ext cx="5909137" cy="2876454"/>
+                    </a:xfrm>
+                    <a:prstGeom prst="rect">
+                      <a:avLst/>
+                    </a:prstGeom>
+                    <a:noFill/>
+                    <a:ln w="9525">
+                      <a:noFill/>
+                      <a:headEnd/>
+                      <a:tailEnd/>
+                    </a:ln>
+                  </pic:spPr>
+                </pic:pic>
+              </a:graphicData>
+            </a:graphic>
+          </wp:inline>
+        </w:drawing>
+      </w:r>
+    </w:p>
     <w:p>
       <w:pPr>
         <w:pStyle w:val="ImageCaption"/>
@@ -6307,8 +6571,8 @@
         </w:tc>
       </w:tr>
     </w:tbl>
-    <w:bookmarkEnd w:id="49"/>
-    <w:bookmarkStart w:id="50" w:name="limitations-of-the-study"/>
+    <w:bookmarkEnd w:id="85"/>
+    <w:bookmarkStart w:id="86" w:name="limitations-of-the-study"/>
     <w:p>
       <w:pPr>
         <w:pStyle w:val="Heading2"/>
@@ -6510,8 +6774,8 @@
         <w:t xml:space="preserve">; seeds are fixed.</w:t>
       </w:r>
     </w:p>
-    <w:bookmarkEnd w:id="50"/>
-    <w:bookmarkStart w:id="51" w:name="X8df0bda2d0692696ae74dfc5c70ee2b43ff4e2b"/>
+    <w:bookmarkEnd w:id="86"/>
+    <w:bookmarkStart w:id="87" w:name="X8df0bda2d0692696ae74dfc5c70ee2b43ff4e2b"/>
     <w:p>
       <w:pPr>
         <w:pStyle w:val="Heading2"/>
@@ -8267,8 +8531,8 @@
         <w:t xml:space="preserve">Median ROC-AUC per cell on raw (R1) and domain-only (R4) URLs in both conditions.</w:t>
       </w:r>
     </w:p>
-    <w:bookmarkEnd w:id="51"/>
-    <w:bookmarkStart w:id="52" w:name="hosting-platform-masking-exploratory"/>
+    <w:bookmarkEnd w:id="87"/>
+    <w:bookmarkStart w:id="88" w:name="hosting-platform-masking-exploratory"/>
     <w:p>
       <w:pPr>
         <w:pStyle w:val="Heading2"/>
@@ -8333,8 +8597,8 @@
         <w:t xml:space="preserve">.</w:t>
       </w:r>
     </w:p>
-    <w:bookmarkEnd w:id="52"/>
-    <w:bookmarkStart w:id="53" w:name="what-can-and-cannot-be-claimed"/>
+    <w:bookmarkEnd w:id="88"/>
+    <w:bookmarkStart w:id="89" w:name="what-can-and-cannot-be-claimed"/>
     <w:p>
       <w:pPr>
         <w:pStyle w:val="Heading2"/>
@@ -8778,9 +9042,9 @@
         </w:tc>
       </w:tr>
     </w:tbl>
-    <w:bookmarkEnd w:id="53"/>
-    <w:bookmarkEnd w:id="54"/>
-    <w:bookmarkStart w:id="61" w:name="data-and-corpus"/>
+    <w:bookmarkEnd w:id="89"/>
+    <w:bookmarkEnd w:id="90"/>
+    <w:bookmarkStart w:id="97" w:name="data-and-corpus"/>
     <w:p>
       <w:pPr>
         <w:pStyle w:val="Heading1"/>
@@ -8927,7 +9191,7 @@
         <w:t xml:space="preserve">Corpus counts in chapter 5 come from the corpus data card as quoted in the 2026-10-13 report draft. The data card file itself is not in this checkout, so those counts are carried over and were not re-checked against it.</w:t>
       </w:r>
     </w:p>
-    <w:bookmarkStart w:id="55" w:name="why-the-corpus-is-built-this-way"/>
+    <w:bookmarkStart w:id="91" w:name="why-the-corpus-is-built-this-way"/>
     <w:p>
       <w:pPr>
         <w:pStyle w:val="Heading2"/>
@@ -8965,8 +9229,8 @@
         <w:t xml:space="preserve">: only URL, label, date and HTML are read from any dataset, never a precomputed feature column; one registrable-domain definition is used everywhere (public-suffix-only); and no model is trained until the corpus passes a depth check.</w:t>
       </w:r>
     </w:p>
-    <w:bookmarkEnd w:id="55"/>
-    <w:bookmarkStart w:id="56" w:name="sources-1"/>
+    <w:bookmarkEnd w:id="91"/>
+    <w:bookmarkStart w:id="92" w:name="sources-1"/>
     <w:p>
       <w:pPr>
         <w:pStyle w:val="Heading2"/>
@@ -9923,8 +10187,8 @@
         <w:t xml:space="preserve">, 2026-10-11). Because PhishStorm has no HTML, the page model has no held-out source at all. Third, the live feeds are still tiny in the pool (245 URLs); they matter mainly for tier C (section 6.4). Licences recorded in the data card: PhreshPhish CC BY 4.0 (anti-phishing research only), PhiUSIIL CC BY 4.0, Phishpedia research use, OpenPhish non-commercial, Phishing.Database MIT; the URL-Phish and Phish-Blitz terms are still to be confirmed.</w:t>
       </w:r>
     </w:p>
-    <w:bookmarkEnd w:id="56"/>
-    <w:bookmarkStart w:id="57" w:name="corpus-build"/>
+    <w:bookmarkEnd w:id="92"/>
+    <w:bookmarkStart w:id="93" w:name="corpus-build"/>
     <w:p>
       <w:pPr>
         <w:pStyle w:val="Heading2"/>
@@ -10377,8 +10641,8 @@
         <w:t xml:space="preserve">). Zero domain overlap and zero canonical-URL overlap between sides is a hard run-time failure, not a warning.</w:t>
       </w:r>
     </w:p>
-    <w:bookmarkEnd w:id="57"/>
-    <w:bookmarkStart w:id="58" w:name="depth-balance"/>
+    <w:bookmarkEnd w:id="93"/>
+    <w:bookmarkStart w:id="94" w:name="depth-balance"/>
     <w:p>
       <w:pPr>
         <w:pStyle w:val="Heading2"/>
@@ -10440,8 +10704,8 @@
         <w:t xml:space="preserve">). This is why chapter 8 adds a depth-matched evaluation and a representation check instead of trusting pooled numbers.</w:t>
       </w:r>
     </w:p>
-    <w:bookmarkEnd w:id="58"/>
-    <w:bookmarkStart w:id="59" w:name="benign-inner-pages"/>
+    <w:bookmarkEnd w:id="94"/>
+    <w:bookmarkStart w:id="95" w:name="benign-inner-pages"/>
     <w:p>
       <w:pPr>
         <w:pStyle w:val="Heading2"/>
@@ -10508,8 +10772,8 @@
         <w:t xml:space="preserve">, 2026-10-20). The corpus described above does not include it, and its effect on false alarms is not measured.</w:t>
       </w:r>
     </w:p>
-    <w:bookmarkEnd w:id="59"/>
-    <w:bookmarkStart w:id="60" w:name="evaluation-only-data"/>
+    <w:bookmarkEnd w:id="95"/>
+    <w:bookmarkStart w:id="96" w:name="evaluation-only-data"/>
     <w:p>
       <w:pPr>
         <w:pStyle w:val="Heading2"/>
@@ -10571,9 +10835,9 @@
         <w:t xml:space="preserve">). The natural pages were sampled from Tranco-listed sites, which makes them easier than a long-tail browsing history; this is a limitation of every false-alarm number below.</w:t>
       </w:r>
     </w:p>
-    <w:bookmarkEnd w:id="60"/>
-    <w:bookmarkEnd w:id="61"/>
-    <w:bookmarkStart w:id="67" w:name="feature-engine-and-models"/>
+    <w:bookmarkEnd w:id="96"/>
+    <w:bookmarkEnd w:id="97"/>
+    <w:bookmarkStart w:id="103" w:name="feature-engine-and-models"/>
     <w:p>
       <w:pPr>
         <w:pStyle w:val="Heading1"/>
@@ -10582,7 +10846,7 @@
         <w:t xml:space="preserve">6. Feature engine and models</w:t>
       </w:r>
     </w:p>
-    <w:bookmarkStart w:id="62" w:name="one-engine-three-tiers"/>
+    <w:bookmarkStart w:id="98" w:name="one-engine-three-tiers"/>
     <w:p>
       <w:pPr>
         <w:pStyle w:val="Heading2"/>
@@ -11081,8 +11345,8 @@
         <w:t xml:space="preserve">).</w:t>
       </w:r>
     </w:p>
-    <w:bookmarkEnd w:id="62"/>
-    <w:bookmarkStart w:id="63" w:name="Xd11bde47366ac7966d4a9d7083ebb37ade0493f"/>
+    <w:bookmarkEnd w:id="98"/>
+    <w:bookmarkStart w:id="99" w:name="Xd11bde47366ac7966d4a9d7083ebb37ade0493f"/>
     <w:p>
       <w:pPr>
         <w:pStyle w:val="Heading2"/>
@@ -11161,8 +11425,8 @@
         <w:t xml:space="preserve">).</w:t>
       </w:r>
     </w:p>
-    <w:bookmarkEnd w:id="63"/>
-    <w:bookmarkStart w:id="64" w:name="tier-b-the-page-model-and-the-blend"/>
+    <w:bookmarkEnd w:id="99"/>
+    <w:bookmarkStart w:id="100" w:name="tier-b-the-page-model-and-the-blend"/>
     <w:p>
       <w:pPr>
         <w:pStyle w:val="Heading2"/>
@@ -11292,8 +11556,8 @@
         <w:t xml:space="preserve">).</w:t>
       </w:r>
     </w:p>
-    <w:bookmarkEnd w:id="64"/>
-    <w:bookmarkStart w:id="65" w:name="tier-c-domain-dns-and-tls"/>
+    <w:bookmarkEnd w:id="100"/>
+    <w:bookmarkStart w:id="101" w:name="tier-c-domain-dns-and-tls"/>
     <w:p>
       <w:pPr>
         <w:pStyle w:val="Heading2"/>
@@ -11310,8 +11574,8 @@
         <w:t xml:space="preserve">Tier C features (registration age and expiry from RDAP, DNS records, certificate age, validity and issuer) can only be computed honestly when captured as soon as a URL is first seen, so the collector records them for live-feed hosts, and for legitimate Tranco hosts, twice a day. They are never computed today for old dataset URLs. Tier C is therefore trained on live data only, and its sample is small (section 8.9). A separate set of hand-set backend rules (section 7.5) uses the same facts at run time; it is not the tier C model.</w:t>
       </w:r>
     </w:p>
-    <w:bookmarkEnd w:id="65"/>
-    <w:bookmarkStart w:id="66" w:name="calibration-and-thresholds"/>
+    <w:bookmarkEnd w:id="101"/>
+    <w:bookmarkStart w:id="102" w:name="calibration-and-thresholds"/>
     <w:p>
       <w:pPr>
         <w:pStyle w:val="Heading2"/>
@@ -11373,9 +11637,9 @@
         <w:t xml:space="preserve">). Chapter 8 shows that the thresholds themselves do not transfer well to a new source.</w:t>
       </w:r>
     </w:p>
-    <w:bookmarkEnd w:id="66"/>
-    <w:bookmarkEnd w:id="67"/>
-    <w:bookmarkStart w:id="76" w:name="system-extension-and-backend"/>
+    <w:bookmarkEnd w:id="102"/>
+    <w:bookmarkEnd w:id="103"/>
+    <w:bookmarkStart w:id="115" w:name="system-extension-and-backend"/>
     <w:p>
       <w:pPr>
         <w:pStyle w:val="Heading1"/>
@@ -11384,7 +11648,7 @@
         <w:t xml:space="preserve">7. System: extension and backend</w:t>
       </w:r>
     </w:p>
-    <w:bookmarkStart w:id="68" w:name="runtime-layers"/>
+    <w:bookmarkStart w:id="107" w:name="runtime-layers"/>
     <w:p>
       <w:pPr>
         <w:pStyle w:val="Heading2"/>
@@ -11443,31 +11707,53 @@
         <w:t xml:space="preserve">.</w:t>
       </w:r>
     </w:p>
-    <w:tbl>
-      <w:tblPr>
-        <w:tblStyle w:val="FigureTable"/>
-        <w:tblW w:type="auto" w:w="0"/>
-        <w:tblLook w:firstRow="0" w:lastRow="0" w:firstColumn="0" w:lastColumn="0"/>
-        <w:jc w:val="center"/>
-      </w:tblPr>
-      <w:tblGrid>
-        <w:gridCol w:w="7920"/>
-      </w:tblGrid>
-      <w:tr>
-        <w:tc>
-          <w:tcPr/>
-          <w:p>
-            <w:pPr>
-              <w:pStyle w:val="Compact"/>
-              <w:jc w:val="center"/>
-            </w:pPr>
-            <w:r>
-              <w:t xml:space="preserve">Figure 7.1. Runtime layers of PhishDrift and where each runs. No data; drawn by scripts/pbl_figures.py.</w:t>
-            </w:r>
-          </w:p>
-        </w:tc>
-      </w:tr>
-    </w:tbl>
+    <w:p>
+      <w:pPr>
+        <w:pStyle w:val="CaptionedFigure"/>
+      </w:pPr>
+      <w:r>
+        <w:drawing>
+          <wp:inline>
+            <wp:extent cx="4810938" cy="4567405"/>
+            <wp:effectExtent b="0" l="0" r="0" t="0"/>
+            <wp:docPr descr="Figure 7.1. Runtime layers of PhishDrift and where each runs. No data; drawn by scripts/pbl_figures.py." title="" id="105" name="Picture"/>
+            <a:graphic>
+              <a:graphicData uri="http://schemas.openxmlformats.org/drawingml/2006/picture">
+                <pic:pic>
+                  <pic:nvPicPr>
+                    <pic:cNvPr descr="figures/fig06_layers.png" id="106" name="Picture"/>
+                    <pic:cNvPicPr>
+                      <a:picLocks noChangeArrowheads="1" noChangeAspect="1"/>
+                    </pic:cNvPicPr>
+                  </pic:nvPicPr>
+                  <pic:blipFill>
+                    <a:blip r:embed="rId104"/>
+                    <a:stretch>
+                      <a:fillRect/>
+                    </a:stretch>
+                  </pic:blipFill>
+                  <pic:spPr bwMode="auto">
+                    <a:xfrm>
+                      <a:off x="0" y="0"/>
+                      <a:ext cx="4810938" cy="4567405"/>
+                    </a:xfrm>
+                    <a:prstGeom prst="rect">
+                      <a:avLst/>
+                    </a:prstGeom>
+                    <a:noFill/>
+                    <a:ln w="9525">
+                      <a:noFill/>
+                      <a:headEnd/>
+                      <a:tailEnd/>
+                    </a:ln>
+                  </pic:spPr>
+                </pic:pic>
+              </a:graphicData>
+            </a:graphic>
+          </wp:inline>
+        </w:drawing>
+      </w:r>
+    </w:p>
     <w:p>
       <w:pPr>
         <w:pStyle w:val="ImageCaption"/>
@@ -11627,8 +11913,8 @@
         <w:t xml:space="preserve">), each with plain-English reasons from TreeSHAP and rule hits. The optional language-model second opinion (layer 6 in the specification) was not built; it was first on the cut list.</w:t>
       </w:r>
     </w:p>
-    <w:bookmarkEnd w:id="68"/>
-    <w:bookmarkStart w:id="69" w:name="how-a-verdict-is-decided"/>
+    <w:bookmarkEnd w:id="107"/>
+    <w:bookmarkStart w:id="108" w:name="how-a-verdict-is-decided"/>
     <w:p>
       <w:pPr>
         <w:pStyle w:val="Heading2"/>
@@ -11849,8 +12135,8 @@
         <w:t xml:space="preserve">Pages with no web address of their own (data URLs, sandboxed frames) are not scored and warn only if they ask for credentials.</w:t>
       </w:r>
     </w:p>
-    <w:bookmarkEnd w:id="69"/>
-    <w:bookmarkStart w:id="70" w:name="lists-zones-and-sync"/>
+    <w:bookmarkEnd w:id="108"/>
+    <w:bookmarkStart w:id="109" w:name="lists-zones-and-sync"/>
     <w:p>
       <w:pPr>
         <w:pStyle w:val="Heading2"/>
@@ -12072,8 +12358,8 @@
         <w:t xml:space="preserve">, 2026-10-19; this is a measurement on constructed variants). Signatures are off until a key is generated on the backend machine, and the bundled allowlist held 43,595 domains at the 2026-10-19 rebuild (137 tenant hosts were added later) because the cloud rebuild could not download Tranco; the PC rebuild restores 5,740 more (same entry).</w:t>
       </w:r>
     </w:p>
-    <w:bookmarkEnd w:id="70"/>
-    <w:bookmarkStart w:id="71" w:name="brand-and-look-alike-rules"/>
+    <w:bookmarkEnd w:id="109"/>
+    <w:bookmarkStart w:id="110" w:name="brand-and-look-alike-rules"/>
     <w:p>
       <w:pPr>
         <w:pStyle w:val="Heading2"/>
@@ -12146,8 +12432,8 @@
         <w:t xml:space="preserve">). The rules were tuned after the natural set was seen, so these false-alarm counts are not independent. TLD swaps such as a bank’s name on another suffix are not caught, because brands own many suffixes.</w:t>
       </w:r>
     </w:p>
-    <w:bookmarkEnd w:id="71"/>
-    <w:bookmarkStart w:id="72" w:name="backend-and-privacy"/>
+    <w:bookmarkEnd w:id="110"/>
+    <w:bookmarkStart w:id="111" w:name="backend-and-privacy"/>
     <w:p>
       <w:pPr>
         <w:pStyle w:val="Heading2"/>
@@ -12432,8 +12718,8 @@
         <w:t xml:space="preserve">. This is a small sample, and the severities are set from it.</w:t>
       </w:r>
     </w:p>
-    <w:bookmarkEnd w:id="72"/>
-    <w:bookmarkStart w:id="73" w:name="latency"/>
+    <w:bookmarkEnd w:id="111"/>
+    <w:bookmarkStart w:id="112" w:name="latency"/>
     <w:p>
       <w:pPr>
         <w:pStyle w:val="Heading2"/>
@@ -12642,8 +12928,8 @@
         <w:t xml:space="preserve">Start-up, once per browser session, takes 166 ms to parse the 11.7 MB model bundle and 73 ms to build the model. The extension scores every navigation without reasons and asks for reasons only when a warning is shown. Page-model latency and backend response times are not measured.</w:t>
       </w:r>
     </w:p>
-    <w:bookmarkEnd w:id="73"/>
-    <w:bookmarkStart w:id="74" w:name="url-check-page-and-user-interface"/>
+    <w:bookmarkEnd w:id="112"/>
+    <w:bookmarkStart w:id="113" w:name="url-check-page-and-user-interface"/>
     <w:p>
       <w:pPr>
         <w:pStyle w:val="Heading2"/>
@@ -12737,8 +13023,8 @@
         <w:t xml:space="preserve">(which sends only the domain). The toolbar popup shows the current verdict and its reasons. Screenshots of each state should be taken on the author’s own browser for the final report.</w:t>
       </w:r>
     </w:p>
-    <w:bookmarkEnd w:id="74"/>
-    <w:bookmarkStart w:id="75" w:name="screenshots"/>
+    <w:bookmarkEnd w:id="113"/>
+    <w:bookmarkStart w:id="114" w:name="screenshots"/>
     <w:p>
       <w:pPr>
         <w:pStyle w:val="Heading2"/>
@@ -12923,9 +13209,9 @@
         <w:t xml:space="preserve">Should show: the final verdict screen with the shield, reasons and score meter.</w:t>
       </w:r>
     </w:p>
-    <w:bookmarkEnd w:id="75"/>
-    <w:bookmarkEnd w:id="76"/>
-    <w:bookmarkStart w:id="90" w:name="evaluation-of-the-detector"/>
+    <w:bookmarkEnd w:id="114"/>
+    <w:bookmarkEnd w:id="115"/>
+    <w:bookmarkStart w:id="150" w:name="evaluation-of-the-detector"/>
     <w:p>
       <w:pPr>
         <w:pStyle w:val="Heading1"/>
@@ -12934,7 +13220,7 @@
         <w:t xml:space="preserve">8. Evaluation of the detector</w:t>
       </w:r>
     </w:p>
-    <w:bookmarkStart w:id="77" w:name="protocol"/>
+    <w:bookmarkStart w:id="116" w:name="protocol"/>
     <w:p>
       <w:pPr>
         <w:pStyle w:val="Heading2"/>
@@ -12960,8 +13246,8 @@
         <w:t xml:space="preserve">), so a 0.1% point allows about 61, 23 and 56 false positives respectively, and in per-bucket views fewer than ten (marked with an asterisk where it applies). No held-out-source result above 99% appears anywhere below, so the leakage tripwire did not fire there; the one place above 0.99 on the test side (tier B on HTML rows) was investigated separately (section 8.4).</w:t>
       </w:r>
     </w:p>
-    <w:bookmarkEnd w:id="77"/>
-    <w:bookmarkStart w:id="78" w:name="Xcc216b2b2525ecbb63550bba86da6a173801b8e"/>
+    <w:bookmarkEnd w:id="116"/>
+    <w:bookmarkStart w:id="120" w:name="Xcc216b2b2525ecbb63550bba86da6a173801b8e"/>
     <w:p>
       <w:pPr>
         <w:pStyle w:val="Heading2"/>
@@ -14290,31 +14576,53 @@
         <w:t xml:space="preserve">Table 8.2. Held-out source (59,485 URLs, 33,056 domains; no HTML, so the blend equals hybrid2 there) and newest time slice (80,653 URLs, 58,054 domains) (same sources as Table 8.1). The blend row on the held-out source uses the same address model with its own thresholds.</w:t>
       </w:r>
     </w:p>
-    <w:tbl>
-      <w:tblPr>
-        <w:tblStyle w:val="FigureTable"/>
-        <w:tblW w:type="auto" w:w="0"/>
-        <w:tblLook w:firstRow="0" w:lastRow="0" w:firstColumn="0" w:lastColumn="0"/>
-        <w:jc w:val="center"/>
-      </w:tblPr>
-      <w:tblGrid>
-        <w:gridCol w:w="7920"/>
-      </w:tblGrid>
-      <w:tr>
-        <w:tc>
-          <w:tcPr/>
-          <w:p>
-            <w:pPr>
-              <w:pStyle w:val="Compact"/>
-              <w:jc w:val="center"/>
-            </w:pPr>
-            <w:r>
-              <w:t xml:space="preserve">Figure 8.1. Recall at FPR 1% and 0.1% by model and evaluation set (median of 10 splits, whiskers min to max).</w:t>
-            </w:r>
-          </w:p>
-        </w:tc>
-      </w:tr>
-    </w:tbl>
+    <w:p>
+      <w:pPr>
+        <w:pStyle w:val="CaptionedFigure"/>
+      </w:pPr>
+      <w:r>
+        <w:drawing>
+          <wp:inline>
+            <wp:extent cx="5922922" cy="3000518"/>
+            <wp:effectExtent b="0" l="0" r="0" t="0"/>
+            <wp:docPr descr="Figure 8.1. Recall at FPR 1% and 0.1% by model and evaluation set (median of 10 splits, whiskers min to max)." title="" id="118" name="Picture"/>
+            <a:graphic>
+              <a:graphicData uri="http://schemas.openxmlformats.org/drawingml/2006/picture">
+                <pic:pic>
+                  <pic:nvPicPr>
+                    <pic:cNvPr descr="figures/fig01_recall_by_model.png" id="119" name="Picture"/>
+                    <pic:cNvPicPr>
+                      <a:picLocks noChangeArrowheads="1" noChangeAspect="1"/>
+                    </pic:cNvPicPr>
+                  </pic:nvPicPr>
+                  <pic:blipFill>
+                    <a:blip r:embed="rId117"/>
+                    <a:stretch>
+                      <a:fillRect/>
+                    </a:stretch>
+                  </pic:blipFill>
+                  <pic:spPr bwMode="auto">
+                    <a:xfrm>
+                      <a:off x="0" y="0"/>
+                      <a:ext cx="5922922" cy="3000518"/>
+                    </a:xfrm>
+                    <a:prstGeom prst="rect">
+                      <a:avLst/>
+                    </a:prstGeom>
+                    <a:noFill/>
+                    <a:ln w="9525">
+                      <a:noFill/>
+                      <a:headEnd/>
+                      <a:tailEnd/>
+                    </a:ln>
+                  </pic:spPr>
+                </pic:pic>
+              </a:graphicData>
+            </a:graphic>
+          </wp:inline>
+        </w:drawing>
+      </w:r>
+    </w:p>
     <w:p>
       <w:pPr>
         <w:pStyle w:val="ImageCaption"/>
@@ -14420,8 +14728,8 @@
         <w:t xml:space="preserve">). The address model lost about three points at 1% and nine at 0.1%.</w:t>
       </w:r>
     </w:p>
-    <w:bookmarkEnd w:id="78"/>
-    <w:bookmarkStart w:id="79" w:name="what-the-page-adds"/>
+    <w:bookmarkEnd w:id="120"/>
+    <w:bookmarkStart w:id="124" w:name="what-the-page-adds"/>
     <w:p>
       <w:pPr>
         <w:pStyle w:val="Heading2"/>
@@ -14802,40 +15110,53 @@
         <w:t xml:space="preserve">; thresholds from the calibration rows that also have HTML).</w:t>
       </w:r>
     </w:p>
-    <w:tbl>
-      <w:tblPr>
-        <w:tblStyle w:val="FigureTable"/>
-        <w:tblW w:type="auto" w:w="0"/>
-        <w:tblLook w:firstRow="0" w:lastRow="0" w:firstColumn="0" w:lastColumn="0"/>
-        <w:jc w:val="center"/>
-      </w:tblPr>
-      <w:tblGrid>
-        <w:gridCol w:w="7920"/>
-      </w:tblGrid>
-      <w:tr>
-        <w:tc>
-          <w:tcPr/>
-          <w:p>
-            <w:pPr>
-              <w:pStyle w:val="Compact"/>
-              <w:jc w:val="center"/>
-            </w:pPr>
-            <w:r>
-              <w:t xml:space="preserve">Figure 8.2. Address model against the blend, on URLs with and without usable HTML (</w:t>
-            </w:r>
-            <w:r>
-              <w:rPr>
-                <w:rStyle w:val="VerbatimChar"/>
-              </w:rPr>
-              <w:t xml:space="preserve">reports/blend2.md</w:t>
-            </w:r>
-            <w:r>
-              <w:t xml:space="preserve">).</w:t>
-            </w:r>
-          </w:p>
-        </w:tc>
-      </w:tr>
-    </w:tbl>
+    <w:p>
+      <w:pPr>
+        <w:pStyle w:val="CaptionedFigure"/>
+      </w:pPr>
+      <w:r>
+        <w:drawing>
+          <wp:inline>
+            <wp:extent cx="5922922" cy="2614540"/>
+            <wp:effectExtent b="0" l="0" r="0" t="0"/>
+            <wp:docPr descr="Figure 8.2. Address model against the blend, on URLs with and without usable HTML (reports/blend2.md)." title="" id="122" name="Picture"/>
+            <a:graphic>
+              <a:graphicData uri="http://schemas.openxmlformats.org/drawingml/2006/picture">
+                <pic:pic>
+                  <pic:nvPicPr>
+                    <pic:cNvPr descr="figures/fig02_html_gain.png" id="123" name="Picture"/>
+                    <pic:cNvPicPr>
+                      <a:picLocks noChangeArrowheads="1" noChangeAspect="1"/>
+                    </pic:cNvPicPr>
+                  </pic:nvPicPr>
+                  <pic:blipFill>
+                    <a:blip r:embed="rId121"/>
+                    <a:stretch>
+                      <a:fillRect/>
+                    </a:stretch>
+                  </pic:blipFill>
+                  <pic:spPr bwMode="auto">
+                    <a:xfrm>
+                      <a:off x="0" y="0"/>
+                      <a:ext cx="5922922" cy="2614540"/>
+                    </a:xfrm>
+                    <a:prstGeom prst="rect">
+                      <a:avLst/>
+                    </a:prstGeom>
+                    <a:noFill/>
+                    <a:ln w="9525">
+                      <a:noFill/>
+                      <a:headEnd/>
+                      <a:tailEnd/>
+                    </a:ln>
+                  </pic:spPr>
+                </pic:pic>
+              </a:graphicData>
+            </a:graphic>
+          </wp:inline>
+        </w:drawing>
+      </w:r>
+    </w:p>
     <w:p>
       <w:pPr>
         <w:pStyle w:val="ImageCaption"/>
@@ -14885,8 +15206,8 @@
         <w:t xml:space="preserve">).</w:t>
       </w:r>
     </w:p>
-    <w:bookmarkEnd w:id="79"/>
-    <w:bookmarkStart w:id="80" w:name="checks-on-the-page-model"/>
+    <w:bookmarkEnd w:id="124"/>
+    <w:bookmarkStart w:id="125" w:name="checks-on-the-page-model"/>
     <w:p>
       <w:pPr>
         <w:pStyle w:val="Heading2"/>
@@ -14953,8 +15274,8 @@
         <w:t xml:space="preserve">), so the HTML subset is not a random sample. Re-weighting each HTML row by the inverse of its estimated probability of having usable HTML (clipped at 20; effective sample sizes 4,788 phishing and 17,855 legitimate rows) lowers the blend’s warned recall on HTML rows from 93.0 to 91.9 and its dangerous recall from 85.7 to 82.5. On the time slice the corrected and uncorrected figures differ by less than one point (80.4 to 80.7 warned). The correction assumes HTML loss depends only on the URL features and source; if phishing pages whose HTML survives are easier than those whose HTML does not, even the corrected figure is optimistic.</w:t>
       </w:r>
     </w:p>
-    <w:bookmarkEnd w:id="80"/>
-    <w:bookmarkStart w:id="81" w:name="the-shipped-verdict-rules"/>
+    <w:bookmarkEnd w:id="125"/>
+    <w:bookmarkStart w:id="126" w:name="the-shipped-verdict-rules"/>
     <w:p>
       <w:pPr>
         <w:pStyle w:val="Heading2"/>
@@ -15928,8 +16249,8 @@
         <w:t xml:space="preserve">).</w:t>
       </w:r>
     </w:p>
-    <w:bookmarkEnd w:id="81"/>
-    <w:bookmarkStart w:id="82" w:name="Xe426f1dec27245d1838fe304132d4e0595d666a"/>
+    <w:bookmarkEnd w:id="126"/>
+    <w:bookmarkStart w:id="130" w:name="Xe426f1dec27245d1838fe304132d4e0595d666a"/>
     <w:p>
       <w:pPr>
         <w:pStyle w:val="Heading2"/>
@@ -16528,31 +16849,53 @@
         <w:t xml:space="preserve">). Phishpedia and Phish-Blitz have only phishing rows and give no FPR.</w:t>
       </w:r>
     </w:p>
-    <w:tbl>
-      <w:tblPr>
-        <w:tblStyle w:val="FigureTable"/>
-        <w:tblW w:type="auto" w:w="0"/>
-        <w:tblLook w:firstRow="0" w:lastRow="0" w:firstColumn="0" w:lastColumn="0"/>
-        <w:jc w:val="center"/>
-      </w:tblPr>
-      <w:tblGrid>
-        <w:gridCol w:w="7920"/>
-      </w:tblGrid>
-      <w:tr>
-        <w:tc>
-          <w:tcPr/>
-          <w:p>
-            <w:pPr>
-              <w:pStyle w:val="Compact"/>
-              <w:jc w:val="center"/>
-            </w:pPr>
-            <w:r>
-              <w:t xml:space="preserve">Figure 8.3. False-positive rate on the left-out source at the threshold chosen for 1% on the other sources.</w:t>
-            </w:r>
-          </w:p>
-        </w:tc>
-      </w:tr>
-    </w:tbl>
+    <w:p>
+      <w:pPr>
+        <w:pStyle w:val="CaptionedFigure"/>
+      </w:pPr>
+      <w:r>
+        <w:drawing>
+          <wp:inline>
+            <wp:extent cx="5844808" cy="2522641"/>
+            <wp:effectExtent b="0" l="0" r="0" t="0"/>
+            <wp:docPr descr="Figure 8.3. False-positive rate on the left-out source at the threshold chosen for 1% on the other sources." title="" id="128" name="Picture"/>
+            <a:graphic>
+              <a:graphicData uri="http://schemas.openxmlformats.org/drawingml/2006/picture">
+                <pic:pic>
+                  <pic:nvPicPr>
+                    <pic:cNvPr descr="figures/fig03_loso_threshold_transfer.png" id="129" name="Picture"/>
+                    <pic:cNvPicPr>
+                      <a:picLocks noChangeArrowheads="1" noChangeAspect="1"/>
+                    </pic:cNvPicPr>
+                  </pic:nvPicPr>
+                  <pic:blipFill>
+                    <a:blip r:embed="rId127"/>
+                    <a:stretch>
+                      <a:fillRect/>
+                    </a:stretch>
+                  </pic:blipFill>
+                  <pic:spPr bwMode="auto">
+                    <a:xfrm>
+                      <a:off x="0" y="0"/>
+                      <a:ext cx="5844808" cy="2522641"/>
+                    </a:xfrm>
+                    <a:prstGeom prst="rect">
+                      <a:avLst/>
+                    </a:prstGeom>
+                    <a:noFill/>
+                    <a:ln w="9525">
+                      <a:noFill/>
+                      <a:headEnd/>
+                      <a:tailEnd/>
+                    </a:ln>
+                  </pic:spPr>
+                </pic:pic>
+              </a:graphicData>
+            </a:graphic>
+          </wp:inline>
+        </w:drawing>
+      </w:r>
+    </w:p>
     <w:p>
       <w:pPr>
         <w:pStyle w:val="ImageCaption"/>
@@ -16584,8 +16927,8 @@
         <w:t xml:space="preserve">baseline (43.4% recall at 1% FPR) beat both trained models (29.5% and 8.2%). The models partly learn source style, and thresholds tuned on some sources do not transfer to another. The live-feed row rests on 245 URLs and is shown for completeness only.</w:t>
       </w:r>
     </w:p>
-    <w:bookmarkEnd w:id="82"/>
-    <w:bookmarkStart w:id="83" w:name="depth-and-representation-checks"/>
+    <w:bookmarkEnd w:id="130"/>
+    <w:bookmarkStart w:id="137" w:name="depth-and-representation-checks"/>
     <w:p>
       <w:pPr>
         <w:pStyle w:val="Heading2"/>
@@ -17001,31 +17344,53 @@
         <w:t xml:space="preserve">). The blend rows come from an earlier blend run (raw ROC-AUC 0.9618, recall 73.7 / 58.6) than Table 8.1.</w:t>
       </w:r>
     </w:p>
-    <w:tbl>
-      <w:tblPr>
-        <w:tblStyle w:val="FigureTable"/>
-        <w:tblW w:type="auto" w:w="0"/>
-        <w:tblLook w:firstRow="0" w:lastRow="0" w:firstColumn="0" w:lastColumn="0"/>
-        <w:jc w:val="center"/>
-      </w:tblPr>
-      <w:tblGrid>
-        <w:gridCol w:w="7920"/>
-      </w:tblGrid>
-      <w:tr>
-        <w:tc>
-          <w:tcPr/>
-          <w:p>
-            <w:pPr>
-              <w:pStyle w:val="Compact"/>
-              <w:jc w:val="center"/>
-            </w:pPr>
-            <w:r>
-              <w:t xml:space="preserve">Figure 8.4. Raw against normalised URLs: recall at FPR 1% and 0.1%.</w:t>
-            </w:r>
-          </w:p>
-        </w:tc>
-      </w:tr>
-    </w:tbl>
+    <w:p>
+      <w:pPr>
+        <w:pStyle w:val="CaptionedFigure"/>
+      </w:pPr>
+      <w:r>
+        <w:drawing>
+          <wp:inline>
+            <wp:extent cx="5922922" cy="2637515"/>
+            <wp:effectExtent b="0" l="0" r="0" t="0"/>
+            <wp:docPr descr="Figure 8.4. Raw against normalised URLs: recall at FPR 1% and 0.1%." title="" id="132" name="Picture"/>
+            <a:graphic>
+              <a:graphicData uri="http://schemas.openxmlformats.org/drawingml/2006/picture">
+                <pic:pic>
+                  <pic:nvPicPr>
+                    <pic:cNvPr descr="figures/fig07_representation.png" id="133" name="Picture"/>
+                    <pic:cNvPicPr>
+                      <a:picLocks noChangeArrowheads="1" noChangeAspect="1"/>
+                    </pic:cNvPicPr>
+                  </pic:nvPicPr>
+                  <pic:blipFill>
+                    <a:blip r:embed="rId131"/>
+                    <a:stretch>
+                      <a:fillRect/>
+                    </a:stretch>
+                  </pic:blipFill>
+                  <pic:spPr bwMode="auto">
+                    <a:xfrm>
+                      <a:off x="0" y="0"/>
+                      <a:ext cx="5922922" cy="2637515"/>
+                    </a:xfrm>
+                    <a:prstGeom prst="rect">
+                      <a:avLst/>
+                    </a:prstGeom>
+                    <a:noFill/>
+                    <a:ln w="9525">
+                      <a:noFill/>
+                      <a:headEnd/>
+                      <a:tailEnd/>
+                    </a:ln>
+                  </pic:spPr>
+                </pic:pic>
+              </a:graphicData>
+            </a:graphic>
+          </wp:inline>
+        </w:drawing>
+      </w:r>
+    </w:p>
     <w:p>
       <w:pPr>
         <w:pStyle w:val="ImageCaption"/>
@@ -17051,31 +17416,53 @@
         <w:t xml:space="preserve">).</w:t>
       </w:r>
     </w:p>
-    <w:tbl>
-      <w:tblPr>
-        <w:tblStyle w:val="FigureTable"/>
-        <w:tblW w:type="auto" w:w="0"/>
-        <w:tblLook w:firstRow="0" w:lastRow="0" w:firstColumn="0" w:lastColumn="0"/>
-        <w:jc w:val="center"/>
-      </w:tblPr>
-      <w:tblGrid>
-        <w:gridCol w:w="7920"/>
-      </w:tblGrid>
-      <w:tr>
-        <w:tc>
-          <w:tcPr/>
-          <w:p>
-            <w:pPr>
-              <w:pStyle w:val="Compact"/>
-              <w:jc w:val="center"/>
-            </w:pPr>
-            <w:r>
-              <w:t xml:space="preserve">Figure 8.5. Shipped address model (hybrid2), ROC-AUC by URL depth bucket on three sets.</w:t>
-            </w:r>
-          </w:p>
-        </w:tc>
-      </w:tr>
-    </w:tbl>
+    <w:p>
+      <w:pPr>
+        <w:pStyle w:val="CaptionedFigure"/>
+      </w:pPr>
+      <w:r>
+        <w:drawing>
+          <wp:inline>
+            <wp:extent cx="5922922" cy="2522641"/>
+            <wp:effectExtent b="0" l="0" r="0" t="0"/>
+            <wp:docPr descr="Figure 8.5. Shipped address model (hybrid2), ROC-AUC by URL depth bucket on three sets." title="" id="135" name="Picture"/>
+            <a:graphic>
+              <a:graphicData uri="http://schemas.openxmlformats.org/drawingml/2006/picture">
+                <pic:pic>
+                  <pic:nvPicPr>
+                    <pic:cNvPr descr="figures/fig08_depth_buckets.png" id="136" name="Picture"/>
+                    <pic:cNvPicPr>
+                      <a:picLocks noChangeArrowheads="1" noChangeAspect="1"/>
+                    </pic:cNvPicPr>
+                  </pic:nvPicPr>
+                  <pic:blipFill>
+                    <a:blip r:embed="rId134"/>
+                    <a:stretch>
+                      <a:fillRect/>
+                    </a:stretch>
+                  </pic:blipFill>
+                  <pic:spPr bwMode="auto">
+                    <a:xfrm>
+                      <a:off x="0" y="0"/>
+                      <a:ext cx="5922922" cy="2522641"/>
+                    </a:xfrm>
+                    <a:prstGeom prst="rect">
+                      <a:avLst/>
+                    </a:prstGeom>
+                    <a:noFill/>
+                    <a:ln w="9525">
+                      <a:noFill/>
+                      <a:headEnd/>
+                      <a:tailEnd/>
+                    </a:ln>
+                  </pic:spPr>
+                </pic:pic>
+              </a:graphicData>
+            </a:graphic>
+          </wp:inline>
+        </w:drawing>
+      </w:r>
+    </w:p>
     <w:p>
       <w:pPr>
         <w:pStyle w:val="ImageCaption"/>
@@ -17104,8 +17491,8 @@
         <w:t xml:space="preserve">) shows that the result does not rest on depth alone. Depth 0 (bare domains) is the weakest bucket on every set: 0.9209 on test, 0.9270 on the time slice and 0.7985 on PhishStorm, where it holds only 91 legitimate URLs and the cal 1% threshold flags 30.2% of them. On PhishStorm depths 1 to 3 give 0.954 to 0.960, about the overall 0.9587, so the held-out result is not an artefact of PhishStorm’s depth imbalance.</w:t>
       </w:r>
     </w:p>
-    <w:bookmarkEnd w:id="83"/>
-    <w:bookmarkStart w:id="85" w:name="Xcd7faad2695b1e803ca25dd0fcfbd11dee0a145"/>
+    <w:bookmarkEnd w:id="137"/>
+    <w:bookmarkStart w:id="142" w:name="Xcd7faad2695b1e803ca25dd0fcfbd11dee0a145"/>
     <w:p>
       <w:pPr>
         <w:pStyle w:val="Heading2"/>
@@ -17618,76 +18005,53 @@
         <w:t xml:space="preserve">; 562 sites, 512 with HTML).</w:t>
       </w:r>
     </w:p>
-    <w:tbl>
-      <w:tblPr>
-        <w:tblStyle w:val="FigureTable"/>
-        <w:tblW w:type="auto" w:w="0"/>
-        <w:tblLook w:firstRow="0" w:lastRow="0" w:firstColumn="0" w:lastColumn="0"/>
-        <w:jc w:val="center"/>
-      </w:tblPr>
-      <w:tblGrid>
-        <w:gridCol w:w="7920"/>
-      </w:tblGrid>
-      <w:tr>
-        <w:tc>
-          <w:tcPr/>
-          <w:p>
-            <w:pPr>
-              <w:pStyle w:val="Compact"/>
-              <w:jc w:val="center"/>
-            </w:pPr>
-            <w:r>
-              <w:t xml:space="preserve">Figure 8.6. Natural-page false alarms by model and by layer set (</w:t>
-            </w:r>
-            <w:r>
-              <w:rPr>
-                <w:rStyle w:val="VerbatimChar"/>
-              </w:rPr>
-              <w:t xml:space="preserve">reports/ood_fpr.md</w:t>
-            </w:r>
-            <w:r>
-              <w:t xml:space="preserve">,</w:t>
-            </w:r>
-            <w:r>
-              <w:t xml:space="preserve"> </w:t>
-            </w:r>
-            <w:r>
-              <w:rPr>
-                <w:rStyle w:val="VerbatimChar"/>
-              </w:rPr>
-              <w:t xml:space="preserve">reports/blend2_rules.md</w:t>
-            </w:r>
-            <w:r>
-              <w:t xml:space="preserve">,</w:t>
-            </w:r>
-            <w:r>
-              <w:t xml:space="preserve"> </w:t>
-            </w:r>
-            <w:r>
-              <w:rPr>
-                <w:rStyle w:val="VerbatimChar"/>
-              </w:rPr>
-              <w:t xml:space="preserve">reports/shipped_verdicts.md</w:t>
-            </w:r>
-            <w:r>
-              <w:t xml:space="preserve">,</w:t>
-            </w:r>
-            <w:r>
-              <w:t xml:space="preserve"> </w:t>
-            </w:r>
-            <w:r>
-              <w:rPr>
-                <w:rStyle w:val="VerbatimChar"/>
-              </w:rPr>
-              <w:t xml:space="preserve">reports/page_fixes_fpr.md</w:t>
-            </w:r>
-            <w:r>
-              <w:t xml:space="preserve">).</w:t>
-            </w:r>
-          </w:p>
-        </w:tc>
-      </w:tr>
-    </w:tbl>
+    <w:p>
+      <w:pPr>
+        <w:pStyle w:val="CaptionedFigure"/>
+      </w:pPr>
+      <w:r>
+        <w:drawing>
+          <wp:inline>
+            <wp:extent cx="6024012" cy="2798339"/>
+            <wp:effectExtent b="0" l="0" r="0" t="0"/>
+            <wp:docPr descr="Figure 8.6. Natural-page false alarms by model and by layer set (reports/ood_fpr.md, reports/blend2_rules.md, reports/shipped_verdicts.md, reports/page_fixes_fpr.md)." title="" id="139" name="Picture"/>
+            <a:graphic>
+              <a:graphicData uri="http://schemas.openxmlformats.org/drawingml/2006/picture">
+                <pic:pic>
+                  <pic:nvPicPr>
+                    <pic:cNvPr descr="figures/fig04_false_alarms_natural_pages.png" id="140" name="Picture"/>
+                    <pic:cNvPicPr>
+                      <a:picLocks noChangeArrowheads="1" noChangeAspect="1"/>
+                    </pic:cNvPicPr>
+                  </pic:nvPicPr>
+                  <pic:blipFill>
+                    <a:blip r:embed="rId138"/>
+                    <a:stretch>
+                      <a:fillRect/>
+                    </a:stretch>
+                  </pic:blipFill>
+                  <pic:spPr bwMode="auto">
+                    <a:xfrm>
+                      <a:off x="0" y="0"/>
+                      <a:ext cx="6024012" cy="2798339"/>
+                    </a:xfrm>
+                    <a:prstGeom prst="rect">
+                      <a:avLst/>
+                    </a:prstGeom>
+                    <a:noFill/>
+                    <a:ln w="9525">
+                      <a:noFill/>
+                      <a:headEnd/>
+                      <a:tailEnd/>
+                    </a:ln>
+                  </pic:spPr>
+                </pic:pic>
+              </a:graphicData>
+            </a:graphic>
+          </wp:inline>
+        </w:drawing>
+      </w:r>
+    </w:p>
     <w:p>
       <w:pPr>
         <w:pStyle w:val="ImageCaption"/>
@@ -17802,7 +18166,7 @@
         <w:t xml:space="preserve">). All of these are measured on stored HTML, not on a live page, and the natural set is Tranco-seeded.</w:t>
       </w:r>
     </w:p>
-    <w:bookmarkStart w:id="84" w:name="X52a89796c9262ce33fe1ffd1a665247df49ea0d"/>
+    <w:bookmarkStart w:id="141" w:name="X52a89796c9262ce33fe1ffd1a665247df49ea0d"/>
     <w:p>
       <w:pPr>
         <w:pStyle w:val="Heading3"/>
@@ -18213,9 +18577,9 @@
         <w:t xml:space="preserve">figures are medians over ten, so the two are not strictly comparable. The crawl hosts and the natural pages both come from popular-site lists, so some of the drop may reflect that similarity. The brand-list change went in together with the new data, so the two effects are not separated. The false-alarm rate on PhishStorm at the cal-side 1% threshold stays at 3.2%. The ten-split tables elsewhere in this chapter were produced before the retrain and have not been refreshed.</w:t>
       </w:r>
     </w:p>
-    <w:bookmarkEnd w:id="84"/>
-    <w:bookmarkEnd w:id="85"/>
-    <w:bookmarkStart w:id="86" w:name="negative-controls-1"/>
+    <w:bookmarkEnd w:id="141"/>
+    <w:bookmarkEnd w:id="142"/>
+    <w:bookmarkStart w:id="143" w:name="negative-controls-1"/>
     <w:p>
       <w:pPr>
         <w:pStyle w:val="Heading2"/>
@@ -18853,8 +19217,8 @@
         <w:t xml:space="preserve">, 2026-10-12). Tier C is the control with the widest range because its test side has only 24 phishing hosts.</w:t>
       </w:r>
     </w:p>
-    <w:bookmarkEnd w:id="86"/>
-    <w:bookmarkStart w:id="87" w:name="robustness-to-url-evasion"/>
+    <w:bookmarkEnd w:id="143"/>
+    <w:bookmarkStart w:id="147" w:name="robustness-to-url-evasion"/>
     <w:p>
       <w:pPr>
         <w:pStyle w:val="Heading2"/>
@@ -18945,31 +19309,53 @@
         <w:t xml:space="preserve">has 68.6 / 50.2, so adversarial training costs about one point.</w:t>
       </w:r>
     </w:p>
-    <w:tbl>
-      <w:tblPr>
-        <w:tblStyle w:val="FigureTable"/>
-        <w:tblW w:type="auto" w:w="0"/>
-        <w:tblLook w:firstRow="0" w:lastRow="0" w:firstColumn="0" w:lastColumn="0"/>
-        <w:jc w:val="center"/>
-      </w:tblPr>
-      <w:tblGrid>
-        <w:gridCol w:w="7920"/>
-      </w:tblGrid>
-      <w:tr>
-        <w:tc>
-          <w:tcPr/>
-          <w:p>
-            <w:pPr>
-              <w:pStyle w:val="Compact"/>
-              <w:jc w:val="center"/>
-            </w:pPr>
-            <w:r>
-              <w:t xml:space="preserve">Figure 8.7. Evasion rate and false alarms before and after adversarial training, per family, at the suspicious threshold.</w:t>
-            </w:r>
-          </w:p>
-        </w:tc>
-      </w:tr>
-    </w:tbl>
+    <w:p>
+      <w:pPr>
+        <w:pStyle w:val="CaptionedFigure"/>
+      </w:pPr>
+      <w:r>
+        <w:drawing>
+          <wp:inline>
+            <wp:extent cx="5922922" cy="2821314"/>
+            <wp:effectExtent b="0" l="0" r="0" t="0"/>
+            <wp:docPr descr="Figure 8.7. Evasion rate and false alarms before and after adversarial training, per family, at the suspicious threshold." title="" id="145" name="Picture"/>
+            <a:graphic>
+              <a:graphicData uri="http://schemas.openxmlformats.org/drawingml/2006/picture">
+                <pic:pic>
+                  <pic:nvPicPr>
+                    <pic:cNvPr descr="figures/fig05_evasion_adversarial.png" id="146" name="Picture"/>
+                    <pic:cNvPicPr>
+                      <a:picLocks noChangeArrowheads="1" noChangeAspect="1"/>
+                    </pic:cNvPicPr>
+                  </pic:nvPicPr>
+                  <pic:blipFill>
+                    <a:blip r:embed="rId144"/>
+                    <a:stretch>
+                      <a:fillRect/>
+                    </a:stretch>
+                  </pic:blipFill>
+                  <pic:spPr bwMode="auto">
+                    <a:xfrm>
+                      <a:off x="0" y="0"/>
+                      <a:ext cx="5922922" cy="2821314"/>
+                    </a:xfrm>
+                    <a:prstGeom prst="rect">
+                      <a:avLst/>
+                    </a:prstGeom>
+                    <a:noFill/>
+                    <a:ln w="9525">
+                      <a:noFill/>
+                      <a:headEnd/>
+                      <a:tailEnd/>
+                    </a:ln>
+                  </pic:spPr>
+                </pic:pic>
+              </a:graphicData>
+            </a:graphic>
+          </wp:inline>
+        </w:drawing>
+      </w:r>
+    </w:p>
     <w:p>
       <w:pPr>
         <w:pStyle w:val="ImageCaption"/>
@@ -18986,8 +19372,8 @@
         <w:t xml:space="preserve">The result is the opposite of the usual evasion story. The shipped model is hard to evade with these rewrites (2.4% evasion for stacked subdomains, 1.3% for padding, 2.9% for shortener wrapping, against 30.5% for unmodified phishing), but only because it treats the rewrite as suspicious: it also flags 63.5%, 72.5% and 97.2% of legitimate URLs rewritten the same way. Long legitimate URLs that were not rewritten are not a problem (0.7% flagged). Training on variants of both classes removes the false alarms for the families it saw (1.1% to 2.1%; 0.0% for shortener) and returns evasion to the clean rate (32% to 41%; shortener 100%, because a short link carries nothing for a URL model). A family the model never saw behaves like the base model on both sides, and each held-out column rests on one split. The apparent robustness of the base model is therefore over-suspicion rather than understanding, and the extension needs its other layers for real traffic: shorteners are expanded and scored at the target, and the allowlist and blocklists carry sites that a URL model would flag. The rewrites are synthetic (random lure words, brands from the project’s own list), so real attacker URLs may differ. Robustness of tier B was not measured.</w:t>
       </w:r>
     </w:p>
-    <w:bookmarkEnd w:id="87"/>
-    <w:bookmarkStart w:id="88" w:name="tier-c"/>
+    <w:bookmarkEnd w:id="147"/>
+    <w:bookmarkStart w:id="148" w:name="tier-c"/>
     <w:p>
       <w:pPr>
         <w:pStyle w:val="Heading2"/>
@@ -19609,8 +19995,8 @@
         <w:t xml:space="preserve">pairs, so collection method may leak into host-form features. The time check was skipped because the eligible rows span two capture days. Tier C is not wired into the backend: the backend’s run-time checks are the hand-set rules in section 7.5.</w:t>
       </w:r>
     </w:p>
-    <w:bookmarkEnd w:id="88"/>
-    <w:bookmarkStart w:id="89" w:name="real-world-and-stress-tests"/>
+    <w:bookmarkEnd w:id="148"/>
+    <w:bookmarkStart w:id="149" w:name="real-world-and-stress-tests"/>
     <w:p>
       <w:pPr>
         <w:pStyle w:val="Heading2"/>
@@ -19787,9 +20173,9 @@
         <w:t xml:space="preserve">Blocklist coverage on the corpus is not measurable, because the test URLs come from datasets collected in other periods than the live feeds. It can only be measured forward, as the share of newly listed feed URLs whose domain was already on an earlier list, once the collector has run for several days. This is not measured.</w:t>
       </w:r>
     </w:p>
-    <w:bookmarkEnd w:id="89"/>
-    <w:bookmarkEnd w:id="90"/>
-    <w:bookmarkStart w:id="91" w:name="limitations-and-what-is-not-done"/>
+    <w:bookmarkEnd w:id="149"/>
+    <w:bookmarkEnd w:id="150"/>
+    <w:bookmarkStart w:id="151" w:name="limitations-and-what-is-not-done"/>
     <w:p>
       <w:pPr>
         <w:pStyle w:val="Heading1"/>
@@ -20259,8 +20645,8 @@
         <w:t xml:space="preserve">, 2026-10-20).</w:t>
       </w:r>
     </w:p>
-    <w:bookmarkEnd w:id="91"/>
-    <w:bookmarkStart w:id="95" w:name="conclusion-and-future-work"/>
+    <w:bookmarkEnd w:id="151"/>
+    <w:bookmarkStart w:id="155" w:name="conclusion-and-future-work"/>
     <w:p>
       <w:pPr>
         <w:pStyle w:val="Heading1"/>
@@ -20269,7 +20655,7 @@
         <w:t xml:space="preserve">10. Conclusion and future work</w:t>
       </w:r>
     </w:p>
-    <w:bookmarkStart w:id="92" w:name="what-was-achieved"/>
+    <w:bookmarkStart w:id="152" w:name="what-was-achieved"/>
     <w:p>
       <w:pPr>
         <w:pStyle w:val="Heading2"/>
@@ -20356,8 +20742,8 @@
         <w:t xml:space="preserve">; seeds are fixed; the study’s plan and consistency rule were frozen before the run.</w:t>
       </w:r>
     </w:p>
-    <w:bookmarkEnd w:id="92"/>
-    <w:bookmarkStart w:id="93" w:name="limitations"/>
+    <w:bookmarkEnd w:id="152"/>
+    <w:bookmarkStart w:id="153" w:name="limitations"/>
     <w:p>
       <w:pPr>
         <w:pStyle w:val="Heading2"/>
@@ -20374,8 +20760,8 @@
         <w:t xml:space="preserve">See Sections 4.12 and Chapter 9. In short: public benchmarks only, two of them old or homepage-heavy; the HTML part rests on two sources with uneven coverage; one shuffled-label control is flagged; platform masking showed no effect in a test that rests on one legitimate source; tier C of the detector rests on a small live capture; and the extension has been checked in test harnesses and on stored pages, not in a long field trial.</w:t>
       </w:r>
     </w:p>
-    <w:bookmarkEnd w:id="93"/>
-    <w:bookmarkStart w:id="94" w:name="future-work"/>
+    <w:bookmarkEnd w:id="153"/>
+    <w:bookmarkStart w:id="154" w:name="future-work"/>
     <w:p>
       <w:pPr>
         <w:pStyle w:val="Heading2"/>
@@ -20444,9 +20830,9 @@
         <w:t xml:space="preserve">Optional second-opinion layer for the grey zone (planned, not built).</w:t>
       </w:r>
     </w:p>
-    <w:bookmarkEnd w:id="94"/>
-    <w:bookmarkEnd w:id="95"/>
-    <w:bookmarkStart w:id="96" w:name="references"/>
+    <w:bookmarkEnd w:id="154"/>
+    <w:bookmarkEnd w:id="155"/>
+    <w:bookmarkStart w:id="156" w:name="references"/>
     <w:p>
       <w:pPr>
         <w:pStyle w:val="Heading1"/>
@@ -20715,7 +21101,7 @@
         <w:t xml:space="preserve">Citation details should be checked against the originals before submission.</w:t>
       </w:r>
     </w:p>
-    <w:bookmarkEnd w:id="96"/>
+    <w:bookmarkEnd w:id="156"/>
     <w:sectPr>
       <w:pgSz w:h="16838" w:w="11906"/>
       <w:pgMar w:bottom="1134" w:left="1020" w:right="1020" w:top="1134"/>

</xml_diff>